<commit_message>
Refactored the 1.1 table and continued to work on the project. Used the tables from session 3 such as the symptoms table and evidence tables.
</commit_message>
<xml_diff>
--- a/report/ca1-report.docx
+++ b/report/ca1-report.docx
@@ -14,6 +14,9 @@
         <w:p/>
         <w:p>
           <w:r>
+            <w:rPr>
+              <w:noProof/>
+            </w:rPr>
             <mc:AlternateContent>
               <mc:Choice Requires="wps">
                 <w:drawing>
@@ -216,6 +219,9 @@
             </mc:AlternateContent>
           </w:r>
           <w:r>
+            <w:rPr>
+              <w:noProof/>
+            </w:rPr>
             <mc:AlternateContent>
               <mc:Choice Requires="wpg">
                 <w:drawing>
@@ -583,6 +589,9 @@
             </mc:AlternateContent>
           </w:r>
           <w:r>
+            <w:rPr>
+              <w:noProof/>
+            </w:rPr>
             <mc:AlternateContent>
               <mc:Choice Requires="wps">
                 <w:drawing>
@@ -689,6 +698,9 @@
             </mc:AlternateContent>
           </w:r>
           <w:r>
+            <w:rPr>
+              <w:noProof/>
+            </w:rPr>
             <mc:AlternateContent>
               <mc:Choice Requires="wps">
                 <w:drawing>
@@ -880,20 +892,18 @@
     </w:sdt>
     <w:sdt>
       <w:sdtPr>
+        <w:rPr>
+          <w:rFonts w:asciiTheme="minorHAnsi" w:eastAsiaTheme="minorEastAsia" w:hAnsiTheme="minorHAnsi" w:cs="Times New Roman"/>
+          <w:color w:val="auto"/>
+          <w:sz w:val="22"/>
+          <w:szCs w:val="22"/>
+        </w:rPr>
         <w:id w:val="1867259204"/>
         <w:docPartObj>
           <w:docPartGallery w:val="Table of Contents"/>
           <w:docPartUnique/>
         </w:docPartObj>
       </w:sdtPr>
-      <w:sdtEndPr>
-        <w:rPr>
-          <w:rFonts w:asciiTheme="minorHAnsi" w:eastAsiaTheme="minorEastAsia" w:hAnsiTheme="minorHAnsi" w:cs="Times New Roman"/>
-          <w:color w:val="auto"/>
-          <w:sz w:val="22"/>
-          <w:szCs w:val="22"/>
-        </w:rPr>
-      </w:sdtEndPr>
       <w:sdtContent>
         <w:p>
           <w:pPr>
@@ -1135,36 +1145,31 @@
         <w:ind w:left="840"/>
       </w:pPr>
       <w:r>
-        <w:t xml:space="preserve">Kerry rural library </w:t>
+        <w:t>Kerry</w:t>
       </w:r>
       <w:r>
-        <w:t>is a service for small communities and towns that do not have direct access to a permanent library. Routes are planned months in advance through a spread sheet. Routes may change dependent o</w:t>
+        <w:t xml:space="preserve"> R</w:t>
       </w:r>
       <w:r>
-        <w:t>n travel conditions, the vehicle may be early, late or not able to show up at all. A borrower can request a specific title, a particular edition or any topic-based book, an alternative can also be provided if the borrower agrees.</w:t>
+        <w:t xml:space="preserve">ural </w:t>
       </w:r>
       <w:r>
-        <w:t xml:space="preserve"> Borrowers also use a mobile app to return items that they have borrowed. The mobile team wants better support for borrower communication, route planning, requested material and service disruption.</w:t>
+        <w:t>L</w:t>
       </w:r>
-    </w:p>
-    <w:p>
-      <w:pPr>
-        <w:pStyle w:val="Heading2"/>
-        <w:numPr>
-          <w:ilvl w:val="1"/>
-          <w:numId w:val="1"/>
-        </w:numPr>
-      </w:pPr>
       <w:r>
-        <w:t>Evidence Extracted from the scenario</w:t>
+        <w:t xml:space="preserve">ibrary </w:t>
       </w:r>
-    </w:p>
-    <w:p>
-      <w:pPr>
-        <w:ind w:left="720"/>
-      </w:pPr>
       <w:r>
-        <w:t xml:space="preserve">  </w:t>
+        <w:t>is a service for small communities and towns that do not have direct access to a permanent library</w:t>
+      </w:r>
+      <w:r>
+        <w:t xml:space="preserve"> it runs on recurring routes enabling remote locations access to library resources</w:t>
+      </w:r>
+      <w:r>
+        <w:t>.</w:t>
+      </w:r>
+      <w:r>
+        <w:t xml:space="preserve"> Information about the routes, requests, loads and disruptions is spread across spreadsheets, printed route sheets, phone calls and social media. The problem is not the lack of any particular technology but the unreliable and inconsistent information between staff and customer. </w:t>
       </w:r>
     </w:p>
     <w:p>
@@ -1175,13 +1180,13 @@
     <w:tbl>
       <w:tblPr>
         <w:tblStyle w:val="PlainTable1"/>
-        <w:tblW w:w="0" w:type="auto"/>
+        <w:tblW w:w="9356" w:type="dxa"/>
+        <w:tblInd w:w="-5" w:type="dxa"/>
         <w:tblLook w:val="04A0" w:firstRow="1" w:lastRow="0" w:firstColumn="1" w:lastColumn="0" w:noHBand="0" w:noVBand="1"/>
       </w:tblPr>
       <w:tblGrid>
-        <w:gridCol w:w="3005"/>
-        <w:gridCol w:w="3005"/>
-        <w:gridCol w:w="3006"/>
+        <w:gridCol w:w="5207"/>
+        <w:gridCol w:w="4149"/>
       </w:tblGrid>
       <w:tr>
         <w:trPr>
@@ -1190,7 +1195,7 @@
         <w:tc>
           <w:tcPr>
             <w:cnfStyle w:val="001000000000" w:firstRow="0" w:lastRow="0" w:firstColumn="1" w:lastColumn="0" w:oddVBand="0" w:evenVBand="0" w:oddHBand="0" w:evenHBand="0" w:firstRowFirstColumn="0" w:firstRowLastColumn="0" w:lastRowFirstColumn="0" w:lastRowLastColumn="0"/>
-            <w:tcW w:w="3005" w:type="dxa"/>
+            <w:tcW w:w="5207" w:type="dxa"/>
           </w:tcPr>
           <w:p>
             <w:pPr>
@@ -1198,13 +1203,13 @@
               <w:ind w:left="0"/>
             </w:pPr>
             <w:r>
-              <w:t>Ref</w:t>
-            </w:r>
-          </w:p>
-        </w:tc>
-        <w:tc>
-          <w:tcPr>
-            <w:tcW w:w="3005" w:type="dxa"/>
+              <w:t>Evidence from the scenario</w:t>
+            </w:r>
+          </w:p>
+        </w:tc>
+        <w:tc>
+          <w:tcPr>
+            <w:tcW w:w="4149" w:type="dxa"/>
           </w:tcPr>
           <w:p>
             <w:pPr>
@@ -1213,21 +1218,6 @@
               <w:cnfStyle w:val="100000000000" w:firstRow="1" w:lastRow="0" w:firstColumn="0" w:lastColumn="0" w:oddVBand="0" w:evenVBand="0" w:oddHBand="0" w:evenHBand="0" w:firstRowFirstColumn="0" w:firstRowLastColumn="0" w:lastRowFirstColumn="0" w:lastRowLastColumn="0"/>
             </w:pPr>
             <w:r>
-              <w:t>Evidence from the scenario</w:t>
-            </w:r>
-          </w:p>
-        </w:tc>
-        <w:tc>
-          <w:tcPr>
-            <w:tcW w:w="3006" w:type="dxa"/>
-          </w:tcPr>
-          <w:p>
-            <w:pPr>
-              <w:pStyle w:val="ListParagraph"/>
-              <w:ind w:left="0"/>
-              <w:cnfStyle w:val="100000000000" w:firstRow="1" w:lastRow="0" w:firstColumn="0" w:lastColumn="0" w:oddVBand="0" w:evenVBand="0" w:oddHBand="0" w:evenHBand="0" w:firstRowFirstColumn="0" w:firstRowLastColumn="0" w:lastRowFirstColumn="0" w:lastRowLastColumn="0"/>
-            </w:pPr>
-            <w:r>
               <w:t>What the evidence tells us</w:t>
             </w:r>
           </w:p>
@@ -1240,21 +1230,29 @@
         <w:tc>
           <w:tcPr>
             <w:cnfStyle w:val="001000000000" w:firstRow="0" w:lastRow="0" w:firstColumn="1" w:lastColumn="0" w:oddVBand="0" w:evenVBand="0" w:oddHBand="0" w:evenHBand="0" w:firstRowFirstColumn="0" w:firstRowLastColumn="0" w:lastRowFirstColumn="0" w:lastRowLastColumn="0"/>
-            <w:tcW w:w="3005" w:type="dxa"/>
+            <w:tcW w:w="5207" w:type="dxa"/>
           </w:tcPr>
           <w:p>
             <w:pPr>
               <w:pStyle w:val="ListParagraph"/>
               <w:ind w:left="0"/>
+              <w:rPr>
+                <w:b w:val="0"/>
+                <w:bCs w:val="0"/>
+              </w:rPr>
             </w:pPr>
             <w:r>
-              <w:t>E01</w:t>
-            </w:r>
-          </w:p>
-        </w:tc>
-        <w:tc>
-          <w:tcPr>
-            <w:tcW w:w="3005" w:type="dxa"/>
+              <w:rPr>
+                <w:b w:val="0"/>
+                <w:bCs w:val="0"/>
+              </w:rPr>
+              <w:t>Routes are planned several months in advance through a spread sheet. A route contains an ordered set of stops, but the sequence may change because of road works, school closures etc.</w:t>
+            </w:r>
+          </w:p>
+        </w:tc>
+        <w:tc>
+          <w:tcPr>
+            <w:tcW w:w="4149" w:type="dxa"/>
           </w:tcPr>
           <w:p>
             <w:pPr>
@@ -1263,13 +1261,81 @@
               <w:cnfStyle w:val="000000100000" w:firstRow="0" w:lastRow="0" w:firstColumn="0" w:lastColumn="0" w:oddVBand="0" w:evenVBand="0" w:oddHBand="1" w:evenHBand="0" w:firstRowFirstColumn="0" w:firstRowLastColumn="0" w:lastRowFirstColumn="0" w:lastRowLastColumn="0"/>
             </w:pPr>
             <w:r>
-              <w:t>Routes are planned weekly through a spread sheet, but the driver prints the spread sheet the day of delivery</w:t>
-            </w:r>
-          </w:p>
-        </w:tc>
-        <w:tc>
-          <w:tcPr>
-            <w:tcW w:w="3006" w:type="dxa"/>
+              <w:t>The planned route and the route actually taken may differ and there is no reliable record of the change in route.</w:t>
+            </w:r>
+          </w:p>
+        </w:tc>
+      </w:tr>
+      <w:tr>
+        <w:tc>
+          <w:tcPr>
+            <w:cnfStyle w:val="001000000000" w:firstRow="0" w:lastRow="0" w:firstColumn="1" w:lastColumn="0" w:oddVBand="0" w:evenVBand="0" w:oddHBand="0" w:evenHBand="0" w:firstRowFirstColumn="0" w:firstRowLastColumn="0" w:lastRowFirstColumn="0" w:lastRowLastColumn="0"/>
+            <w:tcW w:w="5207" w:type="dxa"/>
+          </w:tcPr>
+          <w:p>
+            <w:pPr>
+              <w:pStyle w:val="ListParagraph"/>
+              <w:ind w:left="0"/>
+              <w:rPr>
+                <w:b w:val="0"/>
+                <w:bCs w:val="0"/>
+              </w:rPr>
+            </w:pPr>
+            <w:r>
+              <w:rPr>
+                <w:b w:val="0"/>
+                <w:bCs w:val="0"/>
+              </w:rPr>
+              <w:t>Stops run weekly, fortnightly or monthly. A stop may be suspended without being removed from the scheduled route.</w:t>
+            </w:r>
+          </w:p>
+        </w:tc>
+        <w:tc>
+          <w:tcPr>
+            <w:tcW w:w="4149" w:type="dxa"/>
+          </w:tcPr>
+          <w:p>
+            <w:pPr>
+              <w:pStyle w:val="ListParagraph"/>
+              <w:ind w:left="0"/>
+              <w:cnfStyle w:val="000000000000" w:firstRow="0" w:lastRow="0" w:firstColumn="0" w:lastColumn="0" w:oddVBand="0" w:evenVBand="0" w:oddHBand="0" w:evenHBand="0" w:firstRowFirstColumn="0" w:firstRowLastColumn="0" w:lastRowFirstColumn="0" w:lastRowLastColumn="0"/>
+            </w:pPr>
+            <w:r>
+              <w:t>The stop frequency and status are separate from the scheduled route.</w:t>
+            </w:r>
+          </w:p>
+        </w:tc>
+      </w:tr>
+      <w:tr>
+        <w:trPr>
+          <w:cnfStyle w:val="000000100000" w:firstRow="0" w:lastRow="0" w:firstColumn="0" w:lastColumn="0" w:oddVBand="0" w:evenVBand="0" w:oddHBand="1" w:evenHBand="0" w:firstRowFirstColumn="0" w:firstRowLastColumn="0" w:lastRowFirstColumn="0" w:lastRowLastColumn="0"/>
+        </w:trPr>
+        <w:tc>
+          <w:tcPr>
+            <w:cnfStyle w:val="001000000000" w:firstRow="0" w:lastRow="0" w:firstColumn="1" w:lastColumn="0" w:oddVBand="0" w:evenVBand="0" w:oddHBand="0" w:evenHBand="0" w:firstRowFirstColumn="0" w:firstRowLastColumn="0" w:lastRowFirstColumn="0" w:lastRowLastColumn="0"/>
+            <w:tcW w:w="5207" w:type="dxa"/>
+          </w:tcPr>
+          <w:p>
+            <w:pPr>
+              <w:pStyle w:val="ListParagraph"/>
+              <w:ind w:left="0"/>
+              <w:rPr>
+                <w:b w:val="0"/>
+                <w:bCs w:val="0"/>
+              </w:rPr>
+            </w:pPr>
+            <w:r>
+              <w:rPr>
+                <w:b w:val="0"/>
+                <w:bCs w:val="0"/>
+              </w:rPr>
+              <w:t>Most requests are taken at a branch, by phone or at a stop. Some requests go through the library system, and others go through the printed route sheet.</w:t>
+            </w:r>
+          </w:p>
+        </w:tc>
+        <w:tc>
+          <w:tcPr>
+            <w:tcW w:w="4149" w:type="dxa"/>
           </w:tcPr>
           <w:p>
             <w:pPr>
@@ -1278,15 +1344,7 @@
               <w:cnfStyle w:val="000000100000" w:firstRow="0" w:lastRow="0" w:firstColumn="0" w:lastColumn="0" w:oddVBand="0" w:evenVBand="0" w:oddHBand="1" w:evenHBand="0" w:firstRowFirstColumn="0" w:firstRowLastColumn="0" w:lastRowFirstColumn="0" w:lastRowLastColumn="0"/>
             </w:pPr>
             <w:r>
-              <w:t xml:space="preserve">The planned route may change due to the weather conditions and other contributing factors which means the rout actually driven could differ </w:t>
-            </w:r>
-            <w:proofErr w:type="spellStart"/>
-            <w:r>
-              <w:t>form</w:t>
-            </w:r>
-            <w:proofErr w:type="spellEnd"/>
-            <w:r>
-              <w:t xml:space="preserve"> the original planned route.</w:t>
+              <w:t>There is no central entry point and this can cause confusion between which order goes where.</w:t>
             </w:r>
           </w:p>
         </w:tc>
@@ -1295,7 +1353,7 @@
         <w:tc>
           <w:tcPr>
             <w:cnfStyle w:val="001000000000" w:firstRow="0" w:lastRow="0" w:firstColumn="1" w:lastColumn="0" w:oddVBand="0" w:evenVBand="0" w:oddHBand="0" w:evenHBand="0" w:firstRowFirstColumn="0" w:firstRowLastColumn="0" w:lastRowFirstColumn="0" w:lastRowLastColumn="0"/>
-            <w:tcW w:w="3005" w:type="dxa"/>
+            <w:tcW w:w="5207" w:type="dxa"/>
           </w:tcPr>
           <w:p>
             <w:pPr>
@@ -1303,13 +1361,17 @@
               <w:ind w:left="0"/>
             </w:pPr>
             <w:r>
-              <w:t>E02</w:t>
-            </w:r>
-          </w:p>
-        </w:tc>
-        <w:tc>
-          <w:tcPr>
-            <w:tcW w:w="3005" w:type="dxa"/>
+              <w:rPr>
+                <w:b w:val="0"/>
+                <w:bCs w:val="0"/>
+              </w:rPr>
+              <w:t>Similar place names and handwritten notes have led to material being loaded onto the wrong vehicle.</w:t>
+            </w:r>
+          </w:p>
+        </w:tc>
+        <w:tc>
+          <w:tcPr>
+            <w:tcW w:w="4149" w:type="dxa"/>
           </w:tcPr>
           <w:p>
             <w:pPr>
@@ -1318,16 +1380,87 @@
               <w:cnfStyle w:val="000000000000" w:firstRow="0" w:lastRow="0" w:firstColumn="0" w:lastColumn="0" w:oddVBand="0" w:evenVBand="0" w:oddHBand="0" w:evenHBand="0" w:firstRowFirstColumn="0" w:firstRowLastColumn="0" w:lastRowFirstColumn="0" w:lastRowLastColumn="0"/>
             </w:pPr>
             <w:r>
-              <w:t>A stop may be temporarily suspended without removing it from the normal sp</w:t>
-            </w:r>
-            <w:r>
-              <w:t>readsheet</w:t>
-            </w:r>
-          </w:p>
-        </w:tc>
-        <w:tc>
-          <w:tcPr>
-            <w:tcW w:w="3006" w:type="dxa"/>
+              <w:t>Assigning items to a route relies on informal notes, so loading errors occu</w:t>
+            </w:r>
+            <w:r>
+              <w:t>r</w:t>
+            </w:r>
+            <w:r>
+              <w:t>.</w:t>
+            </w:r>
+          </w:p>
+        </w:tc>
+      </w:tr>
+      <w:tr>
+        <w:trPr>
+          <w:cnfStyle w:val="000000100000" w:firstRow="0" w:lastRow="0" w:firstColumn="0" w:lastColumn="0" w:oddVBand="0" w:evenVBand="0" w:oddHBand="1" w:evenHBand="0" w:firstRowFirstColumn="0" w:firstRowLastColumn="0" w:lastRowFirstColumn="0" w:lastRowLastColumn="0"/>
+        </w:trPr>
+        <w:tc>
+          <w:tcPr>
+            <w:cnfStyle w:val="001000000000" w:firstRow="0" w:lastRow="0" w:firstColumn="1" w:lastColumn="0" w:oddVBand="0" w:evenVBand="0" w:oddHBand="0" w:evenHBand="0" w:firstRowFirstColumn="0" w:firstRowLastColumn="0" w:lastRowFirstColumn="0" w:lastRowLastColumn="0"/>
+            <w:tcW w:w="5207" w:type="dxa"/>
+          </w:tcPr>
+          <w:p>
+            <w:pPr>
+              <w:pStyle w:val="ListParagraph"/>
+              <w:ind w:left="0"/>
+              <w:rPr>
+                <w:b w:val="0"/>
+                <w:bCs w:val="0"/>
+              </w:rPr>
+            </w:pPr>
+            <w:r>
+              <w:rPr>
+                <w:b w:val="0"/>
+                <w:bCs w:val="0"/>
+              </w:rPr>
+              <w:t>Offline loans are written on a sheet and entered later</w:t>
+            </w:r>
+          </w:p>
+        </w:tc>
+        <w:tc>
+          <w:tcPr>
+            <w:tcW w:w="4149" w:type="dxa"/>
+          </w:tcPr>
+          <w:p>
+            <w:pPr>
+              <w:pStyle w:val="ListParagraph"/>
+              <w:ind w:left="0"/>
+              <w:cnfStyle w:val="000000100000" w:firstRow="0" w:lastRow="0" w:firstColumn="0" w:lastColumn="0" w:oddVBand="0" w:evenVBand="0" w:oddHBand="1" w:evenHBand="0" w:firstRowFirstColumn="0" w:firstRowLastColumn="0" w:lastRowFirstColumn="0" w:lastRowLastColumn="0"/>
+            </w:pPr>
+            <w:r>
+              <w:t>This can cause duplications of loans or missing loans</w:t>
+            </w:r>
+          </w:p>
+        </w:tc>
+      </w:tr>
+      <w:tr>
+        <w:tc>
+          <w:tcPr>
+            <w:cnfStyle w:val="001000000000" w:firstRow="0" w:lastRow="0" w:firstColumn="1" w:lastColumn="0" w:oddVBand="0" w:evenVBand="0" w:oddHBand="0" w:evenHBand="0" w:firstRowFirstColumn="0" w:firstRowLastColumn="0" w:lastRowFirstColumn="0" w:lastRowLastColumn="0"/>
+            <w:tcW w:w="5207" w:type="dxa"/>
+          </w:tcPr>
+          <w:p>
+            <w:pPr>
+              <w:pStyle w:val="ListParagraph"/>
+              <w:ind w:left="0"/>
+              <w:rPr>
+                <w:b w:val="0"/>
+                <w:bCs w:val="0"/>
+              </w:rPr>
+            </w:pPr>
+            <w:r>
+              <w:rPr>
+                <w:b w:val="0"/>
+                <w:bCs w:val="0"/>
+              </w:rPr>
+              <w:t>Changes are shared by phone, email, notice boards, messages and social media</w:t>
+            </w:r>
+          </w:p>
+        </w:tc>
+        <w:tc>
+          <w:tcPr>
+            <w:tcW w:w="4149" w:type="dxa"/>
           </w:tcPr>
           <w:p>
             <w:pPr>
@@ -1336,7 +1469,7 @@
               <w:cnfStyle w:val="000000000000" w:firstRow="0" w:lastRow="0" w:firstColumn="0" w:lastColumn="0" w:oddVBand="0" w:evenVBand="0" w:oddHBand="0" w:evenHBand="0" w:firstRowFirstColumn="0" w:firstRowLastColumn="0" w:lastRowFirstColumn="0" w:lastRowLastColumn="0"/>
             </w:pPr>
             <w:r>
-              <w:t>This can result in unfulfilled deliverers and unhappy customers.</w:t>
+              <w:t>There is no single source of status for the borrowers and staff</w:t>
             </w:r>
           </w:p>
         </w:tc>
@@ -1348,21 +1481,29 @@
         <w:tc>
           <w:tcPr>
             <w:cnfStyle w:val="001000000000" w:firstRow="0" w:lastRow="0" w:firstColumn="1" w:lastColumn="0" w:oddVBand="0" w:evenVBand="0" w:oddHBand="0" w:evenHBand="0" w:firstRowFirstColumn="0" w:firstRowLastColumn="0" w:lastRowFirstColumn="0" w:lastRowLastColumn="0"/>
-            <w:tcW w:w="3005" w:type="dxa"/>
+            <w:tcW w:w="5207" w:type="dxa"/>
           </w:tcPr>
           <w:p>
             <w:pPr>
               <w:pStyle w:val="ListParagraph"/>
               <w:ind w:left="0"/>
+              <w:rPr>
+                <w:b w:val="0"/>
+                <w:bCs w:val="0"/>
+              </w:rPr>
             </w:pPr>
             <w:r>
-              <w:t>E03</w:t>
-            </w:r>
-          </w:p>
-        </w:tc>
-        <w:tc>
-          <w:tcPr>
-            <w:tcW w:w="3005" w:type="dxa"/>
+              <w:rPr>
+                <w:b w:val="0"/>
+                <w:bCs w:val="0"/>
+              </w:rPr>
+              <w:t>The final status of a disrupted visit may not be recorded till the vehicle is returned to the depot</w:t>
+            </w:r>
+          </w:p>
+        </w:tc>
+        <w:tc>
+          <w:tcPr>
+            <w:tcW w:w="4149" w:type="dxa"/>
           </w:tcPr>
           <w:p>
             <w:pPr>
@@ -1371,45 +1512,38 @@
               <w:cnfStyle w:val="000000100000" w:firstRow="0" w:lastRow="0" w:firstColumn="0" w:lastColumn="0" w:oddVBand="0" w:evenVBand="0" w:oddHBand="1" w:evenHBand="0" w:firstRowFirstColumn="0" w:firstRowLastColumn="0" w:lastRowFirstColumn="0" w:lastRowLastColumn="0"/>
             </w:pPr>
             <w:r>
-              <w:t>A borrower may accept the alternative, keep the original request active or cancel the request.</w:t>
-            </w:r>
-          </w:p>
-        </w:tc>
-        <w:tc>
-          <w:tcPr>
-            <w:tcW w:w="3006" w:type="dxa"/>
+              <w:t xml:space="preserve">Delayed or cancelled visits may not be counted for. </w:t>
+            </w:r>
+          </w:p>
+        </w:tc>
+      </w:tr>
+      <w:tr>
+        <w:tc>
+          <w:tcPr>
+            <w:cnfStyle w:val="001000000000" w:firstRow="0" w:lastRow="0" w:firstColumn="1" w:lastColumn="0" w:oddVBand="0" w:evenVBand="0" w:oddHBand="0" w:evenHBand="0" w:firstRowFirstColumn="0" w:firstRowLastColumn="0" w:lastRowFirstColumn="0" w:lastRowLastColumn="0"/>
+            <w:tcW w:w="5207" w:type="dxa"/>
           </w:tcPr>
           <w:p>
             <w:pPr>
               <w:pStyle w:val="ListParagraph"/>
               <w:ind w:left="0"/>
-              <w:cnfStyle w:val="000000100000" w:firstRow="0" w:lastRow="0" w:firstColumn="0" w:lastColumn="0" w:oddVBand="0" w:evenVBand="0" w:oddHBand="1" w:evenHBand="0" w:firstRowFirstColumn="0" w:firstRowLastColumn="0" w:lastRowFirstColumn="0" w:lastRowLastColumn="0"/>
+              <w:rPr>
+                <w:b w:val="0"/>
+                <w:bCs w:val="0"/>
+              </w:rPr>
             </w:pPr>
             <w:r>
-              <w:t>Borrowers don’t receive updates on what the status of their order is</w:t>
-            </w:r>
-          </w:p>
-        </w:tc>
-      </w:tr>
-      <w:tr>
-        <w:tc>
-          <w:tcPr>
-            <w:cnfStyle w:val="001000000000" w:firstRow="0" w:lastRow="0" w:firstColumn="1" w:lastColumn="0" w:oddVBand="0" w:evenVBand="0" w:oddHBand="0" w:evenHBand="0" w:firstRowFirstColumn="0" w:firstRowLastColumn="0" w:lastRowFirstColumn="0" w:lastRowLastColumn="0"/>
-            <w:tcW w:w="3005" w:type="dxa"/>
-          </w:tcPr>
-          <w:p>
-            <w:pPr>
-              <w:pStyle w:val="ListParagraph"/>
-              <w:ind w:left="0"/>
-            </w:pPr>
-            <w:r>
-              <w:t>E04</w:t>
-            </w:r>
-          </w:p>
-        </w:tc>
-        <w:tc>
-          <w:tcPr>
-            <w:tcW w:w="3005" w:type="dxa"/>
+              <w:rPr>
+                <w:b w:val="0"/>
+                <w:bCs w:val="0"/>
+              </w:rPr>
+              <w:t>No single retention period applies to uncontrolled items.</w:t>
+            </w:r>
+          </w:p>
+        </w:tc>
+        <w:tc>
+          <w:tcPr>
+            <w:tcW w:w="4149" w:type="dxa"/>
           </w:tcPr>
           <w:p>
             <w:pPr>
@@ -1418,27 +1552,22 @@
               <w:cnfStyle w:val="000000000000" w:firstRow="0" w:lastRow="0" w:firstColumn="0" w:lastColumn="0" w:oddVBand="0" w:evenVBand="0" w:oddHBand="0" w:evenHBand="0" w:firstRowFirstColumn="0" w:firstRowLastColumn="0" w:lastRowFirstColumn="0" w:lastRowLastColumn="0"/>
             </w:pPr>
             <w:r>
-              <w:t>Items intended for a mobile stop must be selected, assigned to the correct route and loaded before departure.</w:t>
-            </w:r>
-          </w:p>
-        </w:tc>
-        <w:tc>
-          <w:tcPr>
-            <w:tcW w:w="3006" w:type="dxa"/>
-          </w:tcPr>
-          <w:p>
-            <w:pPr>
-              <w:pStyle w:val="ListParagraph"/>
-              <w:ind w:left="0"/>
-              <w:cnfStyle w:val="000000000000" w:firstRow="0" w:lastRow="0" w:firstColumn="0" w:lastColumn="0" w:oddVBand="0" w:evenVBand="0" w:oddHBand="0" w:evenHBand="0" w:firstRowFirstColumn="0" w:firstRowLastColumn="0" w:lastRowFirstColumn="0" w:lastRowLastColumn="0"/>
-            </w:pPr>
-            <w:r>
-              <w:t>This mean the borrower has a certain time frame to order but is not provided a deadline as they have no idea when the vehicle will depart for the scheduled route.</w:t>
+              <w:t>Retention is depended on demand, next planned visit and available space within the vehicle.</w:t>
             </w:r>
           </w:p>
         </w:tc>
       </w:tr>
     </w:tbl>
+    <w:p>
+      <w:pPr>
+        <w:pStyle w:val="ListParagraph"/>
+      </w:pPr>
+    </w:p>
+    <w:p>
+      <w:pPr>
+        <w:pStyle w:val="ListParagraph"/>
+      </w:pPr>
+    </w:p>
     <w:p>
       <w:pPr>
         <w:pStyle w:val="ListParagraph"/>
@@ -1457,6 +1586,604 @@
         <w:t>Symptoms, Problems and Consequences</w:t>
       </w:r>
     </w:p>
+    <w:tbl>
+      <w:tblPr>
+        <w:tblStyle w:val="PlainTable1"/>
+        <w:tblW w:w="0" w:type="auto"/>
+        <w:tblLook w:val="04A0" w:firstRow="1" w:lastRow="0" w:firstColumn="1" w:lastColumn="0" w:noHBand="0" w:noVBand="1"/>
+      </w:tblPr>
+      <w:tblGrid>
+        <w:gridCol w:w="2254"/>
+        <w:gridCol w:w="2254"/>
+        <w:gridCol w:w="2254"/>
+        <w:gridCol w:w="2254"/>
+      </w:tblGrid>
+      <w:tr>
+        <w:trPr>
+          <w:cnfStyle w:val="100000000000" w:firstRow="1" w:lastRow="0" w:firstColumn="0" w:lastColumn="0" w:oddVBand="0" w:evenVBand="0" w:oddHBand="0" w:evenHBand="0" w:firstRowFirstColumn="0" w:firstRowLastColumn="0" w:lastRowFirstColumn="0" w:lastRowLastColumn="0"/>
+        </w:trPr>
+        <w:tc>
+          <w:tcPr>
+            <w:cnfStyle w:val="001000000000" w:firstRow="0" w:lastRow="0" w:firstColumn="1" w:lastColumn="0" w:oddVBand="0" w:evenVBand="0" w:oddHBand="0" w:evenHBand="0" w:firstRowFirstColumn="0" w:firstRowLastColumn="0" w:lastRowFirstColumn="0" w:lastRowLastColumn="0"/>
+            <w:tcW w:w="2254" w:type="dxa"/>
+          </w:tcPr>
+          <w:p>
+            <w:r>
+              <w:t xml:space="preserve">ID </w:t>
+            </w:r>
+          </w:p>
+        </w:tc>
+        <w:tc>
+          <w:tcPr>
+            <w:tcW w:w="2254" w:type="dxa"/>
+          </w:tcPr>
+          <w:p>
+            <w:pPr>
+              <w:cnfStyle w:val="100000000000" w:firstRow="1" w:lastRow="0" w:firstColumn="0" w:lastColumn="0" w:oddVBand="0" w:evenVBand="0" w:oddHBand="0" w:evenHBand="0" w:firstRowFirstColumn="0" w:firstRowLastColumn="0" w:lastRowFirstColumn="0" w:lastRowLastColumn="0"/>
+            </w:pPr>
+            <w:r>
+              <w:t>Observation or symptom</w:t>
+            </w:r>
+          </w:p>
+        </w:tc>
+        <w:tc>
+          <w:tcPr>
+            <w:tcW w:w="2254" w:type="dxa"/>
+          </w:tcPr>
+          <w:p>
+            <w:pPr>
+              <w:cnfStyle w:val="100000000000" w:firstRow="1" w:lastRow="0" w:firstColumn="0" w:lastColumn="0" w:oddVBand="0" w:evenVBand="0" w:oddHBand="0" w:evenHBand="0" w:firstRowFirstColumn="0" w:firstRowLastColumn="0" w:lastRowFirstColumn="0" w:lastRowLastColumn="0"/>
+            </w:pPr>
+            <w:r>
+              <w:t>Underlying problem</w:t>
+            </w:r>
+          </w:p>
+        </w:tc>
+        <w:tc>
+          <w:tcPr>
+            <w:tcW w:w="2254" w:type="dxa"/>
+          </w:tcPr>
+          <w:p>
+            <w:pPr>
+              <w:cnfStyle w:val="100000000000" w:firstRow="1" w:lastRow="0" w:firstColumn="0" w:lastColumn="0" w:oddVBand="0" w:evenVBand="0" w:oddHBand="0" w:evenHBand="0" w:firstRowFirstColumn="0" w:firstRowLastColumn="0" w:lastRowFirstColumn="0" w:lastRowLastColumn="0"/>
+            </w:pPr>
+            <w:r>
+              <w:t>Likely consequence</w:t>
+            </w:r>
+          </w:p>
+        </w:tc>
+      </w:tr>
+      <w:tr>
+        <w:trPr>
+          <w:cnfStyle w:val="000000100000" w:firstRow="0" w:lastRow="0" w:firstColumn="0" w:lastColumn="0" w:oddVBand="0" w:evenVBand="0" w:oddHBand="1" w:evenHBand="0" w:firstRowFirstColumn="0" w:firstRowLastColumn="0" w:lastRowFirstColumn="0" w:lastRowLastColumn="0"/>
+        </w:trPr>
+        <w:tc>
+          <w:tcPr>
+            <w:cnfStyle w:val="001000000000" w:firstRow="0" w:lastRow="0" w:firstColumn="1" w:lastColumn="0" w:oddVBand="0" w:evenVBand="0" w:oddHBand="0" w:evenHBand="0" w:firstRowFirstColumn="0" w:firstRowLastColumn="0" w:lastRowFirstColumn="0" w:lastRowLastColumn="0"/>
+            <w:tcW w:w="2254" w:type="dxa"/>
+          </w:tcPr>
+          <w:p>
+            <w:r>
+              <w:t>P1</w:t>
+            </w:r>
+          </w:p>
+        </w:tc>
+        <w:tc>
+          <w:tcPr>
+            <w:tcW w:w="2254" w:type="dxa"/>
+          </w:tcPr>
+          <w:p>
+            <w:pPr>
+              <w:cnfStyle w:val="000000100000" w:firstRow="0" w:lastRow="0" w:firstColumn="0" w:lastColumn="0" w:oddVBand="0" w:evenVBand="0" w:oddHBand="1" w:evenHBand="0" w:firstRowFirstColumn="0" w:firstRowLastColumn="0" w:lastRowFirstColumn="0" w:lastRowLastColumn="0"/>
+            </w:pPr>
+            <w:r>
+              <w:t>Material is loaded onto the wrong vehicle.</w:t>
+            </w:r>
+          </w:p>
+        </w:tc>
+        <w:tc>
+          <w:tcPr>
+            <w:tcW w:w="2254" w:type="dxa"/>
+          </w:tcPr>
+          <w:p>
+            <w:pPr>
+              <w:cnfStyle w:val="000000100000" w:firstRow="0" w:lastRow="0" w:firstColumn="0" w:lastColumn="0" w:oddVBand="0" w:evenVBand="0" w:oddHBand="1" w:evenHBand="0" w:firstRowFirstColumn="0" w:firstRowLastColumn="0" w:lastRowFirstColumn="0" w:lastRowLastColumn="0"/>
+            </w:pPr>
+            <w:r>
+              <w:t>Requested items are not reliably assigned to a route visit.</w:t>
+            </w:r>
+          </w:p>
+        </w:tc>
+        <w:tc>
+          <w:tcPr>
+            <w:tcW w:w="2254" w:type="dxa"/>
+          </w:tcPr>
+          <w:p>
+            <w:pPr>
+              <w:cnfStyle w:val="000000100000" w:firstRow="0" w:lastRow="0" w:firstColumn="0" w:lastColumn="0" w:oddVBand="0" w:evenVBand="0" w:oddHBand="1" w:evenHBand="0" w:firstRowFirstColumn="0" w:firstRowLastColumn="0" w:lastRowFirstColumn="0" w:lastRowLastColumn="0"/>
+            </w:pPr>
+            <w:r>
+              <w:t>Borrowers miss items, and the vehicle carries wasted space.</w:t>
+            </w:r>
+          </w:p>
+        </w:tc>
+      </w:tr>
+      <w:tr>
+        <w:tc>
+          <w:tcPr>
+            <w:cnfStyle w:val="001000000000" w:firstRow="0" w:lastRow="0" w:firstColumn="1" w:lastColumn="0" w:oddVBand="0" w:evenVBand="0" w:oddHBand="0" w:evenHBand="0" w:firstRowFirstColumn="0" w:firstRowLastColumn="0" w:lastRowFirstColumn="0" w:lastRowLastColumn="0"/>
+            <w:tcW w:w="2254" w:type="dxa"/>
+          </w:tcPr>
+          <w:p>
+            <w:r>
+              <w:t>P2</w:t>
+            </w:r>
+          </w:p>
+        </w:tc>
+        <w:tc>
+          <w:tcPr>
+            <w:tcW w:w="2254" w:type="dxa"/>
+          </w:tcPr>
+          <w:p>
+            <w:pPr>
+              <w:cnfStyle w:val="000000000000" w:firstRow="0" w:lastRow="0" w:firstColumn="0" w:lastColumn="0" w:oddVBand="0" w:evenVBand="0" w:oddHBand="0" w:evenHBand="0" w:firstRowFirstColumn="0" w:firstRowLastColumn="0" w:lastRowFirstColumn="0" w:lastRowLastColumn="0"/>
+            </w:pPr>
+            <w:r>
+              <w:t>A request is recorded in several places.</w:t>
+            </w:r>
+          </w:p>
+        </w:tc>
+        <w:tc>
+          <w:tcPr>
+            <w:tcW w:w="2254" w:type="dxa"/>
+          </w:tcPr>
+          <w:p>
+            <w:pPr>
+              <w:cnfStyle w:val="000000000000" w:firstRow="0" w:lastRow="0" w:firstColumn="0" w:lastColumn="0" w:oddVBand="0" w:evenVBand="0" w:oddHBand="0" w:evenHBand="0" w:firstRowFirstColumn="0" w:firstRowLastColumn="0" w:lastRowFirstColumn="0" w:lastRowLastColumn="0"/>
+            </w:pPr>
+            <w:r>
+              <w:t>There is no central repository of all requests.</w:t>
+            </w:r>
+          </w:p>
+        </w:tc>
+        <w:tc>
+          <w:tcPr>
+            <w:tcW w:w="2254" w:type="dxa"/>
+          </w:tcPr>
+          <w:p>
+            <w:pPr>
+              <w:cnfStyle w:val="000000000000" w:firstRow="0" w:lastRow="0" w:firstColumn="0" w:lastColumn="0" w:oddVBand="0" w:evenVBand="0" w:oddHBand="0" w:evenHBand="0" w:firstRowFirstColumn="0" w:firstRowLastColumn="0" w:lastRowFirstColumn="0" w:lastRowLastColumn="0"/>
+            </w:pPr>
+            <w:r>
+              <w:t>Duplicate or lost requests and staff will be confused which note is up to date.</w:t>
+            </w:r>
+          </w:p>
+        </w:tc>
+      </w:tr>
+      <w:tr>
+        <w:trPr>
+          <w:cnfStyle w:val="000000100000" w:firstRow="0" w:lastRow="0" w:firstColumn="0" w:lastColumn="0" w:oddVBand="0" w:evenVBand="0" w:oddHBand="1" w:evenHBand="0" w:firstRowFirstColumn="0" w:firstRowLastColumn="0" w:lastRowFirstColumn="0" w:lastRowLastColumn="0"/>
+        </w:trPr>
+        <w:tc>
+          <w:tcPr>
+            <w:cnfStyle w:val="001000000000" w:firstRow="0" w:lastRow="0" w:firstColumn="1" w:lastColumn="0" w:oddVBand="0" w:evenVBand="0" w:oddHBand="0" w:evenHBand="0" w:firstRowFirstColumn="0" w:firstRowLastColumn="0" w:lastRowFirstColumn="0" w:lastRowLastColumn="0"/>
+            <w:tcW w:w="2254" w:type="dxa"/>
+          </w:tcPr>
+          <w:p>
+            <w:r>
+              <w:t>P3</w:t>
+            </w:r>
+          </w:p>
+        </w:tc>
+        <w:tc>
+          <w:tcPr>
+            <w:tcW w:w="2254" w:type="dxa"/>
+          </w:tcPr>
+          <w:p>
+            <w:pPr>
+              <w:cnfStyle w:val="000000100000" w:firstRow="0" w:lastRow="0" w:firstColumn="0" w:lastColumn="0" w:oddVBand="0" w:evenVBand="0" w:oddHBand="1" w:evenHBand="0" w:firstRowFirstColumn="0" w:firstRowLastColumn="0" w:lastRowFirstColumn="0" w:lastRowLastColumn="0"/>
+            </w:pPr>
+            <w:r>
+              <w:t xml:space="preserve">Offline loans show items on shelf. </w:t>
+            </w:r>
+          </w:p>
+        </w:tc>
+        <w:tc>
+          <w:tcPr>
+            <w:tcW w:w="2254" w:type="dxa"/>
+          </w:tcPr>
+          <w:p>
+            <w:pPr>
+              <w:cnfStyle w:val="000000100000" w:firstRow="0" w:lastRow="0" w:firstColumn="0" w:lastColumn="0" w:oddVBand="0" w:evenVBand="0" w:oddHBand="1" w:evenHBand="0" w:firstRowFirstColumn="0" w:firstRowLastColumn="0" w:lastRowFirstColumn="0" w:lastRowLastColumn="0"/>
+            </w:pPr>
+            <w:r>
+              <w:t>Offline transitions could be late and inconsistent.</w:t>
+            </w:r>
+          </w:p>
+        </w:tc>
+        <w:tc>
+          <w:tcPr>
+            <w:tcW w:w="2254" w:type="dxa"/>
+          </w:tcPr>
+          <w:p>
+            <w:pPr>
+              <w:cnfStyle w:val="000000100000" w:firstRow="0" w:lastRow="0" w:firstColumn="0" w:lastColumn="0" w:oddVBand="0" w:evenVBand="0" w:oddHBand="1" w:evenHBand="0" w:firstRowFirstColumn="0" w:firstRowLastColumn="0" w:lastRowFirstColumn="0" w:lastRowLastColumn="0"/>
+            </w:pPr>
+            <w:r>
+              <w:t>Items are promised twice and records become inaccurate.</w:t>
+            </w:r>
+          </w:p>
+        </w:tc>
+      </w:tr>
+      <w:tr>
+        <w:tc>
+          <w:tcPr>
+            <w:cnfStyle w:val="001000000000" w:firstRow="0" w:lastRow="0" w:firstColumn="1" w:lastColumn="0" w:oddVBand="0" w:evenVBand="0" w:oddHBand="0" w:evenHBand="0" w:firstRowFirstColumn="0" w:firstRowLastColumn="0" w:lastRowFirstColumn="0" w:lastRowLastColumn="0"/>
+            <w:tcW w:w="2254" w:type="dxa"/>
+          </w:tcPr>
+          <w:p>
+            <w:r>
+              <w:t>P4</w:t>
+            </w:r>
+          </w:p>
+        </w:tc>
+        <w:tc>
+          <w:tcPr>
+            <w:tcW w:w="2254" w:type="dxa"/>
+          </w:tcPr>
+          <w:p>
+            <w:pPr>
+              <w:cnfStyle w:val="000000000000" w:firstRow="0" w:lastRow="0" w:firstColumn="0" w:lastColumn="0" w:oddVBand="0" w:evenVBand="0" w:oddHBand="0" w:evenHBand="0" w:firstRowFirstColumn="0" w:firstRowLastColumn="0" w:lastRowFirstColumn="0" w:lastRowLastColumn="0"/>
+            </w:pPr>
+            <w:r>
+              <w:t>Borrowers can’t tell the difference between late and not arriving at all</w:t>
+            </w:r>
+            <w:r>
+              <w:t>.</w:t>
+            </w:r>
+            <w:r>
+              <w:t xml:space="preserve"> </w:t>
+            </w:r>
+          </w:p>
+        </w:tc>
+        <w:tc>
+          <w:tcPr>
+            <w:tcW w:w="2254" w:type="dxa"/>
+          </w:tcPr>
+          <w:p>
+            <w:pPr>
+              <w:cnfStyle w:val="000000000000" w:firstRow="0" w:lastRow="0" w:firstColumn="0" w:lastColumn="0" w:oddVBand="0" w:evenVBand="0" w:oddHBand="0" w:evenHBand="0" w:firstRowFirstColumn="0" w:firstRowLastColumn="0" w:lastRowFirstColumn="0" w:lastRowLastColumn="0"/>
+            </w:pPr>
+            <w:r>
+              <w:t>Status of the loan is not recorded or communicated inconsistently</w:t>
+            </w:r>
+            <w:r>
+              <w:t>.</w:t>
+            </w:r>
+            <w:r>
+              <w:t xml:space="preserve"> </w:t>
+            </w:r>
+          </w:p>
+        </w:tc>
+        <w:tc>
+          <w:tcPr>
+            <w:tcW w:w="2254" w:type="dxa"/>
+          </w:tcPr>
+          <w:p>
+            <w:pPr>
+              <w:cnfStyle w:val="000000000000" w:firstRow="0" w:lastRow="0" w:firstColumn="0" w:lastColumn="0" w:oddVBand="0" w:evenVBand="0" w:oddHBand="0" w:evenHBand="0" w:firstRowFirstColumn="0" w:firstRowLastColumn="0" w:lastRowFirstColumn="0" w:lastRowLastColumn="0"/>
+            </w:pPr>
+            <w:r>
+              <w:t>This results in wasted loss of confidence by borrowers.</w:t>
+            </w:r>
+          </w:p>
+        </w:tc>
+      </w:tr>
+      <w:tr>
+        <w:trPr>
+          <w:cnfStyle w:val="000000100000" w:firstRow="0" w:lastRow="0" w:firstColumn="0" w:lastColumn="0" w:oddVBand="0" w:evenVBand="0" w:oddHBand="1" w:evenHBand="0" w:firstRowFirstColumn="0" w:firstRowLastColumn="0" w:lastRowFirstColumn="0" w:lastRowLastColumn="0"/>
+        </w:trPr>
+        <w:tc>
+          <w:tcPr>
+            <w:cnfStyle w:val="001000000000" w:firstRow="0" w:lastRow="0" w:firstColumn="1" w:lastColumn="0" w:oddVBand="0" w:evenVBand="0" w:oddHBand="0" w:evenHBand="0" w:firstRowFirstColumn="0" w:firstRowLastColumn="0" w:lastRowFirstColumn="0" w:lastRowLastColumn="0"/>
+            <w:tcW w:w="2254" w:type="dxa"/>
+          </w:tcPr>
+          <w:p>
+            <w:r>
+              <w:t>P5</w:t>
+            </w:r>
+          </w:p>
+        </w:tc>
+        <w:tc>
+          <w:tcPr>
+            <w:tcW w:w="2254" w:type="dxa"/>
+          </w:tcPr>
+          <w:p>
+            <w:pPr>
+              <w:cnfStyle w:val="000000100000" w:firstRow="0" w:lastRow="0" w:firstColumn="0" w:lastColumn="0" w:oddVBand="0" w:evenVBand="0" w:oddHBand="1" w:evenHBand="0" w:firstRowFirstColumn="0" w:firstRowLastColumn="0" w:lastRowFirstColumn="0" w:lastRowLastColumn="0"/>
+            </w:pPr>
+            <w:r>
+              <w:t xml:space="preserve">The alternative item choice is not specified. </w:t>
+            </w:r>
+          </w:p>
+        </w:tc>
+        <w:tc>
+          <w:tcPr>
+            <w:tcW w:w="2254" w:type="dxa"/>
+          </w:tcPr>
+          <w:p>
+            <w:pPr>
+              <w:cnfStyle w:val="000000100000" w:firstRow="0" w:lastRow="0" w:firstColumn="0" w:lastColumn="0" w:oddVBand="0" w:evenVBand="0" w:oddHBand="1" w:evenHBand="0" w:firstRowFirstColumn="0" w:firstRowLastColumn="0" w:lastRowFirstColumn="0" w:lastRowLastColumn="0"/>
+            </w:pPr>
+            <w:r>
+              <w:t>The borrower’s decision is not recorded.</w:t>
+            </w:r>
+          </w:p>
+        </w:tc>
+        <w:tc>
+          <w:tcPr>
+            <w:tcW w:w="2254" w:type="dxa"/>
+          </w:tcPr>
+          <w:p>
+            <w:pPr>
+              <w:cnfStyle w:val="000000100000" w:firstRow="0" w:lastRow="0" w:firstColumn="0" w:lastColumn="0" w:oddVBand="0" w:evenVBand="0" w:oddHBand="1" w:evenHBand="0" w:firstRowFirstColumn="0" w:firstRowLastColumn="0" w:lastRowFirstColumn="0" w:lastRowLastColumn="0"/>
+            </w:pPr>
+            <w:r>
+              <w:t>Requests could be wrongly canceled if the borrowers do accept or status left open.</w:t>
+            </w:r>
+          </w:p>
+        </w:tc>
+      </w:tr>
+      <w:tr>
+        <w:tc>
+          <w:tcPr>
+            <w:cnfStyle w:val="001000000000" w:firstRow="0" w:lastRow="0" w:firstColumn="1" w:lastColumn="0" w:oddVBand="0" w:evenVBand="0" w:oddHBand="0" w:evenHBand="0" w:firstRowFirstColumn="0" w:firstRowLastColumn="0" w:lastRowFirstColumn="0" w:lastRowLastColumn="0"/>
+            <w:tcW w:w="2254" w:type="dxa"/>
+          </w:tcPr>
+          <w:p>
+            <w:r>
+              <w:t>P6</w:t>
+            </w:r>
+          </w:p>
+        </w:tc>
+        <w:tc>
+          <w:tcPr>
+            <w:tcW w:w="2254" w:type="dxa"/>
+          </w:tcPr>
+          <w:p>
+            <w:pPr>
+              <w:cnfStyle w:val="000000000000" w:firstRow="0" w:lastRow="0" w:firstColumn="0" w:lastColumn="0" w:oddVBand="0" w:evenVBand="0" w:oddHBand="0" w:evenHBand="0" w:firstRowFirstColumn="0" w:firstRowLastColumn="0" w:lastRowFirstColumn="0" w:lastRowLastColumn="0"/>
+            </w:pPr>
+            <w:r>
+              <w:t>The replacement vehicle could be overloaded.</w:t>
+            </w:r>
+          </w:p>
+        </w:tc>
+        <w:tc>
+          <w:tcPr>
+            <w:tcW w:w="2254" w:type="dxa"/>
+          </w:tcPr>
+          <w:p>
+            <w:pPr>
+              <w:cnfStyle w:val="000000000000" w:firstRow="0" w:lastRow="0" w:firstColumn="0" w:lastColumn="0" w:oddVBand="0" w:evenVBand="0" w:oddHBand="0" w:evenHBand="0" w:firstRowFirstColumn="0" w:firstRowLastColumn="0" w:lastRowFirstColumn="0" w:lastRowLastColumn="0"/>
+            </w:pPr>
+            <w:r>
+              <w:t>Vehicle capacity is not considered when planning the trip.</w:t>
+            </w:r>
+          </w:p>
+        </w:tc>
+        <w:tc>
+          <w:tcPr>
+            <w:tcW w:w="2254" w:type="dxa"/>
+          </w:tcPr>
+          <w:p>
+            <w:pPr>
+              <w:cnfStyle w:val="000000000000" w:firstRow="0" w:lastRow="0" w:firstColumn="0" w:lastColumn="0" w:oddVBand="0" w:evenVBand="0" w:oddHBand="0" w:evenHBand="0" w:firstRowFirstColumn="0" w:firstRowLastColumn="0" w:lastRowFirstColumn="0" w:lastRowLastColumn="0"/>
+            </w:pPr>
+            <w:r>
+              <w:t>Material could be left behind and prioritised deliveries could.</w:t>
+            </w:r>
+          </w:p>
+        </w:tc>
+      </w:tr>
+      <w:tr>
+        <w:trPr>
+          <w:cnfStyle w:val="000000100000" w:firstRow="0" w:lastRow="0" w:firstColumn="0" w:lastColumn="0" w:oddVBand="0" w:evenVBand="0" w:oddHBand="1" w:evenHBand="0" w:firstRowFirstColumn="0" w:firstRowLastColumn="0" w:lastRowFirstColumn="0" w:lastRowLastColumn="0"/>
+        </w:trPr>
+        <w:tc>
+          <w:tcPr>
+            <w:cnfStyle w:val="001000000000" w:firstRow="0" w:lastRow="0" w:firstColumn="1" w:lastColumn="0" w:oddVBand="0" w:evenVBand="0" w:oddHBand="0" w:evenHBand="0" w:firstRowFirstColumn="0" w:firstRowLastColumn="0" w:lastRowFirstColumn="0" w:lastRowLastColumn="0"/>
+            <w:tcW w:w="2254" w:type="dxa"/>
+          </w:tcPr>
+          <w:p>
+            <w:r>
+              <w:t>P7</w:t>
+            </w:r>
+          </w:p>
+        </w:tc>
+        <w:tc>
+          <w:tcPr>
+            <w:tcW w:w="2254" w:type="dxa"/>
+          </w:tcPr>
+          <w:p>
+            <w:pPr>
+              <w:cnfStyle w:val="000000100000" w:firstRow="0" w:lastRow="0" w:firstColumn="0" w:lastColumn="0" w:oddVBand="0" w:evenVBand="0" w:oddHBand="1" w:evenHBand="0" w:firstRowFirstColumn="0" w:firstRowLastColumn="0" w:lastRowFirstColumn="0" w:lastRowLastColumn="0"/>
+            </w:pPr>
+            <w:r>
+              <w:t>Collection rules are unclear.</w:t>
+            </w:r>
+          </w:p>
+        </w:tc>
+        <w:tc>
+          <w:tcPr>
+            <w:tcW w:w="2254" w:type="dxa"/>
+          </w:tcPr>
+          <w:p>
+            <w:pPr>
+              <w:cnfStyle w:val="000000100000" w:firstRow="0" w:lastRow="0" w:firstColumn="0" w:lastColumn="0" w:oddVBand="0" w:evenVBand="0" w:oddHBand="1" w:evenHBand="0" w:firstRowFirstColumn="0" w:firstRowLastColumn="0" w:lastRowFirstColumn="0" w:lastRowLastColumn="0"/>
+            </w:pPr>
+            <w:r>
+              <w:t>Collection permission is undefined.</w:t>
+            </w:r>
+          </w:p>
+        </w:tc>
+        <w:tc>
+          <w:tcPr>
+            <w:tcW w:w="2254" w:type="dxa"/>
+          </w:tcPr>
+          <w:p>
+            <w:pPr>
+              <w:cnfStyle w:val="000000100000" w:firstRow="0" w:lastRow="0" w:firstColumn="0" w:lastColumn="0" w:oddVBand="0" w:evenVBand="0" w:oddHBand="1" w:evenHBand="0" w:firstRowFirstColumn="0" w:firstRowLastColumn="0" w:lastRowFirstColumn="0" w:lastRowLastColumn="0"/>
+            </w:pPr>
+            <w:r>
+              <w:t>Material could be released incorrectly which is considered a privacy risk.</w:t>
+            </w:r>
+          </w:p>
+        </w:tc>
+      </w:tr>
+    </w:tbl>
+    <w:p/>
+    <w:p/>
+    <w:p/>
+    <w:p/>
+    <w:p/>
+    <w:p/>
+    <w:p>
+      <w:pPr>
+        <w:pStyle w:val="Heading2"/>
+        <w:numPr>
+          <w:ilvl w:val="1"/>
+          <w:numId w:val="1"/>
+        </w:numPr>
+      </w:pPr>
+      <w:r>
+        <w:lastRenderedPageBreak/>
+        <w:t>Business Problem statement</w:t>
+      </w:r>
+    </w:p>
+    <w:p>
+      <w:pPr>
+        <w:pStyle w:val="ListParagraph"/>
+        <w:ind w:left="840"/>
+      </w:pPr>
+      <w:r>
+        <w:t xml:space="preserve">The mobile library service has no single reliable source of information about what each route to visit should carry, which audience its serving and if </w:t>
+      </w:r>
+      <w:r>
+        <w:t>it is running as planned. Request and loan status information is stored in disconnected areas and is only confirmed if the vehicle returns to the depot.</w:t>
+      </w:r>
+    </w:p>
+    <w:p>
+      <w:pPr>
+        <w:pStyle w:val="ListParagraph"/>
+        <w:ind w:left="840"/>
+      </w:pPr>
+    </w:p>
+    <w:p>
+      <w:pPr>
+        <w:pStyle w:val="ListParagraph"/>
+        <w:ind w:left="840"/>
+      </w:pPr>
+      <w:r>
+        <w:t xml:space="preserve">This affects several groups. Borrowers may miss out on requested items, lose a request they wanted to keep, or travel to a stop the vehicle is unable to reach. Community coordinators and schools cannot provide the wider audience with reliable updates and route changes. </w:t>
+      </w:r>
+    </w:p>
+    <w:p>
+      <w:pPr>
+        <w:pStyle w:val="ListParagraph"/>
+        <w:ind w:left="840"/>
+      </w:pPr>
+    </w:p>
+    <w:p>
+      <w:pPr>
+        <w:pStyle w:val="ListParagraph"/>
+        <w:ind w:left="840"/>
+      </w:pPr>
+      <w:r>
+        <w:t>The consequences are wasted staff effort, material that is loaded incorrectly, items given to the wrong individual, inaccurate item status across the library service system</w:t>
+      </w:r>
+      <w:r>
+        <w:t xml:space="preserve">. </w:t>
+      </w:r>
+    </w:p>
+    <w:p>
+      <w:pPr>
+        <w:pStyle w:val="ListParagraph"/>
+        <w:ind w:left="840"/>
+      </w:pPr>
+    </w:p>
+    <w:p>
+      <w:pPr>
+        <w:pStyle w:val="Heading2"/>
+        <w:numPr>
+          <w:ilvl w:val="1"/>
+          <w:numId w:val="1"/>
+        </w:numPr>
+      </w:pPr>
+      <w:r>
+        <w:t>Desired outcomes</w:t>
+      </w:r>
+    </w:p>
+    <w:p>
+      <w:pPr>
+        <w:pStyle w:val="ListParagraph"/>
+        <w:numPr>
+          <w:ilvl w:val="0"/>
+          <w:numId w:val="2"/>
+        </w:numPr>
+      </w:pPr>
+      <w:r>
+        <w:t>Staff and drivers work from a central view of each route visit and its stops.</w:t>
+      </w:r>
+    </w:p>
+    <w:p>
+      <w:pPr>
+        <w:pStyle w:val="ListParagraph"/>
+        <w:numPr>
+          <w:ilvl w:val="0"/>
+          <w:numId w:val="2"/>
+        </w:numPr>
+      </w:pPr>
+      <w:r>
+        <w:t>Revery request has its own record, including the borrows choice of their alternative item.</w:t>
+      </w:r>
+    </w:p>
+    <w:p>
+      <w:pPr>
+        <w:pStyle w:val="ListParagraph"/>
+        <w:numPr>
+          <w:ilvl w:val="0"/>
+          <w:numId w:val="2"/>
+        </w:numPr>
+      </w:pPr>
+      <w:r>
+        <w:t>Material for a visit is verifiably assigned and loaded onto the correct vehicle.</w:t>
+      </w:r>
+    </w:p>
+    <w:p>
+      <w:pPr>
+        <w:pStyle w:val="ListParagraph"/>
+        <w:numPr>
+          <w:ilvl w:val="0"/>
+          <w:numId w:val="2"/>
+        </w:numPr>
+      </w:pPr>
+      <w:r>
+        <w:t>Borrowers and coordinators are notified if a visit is delayed or cancelled.</w:t>
+      </w:r>
+    </w:p>
+    <w:p>
+      <w:pPr>
+        <w:pStyle w:val="ListParagraph"/>
+        <w:numPr>
+          <w:ilvl w:val="0"/>
+          <w:numId w:val="2"/>
+        </w:numPr>
+      </w:pPr>
+      <w:r>
+        <w:t>Offline transactions are recorded without duplications.</w:t>
+      </w:r>
+    </w:p>
     <w:p>
       <w:pPr>
         <w:pStyle w:val="ListParagraph"/>
@@ -1465,7 +2192,8 @@
     </w:p>
     <w:p/>
     <w:sectPr>
-      <w:footerReference w:type="first" r:id="rId8"/>
+      <w:footerReference w:type="default" r:id="rId8"/>
+      <w:footerReference w:type="first" r:id="rId9"/>
       <w:pgSz w:w="11906" w:h="16838"/>
       <w:pgMar w:top="1440" w:right="1440" w:bottom="1440" w:left="1440" w:header="708" w:footer="708" w:gutter="0"/>
       <w:pgNumType w:start="0"/>
@@ -1523,6 +2251,27 @@
 </w:ftr>
 </file>
 
+<file path=word/footer2.xml><?xml version="1.0" encoding="utf-8"?>
+<w:ftr xmlns:wpc="http://schemas.microsoft.com/office/word/2010/wordprocessingCanvas" xmlns:cx="http://schemas.microsoft.com/office/drawing/2014/chartex" xmlns:cx1="http://schemas.microsoft.com/office/drawing/2015/9/8/chartex" xmlns:cx2="http://schemas.microsoft.com/office/drawing/2015/10/21/chartex" xmlns:cx3="http://schemas.microsoft.com/office/drawing/2016/5/9/chartex" xmlns:cx4="http://schemas.microsoft.com/office/drawing/2016/5/10/chartex" xmlns:cx5="http://schemas.microsoft.com/office/drawing/2016/5/11/chartex" xmlns:cx6="http://schemas.microsoft.com/office/drawing/2016/5/12/chartex" xmlns:cx7="http://schemas.microsoft.com/office/drawing/2016/5/13/chartex" xmlns:cx8="http://schemas.microsoft.com/office/drawing/2016/5/14/chartex" xmlns:mc="http://schemas.openxmlformats.org/markup-compatibility/2006" xmlns:aink="http://schemas.microsoft.com/office/drawing/2016/ink" xmlns:am3d="http://schemas.microsoft.com/office/drawing/2017/model3d" xmlns:o="urn:schemas-microsoft-com:office:office" xmlns:oel="http://schemas.microsoft.com/office/2019/extlst" xmlns:r="http://schemas.openxmlformats.org/officeDocument/2006/relationships" xmlns:m="http://schemas.openxmlformats.org/officeDocument/2006/math" xmlns:v="urn:schemas-microsoft-com:vml" xmlns:wp14="http://schemas.microsoft.com/office/word/2010/wordprocessingDrawing" xmlns:wp="http://schemas.openxmlformats.org/drawingml/2006/wordprocessingDrawing" xmlns:w10="urn:schemas-microsoft-com:office:word" xmlns:w="http://schemas.openxmlformats.org/wordprocessingml/2006/main" xmlns:w14="http://schemas.microsoft.com/office/word/2010/wordml" xmlns:w15="http://schemas.microsoft.com/office/word/2012/wordml" xmlns:w16cex="http://schemas.microsoft.com/office/word/2018/wordml/cex" xmlns:w16cid="http://schemas.microsoft.com/office/word/2016/wordml/cid" xmlns:w16="http://schemas.microsoft.com/office/word/2018/wordml" xmlns:w16du="http://schemas.microsoft.com/office/word/2023/wordml/word16du" xmlns:w16sdtdh="http://schemas.microsoft.com/office/word/2020/wordml/sdtdatahash" xmlns:w16sdtfl="http://schemas.microsoft.com/office/word/2024/wordml/sdtformatlock" xmlns:w16se="http://schemas.microsoft.com/office/word/2015/wordml/symex" xmlns:wpg="http://schemas.microsoft.com/office/word/2010/wordprocessingGroup" xmlns:wpi="http://schemas.microsoft.com/office/word/2010/wordprocessingInk" xmlns:wne="http://schemas.microsoft.com/office/word/2006/wordml" xmlns:wps="http://schemas.microsoft.com/office/word/2010/wordprocessingShape" mc:Ignorable="w14 w15 w16se w16cid w16 w16cex w16sdtdh w16sdtfl w16du wp14">
+  <w:p>
+    <w:pPr>
+      <w:pStyle w:val="Subtitle"/>
+      <w:rPr>
+        <w:sz w:val="24"/>
+        <w:szCs w:val="24"/>
+      </w:rPr>
+    </w:pPr>
+    <w:r>
+      <w:rPr>
+        <w:sz w:val="24"/>
+        <w:szCs w:val="24"/>
+      </w:rPr>
+      <w:t>Eoin Mannix</w:t>
+    </w:r>
+  </w:p>
+</w:ftr>
+</file>
+
 <file path=word/footnotes.xml><?xml version="1.0" encoding="utf-8"?>
 <w:footnotes xmlns:wpc="http://schemas.microsoft.com/office/word/2010/wordprocessingCanvas" xmlns:cx="http://schemas.microsoft.com/office/drawing/2014/chartex" xmlns:cx1="http://schemas.microsoft.com/office/drawing/2015/9/8/chartex" xmlns:cx2="http://schemas.microsoft.com/office/drawing/2015/10/21/chartex" xmlns:cx3="http://schemas.microsoft.com/office/drawing/2016/5/9/chartex" xmlns:cx4="http://schemas.microsoft.com/office/drawing/2016/5/10/chartex" xmlns:cx5="http://schemas.microsoft.com/office/drawing/2016/5/11/chartex" xmlns:cx6="http://schemas.microsoft.com/office/drawing/2016/5/12/chartex" xmlns:cx7="http://schemas.microsoft.com/office/drawing/2016/5/13/chartex" xmlns:cx8="http://schemas.microsoft.com/office/drawing/2016/5/14/chartex" xmlns:mc="http://schemas.openxmlformats.org/markup-compatibility/2006" xmlns:aink="http://schemas.microsoft.com/office/drawing/2016/ink" xmlns:am3d="http://schemas.microsoft.com/office/drawing/2017/model3d" xmlns:o="urn:schemas-microsoft-com:office:office" xmlns:oel="http://schemas.microsoft.com/office/2019/extlst" xmlns:r="http://schemas.openxmlformats.org/officeDocument/2006/relationships" xmlns:m="http://schemas.openxmlformats.org/officeDocument/2006/math" xmlns:v="urn:schemas-microsoft-com:vml" xmlns:wp14="http://schemas.microsoft.com/office/word/2010/wordprocessingDrawing" xmlns:wp="http://schemas.openxmlformats.org/drawingml/2006/wordprocessingDrawing" xmlns:w10="urn:schemas-microsoft-com:office:word" xmlns:w="http://schemas.openxmlformats.org/wordprocessingml/2006/main" xmlns:w14="http://schemas.microsoft.com/office/word/2010/wordml" xmlns:w15="http://schemas.microsoft.com/office/word/2012/wordml" xmlns:w16cex="http://schemas.microsoft.com/office/word/2018/wordml/cex" xmlns:w16cid="http://schemas.microsoft.com/office/word/2016/wordml/cid" xmlns:w16="http://schemas.microsoft.com/office/word/2018/wordml" xmlns:w16du="http://schemas.microsoft.com/office/word/2023/wordml/word16du" xmlns:w16sdtdh="http://schemas.microsoft.com/office/word/2020/wordml/sdtdatahash" xmlns:w16sdtfl="http://schemas.microsoft.com/office/word/2024/wordml/sdtformatlock" xmlns:w16se="http://schemas.microsoft.com/office/word/2015/wordml/symex" xmlns:wpg="http://schemas.microsoft.com/office/word/2010/wordprocessingGroup" xmlns:wpi="http://schemas.microsoft.com/office/word/2010/wordprocessingInk" xmlns:wne="http://schemas.microsoft.com/office/word/2006/wordml" xmlns:wps="http://schemas.microsoft.com/office/word/2010/wordprocessingShape" mc:Ignorable="w14 w15 w16se w16cid w16 w16cex w16sdtdh w16sdtfl w16du wp14">
   <w:footnote w:type="separator" w:id="-1">
@@ -1551,6 +2300,119 @@
 <file path=word/numbering.xml><?xml version="1.0" encoding="utf-8"?>
 <w:numbering xmlns:wpc="http://schemas.microsoft.com/office/word/2010/wordprocessingCanvas" xmlns:cx="http://schemas.microsoft.com/office/drawing/2014/chartex" xmlns:cx1="http://schemas.microsoft.com/office/drawing/2015/9/8/chartex" xmlns:cx2="http://schemas.microsoft.com/office/drawing/2015/10/21/chartex" xmlns:cx3="http://schemas.microsoft.com/office/drawing/2016/5/9/chartex" xmlns:cx4="http://schemas.microsoft.com/office/drawing/2016/5/10/chartex" xmlns:cx5="http://schemas.microsoft.com/office/drawing/2016/5/11/chartex" xmlns:cx6="http://schemas.microsoft.com/office/drawing/2016/5/12/chartex" xmlns:cx7="http://schemas.microsoft.com/office/drawing/2016/5/13/chartex" xmlns:cx8="http://schemas.microsoft.com/office/drawing/2016/5/14/chartex" xmlns:mc="http://schemas.openxmlformats.org/markup-compatibility/2006" xmlns:aink="http://schemas.microsoft.com/office/drawing/2016/ink" xmlns:am3d="http://schemas.microsoft.com/office/drawing/2017/model3d" xmlns:o="urn:schemas-microsoft-com:office:office" xmlns:oel="http://schemas.microsoft.com/office/2019/extlst" xmlns:r="http://schemas.openxmlformats.org/officeDocument/2006/relationships" xmlns:m="http://schemas.openxmlformats.org/officeDocument/2006/math" xmlns:v="urn:schemas-microsoft-com:vml" xmlns:wp14="http://schemas.microsoft.com/office/word/2010/wordprocessingDrawing" xmlns:wp="http://schemas.openxmlformats.org/drawingml/2006/wordprocessingDrawing" xmlns:w10="urn:schemas-microsoft-com:office:word" xmlns:w="http://schemas.openxmlformats.org/wordprocessingml/2006/main" xmlns:w14="http://schemas.microsoft.com/office/word/2010/wordml" xmlns:w15="http://schemas.microsoft.com/office/word/2012/wordml" xmlns:w16cex="http://schemas.microsoft.com/office/word/2018/wordml/cex" xmlns:w16cid="http://schemas.microsoft.com/office/word/2016/wordml/cid" xmlns:w16="http://schemas.microsoft.com/office/word/2018/wordml" xmlns:w16du="http://schemas.microsoft.com/office/word/2023/wordml/word16du" xmlns:w16sdtdh="http://schemas.microsoft.com/office/word/2020/wordml/sdtdatahash" xmlns:w16sdtfl="http://schemas.microsoft.com/office/word/2024/wordml/sdtformatlock" xmlns:w16se="http://schemas.microsoft.com/office/word/2015/wordml/symex" xmlns:wpg="http://schemas.microsoft.com/office/word/2010/wordprocessingGroup" xmlns:wpi="http://schemas.microsoft.com/office/word/2010/wordprocessingInk" xmlns:wne="http://schemas.microsoft.com/office/word/2006/wordml" xmlns:wps="http://schemas.microsoft.com/office/word/2010/wordprocessingShape" mc:Ignorable="w14 w15 w16se w16cid w16 w16cex w16sdtdh w16sdtfl w16du wp14">
   <w:abstractNum w:abstractNumId="0" w15:restartNumberingAfterBreak="0">
+    <w:nsid w:val="051F2428"/>
+    <w:multiLevelType w:val="hybridMultilevel"/>
+    <w:tmpl w:val="8F16E7A8"/>
+    <w:lvl w:ilvl="0" w:tplc="04090001">
+      <w:start w:val="1"/>
+      <w:numFmt w:val="bullet"/>
+      <w:lvlText w:val=""/>
+      <w:lvlJc w:val="left"/>
+      <w:pPr>
+        <w:ind w:left="1560" w:hanging="360"/>
+      </w:pPr>
+      <w:rPr>
+        <w:rFonts w:ascii="Symbol" w:hAnsi="Symbol" w:hint="default"/>
+      </w:rPr>
+    </w:lvl>
+    <w:lvl w:ilvl="1" w:tplc="04090003" w:tentative="1">
+      <w:start w:val="1"/>
+      <w:numFmt w:val="bullet"/>
+      <w:lvlText w:val="o"/>
+      <w:lvlJc w:val="left"/>
+      <w:pPr>
+        <w:ind w:left="2280" w:hanging="360"/>
+      </w:pPr>
+      <w:rPr>
+        <w:rFonts w:ascii="Courier New" w:hAnsi="Courier New" w:cs="Courier New" w:hint="default"/>
+      </w:rPr>
+    </w:lvl>
+    <w:lvl w:ilvl="2" w:tplc="04090005" w:tentative="1">
+      <w:start w:val="1"/>
+      <w:numFmt w:val="bullet"/>
+      <w:lvlText w:val=""/>
+      <w:lvlJc w:val="left"/>
+      <w:pPr>
+        <w:ind w:left="3000" w:hanging="360"/>
+      </w:pPr>
+      <w:rPr>
+        <w:rFonts w:ascii="Wingdings" w:hAnsi="Wingdings" w:hint="default"/>
+      </w:rPr>
+    </w:lvl>
+    <w:lvl w:ilvl="3" w:tplc="04090001" w:tentative="1">
+      <w:start w:val="1"/>
+      <w:numFmt w:val="bullet"/>
+      <w:lvlText w:val=""/>
+      <w:lvlJc w:val="left"/>
+      <w:pPr>
+        <w:ind w:left="3720" w:hanging="360"/>
+      </w:pPr>
+      <w:rPr>
+        <w:rFonts w:ascii="Symbol" w:hAnsi="Symbol" w:hint="default"/>
+      </w:rPr>
+    </w:lvl>
+    <w:lvl w:ilvl="4" w:tplc="04090003" w:tentative="1">
+      <w:start w:val="1"/>
+      <w:numFmt w:val="bullet"/>
+      <w:lvlText w:val="o"/>
+      <w:lvlJc w:val="left"/>
+      <w:pPr>
+        <w:ind w:left="4440" w:hanging="360"/>
+      </w:pPr>
+      <w:rPr>
+        <w:rFonts w:ascii="Courier New" w:hAnsi="Courier New" w:cs="Courier New" w:hint="default"/>
+      </w:rPr>
+    </w:lvl>
+    <w:lvl w:ilvl="5" w:tplc="04090005" w:tentative="1">
+      <w:start w:val="1"/>
+      <w:numFmt w:val="bullet"/>
+      <w:lvlText w:val=""/>
+      <w:lvlJc w:val="left"/>
+      <w:pPr>
+        <w:ind w:left="5160" w:hanging="360"/>
+      </w:pPr>
+      <w:rPr>
+        <w:rFonts w:ascii="Wingdings" w:hAnsi="Wingdings" w:hint="default"/>
+      </w:rPr>
+    </w:lvl>
+    <w:lvl w:ilvl="6" w:tplc="04090001" w:tentative="1">
+      <w:start w:val="1"/>
+      <w:numFmt w:val="bullet"/>
+      <w:lvlText w:val=""/>
+      <w:lvlJc w:val="left"/>
+      <w:pPr>
+        <w:ind w:left="5880" w:hanging="360"/>
+      </w:pPr>
+      <w:rPr>
+        <w:rFonts w:ascii="Symbol" w:hAnsi="Symbol" w:hint="default"/>
+      </w:rPr>
+    </w:lvl>
+    <w:lvl w:ilvl="7" w:tplc="04090003" w:tentative="1">
+      <w:start w:val="1"/>
+      <w:numFmt w:val="bullet"/>
+      <w:lvlText w:val="o"/>
+      <w:lvlJc w:val="left"/>
+      <w:pPr>
+        <w:ind w:left="6600" w:hanging="360"/>
+      </w:pPr>
+      <w:rPr>
+        <w:rFonts w:ascii="Courier New" w:hAnsi="Courier New" w:cs="Courier New" w:hint="default"/>
+      </w:rPr>
+    </w:lvl>
+    <w:lvl w:ilvl="8" w:tplc="04090005" w:tentative="1">
+      <w:start w:val="1"/>
+      <w:numFmt w:val="bullet"/>
+      <w:lvlText w:val=""/>
+      <w:lvlJc w:val="left"/>
+      <w:pPr>
+        <w:ind w:left="7320" w:hanging="360"/>
+      </w:pPr>
+      <w:rPr>
+        <w:rFonts w:ascii="Wingdings" w:hAnsi="Wingdings" w:hint="default"/>
+      </w:rPr>
+    </w:lvl>
+  </w:abstractNum>
+  <w:abstractNum w:abstractNumId="1" w15:restartNumberingAfterBreak="0">
     <w:nsid w:val="115E7132"/>
     <w:multiLevelType w:val="multilevel"/>
     <w:tmpl w:val="CC463596"/>
@@ -1672,6 +2534,9 @@
     </w:lvl>
   </w:abstractNum>
   <w:num w:numId="1" w16cid:durableId="1306160019">
+    <w:abstractNumId w:val="1"/>
+  </w:num>
+  <w:num w:numId="2" w16cid:durableId="843127062">
     <w:abstractNumId w:val="0"/>
   </w:num>
 </w:numbering>
@@ -2995,12 +3860,33 @@
 
 <file path=word/glossary/fontTable.xml><?xml version="1.0" encoding="utf-8"?>
 <w:fonts xmlns:mc="http://schemas.openxmlformats.org/markup-compatibility/2006" xmlns:r="http://schemas.openxmlformats.org/officeDocument/2006/relationships" xmlns:w="http://schemas.openxmlformats.org/wordprocessingml/2006/main" xmlns:w14="http://schemas.microsoft.com/office/word/2010/wordml" xmlns:w15="http://schemas.microsoft.com/office/word/2012/wordml" xmlns:w16cex="http://schemas.microsoft.com/office/word/2018/wordml/cex" xmlns:w16cid="http://schemas.microsoft.com/office/word/2016/wordml/cid" xmlns:w16="http://schemas.microsoft.com/office/word/2018/wordml" xmlns:w16du="http://schemas.microsoft.com/office/word/2023/wordml/word16du" xmlns:w16sdtdh="http://schemas.microsoft.com/office/word/2020/wordml/sdtdatahash" xmlns:w16sdtfl="http://schemas.microsoft.com/office/word/2024/wordml/sdtformatlock" xmlns:w16se="http://schemas.microsoft.com/office/word/2015/wordml/symex" mc:Ignorable="w14 w15 w16se w16cid w16 w16cex w16sdtdh w16sdtfl w16du">
+  <w:font w:name="Symbol">
+    <w:panose1 w:val="05050102010706020507"/>
+    <w:charset w:val="02"/>
+    <w:family w:val="roman"/>
+    <w:pitch w:val="variable"/>
+    <w:sig w:usb0="00000000" w:usb1="10000000" w:usb2="00000000" w:usb3="00000000" w:csb0="80000000" w:csb1="00000000"/>
+  </w:font>
   <w:font w:name="Times New Roman">
     <w:panose1 w:val="02020603050405020304"/>
     <w:charset w:val="00"/>
     <w:family w:val="roman"/>
     <w:pitch w:val="variable"/>
     <w:sig w:usb0="E0002EFF" w:usb1="C000785B" w:usb2="00000009" w:usb3="00000000" w:csb0="000001FF" w:csb1="00000000"/>
+  </w:font>
+  <w:font w:name="Courier New">
+    <w:panose1 w:val="02070309020205020404"/>
+    <w:charset w:val="00"/>
+    <w:family w:val="modern"/>
+    <w:pitch w:val="fixed"/>
+    <w:sig w:usb0="E0002EFF" w:usb1="C0007843" w:usb2="00000009" w:usb3="00000000" w:csb0="000001FF" w:csb1="00000000"/>
+  </w:font>
+  <w:font w:name="Wingdings">
+    <w:panose1 w:val="05000000000000000000"/>
+    <w:charset w:val="02"/>
+    <w:family w:val="auto"/>
+    <w:pitch w:val="variable"/>
+    <w:sig w:usb0="00000000" w:usb1="10000000" w:usb2="00000000" w:usb3="00000000" w:csb0="80000000" w:csb1="00000000"/>
   </w:font>
   <w:font w:name="Aptos">
     <w:charset w:val="00"/>
@@ -3040,9 +3926,12 @@
   </w:compat>
   <w:rsids>
     <w:rsidRoot w:val="00575EB9"/>
+    <w:rsid w:val="001C5C80"/>
     <w:rsid w:val="003432F7"/>
     <w:rsid w:val="003A50E0"/>
+    <w:rsid w:val="004A6801"/>
     <w:rsid w:val="00575EB9"/>
+    <w:rsid w:val="00C547D0"/>
   </w:rsids>
   <m:mathPr>
     <m:mathFont m:val="Cambria Math"/>

</xml_diff>

<commit_message>
A bit more work on the report starting the in and out scope table from lab sheet 3
</commit_message>
<xml_diff>
--- a/report/ca1-report.docx
+++ b/report/ca1-report.docx
@@ -2184,10 +2184,303 @@
         <w:t>Offline transactions are recorded without duplications.</w:t>
       </w:r>
     </w:p>
+    <w:p/>
+    <w:p/>
+    <w:p/>
+    <w:p/>
+    <w:p/>
+    <w:p/>
+    <w:p/>
+    <w:p/>
     <w:p>
       <w:pPr>
-        <w:pStyle w:val="ListParagraph"/>
-        <w:ind w:left="840"/>
+        <w:pStyle w:val="Heading1"/>
+        <w:numPr>
+          <w:ilvl w:val="0"/>
+          <w:numId w:val="1"/>
+        </w:numPr>
+      </w:pPr>
+      <w:r>
+        <w:lastRenderedPageBreak/>
+        <w:t>Purpose, scope and boundary</w:t>
+      </w:r>
+    </w:p>
+    <w:p>
+      <w:pPr>
+        <w:ind w:left="360"/>
+      </w:pPr>
+      <w:r>
+        <w:t>The proposed Mobile library support service will support route and stop scheduling, request</w:t>
+      </w:r>
+      <w:r>
+        <w:t xml:space="preserve"> assignment to route visits, visit preparation and loading checks, recording of service status and disruption, borrower and partner notification and reconciliation of offline transactions, all applied for the two mobile library vehicles. </w:t>
+      </w:r>
+    </w:p>
+    <w:tbl>
+      <w:tblPr>
+        <w:tblStyle w:val="PlainTable1"/>
+        <w:tblW w:w="0" w:type="auto"/>
+        <w:tblLook w:val="04A0" w:firstRow="1" w:lastRow="0" w:firstColumn="1" w:lastColumn="0" w:noHBand="0" w:noVBand="1"/>
+      </w:tblPr>
+      <w:tblGrid>
+        <w:gridCol w:w="4508"/>
+        <w:gridCol w:w="4508"/>
+      </w:tblGrid>
+      <w:tr>
+        <w:trPr>
+          <w:cnfStyle w:val="100000000000" w:firstRow="1" w:lastRow="0" w:firstColumn="0" w:lastColumn="0" w:oddVBand="0" w:evenVBand="0" w:oddHBand="0" w:evenHBand="0" w:firstRowFirstColumn="0" w:firstRowLastColumn="0" w:lastRowFirstColumn="0" w:lastRowLastColumn="0"/>
+        </w:trPr>
+        <w:tc>
+          <w:tcPr>
+            <w:cnfStyle w:val="001000000000" w:firstRow="0" w:lastRow="0" w:firstColumn="1" w:lastColumn="0" w:oddVBand="0" w:evenVBand="0" w:oddHBand="0" w:evenHBand="0" w:firstRowFirstColumn="0" w:firstRowLastColumn="0" w:lastRowFirstColumn="0" w:lastRowLastColumn="0"/>
+            <w:tcW w:w="4508" w:type="dxa"/>
+          </w:tcPr>
+          <w:p>
+            <w:r>
+              <w:t>In scope (initial release)</w:t>
+            </w:r>
+          </w:p>
+        </w:tc>
+        <w:tc>
+          <w:tcPr>
+            <w:tcW w:w="4508" w:type="dxa"/>
+          </w:tcPr>
+          <w:p>
+            <w:pPr>
+              <w:cnfStyle w:val="100000000000" w:firstRow="1" w:lastRow="0" w:firstColumn="0" w:lastColumn="0" w:oddVBand="0" w:evenVBand="0" w:oddHBand="0" w:evenHBand="0" w:firstRowFirstColumn="0" w:firstRowLastColumn="0" w:lastRowFirstColumn="0" w:lastRowLastColumn="0"/>
+            </w:pPr>
+            <w:r>
+              <w:t>Out of scope (initial release)</w:t>
+            </w:r>
+          </w:p>
+        </w:tc>
+      </w:tr>
+      <w:tr>
+        <w:trPr>
+          <w:cnfStyle w:val="000000100000" w:firstRow="0" w:lastRow="0" w:firstColumn="0" w:lastColumn="0" w:oddVBand="0" w:evenVBand="0" w:oddHBand="1" w:evenHBand="0" w:firstRowFirstColumn="0" w:firstRowLastColumn="0" w:lastRowFirstColumn="0" w:lastRowLastColumn="0"/>
+        </w:trPr>
+        <w:tc>
+          <w:tcPr>
+            <w:cnfStyle w:val="001000000000" w:firstRow="0" w:lastRow="0" w:firstColumn="1" w:lastColumn="0" w:oddVBand="0" w:evenVBand="0" w:oddHBand="0" w:evenHBand="0" w:firstRowFirstColumn="0" w:firstRowLastColumn="0" w:lastRowFirstColumn="0" w:lastRowLastColumn="0"/>
+            <w:tcW w:w="4508" w:type="dxa"/>
+          </w:tcPr>
+          <w:p>
+            <w:pPr>
+              <w:rPr>
+                <w:b w:val="0"/>
+                <w:bCs w:val="0"/>
+              </w:rPr>
+            </w:pPr>
+            <w:r>
+              <w:rPr>
+                <w:b w:val="0"/>
+                <w:bCs w:val="0"/>
+              </w:rPr>
+              <w:t>Route and stop planning</w:t>
+            </w:r>
+          </w:p>
+        </w:tc>
+        <w:tc>
+          <w:tcPr>
+            <w:tcW w:w="4508" w:type="dxa"/>
+          </w:tcPr>
+          <w:p>
+            <w:pPr>
+              <w:cnfStyle w:val="000000100000" w:firstRow="0" w:lastRow="0" w:firstColumn="0" w:lastColumn="0" w:oddVBand="0" w:evenVBand="0" w:oddHBand="1" w:evenHBand="0" w:firstRowFirstColumn="0" w:firstRowLastColumn="0" w:lastRowFirstColumn="0" w:lastRowLastColumn="0"/>
+            </w:pPr>
+            <w:r>
+              <w:t>Replacing the main library system</w:t>
+            </w:r>
+          </w:p>
+        </w:tc>
+      </w:tr>
+      <w:tr>
+        <w:tc>
+          <w:tcPr>
+            <w:cnfStyle w:val="001000000000" w:firstRow="0" w:lastRow="0" w:firstColumn="1" w:lastColumn="0" w:oddVBand="0" w:evenVBand="0" w:oddHBand="0" w:evenHBand="0" w:firstRowFirstColumn="0" w:firstRowLastColumn="0" w:lastRowFirstColumn="0" w:lastRowLastColumn="0"/>
+            <w:tcW w:w="4508" w:type="dxa"/>
+          </w:tcPr>
+          <w:p>
+            <w:pPr>
+              <w:rPr>
+                <w:b w:val="0"/>
+                <w:bCs w:val="0"/>
+              </w:rPr>
+            </w:pPr>
+            <w:r>
+              <w:rPr>
+                <w:b w:val="0"/>
+                <w:bCs w:val="0"/>
+              </w:rPr>
+              <w:t>Change or pausing a stop</w:t>
+            </w:r>
+          </w:p>
+        </w:tc>
+        <w:tc>
+          <w:tcPr>
+            <w:tcW w:w="4508" w:type="dxa"/>
+          </w:tcPr>
+          <w:p>
+            <w:pPr>
+              <w:cnfStyle w:val="000000000000" w:firstRow="0" w:lastRow="0" w:firstColumn="0" w:lastColumn="0" w:oddVBand="0" w:evenVBand="0" w:oddHBand="0" w:evenHBand="0" w:firstRowFirstColumn="0" w:firstRowLastColumn="0" w:lastRowFirstColumn="0" w:lastRowLastColumn="0"/>
+            </w:pPr>
+            <w:r>
+              <w:t>Borrower account and the book catalogue</w:t>
+            </w:r>
+          </w:p>
+        </w:tc>
+      </w:tr>
+      <w:tr>
+        <w:trPr>
+          <w:cnfStyle w:val="000000100000" w:firstRow="0" w:lastRow="0" w:firstColumn="0" w:lastColumn="0" w:oddVBand="0" w:evenVBand="0" w:oddHBand="1" w:evenHBand="0" w:firstRowFirstColumn="0" w:firstRowLastColumn="0" w:lastRowFirstColumn="0" w:lastRowLastColumn="0"/>
+        </w:trPr>
+        <w:tc>
+          <w:tcPr>
+            <w:cnfStyle w:val="001000000000" w:firstRow="0" w:lastRow="0" w:firstColumn="1" w:lastColumn="0" w:oddVBand="0" w:evenVBand="0" w:oddHBand="0" w:evenHBand="0" w:firstRowFirstColumn="0" w:firstRowLastColumn="0" w:lastRowFirstColumn="0" w:lastRowLastColumn="0"/>
+            <w:tcW w:w="4508" w:type="dxa"/>
+          </w:tcPr>
+          <w:p>
+            <w:pPr>
+              <w:rPr>
+                <w:b w:val="0"/>
+                <w:bCs w:val="0"/>
+              </w:rPr>
+            </w:pPr>
+            <w:r>
+              <w:rPr>
+                <w:b w:val="0"/>
+                <w:bCs w:val="0"/>
+              </w:rPr>
+              <w:t>Book requests</w:t>
+            </w:r>
+            <w:r>
+              <w:rPr>
+                <w:b w:val="0"/>
+                <w:bCs w:val="0"/>
+              </w:rPr>
+              <w:t xml:space="preserve"> linked to a trip</w:t>
+            </w:r>
+          </w:p>
+        </w:tc>
+        <w:tc>
+          <w:tcPr>
+            <w:tcW w:w="4508" w:type="dxa"/>
+          </w:tcPr>
+          <w:p>
+            <w:pPr>
+              <w:cnfStyle w:val="000000100000" w:firstRow="0" w:lastRow="0" w:firstColumn="0" w:lastColumn="0" w:oddVBand="0" w:evenVBand="0" w:oddHBand="1" w:evenHBand="0" w:firstRowFirstColumn="0" w:firstRowLastColumn="0" w:lastRowFirstColumn="0" w:lastRowLastColumn="0"/>
+            </w:pPr>
+            <w:r>
+              <w:t>Work in the permanent branch libraries</w:t>
+            </w:r>
+          </w:p>
+        </w:tc>
+      </w:tr>
+      <w:tr>
+        <w:tc>
+          <w:tcPr>
+            <w:cnfStyle w:val="001000000000" w:firstRow="0" w:lastRow="0" w:firstColumn="1" w:lastColumn="0" w:oddVBand="0" w:evenVBand="0" w:oddHBand="0" w:evenHBand="0" w:firstRowFirstColumn="0" w:firstRowLastColumn="0" w:lastRowFirstColumn="0" w:lastRowLastColumn="0"/>
+            <w:tcW w:w="4508" w:type="dxa"/>
+          </w:tcPr>
+          <w:p/>
+        </w:tc>
+        <w:tc>
+          <w:tcPr>
+            <w:tcW w:w="4508" w:type="dxa"/>
+          </w:tcPr>
+          <w:p>
+            <w:pPr>
+              <w:cnfStyle w:val="000000000000" w:firstRow="0" w:lastRow="0" w:firstColumn="0" w:lastColumn="0" w:oddVBand="0" w:evenVBand="0" w:oddHBand="0" w:evenHBand="0" w:firstRowFirstColumn="0" w:firstRowLastColumn="0" w:lastRowFirstColumn="0" w:lastRowLastColumn="0"/>
+            </w:pPr>
+          </w:p>
+        </w:tc>
+      </w:tr>
+      <w:tr>
+        <w:trPr>
+          <w:cnfStyle w:val="000000100000" w:firstRow="0" w:lastRow="0" w:firstColumn="0" w:lastColumn="0" w:oddVBand="0" w:evenVBand="0" w:oddHBand="1" w:evenHBand="0" w:firstRowFirstColumn="0" w:firstRowLastColumn="0" w:lastRowFirstColumn="0" w:lastRowLastColumn="0"/>
+        </w:trPr>
+        <w:tc>
+          <w:tcPr>
+            <w:cnfStyle w:val="001000000000" w:firstRow="0" w:lastRow="0" w:firstColumn="1" w:lastColumn="0" w:oddVBand="0" w:evenVBand="0" w:oddHBand="0" w:evenHBand="0" w:firstRowFirstColumn="0" w:firstRowLastColumn="0" w:lastRowFirstColumn="0" w:lastRowLastColumn="0"/>
+            <w:tcW w:w="4508" w:type="dxa"/>
+          </w:tcPr>
+          <w:p/>
+        </w:tc>
+        <w:tc>
+          <w:tcPr>
+            <w:tcW w:w="4508" w:type="dxa"/>
+          </w:tcPr>
+          <w:p>
+            <w:pPr>
+              <w:cnfStyle w:val="000000100000" w:firstRow="0" w:lastRow="0" w:firstColumn="0" w:lastColumn="0" w:oddVBand="0" w:evenVBand="0" w:oddHBand="1" w:evenHBand="0" w:firstRowFirstColumn="0" w:firstRowLastColumn="0" w:lastRowFirstColumn="0" w:lastRowLastColumn="0"/>
+            </w:pPr>
+          </w:p>
+        </w:tc>
+      </w:tr>
+      <w:tr>
+        <w:tc>
+          <w:tcPr>
+            <w:cnfStyle w:val="001000000000" w:firstRow="0" w:lastRow="0" w:firstColumn="1" w:lastColumn="0" w:oddVBand="0" w:evenVBand="0" w:oddHBand="0" w:evenHBand="0" w:firstRowFirstColumn="0" w:firstRowLastColumn="0" w:lastRowFirstColumn="0" w:lastRowLastColumn="0"/>
+            <w:tcW w:w="4508" w:type="dxa"/>
+          </w:tcPr>
+          <w:p/>
+        </w:tc>
+        <w:tc>
+          <w:tcPr>
+            <w:tcW w:w="4508" w:type="dxa"/>
+          </w:tcPr>
+          <w:p>
+            <w:pPr>
+              <w:cnfStyle w:val="000000000000" w:firstRow="0" w:lastRow="0" w:firstColumn="0" w:lastColumn="0" w:oddVBand="0" w:evenVBand="0" w:oddHBand="0" w:evenHBand="0" w:firstRowFirstColumn="0" w:firstRowLastColumn="0" w:lastRowFirstColumn="0" w:lastRowLastColumn="0"/>
+            </w:pPr>
+          </w:p>
+        </w:tc>
+      </w:tr>
+      <w:tr>
+        <w:trPr>
+          <w:cnfStyle w:val="000000100000" w:firstRow="0" w:lastRow="0" w:firstColumn="0" w:lastColumn="0" w:oddVBand="0" w:evenVBand="0" w:oddHBand="1" w:evenHBand="0" w:firstRowFirstColumn="0" w:firstRowLastColumn="0" w:lastRowFirstColumn="0" w:lastRowLastColumn="0"/>
+        </w:trPr>
+        <w:tc>
+          <w:tcPr>
+            <w:cnfStyle w:val="001000000000" w:firstRow="0" w:lastRow="0" w:firstColumn="1" w:lastColumn="0" w:oddVBand="0" w:evenVBand="0" w:oddHBand="0" w:evenHBand="0" w:firstRowFirstColumn="0" w:firstRowLastColumn="0" w:lastRowFirstColumn="0" w:lastRowLastColumn="0"/>
+            <w:tcW w:w="4508" w:type="dxa"/>
+          </w:tcPr>
+          <w:p/>
+        </w:tc>
+        <w:tc>
+          <w:tcPr>
+            <w:tcW w:w="4508" w:type="dxa"/>
+          </w:tcPr>
+          <w:p>
+            <w:pPr>
+              <w:cnfStyle w:val="000000100000" w:firstRow="0" w:lastRow="0" w:firstColumn="0" w:lastColumn="0" w:oddVBand="0" w:evenVBand="0" w:oddHBand="1" w:evenHBand="0" w:firstRowFirstColumn="0" w:firstRowLastColumn="0" w:lastRowFirstColumn="0" w:lastRowLastColumn="0"/>
+            </w:pPr>
+          </w:p>
+        </w:tc>
+      </w:tr>
+      <w:tr>
+        <w:tc>
+          <w:tcPr>
+            <w:cnfStyle w:val="001000000000" w:firstRow="0" w:lastRow="0" w:firstColumn="1" w:lastColumn="0" w:oddVBand="0" w:evenVBand="0" w:oddHBand="0" w:evenHBand="0" w:firstRowFirstColumn="0" w:firstRowLastColumn="0" w:lastRowFirstColumn="0" w:lastRowLastColumn="0"/>
+            <w:tcW w:w="4508" w:type="dxa"/>
+          </w:tcPr>
+          <w:p/>
+        </w:tc>
+        <w:tc>
+          <w:tcPr>
+            <w:tcW w:w="4508" w:type="dxa"/>
+          </w:tcPr>
+          <w:p>
+            <w:pPr>
+              <w:cnfStyle w:val="000000000000" w:firstRow="0" w:lastRow="0" w:firstColumn="0" w:lastColumn="0" w:oddVBand="0" w:evenVBand="0" w:oddHBand="0" w:evenHBand="0" w:firstRowFirstColumn="0" w:firstRowLastColumn="0" w:lastRowFirstColumn="0" w:lastRowLastColumn="0"/>
+            </w:pPr>
+          </w:p>
+        </w:tc>
+      </w:tr>
+    </w:tbl>
+    <w:p>
+      <w:pPr>
+        <w:ind w:left="360"/>
       </w:pPr>
     </w:p>
     <w:p/>
@@ -3926,11 +4219,11 @@
   </w:compat>
   <w:rsids>
     <w:rsidRoot w:val="00575EB9"/>
-    <w:rsid w:val="001C5C80"/>
     <w:rsid w:val="003432F7"/>
     <w:rsid w:val="003A50E0"/>
     <w:rsid w:val="004A6801"/>
     <w:rsid w:val="00575EB9"/>
+    <w:rsid w:val="00A7585A"/>
     <w:rsid w:val="00C547D0"/>
   </w:rsids>
   <m:mathPr>

</xml_diff>

<commit_message>
Finished part 2 and nearly done part 3.
</commit_message>
<xml_diff>
--- a/report/ca1-report.docx
+++ b/report/ca1-report.docx
@@ -892,209 +892,763 @@
     </w:sdt>
     <w:sdt>
       <w:sdtPr>
-        <w:rPr>
-          <w:rFonts w:asciiTheme="minorHAnsi" w:eastAsiaTheme="minorEastAsia" w:hAnsiTheme="minorHAnsi" w:cs="Times New Roman"/>
-          <w:color w:val="auto"/>
-          <w:sz w:val="22"/>
-          <w:szCs w:val="22"/>
-        </w:rPr>
-        <w:id w:val="1867259204"/>
+        <w:id w:val="117424358"/>
         <w:docPartObj>
           <w:docPartGallery w:val="Table of Contents"/>
           <w:docPartUnique/>
         </w:docPartObj>
       </w:sdtPr>
+      <w:sdtEndPr>
+        <w:rPr>
+          <w:rFonts w:asciiTheme="minorHAnsi" w:eastAsiaTheme="minorHAnsi" w:hAnsiTheme="minorHAnsi" w:cstheme="minorBidi"/>
+          <w:b/>
+          <w:bCs/>
+          <w:noProof/>
+          <w:color w:val="auto"/>
+          <w:kern w:val="2"/>
+          <w:sz w:val="24"/>
+          <w:szCs w:val="24"/>
+          <w14:ligatures w14:val="standardContextual"/>
+        </w:rPr>
+      </w:sdtEndPr>
       <w:sdtContent>
         <w:p>
           <w:pPr>
             <w:pStyle w:val="TOCHeading"/>
           </w:pPr>
           <w:r>
-            <w:t>Table of Contents</w:t>
+            <w:t>Contents</w:t>
           </w:r>
         </w:p>
         <w:p>
           <w:pPr>
             <w:pStyle w:val="TOC1"/>
+            <w:tabs>
+              <w:tab w:val="left" w:pos="440"/>
+              <w:tab w:val="right" w:leader="dot" w:pos="9016"/>
+            </w:tabs>
+            <w:rPr>
+              <w:rFonts w:cstheme="minorBidi"/>
+              <w:noProof/>
+              <w:kern w:val="2"/>
+              <w:sz w:val="24"/>
+              <w:szCs w:val="24"/>
+              <w:lang w:val="en-US"/>
+              <w14:ligatures w14:val="standardContextual"/>
+            </w:rPr>
           </w:pPr>
-          <w:sdt>
-            <w:sdtPr>
-              <w:rPr>
-                <w:b/>
-                <w:bCs/>
-              </w:rPr>
-              <w:id w:val="183865962"/>
-              <w:placeholder>
-                <w:docPart w:val="47E774277D0F47669AB0A2C67AC546AF"/>
-              </w:placeholder>
-              <w:temporary/>
-              <w:showingPlcHdr/>
-            </w:sdtPr>
-            <w:sdtContent>
-              <w:r>
-                <w:rPr>
-                  <w:b/>
-                  <w:bCs/>
-                </w:rPr>
-                <w:t>Type chapter title (level 1)</w:t>
-              </w:r>
-            </w:sdtContent>
-          </w:sdt>
           <w:r>
-            <w:ptab w:relativeTo="margin" w:alignment="right" w:leader="dot"/>
+            <w:fldChar w:fldCharType="begin"/>
           </w:r>
+          <w:r>
+            <w:instrText xml:space="preserve"> TOC \o "1-3" \h \z \u </w:instrText>
+          </w:r>
+          <w:r>
+            <w:fldChar w:fldCharType="separate"/>
+          </w:r>
+          <w:hyperlink w:anchor="_Toc242965602" w:history="1">
+            <w:r>
+              <w:rPr>
+                <w:rStyle w:val="Hyperlink"/>
+                <w:noProof/>
+              </w:rPr>
+              <w:t>1.</w:t>
+            </w:r>
+            <w:r>
+              <w:rPr>
+                <w:rFonts w:cstheme="minorBidi"/>
+                <w:noProof/>
+                <w:kern w:val="2"/>
+                <w:sz w:val="24"/>
+                <w:szCs w:val="24"/>
+                <w:lang w:val="en-US"/>
+                <w14:ligatures w14:val="standardContextual"/>
+              </w:rPr>
+              <w:tab/>
+            </w:r>
+            <w:r>
+              <w:rPr>
+                <w:rStyle w:val="Hyperlink"/>
+                <w:noProof/>
+              </w:rPr>
+              <w:t>Scenario Interpretation</w:t>
+            </w:r>
+            <w:r>
+              <w:rPr>
+                <w:noProof/>
+                <w:webHidden/>
+              </w:rPr>
+              <w:tab/>
+            </w:r>
+            <w:r>
+              <w:rPr>
+                <w:noProof/>
+                <w:webHidden/>
+              </w:rPr>
+              <w:fldChar w:fldCharType="begin"/>
+            </w:r>
+            <w:r>
+              <w:rPr>
+                <w:noProof/>
+                <w:webHidden/>
+              </w:rPr>
+              <w:instrText xml:space="preserve"> PAGEREF _Toc242965602 \h </w:instrText>
+            </w:r>
+            <w:r>
+              <w:rPr>
+                <w:noProof/>
+                <w:webHidden/>
+              </w:rPr>
+            </w:r>
+            <w:r>
+              <w:rPr>
+                <w:noProof/>
+                <w:webHidden/>
+              </w:rPr>
+              <w:fldChar w:fldCharType="separate"/>
+            </w:r>
+            <w:r>
+              <w:rPr>
+                <w:noProof/>
+                <w:webHidden/>
+              </w:rPr>
+              <w:t>2</w:t>
+            </w:r>
+            <w:r>
+              <w:rPr>
+                <w:noProof/>
+                <w:webHidden/>
+              </w:rPr>
+              <w:fldChar w:fldCharType="end"/>
+            </w:r>
+          </w:hyperlink>
+        </w:p>
+        <w:p>
+          <w:pPr>
+            <w:pStyle w:val="TOC2"/>
+            <w:tabs>
+              <w:tab w:val="left" w:pos="960"/>
+              <w:tab w:val="right" w:leader="dot" w:pos="9016"/>
+            </w:tabs>
+            <w:rPr>
+              <w:rFonts w:cstheme="minorBidi"/>
+              <w:noProof/>
+              <w:kern w:val="2"/>
+              <w:sz w:val="24"/>
+              <w:szCs w:val="24"/>
+              <w:lang w:val="en-US"/>
+              <w14:ligatures w14:val="standardContextual"/>
+            </w:rPr>
+          </w:pPr>
+          <w:hyperlink w:anchor="_Toc242965603" w:history="1">
+            <w:r>
+              <w:rPr>
+                <w:rStyle w:val="Hyperlink"/>
+                <w:noProof/>
+              </w:rPr>
+              <w:t>1.1</w:t>
+            </w:r>
+            <w:r>
+              <w:rPr>
+                <w:rFonts w:cstheme="minorBidi"/>
+                <w:noProof/>
+                <w:kern w:val="2"/>
+                <w:sz w:val="24"/>
+                <w:szCs w:val="24"/>
+                <w:lang w:val="en-US"/>
+                <w14:ligatures w14:val="standardContextual"/>
+              </w:rPr>
+              <w:tab/>
+            </w:r>
+            <w:r>
+              <w:rPr>
+                <w:rStyle w:val="Hyperlink"/>
+                <w:noProof/>
+              </w:rPr>
+              <w:t>Organisation and current Process.</w:t>
+            </w:r>
+            <w:r>
+              <w:rPr>
+                <w:noProof/>
+                <w:webHidden/>
+              </w:rPr>
+              <w:tab/>
+            </w:r>
+            <w:r>
+              <w:rPr>
+                <w:noProof/>
+                <w:webHidden/>
+              </w:rPr>
+              <w:fldChar w:fldCharType="begin"/>
+            </w:r>
+            <w:r>
+              <w:rPr>
+                <w:noProof/>
+                <w:webHidden/>
+              </w:rPr>
+              <w:instrText xml:space="preserve"> PAGEREF _Toc242965603 \h </w:instrText>
+            </w:r>
+            <w:r>
+              <w:rPr>
+                <w:noProof/>
+                <w:webHidden/>
+              </w:rPr>
+            </w:r>
+            <w:r>
+              <w:rPr>
+                <w:noProof/>
+                <w:webHidden/>
+              </w:rPr>
+              <w:fldChar w:fldCharType="separate"/>
+            </w:r>
+            <w:r>
+              <w:rPr>
+                <w:noProof/>
+                <w:webHidden/>
+              </w:rPr>
+              <w:t>2</w:t>
+            </w:r>
+            <w:r>
+              <w:rPr>
+                <w:noProof/>
+                <w:webHidden/>
+              </w:rPr>
+              <w:fldChar w:fldCharType="end"/>
+            </w:r>
+          </w:hyperlink>
+        </w:p>
+        <w:p>
+          <w:pPr>
+            <w:pStyle w:val="TOC2"/>
+            <w:tabs>
+              <w:tab w:val="left" w:pos="960"/>
+              <w:tab w:val="right" w:leader="dot" w:pos="9016"/>
+            </w:tabs>
+            <w:rPr>
+              <w:rFonts w:cstheme="minorBidi"/>
+              <w:noProof/>
+              <w:kern w:val="2"/>
+              <w:sz w:val="24"/>
+              <w:szCs w:val="24"/>
+              <w:lang w:val="en-US"/>
+              <w14:ligatures w14:val="standardContextual"/>
+            </w:rPr>
+          </w:pPr>
+          <w:hyperlink w:anchor="_Toc242965604" w:history="1">
+            <w:r>
+              <w:rPr>
+                <w:rStyle w:val="Hyperlink"/>
+                <w:noProof/>
+              </w:rPr>
+              <w:t>1.2</w:t>
+            </w:r>
+            <w:r>
+              <w:rPr>
+                <w:rFonts w:cstheme="minorBidi"/>
+                <w:noProof/>
+                <w:kern w:val="2"/>
+                <w:sz w:val="24"/>
+                <w:szCs w:val="24"/>
+                <w:lang w:val="en-US"/>
+                <w14:ligatures w14:val="standardContextual"/>
+              </w:rPr>
+              <w:tab/>
+            </w:r>
+            <w:r>
+              <w:rPr>
+                <w:rStyle w:val="Hyperlink"/>
+                <w:noProof/>
+              </w:rPr>
+              <w:t>Symptoms, Problems and Consequences</w:t>
+            </w:r>
+            <w:r>
+              <w:rPr>
+                <w:noProof/>
+                <w:webHidden/>
+              </w:rPr>
+              <w:tab/>
+            </w:r>
+            <w:r>
+              <w:rPr>
+                <w:noProof/>
+                <w:webHidden/>
+              </w:rPr>
+              <w:fldChar w:fldCharType="begin"/>
+            </w:r>
+            <w:r>
+              <w:rPr>
+                <w:noProof/>
+                <w:webHidden/>
+              </w:rPr>
+              <w:instrText xml:space="preserve"> PAGEREF _Toc242965604 \h </w:instrText>
+            </w:r>
+            <w:r>
+              <w:rPr>
+                <w:noProof/>
+                <w:webHidden/>
+              </w:rPr>
+            </w:r>
+            <w:r>
+              <w:rPr>
+                <w:noProof/>
+                <w:webHidden/>
+              </w:rPr>
+              <w:fldChar w:fldCharType="separate"/>
+            </w:r>
+            <w:r>
+              <w:rPr>
+                <w:noProof/>
+                <w:webHidden/>
+              </w:rPr>
+              <w:t>3</w:t>
+            </w:r>
+            <w:r>
+              <w:rPr>
+                <w:noProof/>
+                <w:webHidden/>
+              </w:rPr>
+              <w:fldChar w:fldCharType="end"/>
+            </w:r>
+          </w:hyperlink>
+        </w:p>
+        <w:p>
+          <w:pPr>
+            <w:pStyle w:val="TOC2"/>
+            <w:tabs>
+              <w:tab w:val="left" w:pos="960"/>
+              <w:tab w:val="right" w:leader="dot" w:pos="9016"/>
+            </w:tabs>
+            <w:rPr>
+              <w:rFonts w:cstheme="minorBidi"/>
+              <w:noProof/>
+              <w:kern w:val="2"/>
+              <w:sz w:val="24"/>
+              <w:szCs w:val="24"/>
+              <w:lang w:val="en-US"/>
+              <w14:ligatures w14:val="standardContextual"/>
+            </w:rPr>
+          </w:pPr>
+          <w:hyperlink w:anchor="_Toc242965605" w:history="1">
+            <w:r>
+              <w:rPr>
+                <w:rStyle w:val="Hyperlink"/>
+                <w:noProof/>
+              </w:rPr>
+              <w:t>1.3</w:t>
+            </w:r>
+            <w:r>
+              <w:rPr>
+                <w:rFonts w:cstheme="minorBidi"/>
+                <w:noProof/>
+                <w:kern w:val="2"/>
+                <w:sz w:val="24"/>
+                <w:szCs w:val="24"/>
+                <w:lang w:val="en-US"/>
+                <w14:ligatures w14:val="standardContextual"/>
+              </w:rPr>
+              <w:tab/>
+            </w:r>
+            <w:r>
+              <w:rPr>
+                <w:rStyle w:val="Hyperlink"/>
+                <w:noProof/>
+              </w:rPr>
+              <w:t>Business Problem statement</w:t>
+            </w:r>
+            <w:r>
+              <w:rPr>
+                <w:noProof/>
+                <w:webHidden/>
+              </w:rPr>
+              <w:tab/>
+            </w:r>
+            <w:r>
+              <w:rPr>
+                <w:noProof/>
+                <w:webHidden/>
+              </w:rPr>
+              <w:fldChar w:fldCharType="begin"/>
+            </w:r>
+            <w:r>
+              <w:rPr>
+                <w:noProof/>
+                <w:webHidden/>
+              </w:rPr>
+              <w:instrText xml:space="preserve"> PAGEREF _Toc242965605 \h </w:instrText>
+            </w:r>
+            <w:r>
+              <w:rPr>
+                <w:noProof/>
+                <w:webHidden/>
+              </w:rPr>
+            </w:r>
+            <w:r>
+              <w:rPr>
+                <w:noProof/>
+                <w:webHidden/>
+              </w:rPr>
+              <w:fldChar w:fldCharType="separate"/>
+            </w:r>
+            <w:r>
+              <w:rPr>
+                <w:noProof/>
+                <w:webHidden/>
+              </w:rPr>
+              <w:t>4</w:t>
+            </w:r>
+            <w:r>
+              <w:rPr>
+                <w:noProof/>
+                <w:webHidden/>
+              </w:rPr>
+              <w:fldChar w:fldCharType="end"/>
+            </w:r>
+          </w:hyperlink>
+        </w:p>
+        <w:p>
+          <w:pPr>
+            <w:pStyle w:val="TOC2"/>
+            <w:tabs>
+              <w:tab w:val="left" w:pos="960"/>
+              <w:tab w:val="right" w:leader="dot" w:pos="9016"/>
+            </w:tabs>
+            <w:rPr>
+              <w:rFonts w:cstheme="minorBidi"/>
+              <w:noProof/>
+              <w:kern w:val="2"/>
+              <w:sz w:val="24"/>
+              <w:szCs w:val="24"/>
+              <w:lang w:val="en-US"/>
+              <w14:ligatures w14:val="standardContextual"/>
+            </w:rPr>
+          </w:pPr>
+          <w:hyperlink w:anchor="_Toc242965606" w:history="1">
+            <w:r>
+              <w:rPr>
+                <w:rStyle w:val="Hyperlink"/>
+                <w:noProof/>
+              </w:rPr>
+              <w:t>1.4</w:t>
+            </w:r>
+            <w:r>
+              <w:rPr>
+                <w:rFonts w:cstheme="minorBidi"/>
+                <w:noProof/>
+                <w:kern w:val="2"/>
+                <w:sz w:val="24"/>
+                <w:szCs w:val="24"/>
+                <w:lang w:val="en-US"/>
+                <w14:ligatures w14:val="standardContextual"/>
+              </w:rPr>
+              <w:tab/>
+            </w:r>
+            <w:r>
+              <w:rPr>
+                <w:rStyle w:val="Hyperlink"/>
+                <w:noProof/>
+              </w:rPr>
+              <w:t>Desired outcomes</w:t>
+            </w:r>
+            <w:r>
+              <w:rPr>
+                <w:noProof/>
+                <w:webHidden/>
+              </w:rPr>
+              <w:tab/>
+            </w:r>
+            <w:r>
+              <w:rPr>
+                <w:noProof/>
+                <w:webHidden/>
+              </w:rPr>
+              <w:fldChar w:fldCharType="begin"/>
+            </w:r>
+            <w:r>
+              <w:rPr>
+                <w:noProof/>
+                <w:webHidden/>
+              </w:rPr>
+              <w:instrText xml:space="preserve"> PAGEREF _Toc242965606 \h </w:instrText>
+            </w:r>
+            <w:r>
+              <w:rPr>
+                <w:noProof/>
+                <w:webHidden/>
+              </w:rPr>
+            </w:r>
+            <w:r>
+              <w:rPr>
+                <w:noProof/>
+                <w:webHidden/>
+              </w:rPr>
+              <w:fldChar w:fldCharType="separate"/>
+            </w:r>
+            <w:r>
+              <w:rPr>
+                <w:noProof/>
+                <w:webHidden/>
+              </w:rPr>
+              <w:t>4</w:t>
+            </w:r>
+            <w:r>
+              <w:rPr>
+                <w:noProof/>
+                <w:webHidden/>
+              </w:rPr>
+              <w:fldChar w:fldCharType="end"/>
+            </w:r>
+          </w:hyperlink>
+        </w:p>
+        <w:p>
+          <w:pPr>
+            <w:pStyle w:val="TOC1"/>
+            <w:tabs>
+              <w:tab w:val="left" w:pos="440"/>
+              <w:tab w:val="right" w:leader="dot" w:pos="9016"/>
+            </w:tabs>
+            <w:rPr>
+              <w:rFonts w:cstheme="minorBidi"/>
+              <w:noProof/>
+              <w:kern w:val="2"/>
+              <w:sz w:val="24"/>
+              <w:szCs w:val="24"/>
+              <w:lang w:val="en-US"/>
+              <w14:ligatures w14:val="standardContextual"/>
+            </w:rPr>
+          </w:pPr>
+          <w:hyperlink w:anchor="_Toc242965607" w:history="1">
+            <w:r>
+              <w:rPr>
+                <w:rStyle w:val="Hyperlink"/>
+                <w:noProof/>
+              </w:rPr>
+              <w:t>2.</w:t>
+            </w:r>
+            <w:r>
+              <w:rPr>
+                <w:rFonts w:cstheme="minorBidi"/>
+                <w:noProof/>
+                <w:kern w:val="2"/>
+                <w:sz w:val="24"/>
+                <w:szCs w:val="24"/>
+                <w:lang w:val="en-US"/>
+                <w14:ligatures w14:val="standardContextual"/>
+              </w:rPr>
+              <w:tab/>
+            </w:r>
+            <w:r>
+              <w:rPr>
+                <w:rStyle w:val="Hyperlink"/>
+                <w:noProof/>
+              </w:rPr>
+              <w:t>Purpose, scope and boundary</w:t>
+            </w:r>
+            <w:r>
+              <w:rPr>
+                <w:noProof/>
+                <w:webHidden/>
+              </w:rPr>
+              <w:tab/>
+            </w:r>
+            <w:r>
+              <w:rPr>
+                <w:noProof/>
+                <w:webHidden/>
+              </w:rPr>
+              <w:fldChar w:fldCharType="begin"/>
+            </w:r>
+            <w:r>
+              <w:rPr>
+                <w:noProof/>
+                <w:webHidden/>
+              </w:rPr>
+              <w:instrText xml:space="preserve"> PAGEREF _Toc242965607 \h </w:instrText>
+            </w:r>
+            <w:r>
+              <w:rPr>
+                <w:noProof/>
+                <w:webHidden/>
+              </w:rPr>
+            </w:r>
+            <w:r>
+              <w:rPr>
+                <w:noProof/>
+                <w:webHidden/>
+              </w:rPr>
+              <w:fldChar w:fldCharType="separate"/>
+            </w:r>
+            <w:r>
+              <w:rPr>
+                <w:noProof/>
+                <w:webHidden/>
+              </w:rPr>
+              <w:t>5</w:t>
+            </w:r>
+            <w:r>
+              <w:rPr>
+                <w:noProof/>
+                <w:webHidden/>
+              </w:rPr>
+              <w:fldChar w:fldCharType="end"/>
+            </w:r>
+          </w:hyperlink>
+        </w:p>
+        <w:p>
+          <w:pPr>
+            <w:pStyle w:val="TOC2"/>
+            <w:tabs>
+              <w:tab w:val="right" w:leader="dot" w:pos="9016"/>
+            </w:tabs>
+            <w:rPr>
+              <w:rFonts w:cstheme="minorBidi"/>
+              <w:noProof/>
+              <w:kern w:val="2"/>
+              <w:sz w:val="24"/>
+              <w:szCs w:val="24"/>
+              <w:lang w:val="en-US"/>
+              <w14:ligatures w14:val="standardContextual"/>
+            </w:rPr>
+          </w:pPr>
+          <w:hyperlink w:anchor="_Toc242965608" w:history="1">
+            <w:r>
+              <w:rPr>
+                <w:rStyle w:val="Hyperlink"/>
+                <w:noProof/>
+              </w:rPr>
+              <w:t>What the in scope items mean</w:t>
+            </w:r>
+            <w:r>
+              <w:rPr>
+                <w:noProof/>
+                <w:webHidden/>
+              </w:rPr>
+              <w:tab/>
+            </w:r>
+            <w:r>
+              <w:rPr>
+                <w:noProof/>
+                <w:webHidden/>
+              </w:rPr>
+              <w:fldChar w:fldCharType="begin"/>
+            </w:r>
+            <w:r>
+              <w:rPr>
+                <w:noProof/>
+                <w:webHidden/>
+              </w:rPr>
+              <w:instrText xml:space="preserve"> PAGEREF _Toc242965608 \h </w:instrText>
+            </w:r>
+            <w:r>
+              <w:rPr>
+                <w:noProof/>
+                <w:webHidden/>
+              </w:rPr>
+            </w:r>
+            <w:r>
+              <w:rPr>
+                <w:noProof/>
+                <w:webHidden/>
+              </w:rPr>
+              <w:fldChar w:fldCharType="separate"/>
+            </w:r>
+            <w:r>
+              <w:rPr>
+                <w:noProof/>
+                <w:webHidden/>
+              </w:rPr>
+              <w:t>5</w:t>
+            </w:r>
+            <w:r>
+              <w:rPr>
+                <w:noProof/>
+                <w:webHidden/>
+              </w:rPr>
+              <w:fldChar w:fldCharType="end"/>
+            </w:r>
+          </w:hyperlink>
+        </w:p>
+        <w:p>
+          <w:pPr>
+            <w:pStyle w:val="TOC2"/>
+            <w:tabs>
+              <w:tab w:val="right" w:leader="dot" w:pos="9016"/>
+            </w:tabs>
+            <w:rPr>
+              <w:rFonts w:cstheme="minorBidi"/>
+              <w:noProof/>
+              <w:kern w:val="2"/>
+              <w:sz w:val="24"/>
+              <w:szCs w:val="24"/>
+              <w:lang w:val="en-US"/>
+              <w14:ligatures w14:val="standardContextual"/>
+            </w:rPr>
+          </w:pPr>
+          <w:hyperlink w:anchor="_Toc242965609" w:history="1">
+            <w:r>
+              <w:rPr>
+                <w:rStyle w:val="Hyperlink"/>
+                <w:noProof/>
+              </w:rPr>
+              <w:t>What the out-of-scope items are left out</w:t>
+            </w:r>
+            <w:r>
+              <w:rPr>
+                <w:noProof/>
+                <w:webHidden/>
+              </w:rPr>
+              <w:tab/>
+            </w:r>
+            <w:r>
+              <w:rPr>
+                <w:noProof/>
+                <w:webHidden/>
+              </w:rPr>
+              <w:fldChar w:fldCharType="begin"/>
+            </w:r>
+            <w:r>
+              <w:rPr>
+                <w:noProof/>
+                <w:webHidden/>
+              </w:rPr>
+              <w:instrText xml:space="preserve"> PAGEREF _Toc242965609 \h </w:instrText>
+            </w:r>
+            <w:r>
+              <w:rPr>
+                <w:noProof/>
+                <w:webHidden/>
+              </w:rPr>
+            </w:r>
+            <w:r>
+              <w:rPr>
+                <w:noProof/>
+                <w:webHidden/>
+              </w:rPr>
+              <w:fldChar w:fldCharType="separate"/>
+            </w:r>
+            <w:r>
+              <w:rPr>
+                <w:noProof/>
+                <w:webHidden/>
+              </w:rPr>
+              <w:t>6</w:t>
+            </w:r>
+            <w:r>
+              <w:rPr>
+                <w:noProof/>
+                <w:webHidden/>
+              </w:rPr>
+              <w:fldChar w:fldCharType="end"/>
+            </w:r>
+          </w:hyperlink>
+        </w:p>
+        <w:p>
           <w:r>
             <w:rPr>
               <w:b/>
               <w:bCs/>
+              <w:noProof/>
             </w:rPr>
-            <w:t>1</w:t>
-          </w:r>
-        </w:p>
-        <w:p>
-          <w:pPr>
-            <w:pStyle w:val="TOC2"/>
-            <w:ind w:left="216"/>
-          </w:pPr>
-          <w:sdt>
-            <w:sdtPr>
-              <w:id w:val="1667506712"/>
-              <w:placeholder>
-                <w:docPart w:val="F94DB55F2BB04C748199D37BD6487319"/>
-              </w:placeholder>
-              <w:temporary/>
-              <w:showingPlcHdr/>
-            </w:sdtPr>
-            <w:sdtContent>
-              <w:r>
-                <w:t>Type chapter title (level 2)</w:t>
-              </w:r>
-            </w:sdtContent>
-          </w:sdt>
-          <w:r>
-            <w:ptab w:relativeTo="margin" w:alignment="right" w:leader="dot"/>
-          </w:r>
-          <w:r>
-            <w:t>2</w:t>
-          </w:r>
-        </w:p>
-        <w:p>
-          <w:pPr>
-            <w:pStyle w:val="TOC3"/>
-            <w:ind w:left="446"/>
-          </w:pPr>
-          <w:sdt>
-            <w:sdtPr>
-              <w:id w:val="93059032"/>
-              <w:placeholder>
-                <w:docPart w:val="EE81D1A4A5874F458B2F579F40AA7516"/>
-              </w:placeholder>
-              <w:temporary/>
-              <w:showingPlcHdr/>
-            </w:sdtPr>
-            <w:sdtContent>
-              <w:r>
-                <w:t>Type chapter title (level 3)</w:t>
-              </w:r>
-            </w:sdtContent>
-          </w:sdt>
-          <w:r>
-            <w:ptab w:relativeTo="margin" w:alignment="right" w:leader="dot"/>
-          </w:r>
-          <w:r>
-            <w:t>3</w:t>
-          </w:r>
-        </w:p>
-        <w:p>
-          <w:pPr>
-            <w:pStyle w:val="TOC1"/>
-          </w:pPr>
-          <w:sdt>
-            <w:sdtPr>
-              <w:rPr>
-                <w:b/>
-                <w:bCs/>
-              </w:rPr>
-              <w:id w:val="183865966"/>
-              <w:placeholder>
-                <w:docPart w:val="47E774277D0F47669AB0A2C67AC546AF"/>
-              </w:placeholder>
-              <w:temporary/>
-              <w:showingPlcHdr/>
-            </w:sdtPr>
-            <w:sdtContent>
-              <w:r>
-                <w:rPr>
-                  <w:b/>
-                  <w:bCs/>
-                </w:rPr>
-                <w:t>Type chapter title (level 1)</w:t>
-              </w:r>
-            </w:sdtContent>
-          </w:sdt>
-          <w:r>
-            <w:ptab w:relativeTo="margin" w:alignment="right" w:leader="dot"/>
-          </w:r>
-          <w:r>
-            <w:rPr>
-              <w:b/>
-              <w:bCs/>
-            </w:rPr>
-            <w:t>4</w:t>
-          </w:r>
-        </w:p>
-        <w:p>
-          <w:pPr>
-            <w:pStyle w:val="TOC2"/>
-            <w:ind w:left="216"/>
-          </w:pPr>
-          <w:sdt>
-            <w:sdtPr>
-              <w:id w:val="93059040"/>
-              <w:placeholder>
-                <w:docPart w:val="F94DB55F2BB04C748199D37BD6487319"/>
-              </w:placeholder>
-              <w:temporary/>
-              <w:showingPlcHdr/>
-            </w:sdtPr>
-            <w:sdtContent>
-              <w:r>
-                <w:t>Type chapter title (level 2)</w:t>
-              </w:r>
-            </w:sdtContent>
-          </w:sdt>
-          <w:r>
-            <w:ptab w:relativeTo="margin" w:alignment="right" w:leader="dot"/>
-          </w:r>
-          <w:r>
-            <w:t>5</w:t>
-          </w:r>
-        </w:p>
-        <w:p>
-          <w:pPr>
-            <w:pStyle w:val="TOC3"/>
-            <w:ind w:left="446"/>
-          </w:pPr>
-          <w:sdt>
-            <w:sdtPr>
-              <w:id w:val="93059044"/>
-              <w:placeholder>
-                <w:docPart w:val="EE81D1A4A5874F458B2F579F40AA7516"/>
-              </w:placeholder>
-              <w:temporary/>
-              <w:showingPlcHdr/>
-            </w:sdtPr>
-            <w:sdtContent>
-              <w:r>
-                <w:t>Type chapter title (level 3)</w:t>
-              </w:r>
-            </w:sdtContent>
-          </w:sdt>
-          <w:r>
-            <w:ptab w:relativeTo="margin" w:alignment="right" w:leader="dot"/>
-          </w:r>
-          <w:r>
-            <w:t>6</w:t>
+            <w:fldChar w:fldCharType="end"/>
           </w:r>
         </w:p>
       </w:sdtContent>
@@ -1113,10 +1667,12 @@
           <w:numId w:val="1"/>
         </w:numPr>
       </w:pPr>
+      <w:bookmarkStart w:id="0" w:name="_Toc242965602"/>
       <w:r>
         <w:lastRenderedPageBreak/>
         <w:t>Scenario Interpretation</w:t>
       </w:r>
+      <w:bookmarkEnd w:id="0"/>
     </w:p>
     <w:p>
       <w:pPr>
@@ -1126,6 +1682,7 @@
           <w:numId w:val="1"/>
         </w:numPr>
       </w:pPr>
+      <w:bookmarkStart w:id="1" w:name="_Toc242965603"/>
       <w:r>
         <w:t>Organi</w:t>
       </w:r>
@@ -1138,6 +1695,7 @@
       <w:r>
         <w:t>.</w:t>
       </w:r>
+      <w:bookmarkEnd w:id="1"/>
     </w:p>
     <w:p>
       <w:pPr>
@@ -1581,10 +2139,12 @@
           <w:numId w:val="1"/>
         </w:numPr>
       </w:pPr>
+      <w:bookmarkStart w:id="2" w:name="_Toc242965604"/>
       <w:r>
         <w:lastRenderedPageBreak/>
         <w:t>Symptoms, Problems and Consequences</w:t>
       </w:r>
+      <w:bookmarkEnd w:id="2"/>
     </w:p>
     <w:tbl>
       <w:tblPr>
@@ -2056,10 +2616,12 @@
           <w:numId w:val="1"/>
         </w:numPr>
       </w:pPr>
+      <w:bookmarkStart w:id="3" w:name="_Toc242965605"/>
       <w:r>
         <w:lastRenderedPageBreak/>
         <w:t>Business Problem statement</w:t>
       </w:r>
+      <w:bookmarkEnd w:id="3"/>
     </w:p>
     <w:p>
       <w:pPr>
@@ -2105,6 +2667,12 @@
       <w:r>
         <w:t xml:space="preserve">. </w:t>
       </w:r>
+    </w:p>
+    <w:p>
+      <w:pPr>
+        <w:pStyle w:val="ListParagraph"/>
+        <w:ind w:left="840"/>
+      </w:pPr>
     </w:p>
     <w:p>
       <w:pPr>
@@ -2120,9 +2688,11 @@
           <w:numId w:val="1"/>
         </w:numPr>
       </w:pPr>
+      <w:bookmarkStart w:id="4" w:name="_Toc242965606"/>
       <w:r>
         <w:t>Desired outcomes</w:t>
       </w:r>
+      <w:bookmarkEnd w:id="4"/>
     </w:p>
     <w:p>
       <w:pPr>
@@ -2200,10 +2770,12 @@
           <w:numId w:val="1"/>
         </w:numPr>
       </w:pPr>
+      <w:bookmarkStart w:id="5" w:name="_Toc242965607"/>
       <w:r>
         <w:lastRenderedPageBreak/>
         <w:t>Purpose, scope and boundary</w:t>
       </w:r>
+      <w:bookmarkEnd w:id="5"/>
     </w:p>
     <w:p>
       <w:pPr>
@@ -2215,6 +2787,11 @@
       <w:r>
         <w:t xml:space="preserve"> assignment to route visits, visit preparation and loading checks, recording of service status and disruption, borrower and partner notification and reconciliation of offline transactions, all applied for the two mobile library vehicles. </w:t>
       </w:r>
+    </w:p>
+    <w:p>
+      <w:pPr>
+        <w:ind w:left="360"/>
+      </w:pPr>
     </w:p>
     <w:tbl>
       <w:tblPr>
@@ -2382,7 +2959,28 @@
             <w:cnfStyle w:val="001000000000" w:firstRow="0" w:lastRow="0" w:firstColumn="1" w:lastColumn="0" w:oddVBand="0" w:evenVBand="0" w:oddHBand="0" w:evenHBand="0" w:firstRowFirstColumn="0" w:firstRowLastColumn="0" w:lastRowFirstColumn="0" w:lastRowLastColumn="0"/>
             <w:tcW w:w="4508" w:type="dxa"/>
           </w:tcPr>
-          <w:p/>
+          <w:p>
+            <w:pPr>
+              <w:rPr>
+                <w:b w:val="0"/>
+                <w:bCs w:val="0"/>
+              </w:rPr>
+            </w:pPr>
+            <w:r>
+              <w:rPr>
+                <w:b w:val="0"/>
+                <w:bCs w:val="0"/>
+              </w:rPr>
+              <w:t xml:space="preserve">Van load lists and </w:t>
+            </w:r>
+            <w:r>
+              <w:rPr>
+                <w:b w:val="0"/>
+                <w:bCs w:val="0"/>
+              </w:rPr>
+              <w:t>load checks</w:t>
+            </w:r>
+          </w:p>
         </w:tc>
         <w:tc>
           <w:tcPr>
@@ -2392,6 +2990,9 @@
             <w:pPr>
               <w:cnfStyle w:val="000000000000" w:firstRow="0" w:lastRow="0" w:firstColumn="0" w:lastColumn="0" w:oddVBand="0" w:evenVBand="0" w:oddHBand="0" w:evenHBand="0" w:firstRowFirstColumn="0" w:firstRowLastColumn="0" w:lastRowFirstColumn="0" w:lastRowLastColumn="0"/>
             </w:pPr>
+            <w:r>
+              <w:t xml:space="preserve">Automatic route planning </w:t>
+            </w:r>
           </w:p>
         </w:tc>
       </w:tr>
@@ -2404,7 +3005,21 @@
             <w:cnfStyle w:val="001000000000" w:firstRow="0" w:lastRow="0" w:firstColumn="1" w:lastColumn="0" w:oddVBand="0" w:evenVBand="0" w:oddHBand="0" w:evenHBand="0" w:firstRowFirstColumn="0" w:firstRowLastColumn="0" w:lastRowFirstColumn="0" w:lastRowLastColumn="0"/>
             <w:tcW w:w="4508" w:type="dxa"/>
           </w:tcPr>
-          <w:p/>
+          <w:p>
+            <w:pPr>
+              <w:rPr>
+                <w:b w:val="0"/>
+                <w:bCs w:val="0"/>
+              </w:rPr>
+            </w:pPr>
+            <w:r>
+              <w:rPr>
+                <w:b w:val="0"/>
+                <w:bCs w:val="0"/>
+              </w:rPr>
+              <w:t>Stop status: on time, late, moved or cancelled</w:t>
+            </w:r>
+          </w:p>
         </w:tc>
         <w:tc>
           <w:tcPr>
@@ -2414,6 +3029,9 @@
             <w:pPr>
               <w:cnfStyle w:val="000000100000" w:firstRow="0" w:lastRow="0" w:firstColumn="0" w:lastColumn="0" w:oddVBand="0" w:evenVBand="0" w:oddHBand="1" w:evenHBand="0" w:firstRowFirstColumn="0" w:firstRowLastColumn="0" w:lastRowFirstColumn="0" w:lastRowLastColumn="0"/>
             </w:pPr>
+            <w:r>
+              <w:t>Live van tracking on a map</w:t>
+            </w:r>
           </w:p>
         </w:tc>
       </w:tr>
@@ -2423,7 +3041,21 @@
             <w:cnfStyle w:val="001000000000" w:firstRow="0" w:lastRow="0" w:firstColumn="1" w:lastColumn="0" w:oddVBand="0" w:evenVBand="0" w:oddHBand="0" w:evenHBand="0" w:firstRowFirstColumn="0" w:firstRowLastColumn="0" w:lastRowFirstColumn="0" w:lastRowLastColumn="0"/>
             <w:tcW w:w="4508" w:type="dxa"/>
           </w:tcPr>
-          <w:p/>
+          <w:p>
+            <w:pPr>
+              <w:rPr>
+                <w:b w:val="0"/>
+                <w:bCs w:val="0"/>
+              </w:rPr>
+            </w:pPr>
+            <w:r>
+              <w:rPr>
+                <w:b w:val="0"/>
+                <w:bCs w:val="0"/>
+              </w:rPr>
+              <w:t>Messages to borrowers and community contacts about changes</w:t>
+            </w:r>
+          </w:p>
         </w:tc>
         <w:tc>
           <w:tcPr>
@@ -2433,6 +3065,412 @@
             <w:pPr>
               <w:cnfStyle w:val="000000000000" w:firstRow="0" w:lastRow="0" w:firstColumn="0" w:lastColumn="0" w:oddVBand="0" w:evenVBand="0" w:oddHBand="0" w:evenHBand="0" w:firstRowFirstColumn="0" w:firstRowLastColumn="0" w:lastRowFirstColumn="0" w:lastRowLastColumn="0"/>
             </w:pPr>
+            <w:r>
+              <w:t>Posting on social media and noticeboards</w:t>
+            </w:r>
+          </w:p>
+        </w:tc>
+      </w:tr>
+    </w:tbl>
+    <w:p>
+      <w:pPr>
+        <w:ind w:left="360"/>
+      </w:pPr>
+    </w:p>
+    <w:p>
+      <w:pPr>
+        <w:pStyle w:val="Heading2"/>
+      </w:pPr>
+      <w:bookmarkStart w:id="6" w:name="_Toc242965608"/>
+      <w:r>
+        <w:t>What the in</w:t>
+      </w:r>
+      <w:r>
+        <w:t xml:space="preserve"> </w:t>
+      </w:r>
+      <w:r>
+        <w:t>scope items mean</w:t>
+      </w:r>
+      <w:bookmarkEnd w:id="6"/>
+    </w:p>
+    <w:p>
+      <w:pPr>
+        <w:pStyle w:val="ListParagraph"/>
+        <w:numPr>
+          <w:ilvl w:val="0"/>
+          <w:numId w:val="3"/>
+        </w:numPr>
+      </w:pPr>
+      <w:r>
+        <w:rPr>
+          <w:b/>
+          <w:bCs/>
+        </w:rPr>
+        <w:t>Route and stop planning</w:t>
+      </w:r>
+      <w:r>
+        <w:t>: each van follows a set route, and each spot has a usual arrival time and visit length. Today this kept in a spreadsheet.</w:t>
+      </w:r>
+    </w:p>
+    <w:p>
+      <w:pPr>
+        <w:pStyle w:val="ListParagraph"/>
+        <w:numPr>
+          <w:ilvl w:val="0"/>
+          <w:numId w:val="3"/>
+        </w:numPr>
+      </w:pPr>
+      <w:r>
+        <w:rPr>
+          <w:b/>
+          <w:bCs/>
+        </w:rPr>
+        <w:t>Changing or pausing a stop</w:t>
+      </w:r>
+      <w:r>
+        <w:t xml:space="preserve">: the stop order can change on the morning of the trip if there are road works, bad weather or school closures. A stop can also be paused without being </w:t>
+      </w:r>
+      <w:r>
+        <w:t>removed from the route.</w:t>
+      </w:r>
+    </w:p>
+    <w:p>
+      <w:pPr>
+        <w:pStyle w:val="ListParagraph"/>
+        <w:numPr>
+          <w:ilvl w:val="0"/>
+          <w:numId w:val="3"/>
+        </w:numPr>
+      </w:pPr>
+      <w:r>
+        <w:rPr>
+          <w:b/>
+          <w:bCs/>
+        </w:rPr>
+        <w:t>Book requests</w:t>
+      </w:r>
+      <w:r>
+        <w:rPr>
+          <w:b/>
+          <w:bCs/>
+        </w:rPr>
+        <w:t xml:space="preserve"> linked to a trip</w:t>
+      </w:r>
+      <w:r>
+        <w:t xml:space="preserve">: borrowers ask for books at a branch, by phone or at a van. Each request needs to be linked to the right </w:t>
+      </w:r>
+      <w:r>
+        <w:t>trip,</w:t>
+      </w:r>
+      <w:r>
+        <w:t xml:space="preserve"> so it goes on the right van.</w:t>
+      </w:r>
+    </w:p>
+    <w:p>
+      <w:pPr>
+        <w:pStyle w:val="ListParagraph"/>
+        <w:numPr>
+          <w:ilvl w:val="0"/>
+          <w:numId w:val="3"/>
+        </w:numPr>
+      </w:pPr>
+      <w:r>
+        <w:rPr>
+          <w:b/>
+          <w:bCs/>
+        </w:rPr>
+        <w:t>Van load lists and load checks:</w:t>
+      </w:r>
+      <w:r>
+        <w:t xml:space="preserve"> books have been put on the wrong van because of similar place names and handwritten notes. Staff needs a list to check against before the van leaves.</w:t>
+      </w:r>
+    </w:p>
+    <w:p>
+      <w:pPr>
+        <w:pStyle w:val="ListParagraph"/>
+        <w:numPr>
+          <w:ilvl w:val="0"/>
+          <w:numId w:val="3"/>
+        </w:numPr>
+      </w:pPr>
+      <w:r>
+        <w:rPr>
+          <w:b/>
+          <w:bCs/>
+        </w:rPr>
+        <w:t>Stop status</w:t>
+      </w:r>
+      <w:r>
+        <w:t>: the community coordinator said people need to know whether the van is late or whether it is not coming at all</w:t>
+      </w:r>
+      <w:r>
+        <w:t>.</w:t>
+      </w:r>
+    </w:p>
+    <w:p>
+      <w:pPr>
+        <w:pStyle w:val="ListParagraph"/>
+        <w:numPr>
+          <w:ilvl w:val="0"/>
+          <w:numId w:val="3"/>
+        </w:numPr>
+      </w:pPr>
+      <w:r>
+        <w:rPr>
+          <w:b/>
+          <w:bCs/>
+        </w:rPr>
+        <w:t>Messages about changes</w:t>
+      </w:r>
+      <w:r>
+        <w:t>: changes go out by phone, email, noticeboards and social media, and the messages do not always match.</w:t>
+      </w:r>
+    </w:p>
+    <w:p/>
+    <w:p/>
+    <w:p/>
+    <w:p>
+      <w:pPr>
+        <w:pStyle w:val="Heading2"/>
+      </w:pPr>
+      <w:bookmarkStart w:id="7" w:name="_Toc242965609"/>
+      <w:r>
+        <w:lastRenderedPageBreak/>
+        <w:t xml:space="preserve">What the </w:t>
+      </w:r>
+      <w:r>
+        <w:t>out</w:t>
+      </w:r>
+      <w:r>
+        <w:t xml:space="preserve"> </w:t>
+      </w:r>
+      <w:r>
+        <w:t>of</w:t>
+      </w:r>
+      <w:r>
+        <w:t xml:space="preserve"> </w:t>
+      </w:r>
+      <w:r>
+        <w:t>scope</w:t>
+      </w:r>
+      <w:r>
+        <w:t xml:space="preserve"> items are left out</w:t>
+      </w:r>
+      <w:bookmarkEnd w:id="7"/>
+    </w:p>
+    <w:p>
+      <w:pPr>
+        <w:pStyle w:val="ListParagraph"/>
+        <w:numPr>
+          <w:ilvl w:val="0"/>
+          <w:numId w:val="4"/>
+        </w:numPr>
+      </w:pPr>
+      <w:r>
+        <w:rPr>
+          <w:b/>
+          <w:bCs/>
+        </w:rPr>
+        <w:t>Replacing the main library system</w:t>
+      </w:r>
+      <w:r>
+        <w:t xml:space="preserve">: </w:t>
+      </w:r>
+      <w:r>
+        <w:t>the scenario says, “replacement of the wider library management system is not proposed”. The new service works alongside it.</w:t>
+      </w:r>
+    </w:p>
+    <w:p>
+      <w:pPr>
+        <w:pStyle w:val="ListParagraph"/>
+        <w:numPr>
+          <w:ilvl w:val="0"/>
+          <w:numId w:val="4"/>
+        </w:numPr>
+      </w:pPr>
+      <w:r>
+        <w:rPr>
+          <w:b/>
+          <w:bCs/>
+        </w:rPr>
+        <w:t>Borrower account and the book catalogue</w:t>
+      </w:r>
+      <w:r>
+        <w:t xml:space="preserve">: </w:t>
+      </w:r>
+      <w:r>
+        <w:t>the scenario says this information is shared with the wider library service. The existing system already holds it, so the mobile service only reads it.</w:t>
+      </w:r>
+    </w:p>
+    <w:p>
+      <w:pPr>
+        <w:pStyle w:val="ListParagraph"/>
+        <w:numPr>
+          <w:ilvl w:val="0"/>
+          <w:numId w:val="4"/>
+        </w:numPr>
+      </w:pPr>
+      <w:r>
+        <w:rPr>
+          <w:b/>
+          <w:bCs/>
+        </w:rPr>
+        <w:t>Permanent branch libraries</w:t>
+      </w:r>
+      <w:r>
+        <w:t>:</w:t>
+      </w:r>
+      <w:r>
+        <w:t xml:space="preserve"> the scenario says the initial scope is the </w:t>
+      </w:r>
+      <w:r>
+        <w:t>operate</w:t>
+      </w:r>
+    </w:p>
+    <w:p>
+      <w:pPr>
+        <w:pStyle w:val="ListParagraph"/>
+        <w:numPr>
+          <w:ilvl w:val="0"/>
+          <w:numId w:val="4"/>
+        </w:numPr>
+      </w:pPr>
+      <w:r>
+        <w:rPr>
+          <w:b/>
+          <w:bCs/>
+        </w:rPr>
+        <w:t>Automatic route planning</w:t>
+      </w:r>
+      <w:r>
+        <w:t xml:space="preserve">: the </w:t>
+      </w:r>
+      <w:r>
+        <w:t>problem is that route changes are not shared, not how routes are planned.</w:t>
+      </w:r>
+    </w:p>
+    <w:p>
+      <w:pPr>
+        <w:pStyle w:val="ListParagraph"/>
+        <w:numPr>
+          <w:ilvl w:val="0"/>
+          <w:numId w:val="4"/>
+        </w:numPr>
+      </w:pPr>
+      <w:r>
+        <w:rPr>
+          <w:b/>
+          <w:bCs/>
+        </w:rPr>
+        <w:t>Live vehicle tracking</w:t>
+      </w:r>
+      <w:r>
+        <w:t>: stop status already shows if the van is late or not coming.</w:t>
+      </w:r>
+    </w:p>
+    <w:p>
+      <w:pPr>
+        <w:pStyle w:val="ListParagraph"/>
+        <w:numPr>
+          <w:ilvl w:val="0"/>
+          <w:numId w:val="4"/>
+        </w:numPr>
+      </w:pPr>
+      <w:r>
+        <w:rPr>
+          <w:b/>
+          <w:bCs/>
+        </w:rPr>
+        <w:t>Social media and noticeboards:</w:t>
+      </w:r>
+      <w:r>
+        <w:t xml:space="preserve"> Staff do not want to publish borrower information.</w:t>
+      </w:r>
+    </w:p>
+    <w:p/>
+    <w:p/>
+    <w:p>
+      <w:pPr>
+        <w:pStyle w:val="Heading2"/>
+        <w:numPr>
+          <w:ilvl w:val="1"/>
+          <w:numId w:val="1"/>
+        </w:numPr>
+      </w:pPr>
+      <w:r>
+        <w:t>Dependencies</w:t>
+      </w:r>
+      <w:r>
+        <w:t xml:space="preserve">, </w:t>
+      </w:r>
+      <w:r>
+        <w:t>Rules</w:t>
+      </w:r>
+      <w:r>
+        <w:t xml:space="preserve"> and </w:t>
+      </w:r>
+      <w:r>
+        <w:t>Constraints</w:t>
+      </w:r>
+    </w:p>
+    <w:tbl>
+      <w:tblPr>
+        <w:tblStyle w:val="PlainTable1"/>
+        <w:tblW w:w="0" w:type="auto"/>
+        <w:tblLook w:val="04A0" w:firstRow="1" w:lastRow="0" w:firstColumn="1" w:lastColumn="0" w:noHBand="0" w:noVBand="1"/>
+      </w:tblPr>
+      <w:tblGrid>
+        <w:gridCol w:w="3005"/>
+        <w:gridCol w:w="3005"/>
+        <w:gridCol w:w="3006"/>
+      </w:tblGrid>
+      <w:tr>
+        <w:trPr>
+          <w:cnfStyle w:val="100000000000" w:firstRow="1" w:lastRow="0" w:firstColumn="0" w:lastColumn="0" w:oddVBand="0" w:evenVBand="0" w:oddHBand="0" w:evenHBand="0" w:firstRowFirstColumn="0" w:firstRowLastColumn="0" w:lastRowFirstColumn="0" w:lastRowLastColumn="0"/>
+        </w:trPr>
+        <w:tc>
+          <w:tcPr>
+            <w:cnfStyle w:val="001000000000" w:firstRow="0" w:lastRow="0" w:firstColumn="1" w:lastColumn="0" w:oddVBand="0" w:evenVBand="0" w:oddHBand="0" w:evenHBand="0" w:firstRowFirstColumn="0" w:firstRowLastColumn="0" w:lastRowFirstColumn="0" w:lastRowLastColumn="0"/>
+            <w:tcW w:w="3005" w:type="dxa"/>
+          </w:tcPr>
+          <w:p>
+            <w:pPr>
+              <w:pStyle w:val="ListParagraph"/>
+              <w:ind w:left="0"/>
+            </w:pPr>
+            <w:r>
+              <w:t>Type</w:t>
+            </w:r>
+          </w:p>
+        </w:tc>
+        <w:tc>
+          <w:tcPr>
+            <w:tcW w:w="3005" w:type="dxa"/>
+          </w:tcPr>
+          <w:p>
+            <w:pPr>
+              <w:pStyle w:val="ListParagraph"/>
+              <w:ind w:left="0"/>
+              <w:cnfStyle w:val="100000000000" w:firstRow="1" w:lastRow="0" w:firstColumn="0" w:lastColumn="0" w:oddVBand="0" w:evenVBand="0" w:oddHBand="0" w:evenHBand="0" w:firstRowFirstColumn="0" w:firstRowLastColumn="0" w:lastRowFirstColumn="0" w:lastRowLastColumn="0"/>
+            </w:pPr>
+            <w:r>
+              <w:t>Worked example</w:t>
+            </w:r>
+          </w:p>
+        </w:tc>
+        <w:tc>
+          <w:tcPr>
+            <w:tcW w:w="3006" w:type="dxa"/>
+          </w:tcPr>
+          <w:p>
+            <w:pPr>
+              <w:pStyle w:val="ListParagraph"/>
+              <w:ind w:left="0"/>
+              <w:cnfStyle w:val="100000000000" w:firstRow="1" w:lastRow="0" w:firstColumn="0" w:lastColumn="0" w:oddVBand="0" w:evenVBand="0" w:oddHBand="0" w:evenHBand="0" w:firstRowFirstColumn="0" w:firstRowLastColumn="0" w:lastRowFirstColumn="0" w:lastRowLastColumn="0"/>
+            </w:pPr>
+            <w:r>
+              <w:t>Explanation</w:t>
+            </w:r>
           </w:p>
         </w:tc>
       </w:tr>
@@ -2443,18 +3481,46 @@
         <w:tc>
           <w:tcPr>
             <w:cnfStyle w:val="001000000000" w:firstRow="0" w:lastRow="0" w:firstColumn="1" w:lastColumn="0" w:oddVBand="0" w:evenVBand="0" w:oddHBand="0" w:evenHBand="0" w:firstRowFirstColumn="0" w:firstRowLastColumn="0" w:lastRowFirstColumn="0" w:lastRowLastColumn="0"/>
-            <w:tcW w:w="4508" w:type="dxa"/>
-          </w:tcPr>
-          <w:p/>
-        </w:tc>
-        <w:tc>
-          <w:tcPr>
-            <w:tcW w:w="4508" w:type="dxa"/>
-          </w:tcPr>
-          <w:p>
-            <w:pPr>
+            <w:tcW w:w="3005" w:type="dxa"/>
+          </w:tcPr>
+          <w:p>
+            <w:pPr>
+              <w:pStyle w:val="ListParagraph"/>
+              <w:ind w:left="0"/>
+            </w:pPr>
+            <w:r>
+              <w:t>Assumption</w:t>
+            </w:r>
+          </w:p>
+        </w:tc>
+        <w:tc>
+          <w:tcPr>
+            <w:tcW w:w="3005" w:type="dxa"/>
+          </w:tcPr>
+          <w:p>
+            <w:pPr>
+              <w:pStyle w:val="ListParagraph"/>
+              <w:ind w:left="0"/>
               <w:cnfStyle w:val="000000100000" w:firstRow="0" w:lastRow="0" w:firstColumn="0" w:lastColumn="0" w:oddVBand="0" w:evenVBand="0" w:oddHBand="1" w:evenHBand="0" w:firstRowFirstColumn="0" w:firstRowLastColumn="0" w:lastRowFirstColumn="0" w:lastRowLastColumn="0"/>
             </w:pPr>
+            <w:r>
+              <w:t>Every borrower and item has a unique identifier in the library system.</w:t>
+            </w:r>
+          </w:p>
+        </w:tc>
+        <w:tc>
+          <w:tcPr>
+            <w:tcW w:w="3006" w:type="dxa"/>
+          </w:tcPr>
+          <w:p>
+            <w:pPr>
+              <w:pStyle w:val="ListParagraph"/>
+              <w:ind w:left="0"/>
+              <w:cnfStyle w:val="000000100000" w:firstRow="0" w:lastRow="0" w:firstColumn="0" w:lastColumn="0" w:oddVBand="0" w:evenVBand="0" w:oddHBand="1" w:evenHBand="0" w:firstRowFirstColumn="0" w:firstRowLastColumn="0" w:lastRowFirstColumn="0" w:lastRowLastColumn="0"/>
+            </w:pPr>
+            <w:r>
+              <w:t>Believed to be true but must be verified.</w:t>
+            </w:r>
           </w:p>
         </w:tc>
       </w:tr>
@@ -2462,27 +3528,768 @@
         <w:tc>
           <w:tcPr>
             <w:cnfStyle w:val="001000000000" w:firstRow="0" w:lastRow="0" w:firstColumn="1" w:lastColumn="0" w:oddVBand="0" w:evenVBand="0" w:oddHBand="0" w:evenHBand="0" w:firstRowFirstColumn="0" w:firstRowLastColumn="0" w:lastRowFirstColumn="0" w:lastRowLastColumn="0"/>
-            <w:tcW w:w="4508" w:type="dxa"/>
-          </w:tcPr>
-          <w:p/>
-        </w:tc>
-        <w:tc>
-          <w:tcPr>
-            <w:tcW w:w="4508" w:type="dxa"/>
-          </w:tcPr>
-          <w:p>
-            <w:pPr>
+            <w:tcW w:w="3005" w:type="dxa"/>
+          </w:tcPr>
+          <w:p>
+            <w:pPr>
+              <w:pStyle w:val="ListParagraph"/>
+              <w:ind w:left="0"/>
+            </w:pPr>
+            <w:r>
+              <w:t>Assumption</w:t>
+            </w:r>
+          </w:p>
+        </w:tc>
+        <w:tc>
+          <w:tcPr>
+            <w:tcW w:w="3005" w:type="dxa"/>
+          </w:tcPr>
+          <w:p>
+            <w:pPr>
+              <w:pStyle w:val="ListParagraph"/>
+              <w:ind w:left="0"/>
               <w:cnfStyle w:val="000000000000" w:firstRow="0" w:lastRow="0" w:firstColumn="0" w:lastColumn="0" w:oddVBand="0" w:evenVBand="0" w:oddHBand="0" w:evenHBand="0" w:firstRowFirstColumn="0" w:firstRowLastColumn="0" w:lastRowFirstColumn="0" w:lastRowLastColumn="0"/>
             </w:pPr>
+            <w:r>
+              <w:t>The library system can accept loans and returns recorded offline</w:t>
+            </w:r>
+          </w:p>
+        </w:tc>
+        <w:tc>
+          <w:tcPr>
+            <w:tcW w:w="3006" w:type="dxa"/>
+          </w:tcPr>
+          <w:p>
+            <w:pPr>
+              <w:pStyle w:val="ListParagraph"/>
+              <w:ind w:left="0"/>
+              <w:cnfStyle w:val="000000000000" w:firstRow="0" w:lastRow="0" w:firstColumn="0" w:lastColumn="0" w:oddVBand="0" w:evenVBand="0" w:oddHBand="0" w:evenHBand="0" w:firstRowFirstColumn="0" w:firstRowLastColumn="0" w:lastRowFirstColumn="0" w:lastRowLastColumn="0"/>
+            </w:pPr>
+            <w:r>
+              <w:t>Requires verification</w:t>
+            </w:r>
+          </w:p>
+        </w:tc>
+      </w:tr>
+      <w:tr>
+        <w:trPr>
+          <w:cnfStyle w:val="000000100000" w:firstRow="0" w:lastRow="0" w:firstColumn="0" w:lastColumn="0" w:oddVBand="0" w:evenVBand="0" w:oddHBand="1" w:evenHBand="0" w:firstRowFirstColumn="0" w:firstRowLastColumn="0" w:lastRowFirstColumn="0" w:lastRowLastColumn="0"/>
+        </w:trPr>
+        <w:tc>
+          <w:tcPr>
+            <w:cnfStyle w:val="001000000000" w:firstRow="0" w:lastRow="0" w:firstColumn="1" w:lastColumn="0" w:oddVBand="0" w:evenVBand="0" w:oddHBand="0" w:evenHBand="0" w:firstRowFirstColumn="0" w:firstRowLastColumn="0" w:lastRowFirstColumn="0" w:lastRowLastColumn="0"/>
+            <w:tcW w:w="3005" w:type="dxa"/>
+          </w:tcPr>
+          <w:p>
+            <w:pPr>
+              <w:pStyle w:val="ListParagraph"/>
+              <w:ind w:left="0"/>
+            </w:pPr>
+            <w:r>
+              <w:t>Constraint</w:t>
+            </w:r>
+          </w:p>
+        </w:tc>
+        <w:tc>
+          <w:tcPr>
+            <w:tcW w:w="3005" w:type="dxa"/>
+          </w:tcPr>
+          <w:p>
+            <w:pPr>
+              <w:pStyle w:val="ListParagraph"/>
+              <w:ind w:left="0"/>
+              <w:cnfStyle w:val="000000100000" w:firstRow="0" w:lastRow="0" w:firstColumn="0" w:lastColumn="0" w:oddVBand="0" w:evenVBand="0" w:oddHBand="1" w:evenHBand="0" w:firstRowFirstColumn="0" w:firstRowLastColumn="0" w:lastRowFirstColumn="0" w:lastRowLastColumn="0"/>
+            </w:pPr>
+            <w:r>
+              <w:t>The wider library management system will not be replaced</w:t>
+            </w:r>
+          </w:p>
+        </w:tc>
+        <w:tc>
+          <w:tcPr>
+            <w:tcW w:w="3006" w:type="dxa"/>
+          </w:tcPr>
+          <w:p>
+            <w:pPr>
+              <w:pStyle w:val="ListParagraph"/>
+              <w:ind w:left="0"/>
+              <w:cnfStyle w:val="000000100000" w:firstRow="0" w:lastRow="0" w:firstColumn="0" w:lastColumn="0" w:oddVBand="0" w:evenVBand="0" w:oddHBand="1" w:evenHBand="0" w:firstRowFirstColumn="0" w:firstRowLastColumn="0" w:lastRowFirstColumn="0" w:lastRowLastColumn="0"/>
+            </w:pPr>
+            <w:r>
+              <w:t>Restricts the solution</w:t>
+            </w:r>
+          </w:p>
+        </w:tc>
+      </w:tr>
+      <w:tr>
+        <w:tc>
+          <w:tcPr>
+            <w:cnfStyle w:val="001000000000" w:firstRow="0" w:lastRow="0" w:firstColumn="1" w:lastColumn="0" w:oddVBand="0" w:evenVBand="0" w:oddHBand="0" w:evenHBand="0" w:firstRowFirstColumn="0" w:firstRowLastColumn="0" w:lastRowFirstColumn="0" w:lastRowLastColumn="0"/>
+            <w:tcW w:w="3005" w:type="dxa"/>
+          </w:tcPr>
+          <w:p>
+            <w:pPr>
+              <w:pStyle w:val="ListParagraph"/>
+              <w:ind w:left="0"/>
+            </w:pPr>
+            <w:r>
+              <w:t>Constraint</w:t>
+            </w:r>
+          </w:p>
+        </w:tc>
+        <w:tc>
+          <w:tcPr>
+            <w:tcW w:w="3005" w:type="dxa"/>
+          </w:tcPr>
+          <w:p>
+            <w:pPr>
+              <w:pStyle w:val="ListParagraph"/>
+              <w:ind w:left="0"/>
+              <w:cnfStyle w:val="000000000000" w:firstRow="0" w:lastRow="0" w:firstColumn="0" w:lastColumn="0" w:oddVBand="0" w:evenVBand="0" w:oddHBand="0" w:evenHBand="0" w:firstRowFirstColumn="0" w:firstRowLastColumn="0" w:lastRowFirstColumn="0" w:lastRowLastColumn="0"/>
+            </w:pPr>
+            <w:r>
+              <w:t>Mobile connectivity is unreliable in some areas.</w:t>
+            </w:r>
+          </w:p>
+        </w:tc>
+        <w:tc>
+          <w:tcPr>
+            <w:tcW w:w="3006" w:type="dxa"/>
+          </w:tcPr>
+          <w:p>
+            <w:pPr>
+              <w:pStyle w:val="ListParagraph"/>
+              <w:ind w:left="0"/>
+              <w:cnfStyle w:val="000000000000" w:firstRow="0" w:lastRow="0" w:firstColumn="0" w:lastColumn="0" w:oddVBand="0" w:evenVBand="0" w:oddHBand="0" w:evenHBand="0" w:firstRowFirstColumn="0" w:firstRowLastColumn="0" w:lastRowFirstColumn="0" w:lastRowLastColumn="0"/>
+            </w:pPr>
+            <w:r>
+              <w:t>Restricts the solution</w:t>
+            </w:r>
+          </w:p>
+        </w:tc>
+      </w:tr>
+      <w:tr>
+        <w:trPr>
+          <w:cnfStyle w:val="000000100000" w:firstRow="0" w:lastRow="0" w:firstColumn="0" w:lastColumn="0" w:oddVBand="0" w:evenVBand="0" w:oddHBand="1" w:evenHBand="0" w:firstRowFirstColumn="0" w:firstRowLastColumn="0" w:lastRowFirstColumn="0" w:lastRowLastColumn="0"/>
+        </w:trPr>
+        <w:tc>
+          <w:tcPr>
+            <w:cnfStyle w:val="001000000000" w:firstRow="0" w:lastRow="0" w:firstColumn="1" w:lastColumn="0" w:oddVBand="0" w:evenVBand="0" w:oddHBand="0" w:evenHBand="0" w:firstRowFirstColumn="0" w:firstRowLastColumn="0" w:lastRowFirstColumn="0" w:lastRowLastColumn="0"/>
+            <w:tcW w:w="3005" w:type="dxa"/>
+          </w:tcPr>
+          <w:p>
+            <w:pPr>
+              <w:pStyle w:val="ListParagraph"/>
+              <w:ind w:left="0"/>
+            </w:pPr>
+            <w:r>
+              <w:t>Constraint</w:t>
+            </w:r>
+          </w:p>
+        </w:tc>
+        <w:tc>
+          <w:tcPr>
+            <w:tcW w:w="3005" w:type="dxa"/>
+          </w:tcPr>
+          <w:p>
+            <w:pPr>
+              <w:pStyle w:val="ListParagraph"/>
+              <w:ind w:left="0"/>
+              <w:cnfStyle w:val="000000100000" w:firstRow="0" w:lastRow="0" w:firstColumn="0" w:lastColumn="0" w:oddVBand="0" w:evenVBand="0" w:oddHBand="1" w:evenHBand="0" w:firstRowFirstColumn="0" w:firstRowLastColumn="0" w:lastRowFirstColumn="0" w:lastRowLastColumn="0"/>
+            </w:pPr>
+            <w:r>
+              <w:t>The initial scope is the two vehicles</w:t>
+            </w:r>
+            <w:r>
+              <w:t xml:space="preserve"> and there</w:t>
+            </w:r>
+            <w:r>
+              <w:t xml:space="preserve"> community stops</w:t>
+            </w:r>
+          </w:p>
+        </w:tc>
+        <w:tc>
+          <w:tcPr>
+            <w:tcW w:w="3006" w:type="dxa"/>
+          </w:tcPr>
+          <w:p>
+            <w:pPr>
+              <w:pStyle w:val="ListParagraph"/>
+              <w:ind w:left="0"/>
+              <w:cnfStyle w:val="000000100000" w:firstRow="0" w:lastRow="0" w:firstColumn="0" w:lastColumn="0" w:oddVBand="0" w:evenVBand="0" w:oddHBand="1" w:evenHBand="0" w:firstRowFirstColumn="0" w:firstRowLastColumn="0" w:lastRowFirstColumn="0" w:lastRowLastColumn="0"/>
+            </w:pPr>
+            <w:r>
+              <w:t>Restricts the boundary</w:t>
+            </w:r>
           </w:p>
         </w:tc>
       </w:tr>
     </w:tbl>
     <w:p>
       <w:pPr>
+        <w:pStyle w:val="ListParagraph"/>
+      </w:pPr>
+    </w:p>
+    <w:p>
+      <w:pPr>
+        <w:pStyle w:val="ListParagraph"/>
+      </w:pPr>
+    </w:p>
+    <w:p>
+      <w:pPr>
+        <w:pStyle w:val="ListParagraph"/>
+      </w:pPr>
+    </w:p>
+    <w:p>
+      <w:pPr>
+        <w:pStyle w:val="ListParagraph"/>
+      </w:pPr>
+    </w:p>
+    <w:p>
+      <w:pPr>
+        <w:pStyle w:val="ListParagraph"/>
+      </w:pPr>
+    </w:p>
+    <w:p>
+      <w:pPr>
+        <w:pStyle w:val="ListParagraph"/>
+      </w:pPr>
+    </w:p>
+    <w:p>
+      <w:pPr>
+        <w:pStyle w:val="ListParagraph"/>
+      </w:pPr>
+    </w:p>
+    <w:p>
+      <w:pPr>
+        <w:pStyle w:val="ListParagraph"/>
+      </w:pPr>
+    </w:p>
+    <w:p>
+      <w:pPr>
+        <w:pStyle w:val="ListParagraph"/>
+      </w:pPr>
+    </w:p>
+    <w:p>
+      <w:pPr>
+        <w:pStyle w:val="Heading2"/>
+        <w:numPr>
+          <w:ilvl w:val="1"/>
+          <w:numId w:val="1"/>
+        </w:numPr>
+      </w:pPr>
+      <w:r>
+        <w:lastRenderedPageBreak/>
+        <w:t>System Boundary</w:t>
+      </w:r>
+    </w:p>
+    <w:tbl>
+      <w:tblPr>
+        <w:tblStyle w:val="PlainTable1"/>
+        <w:tblW w:w="0" w:type="auto"/>
+        <w:tblLook w:val="04A0" w:firstRow="1" w:lastRow="0" w:firstColumn="1" w:lastColumn="0" w:noHBand="0" w:noVBand="1"/>
+      </w:tblPr>
+      <w:tblGrid>
+        <w:gridCol w:w="4508"/>
+        <w:gridCol w:w="4508"/>
+      </w:tblGrid>
+      <w:tr>
+        <w:trPr>
+          <w:cnfStyle w:val="100000000000" w:firstRow="1" w:lastRow="0" w:firstColumn="0" w:lastColumn="0" w:oddVBand="0" w:evenVBand="0" w:oddHBand="0" w:evenHBand="0" w:firstRowFirstColumn="0" w:firstRowLastColumn="0" w:lastRowFirstColumn="0" w:lastRowLastColumn="0"/>
+        </w:trPr>
+        <w:tc>
+          <w:tcPr>
+            <w:cnfStyle w:val="001000000000" w:firstRow="0" w:lastRow="0" w:firstColumn="1" w:lastColumn="0" w:oddVBand="0" w:evenVBand="0" w:oddHBand="0" w:evenHBand="0" w:firstRowFirstColumn="0" w:firstRowLastColumn="0" w:lastRowFirstColumn="0" w:lastRowLastColumn="0"/>
+            <w:tcW w:w="4508" w:type="dxa"/>
+          </w:tcPr>
+          <w:p>
+            <w:r>
+              <w:t>Element</w:t>
+            </w:r>
+          </w:p>
+        </w:tc>
+        <w:tc>
+          <w:tcPr>
+            <w:tcW w:w="4508" w:type="dxa"/>
+          </w:tcPr>
+          <w:p>
+            <w:pPr>
+              <w:cnfStyle w:val="100000000000" w:firstRow="1" w:lastRow="0" w:firstColumn="0" w:lastColumn="0" w:oddVBand="0" w:evenVBand="0" w:oddHBand="0" w:evenHBand="0" w:firstRowFirstColumn="0" w:firstRowLastColumn="0" w:lastRowFirstColumn="0" w:lastRowLastColumn="0"/>
+            </w:pPr>
+            <w:r>
+              <w:t>Notation and meaning</w:t>
+            </w:r>
+          </w:p>
+        </w:tc>
+      </w:tr>
+      <w:tr>
+        <w:trPr>
+          <w:cnfStyle w:val="000000100000" w:firstRow="0" w:lastRow="0" w:firstColumn="0" w:lastColumn="0" w:oddVBand="0" w:evenVBand="0" w:oddHBand="1" w:evenHBand="0" w:firstRowFirstColumn="0" w:firstRowLastColumn="0" w:lastRowFirstColumn="0" w:lastRowLastColumn="0"/>
+        </w:trPr>
+        <w:tc>
+          <w:tcPr>
+            <w:cnfStyle w:val="001000000000" w:firstRow="0" w:lastRow="0" w:firstColumn="1" w:lastColumn="0" w:oddVBand="0" w:evenVBand="0" w:oddHBand="0" w:evenHBand="0" w:firstRowFirstColumn="0" w:firstRowLastColumn="0" w:lastRowFirstColumn="0" w:lastRowLastColumn="0"/>
+            <w:tcW w:w="4508" w:type="dxa"/>
+          </w:tcPr>
+          <w:p>
+            <w:pPr>
+              <w:rPr>
+                <w:b w:val="0"/>
+                <w:bCs w:val="0"/>
+              </w:rPr>
+            </w:pPr>
+            <w:r>
+              <w:rPr>
+                <w:b w:val="0"/>
+                <w:bCs w:val="0"/>
+              </w:rPr>
+              <w:t xml:space="preserve">System </w:t>
+            </w:r>
+          </w:p>
+        </w:tc>
+        <w:tc>
+          <w:tcPr>
+            <w:tcW w:w="4508" w:type="dxa"/>
+          </w:tcPr>
+          <w:p>
+            <w:pPr>
+              <w:cnfStyle w:val="000000100000" w:firstRow="0" w:lastRow="0" w:firstColumn="0" w:lastColumn="0" w:oddVBand="0" w:evenVBand="0" w:oddHBand="1" w:evenHBand="0" w:firstRowFirstColumn="0" w:firstRowLastColumn="0" w:lastRowFirstColumn="0" w:lastRowLastColumn="0"/>
+            </w:pPr>
+            <w:r>
+              <w:t>Named rectangle containing the use cases for the Mobile Library support service</w:t>
+            </w:r>
+          </w:p>
+        </w:tc>
+      </w:tr>
+      <w:tr>
+        <w:tc>
+          <w:tcPr>
+            <w:cnfStyle w:val="001000000000" w:firstRow="0" w:lastRow="0" w:firstColumn="1" w:lastColumn="0" w:oddVBand="0" w:evenVBand="0" w:oddHBand="0" w:evenHBand="0" w:firstRowFirstColumn="0" w:firstRowLastColumn="0" w:lastRowFirstColumn="0" w:lastRowLastColumn="0"/>
+            <w:tcW w:w="4508" w:type="dxa"/>
+          </w:tcPr>
+          <w:p>
+            <w:pPr>
+              <w:rPr>
+                <w:b w:val="0"/>
+                <w:bCs w:val="0"/>
+              </w:rPr>
+            </w:pPr>
+            <w:r>
+              <w:rPr>
+                <w:b w:val="0"/>
+                <w:bCs w:val="0"/>
+              </w:rPr>
+              <w:t>Actor</w:t>
+            </w:r>
+          </w:p>
+        </w:tc>
+        <w:tc>
+          <w:tcPr>
+            <w:tcW w:w="4508" w:type="dxa"/>
+          </w:tcPr>
+          <w:p>
+            <w:pPr>
+              <w:cnfStyle w:val="000000000000" w:firstRow="0" w:lastRow="0" w:firstColumn="0" w:lastColumn="0" w:oddVBand="0" w:evenVBand="0" w:oddHBand="0" w:evenHBand="0" w:firstRowFirstColumn="0" w:firstRowLastColumn="0" w:lastRowFirstColumn="0" w:lastRowLastColumn="0"/>
+            </w:pPr>
+            <w:r>
+              <w:t>External role or system placed outside the boundary: route coordinator, mobile</w:t>
+            </w:r>
+            <w:r>
+              <w:t xml:space="preserve"> </w:t>
+            </w:r>
+            <w:r>
+              <w:t>library staff</w:t>
+            </w:r>
+            <w:r>
+              <w:t xml:space="preserve"> member, driver, branch staff member, community coordinator, library management system</w:t>
+            </w:r>
+          </w:p>
+        </w:tc>
+      </w:tr>
+      <w:tr>
+        <w:trPr>
+          <w:cnfStyle w:val="000000100000" w:firstRow="0" w:lastRow="0" w:firstColumn="0" w:lastColumn="0" w:oddVBand="0" w:evenVBand="0" w:oddHBand="1" w:evenHBand="0" w:firstRowFirstColumn="0" w:firstRowLastColumn="0" w:lastRowFirstColumn="0" w:lastRowLastColumn="0"/>
+        </w:trPr>
+        <w:tc>
+          <w:tcPr>
+            <w:cnfStyle w:val="001000000000" w:firstRow="0" w:lastRow="0" w:firstColumn="1" w:lastColumn="0" w:oddVBand="0" w:evenVBand="0" w:oddHBand="0" w:evenHBand="0" w:firstRowFirstColumn="0" w:firstRowLastColumn="0" w:lastRowFirstColumn="0" w:lastRowLastColumn="0"/>
+            <w:tcW w:w="4508" w:type="dxa"/>
+          </w:tcPr>
+          <w:p>
+            <w:pPr>
+              <w:rPr>
+                <w:b w:val="0"/>
+                <w:bCs w:val="0"/>
+              </w:rPr>
+            </w:pPr>
+            <w:r>
+              <w:rPr>
+                <w:b w:val="0"/>
+                <w:bCs w:val="0"/>
+              </w:rPr>
+              <w:t>Use case</w:t>
+            </w:r>
+          </w:p>
+        </w:tc>
+        <w:tc>
+          <w:tcPr>
+            <w:tcW w:w="4508" w:type="dxa"/>
+          </w:tcPr>
+          <w:p>
+            <w:pPr>
+              <w:cnfStyle w:val="000000100000" w:firstRow="0" w:lastRow="0" w:firstColumn="0" w:lastColumn="0" w:oddVBand="0" w:evenVBand="0" w:oddHBand="1" w:evenHBand="0" w:firstRowFirstColumn="0" w:firstRowLastColumn="0" w:lastRowFirstColumn="0" w:lastRowLastColumn="0"/>
+            </w:pPr>
+            <w:r>
+              <w:t>Oval containing a verb-object actor goal, inside the boundary, for example Record request or record visit status</w:t>
+            </w:r>
+          </w:p>
+        </w:tc>
+      </w:tr>
+      <w:tr>
+        <w:tc>
+          <w:tcPr>
+            <w:cnfStyle w:val="001000000000" w:firstRow="0" w:lastRow="0" w:firstColumn="1" w:lastColumn="0" w:oddVBand="0" w:evenVBand="0" w:oddHBand="0" w:evenHBand="0" w:firstRowFirstColumn="0" w:firstRowLastColumn="0" w:lastRowFirstColumn="0" w:lastRowLastColumn="0"/>
+            <w:tcW w:w="4508" w:type="dxa"/>
+          </w:tcPr>
+          <w:p>
+            <w:pPr>
+              <w:rPr>
+                <w:b w:val="0"/>
+                <w:bCs w:val="0"/>
+              </w:rPr>
+            </w:pPr>
+            <w:r>
+              <w:rPr>
+                <w:b w:val="0"/>
+                <w:bCs w:val="0"/>
+              </w:rPr>
+              <w:t>Association</w:t>
+            </w:r>
+          </w:p>
+        </w:tc>
+        <w:tc>
+          <w:tcPr>
+            <w:tcW w:w="4508" w:type="dxa"/>
+          </w:tcPr>
+          <w:p>
+            <w:pPr>
+              <w:cnfStyle w:val="000000000000" w:firstRow="0" w:lastRow="0" w:firstColumn="0" w:lastColumn="0" w:oddVBand="0" w:evenVBand="0" w:oddHBand="0" w:evenHBand="0" w:firstRowFirstColumn="0" w:firstRowLastColumn="0" w:lastRowFirstColumn="0" w:lastRowLastColumn="0"/>
+            </w:pPr>
+            <w:r>
+              <w:t>Simple line showing actor participation, not timing or message order</w:t>
+            </w:r>
+          </w:p>
+        </w:tc>
+      </w:tr>
+    </w:tbl>
+    <w:p>
+      <w:pPr>
         <w:ind w:left="360"/>
       </w:pPr>
     </w:p>
+    <w:p>
+      <w:pPr>
+        <w:pStyle w:val="Heading1"/>
+        <w:numPr>
+          <w:ilvl w:val="0"/>
+          <w:numId w:val="1"/>
+        </w:numPr>
+      </w:pPr>
+      <w:r>
+        <w:t xml:space="preserve"> Stakeholder and actor catalogue</w:t>
+      </w:r>
+    </w:p>
+    <w:p>
+      <w:r>
+        <w:t>A stakeholder is any person, group or organisation that affects the system or is effected by it. An actor is an external role or system that directly interacts with the system or is effected by it. An actor is an external role or system that directly interacts with the system boundary. A role may be both, but the terms are not the same.</w:t>
+      </w:r>
+    </w:p>
+    <w:tbl>
+      <w:tblPr>
+        <w:tblStyle w:val="PlainTable1"/>
+        <w:tblW w:w="0" w:type="auto"/>
+        <w:tblLook w:val="04A0" w:firstRow="1" w:lastRow="0" w:firstColumn="1" w:lastColumn="0" w:noHBand="0" w:noVBand="1"/>
+      </w:tblPr>
+      <w:tblGrid>
+        <w:gridCol w:w="3005"/>
+        <w:gridCol w:w="3005"/>
+        <w:gridCol w:w="3006"/>
+      </w:tblGrid>
+      <w:tr>
+        <w:trPr>
+          <w:cnfStyle w:val="100000000000" w:firstRow="1" w:lastRow="0" w:firstColumn="0" w:lastColumn="0" w:oddVBand="0" w:evenVBand="0" w:oddHBand="0" w:evenHBand="0" w:firstRowFirstColumn="0" w:firstRowLastColumn="0" w:lastRowFirstColumn="0" w:lastRowLastColumn="0"/>
+        </w:trPr>
+        <w:tc>
+          <w:tcPr>
+            <w:cnfStyle w:val="001000000000" w:firstRow="0" w:lastRow="0" w:firstColumn="1" w:lastColumn="0" w:oddVBand="0" w:evenVBand="0" w:oddHBand="0" w:evenHBand="0" w:firstRowFirstColumn="0" w:firstRowLastColumn="0" w:lastRowFirstColumn="0" w:lastRowLastColumn="0"/>
+            <w:tcW w:w="3005" w:type="dxa"/>
+          </w:tcPr>
+          <w:p>
+            <w:r>
+              <w:t>Stakeholder category</w:t>
+            </w:r>
+          </w:p>
+        </w:tc>
+        <w:tc>
+          <w:tcPr>
+            <w:tcW w:w="3005" w:type="dxa"/>
+          </w:tcPr>
+          <w:p>
+            <w:pPr>
+              <w:cnfStyle w:val="100000000000" w:firstRow="1" w:lastRow="0" w:firstColumn="0" w:lastColumn="0" w:oddVBand="0" w:evenVBand="0" w:oddHBand="0" w:evenHBand="0" w:firstRowFirstColumn="0" w:firstRowLastColumn="0" w:lastRowFirstColumn="0" w:lastRowLastColumn="0"/>
+            </w:pPr>
+            <w:r>
+              <w:t>Guiding question</w:t>
+            </w:r>
+          </w:p>
+        </w:tc>
+        <w:tc>
+          <w:tcPr>
+            <w:tcW w:w="3006" w:type="dxa"/>
+          </w:tcPr>
+          <w:p>
+            <w:pPr>
+              <w:cnfStyle w:val="100000000000" w:firstRow="1" w:lastRow="0" w:firstColumn="0" w:lastColumn="0" w:oddVBand="0" w:evenVBand="0" w:oddHBand="0" w:evenHBand="0" w:firstRowFirstColumn="0" w:firstRowLastColumn="0" w:lastRowFirstColumn="0" w:lastRowLastColumn="0"/>
+            </w:pPr>
+            <w:r>
+              <w:t>Typical example</w:t>
+            </w:r>
+          </w:p>
+        </w:tc>
+      </w:tr>
+      <w:tr>
+        <w:trPr>
+          <w:cnfStyle w:val="000000100000" w:firstRow="0" w:lastRow="0" w:firstColumn="0" w:lastColumn="0" w:oddVBand="0" w:evenVBand="0" w:oddHBand="1" w:evenHBand="0" w:firstRowFirstColumn="0" w:firstRowLastColumn="0" w:lastRowFirstColumn="0" w:lastRowLastColumn="0"/>
+        </w:trPr>
+        <w:tc>
+          <w:tcPr>
+            <w:cnfStyle w:val="001000000000" w:firstRow="0" w:lastRow="0" w:firstColumn="1" w:lastColumn="0" w:oddVBand="0" w:evenVBand="0" w:oddHBand="0" w:evenHBand="0" w:firstRowFirstColumn="0" w:firstRowLastColumn="0" w:lastRowFirstColumn="0" w:lastRowLastColumn="0"/>
+            <w:tcW w:w="3005" w:type="dxa"/>
+          </w:tcPr>
+          <w:p>
+            <w:pPr>
+              <w:rPr>
+                <w:b w:val="0"/>
+                <w:bCs w:val="0"/>
+              </w:rPr>
+            </w:pPr>
+            <w:r>
+              <w:rPr>
+                <w:b w:val="0"/>
+                <w:bCs w:val="0"/>
+              </w:rPr>
+              <w:t>Primary</w:t>
+            </w:r>
+          </w:p>
+        </w:tc>
+        <w:tc>
+          <w:tcPr>
+            <w:tcW w:w="3005" w:type="dxa"/>
+          </w:tcPr>
+          <w:p>
+            <w:pPr>
+              <w:cnfStyle w:val="000000100000" w:firstRow="0" w:lastRow="0" w:firstColumn="0" w:lastColumn="0" w:oddVBand="0" w:evenVBand="0" w:oddHBand="1" w:evenHBand="0" w:firstRowFirstColumn="0" w:firstRowLastColumn="0" w:lastRowFirstColumn="0" w:lastRowLastColumn="0"/>
+            </w:pPr>
+            <w:r>
+              <w:t>Who seeks value from the service ?</w:t>
+            </w:r>
+          </w:p>
+        </w:tc>
+        <w:tc>
+          <w:tcPr>
+            <w:tcW w:w="3006" w:type="dxa"/>
+          </w:tcPr>
+          <w:p>
+            <w:pPr>
+              <w:cnfStyle w:val="000000100000" w:firstRow="0" w:lastRow="0" w:firstColumn="0" w:lastColumn="0" w:oddVBand="0" w:evenVBand="0" w:oddHBand="1" w:evenHBand="0" w:firstRowFirstColumn="0" w:firstRowLastColumn="0" w:lastRowFirstColumn="0" w:lastRowLastColumn="0"/>
+            </w:pPr>
+            <w:r>
+              <w:t>Borrower, community coordinator</w:t>
+            </w:r>
+          </w:p>
+        </w:tc>
+      </w:tr>
+      <w:tr>
+        <w:tc>
+          <w:tcPr>
+            <w:cnfStyle w:val="001000000000" w:firstRow="0" w:lastRow="0" w:firstColumn="1" w:lastColumn="0" w:oddVBand="0" w:evenVBand="0" w:oddHBand="0" w:evenHBand="0" w:firstRowFirstColumn="0" w:firstRowLastColumn="0" w:lastRowFirstColumn="0" w:lastRowLastColumn="0"/>
+            <w:tcW w:w="3005" w:type="dxa"/>
+          </w:tcPr>
+          <w:p>
+            <w:pPr>
+              <w:rPr>
+                <w:b w:val="0"/>
+                <w:bCs w:val="0"/>
+              </w:rPr>
+            </w:pPr>
+            <w:r>
+              <w:rPr>
+                <w:b w:val="0"/>
+                <w:bCs w:val="0"/>
+              </w:rPr>
+              <w:t>Operational</w:t>
+            </w:r>
+          </w:p>
+        </w:tc>
+        <w:tc>
+          <w:tcPr>
+            <w:tcW w:w="3005" w:type="dxa"/>
+          </w:tcPr>
+          <w:p>
+            <w:pPr>
+              <w:cnfStyle w:val="000000000000" w:firstRow="0" w:lastRow="0" w:firstColumn="0" w:lastColumn="0" w:oddVBand="0" w:evenVBand="0" w:oddHBand="0" w:evenHBand="0" w:firstRowFirstColumn="0" w:firstRowLastColumn="0" w:lastRowFirstColumn="0" w:lastRowLastColumn="0"/>
+            </w:pPr>
+            <w:r>
+              <w:t>Who performs day-to-day work?</w:t>
+            </w:r>
+          </w:p>
+        </w:tc>
+        <w:tc>
+          <w:tcPr>
+            <w:tcW w:w="3006" w:type="dxa"/>
+          </w:tcPr>
+          <w:p>
+            <w:pPr>
+              <w:cnfStyle w:val="000000000000" w:firstRow="0" w:lastRow="0" w:firstColumn="0" w:lastColumn="0" w:oddVBand="0" w:evenVBand="0" w:oddHBand="0" w:evenHBand="0" w:firstRowFirstColumn="0" w:firstRowLastColumn="0" w:lastRowFirstColumn="0" w:lastRowLastColumn="0"/>
+            </w:pPr>
+          </w:p>
+        </w:tc>
+      </w:tr>
+      <w:tr>
+        <w:trPr>
+          <w:cnfStyle w:val="000000100000" w:firstRow="0" w:lastRow="0" w:firstColumn="0" w:lastColumn="0" w:oddVBand="0" w:evenVBand="0" w:oddHBand="1" w:evenHBand="0" w:firstRowFirstColumn="0" w:firstRowLastColumn="0" w:lastRowFirstColumn="0" w:lastRowLastColumn="0"/>
+        </w:trPr>
+        <w:tc>
+          <w:tcPr>
+            <w:cnfStyle w:val="001000000000" w:firstRow="0" w:lastRow="0" w:firstColumn="1" w:lastColumn="0" w:oddVBand="0" w:evenVBand="0" w:oddHBand="0" w:evenHBand="0" w:firstRowFirstColumn="0" w:firstRowLastColumn="0" w:lastRowFirstColumn="0" w:lastRowLastColumn="0"/>
+            <w:tcW w:w="3005" w:type="dxa"/>
+          </w:tcPr>
+          <w:p/>
+        </w:tc>
+        <w:tc>
+          <w:tcPr>
+            <w:tcW w:w="3005" w:type="dxa"/>
+          </w:tcPr>
+          <w:p>
+            <w:pPr>
+              <w:cnfStyle w:val="000000100000" w:firstRow="0" w:lastRow="0" w:firstColumn="0" w:lastColumn="0" w:oddVBand="0" w:evenVBand="0" w:oddHBand="1" w:evenHBand="0" w:firstRowFirstColumn="0" w:firstRowLastColumn="0" w:lastRowFirstColumn="0" w:lastRowLastColumn="0"/>
+            </w:pPr>
+            <w:r>
+              <w:t>Who approves policy or monitors performance?</w:t>
+            </w:r>
+          </w:p>
+        </w:tc>
+        <w:tc>
+          <w:tcPr>
+            <w:tcW w:w="3006" w:type="dxa"/>
+          </w:tcPr>
+          <w:p>
+            <w:pPr>
+              <w:cnfStyle w:val="000000100000" w:firstRow="0" w:lastRow="0" w:firstColumn="0" w:lastColumn="0" w:oddVBand="0" w:evenVBand="0" w:oddHBand="1" w:evenHBand="0" w:firstRowFirstColumn="0" w:firstRowLastColumn="0" w:lastRowFirstColumn="0" w:lastRowLastColumn="0"/>
+            </w:pPr>
+          </w:p>
+        </w:tc>
+      </w:tr>
+      <w:tr>
+        <w:tc>
+          <w:tcPr>
+            <w:cnfStyle w:val="001000000000" w:firstRow="0" w:lastRow="0" w:firstColumn="1" w:lastColumn="0" w:oddVBand="0" w:evenVBand="0" w:oddHBand="0" w:evenHBand="0" w:firstRowFirstColumn="0" w:firstRowLastColumn="0" w:lastRowFirstColumn="0" w:lastRowLastColumn="0"/>
+            <w:tcW w:w="3005" w:type="dxa"/>
+          </w:tcPr>
+          <w:p/>
+        </w:tc>
+        <w:tc>
+          <w:tcPr>
+            <w:tcW w:w="3005" w:type="dxa"/>
+          </w:tcPr>
+          <w:p>
+            <w:pPr>
+              <w:cnfStyle w:val="000000000000" w:firstRow="0" w:lastRow="0" w:firstColumn="0" w:lastColumn="0" w:oddVBand="0" w:evenVBand="0" w:oddHBand="0" w:evenHBand="0" w:firstRowFirstColumn="0" w:firstRowLastColumn="0" w:lastRowFirstColumn="0" w:lastRowLastColumn="0"/>
+            </w:pPr>
+            <w:r>
+              <w:t>Who maintains access or operation?</w:t>
+            </w:r>
+          </w:p>
+        </w:tc>
+        <w:tc>
+          <w:tcPr>
+            <w:tcW w:w="3006" w:type="dxa"/>
+          </w:tcPr>
+          <w:p>
+            <w:pPr>
+              <w:cnfStyle w:val="000000000000" w:firstRow="0" w:lastRow="0" w:firstColumn="0" w:lastColumn="0" w:oddVBand="0" w:evenVBand="0" w:oddHBand="0" w:evenHBand="0" w:firstRowFirstColumn="0" w:firstRowLastColumn="0" w:lastRowFirstColumn="0" w:lastRowLastColumn="0"/>
+            </w:pPr>
+          </w:p>
+        </w:tc>
+      </w:tr>
+      <w:tr>
+        <w:trPr>
+          <w:cnfStyle w:val="000000100000" w:firstRow="0" w:lastRow="0" w:firstColumn="0" w:lastColumn="0" w:oddVBand="0" w:evenVBand="0" w:oddHBand="1" w:evenHBand="0" w:firstRowFirstColumn="0" w:firstRowLastColumn="0" w:lastRowFirstColumn="0" w:lastRowLastColumn="0"/>
+        </w:trPr>
+        <w:tc>
+          <w:tcPr>
+            <w:cnfStyle w:val="001000000000" w:firstRow="0" w:lastRow="0" w:firstColumn="1" w:lastColumn="0" w:oddVBand="0" w:evenVBand="0" w:oddHBand="0" w:evenHBand="0" w:firstRowFirstColumn="0" w:firstRowLastColumn="0" w:lastRowFirstColumn="0" w:lastRowLastColumn="0"/>
+            <w:tcW w:w="3005" w:type="dxa"/>
+          </w:tcPr>
+          <w:p/>
+        </w:tc>
+        <w:tc>
+          <w:tcPr>
+            <w:tcW w:w="3005" w:type="dxa"/>
+          </w:tcPr>
+          <w:p>
+            <w:pPr>
+              <w:cnfStyle w:val="000000100000" w:firstRow="0" w:lastRow="0" w:firstColumn="0" w:lastColumn="0" w:oddVBand="0" w:evenVBand="0" w:oddHBand="1" w:evenHBand="0" w:firstRowFirstColumn="0" w:firstRowLastColumn="0" w:lastRowFirstColumn="0" w:lastRowLastColumn="0"/>
+            </w:pPr>
+            <w:r>
+              <w:t>Who imposes reporting or compliance obligations?</w:t>
+            </w:r>
+          </w:p>
+        </w:tc>
+        <w:tc>
+          <w:tcPr>
+            <w:tcW w:w="3006" w:type="dxa"/>
+          </w:tcPr>
+          <w:p>
+            <w:pPr>
+              <w:cnfStyle w:val="000000100000" w:firstRow="0" w:lastRow="0" w:firstColumn="0" w:lastColumn="0" w:oddVBand="0" w:evenVBand="0" w:oddHBand="1" w:evenHBand="0" w:firstRowFirstColumn="0" w:firstRowLastColumn="0" w:lastRowFirstColumn="0" w:lastRowLastColumn="0"/>
+            </w:pPr>
+          </w:p>
+        </w:tc>
+      </w:tr>
+      <w:tr>
+        <w:tc>
+          <w:tcPr>
+            <w:cnfStyle w:val="001000000000" w:firstRow="0" w:lastRow="0" w:firstColumn="1" w:lastColumn="0" w:oddVBand="0" w:evenVBand="0" w:oddHBand="0" w:evenHBand="0" w:firstRowFirstColumn="0" w:firstRowLastColumn="0" w:lastRowFirstColumn="0" w:lastRowLastColumn="0"/>
+            <w:tcW w:w="3005" w:type="dxa"/>
+          </w:tcPr>
+          <w:p/>
+        </w:tc>
+        <w:tc>
+          <w:tcPr>
+            <w:tcW w:w="3005" w:type="dxa"/>
+          </w:tcPr>
+          <w:p>
+            <w:pPr>
+              <w:cnfStyle w:val="000000000000" w:firstRow="0" w:lastRow="0" w:firstColumn="0" w:lastColumn="0" w:oddVBand="0" w:evenVBand="0" w:oddHBand="0" w:evenHBand="0" w:firstRowFirstColumn="0" w:firstRowLastColumn="0" w:lastRowFirstColumn="0" w:lastRowLastColumn="0"/>
+            </w:pPr>
+            <w:r>
+              <w:t>Who is affected without direct interaction?</w:t>
+            </w:r>
+          </w:p>
+        </w:tc>
+        <w:tc>
+          <w:tcPr>
+            <w:tcW w:w="3006" w:type="dxa"/>
+          </w:tcPr>
+          <w:p>
+            <w:pPr>
+              <w:cnfStyle w:val="000000000000" w:firstRow="0" w:lastRow="0" w:firstColumn="0" w:lastColumn="0" w:oddVBand="0" w:evenVBand="0" w:oddHBand="0" w:evenHBand="0" w:firstRowFirstColumn="0" w:firstRowLastColumn="0" w:lastRowFirstColumn="0" w:lastRowLastColumn="0"/>
+            </w:pPr>
+          </w:p>
+        </w:tc>
+      </w:tr>
+    </w:tbl>
     <w:p/>
     <w:sectPr>
       <w:footerReference w:type="default" r:id="rId8"/>
@@ -2826,11 +4633,591 @@
       </w:rPr>
     </w:lvl>
   </w:abstractNum>
+  <w:abstractNum w:abstractNumId="2" w15:restartNumberingAfterBreak="0">
+    <w:nsid w:val="185C28BB"/>
+    <w:multiLevelType w:val="hybridMultilevel"/>
+    <w:tmpl w:val="9EFC9F78"/>
+    <w:lvl w:ilvl="0" w:tplc="18090001">
+      <w:start w:val="1"/>
+      <w:numFmt w:val="bullet"/>
+      <w:lvlText w:val=""/>
+      <w:lvlJc w:val="left"/>
+      <w:pPr>
+        <w:ind w:left="720" w:hanging="360"/>
+      </w:pPr>
+      <w:rPr>
+        <w:rFonts w:ascii="Symbol" w:hAnsi="Symbol" w:hint="default"/>
+      </w:rPr>
+    </w:lvl>
+    <w:lvl w:ilvl="1" w:tplc="04090003" w:tentative="1">
+      <w:start w:val="1"/>
+      <w:numFmt w:val="bullet"/>
+      <w:lvlText w:val="o"/>
+      <w:lvlJc w:val="left"/>
+      <w:pPr>
+        <w:ind w:left="1440" w:hanging="360"/>
+      </w:pPr>
+      <w:rPr>
+        <w:rFonts w:ascii="Courier New" w:hAnsi="Courier New" w:cs="Courier New" w:hint="default"/>
+      </w:rPr>
+    </w:lvl>
+    <w:lvl w:ilvl="2" w:tplc="04090005" w:tentative="1">
+      <w:start w:val="1"/>
+      <w:numFmt w:val="bullet"/>
+      <w:lvlText w:val=""/>
+      <w:lvlJc w:val="left"/>
+      <w:pPr>
+        <w:ind w:left="2160" w:hanging="360"/>
+      </w:pPr>
+      <w:rPr>
+        <w:rFonts w:ascii="Wingdings" w:hAnsi="Wingdings" w:hint="default"/>
+      </w:rPr>
+    </w:lvl>
+    <w:lvl w:ilvl="3" w:tplc="04090001" w:tentative="1">
+      <w:start w:val="1"/>
+      <w:numFmt w:val="bullet"/>
+      <w:lvlText w:val=""/>
+      <w:lvlJc w:val="left"/>
+      <w:pPr>
+        <w:ind w:left="2880" w:hanging="360"/>
+      </w:pPr>
+      <w:rPr>
+        <w:rFonts w:ascii="Symbol" w:hAnsi="Symbol" w:hint="default"/>
+      </w:rPr>
+    </w:lvl>
+    <w:lvl w:ilvl="4" w:tplc="04090003" w:tentative="1">
+      <w:start w:val="1"/>
+      <w:numFmt w:val="bullet"/>
+      <w:lvlText w:val="o"/>
+      <w:lvlJc w:val="left"/>
+      <w:pPr>
+        <w:ind w:left="3600" w:hanging="360"/>
+      </w:pPr>
+      <w:rPr>
+        <w:rFonts w:ascii="Courier New" w:hAnsi="Courier New" w:cs="Courier New" w:hint="default"/>
+      </w:rPr>
+    </w:lvl>
+    <w:lvl w:ilvl="5" w:tplc="04090005" w:tentative="1">
+      <w:start w:val="1"/>
+      <w:numFmt w:val="bullet"/>
+      <w:lvlText w:val=""/>
+      <w:lvlJc w:val="left"/>
+      <w:pPr>
+        <w:ind w:left="4320" w:hanging="360"/>
+      </w:pPr>
+      <w:rPr>
+        <w:rFonts w:ascii="Wingdings" w:hAnsi="Wingdings" w:hint="default"/>
+      </w:rPr>
+    </w:lvl>
+    <w:lvl w:ilvl="6" w:tplc="04090001" w:tentative="1">
+      <w:start w:val="1"/>
+      <w:numFmt w:val="bullet"/>
+      <w:lvlText w:val=""/>
+      <w:lvlJc w:val="left"/>
+      <w:pPr>
+        <w:ind w:left="5040" w:hanging="360"/>
+      </w:pPr>
+      <w:rPr>
+        <w:rFonts w:ascii="Symbol" w:hAnsi="Symbol" w:hint="default"/>
+      </w:rPr>
+    </w:lvl>
+    <w:lvl w:ilvl="7" w:tplc="04090003" w:tentative="1">
+      <w:start w:val="1"/>
+      <w:numFmt w:val="bullet"/>
+      <w:lvlText w:val="o"/>
+      <w:lvlJc w:val="left"/>
+      <w:pPr>
+        <w:ind w:left="5760" w:hanging="360"/>
+      </w:pPr>
+      <w:rPr>
+        <w:rFonts w:ascii="Courier New" w:hAnsi="Courier New" w:cs="Courier New" w:hint="default"/>
+      </w:rPr>
+    </w:lvl>
+    <w:lvl w:ilvl="8" w:tplc="04090005" w:tentative="1">
+      <w:start w:val="1"/>
+      <w:numFmt w:val="bullet"/>
+      <w:lvlText w:val=""/>
+      <w:lvlJc w:val="left"/>
+      <w:pPr>
+        <w:ind w:left="6480" w:hanging="360"/>
+      </w:pPr>
+      <w:rPr>
+        <w:rFonts w:ascii="Wingdings" w:hAnsi="Wingdings" w:hint="default"/>
+      </w:rPr>
+    </w:lvl>
+  </w:abstractNum>
+  <w:abstractNum w:abstractNumId="3" w15:restartNumberingAfterBreak="0">
+    <w:nsid w:val="209F3D19"/>
+    <w:multiLevelType w:val="hybridMultilevel"/>
+    <w:tmpl w:val="2BB8BA8C"/>
+    <w:lvl w:ilvl="0" w:tplc="18090001">
+      <w:start w:val="1"/>
+      <w:numFmt w:val="bullet"/>
+      <w:lvlText w:val=""/>
+      <w:lvlJc w:val="left"/>
+      <w:pPr>
+        <w:ind w:left="720" w:hanging="360"/>
+      </w:pPr>
+      <w:rPr>
+        <w:rFonts w:ascii="Symbol" w:hAnsi="Symbol" w:hint="default"/>
+      </w:rPr>
+    </w:lvl>
+    <w:lvl w:ilvl="1" w:tplc="04090003" w:tentative="1">
+      <w:start w:val="1"/>
+      <w:numFmt w:val="bullet"/>
+      <w:lvlText w:val="o"/>
+      <w:lvlJc w:val="left"/>
+      <w:pPr>
+        <w:ind w:left="1440" w:hanging="360"/>
+      </w:pPr>
+      <w:rPr>
+        <w:rFonts w:ascii="Courier New" w:hAnsi="Courier New" w:cs="Courier New" w:hint="default"/>
+      </w:rPr>
+    </w:lvl>
+    <w:lvl w:ilvl="2" w:tplc="04090005" w:tentative="1">
+      <w:start w:val="1"/>
+      <w:numFmt w:val="bullet"/>
+      <w:lvlText w:val=""/>
+      <w:lvlJc w:val="left"/>
+      <w:pPr>
+        <w:ind w:left="2160" w:hanging="360"/>
+      </w:pPr>
+      <w:rPr>
+        <w:rFonts w:ascii="Wingdings" w:hAnsi="Wingdings" w:hint="default"/>
+      </w:rPr>
+    </w:lvl>
+    <w:lvl w:ilvl="3" w:tplc="04090001" w:tentative="1">
+      <w:start w:val="1"/>
+      <w:numFmt w:val="bullet"/>
+      <w:lvlText w:val=""/>
+      <w:lvlJc w:val="left"/>
+      <w:pPr>
+        <w:ind w:left="2880" w:hanging="360"/>
+      </w:pPr>
+      <w:rPr>
+        <w:rFonts w:ascii="Symbol" w:hAnsi="Symbol" w:hint="default"/>
+      </w:rPr>
+    </w:lvl>
+    <w:lvl w:ilvl="4" w:tplc="04090003" w:tentative="1">
+      <w:start w:val="1"/>
+      <w:numFmt w:val="bullet"/>
+      <w:lvlText w:val="o"/>
+      <w:lvlJc w:val="left"/>
+      <w:pPr>
+        <w:ind w:left="3600" w:hanging="360"/>
+      </w:pPr>
+      <w:rPr>
+        <w:rFonts w:ascii="Courier New" w:hAnsi="Courier New" w:cs="Courier New" w:hint="default"/>
+      </w:rPr>
+    </w:lvl>
+    <w:lvl w:ilvl="5" w:tplc="04090005" w:tentative="1">
+      <w:start w:val="1"/>
+      <w:numFmt w:val="bullet"/>
+      <w:lvlText w:val=""/>
+      <w:lvlJc w:val="left"/>
+      <w:pPr>
+        <w:ind w:left="4320" w:hanging="360"/>
+      </w:pPr>
+      <w:rPr>
+        <w:rFonts w:ascii="Wingdings" w:hAnsi="Wingdings" w:hint="default"/>
+      </w:rPr>
+    </w:lvl>
+    <w:lvl w:ilvl="6" w:tplc="04090001" w:tentative="1">
+      <w:start w:val="1"/>
+      <w:numFmt w:val="bullet"/>
+      <w:lvlText w:val=""/>
+      <w:lvlJc w:val="left"/>
+      <w:pPr>
+        <w:ind w:left="5040" w:hanging="360"/>
+      </w:pPr>
+      <w:rPr>
+        <w:rFonts w:ascii="Symbol" w:hAnsi="Symbol" w:hint="default"/>
+      </w:rPr>
+    </w:lvl>
+    <w:lvl w:ilvl="7" w:tplc="04090003" w:tentative="1">
+      <w:start w:val="1"/>
+      <w:numFmt w:val="bullet"/>
+      <w:lvlText w:val="o"/>
+      <w:lvlJc w:val="left"/>
+      <w:pPr>
+        <w:ind w:left="5760" w:hanging="360"/>
+      </w:pPr>
+      <w:rPr>
+        <w:rFonts w:ascii="Courier New" w:hAnsi="Courier New" w:cs="Courier New" w:hint="default"/>
+      </w:rPr>
+    </w:lvl>
+    <w:lvl w:ilvl="8" w:tplc="04090005" w:tentative="1">
+      <w:start w:val="1"/>
+      <w:numFmt w:val="bullet"/>
+      <w:lvlText w:val=""/>
+      <w:lvlJc w:val="left"/>
+      <w:pPr>
+        <w:ind w:left="6480" w:hanging="360"/>
+      </w:pPr>
+      <w:rPr>
+        <w:rFonts w:ascii="Wingdings" w:hAnsi="Wingdings" w:hint="default"/>
+      </w:rPr>
+    </w:lvl>
+  </w:abstractNum>
+  <w:abstractNum w:abstractNumId="4" w15:restartNumberingAfterBreak="0">
+    <w:nsid w:val="33BF5F14"/>
+    <w:multiLevelType w:val="hybridMultilevel"/>
+    <w:tmpl w:val="79B0E864"/>
+    <w:lvl w:ilvl="0" w:tplc="04090001">
+      <w:start w:val="1"/>
+      <w:numFmt w:val="bullet"/>
+      <w:lvlText w:val=""/>
+      <w:lvlJc w:val="left"/>
+      <w:pPr>
+        <w:ind w:left="720" w:hanging="360"/>
+      </w:pPr>
+      <w:rPr>
+        <w:rFonts w:ascii="Symbol" w:hAnsi="Symbol" w:hint="default"/>
+      </w:rPr>
+    </w:lvl>
+    <w:lvl w:ilvl="1" w:tplc="04090003" w:tentative="1">
+      <w:start w:val="1"/>
+      <w:numFmt w:val="bullet"/>
+      <w:lvlText w:val="o"/>
+      <w:lvlJc w:val="left"/>
+      <w:pPr>
+        <w:ind w:left="1440" w:hanging="360"/>
+      </w:pPr>
+      <w:rPr>
+        <w:rFonts w:ascii="Courier New" w:hAnsi="Courier New" w:cs="Courier New" w:hint="default"/>
+      </w:rPr>
+    </w:lvl>
+    <w:lvl w:ilvl="2" w:tplc="04090005" w:tentative="1">
+      <w:start w:val="1"/>
+      <w:numFmt w:val="bullet"/>
+      <w:lvlText w:val=""/>
+      <w:lvlJc w:val="left"/>
+      <w:pPr>
+        <w:ind w:left="2160" w:hanging="360"/>
+      </w:pPr>
+      <w:rPr>
+        <w:rFonts w:ascii="Wingdings" w:hAnsi="Wingdings" w:hint="default"/>
+      </w:rPr>
+    </w:lvl>
+    <w:lvl w:ilvl="3" w:tplc="04090001" w:tentative="1">
+      <w:start w:val="1"/>
+      <w:numFmt w:val="bullet"/>
+      <w:lvlText w:val=""/>
+      <w:lvlJc w:val="left"/>
+      <w:pPr>
+        <w:ind w:left="2880" w:hanging="360"/>
+      </w:pPr>
+      <w:rPr>
+        <w:rFonts w:ascii="Symbol" w:hAnsi="Symbol" w:hint="default"/>
+      </w:rPr>
+    </w:lvl>
+    <w:lvl w:ilvl="4" w:tplc="04090003" w:tentative="1">
+      <w:start w:val="1"/>
+      <w:numFmt w:val="bullet"/>
+      <w:lvlText w:val="o"/>
+      <w:lvlJc w:val="left"/>
+      <w:pPr>
+        <w:ind w:left="3600" w:hanging="360"/>
+      </w:pPr>
+      <w:rPr>
+        <w:rFonts w:ascii="Courier New" w:hAnsi="Courier New" w:cs="Courier New" w:hint="default"/>
+      </w:rPr>
+    </w:lvl>
+    <w:lvl w:ilvl="5" w:tplc="04090005" w:tentative="1">
+      <w:start w:val="1"/>
+      <w:numFmt w:val="bullet"/>
+      <w:lvlText w:val=""/>
+      <w:lvlJc w:val="left"/>
+      <w:pPr>
+        <w:ind w:left="4320" w:hanging="360"/>
+      </w:pPr>
+      <w:rPr>
+        <w:rFonts w:ascii="Wingdings" w:hAnsi="Wingdings" w:hint="default"/>
+      </w:rPr>
+    </w:lvl>
+    <w:lvl w:ilvl="6" w:tplc="04090001" w:tentative="1">
+      <w:start w:val="1"/>
+      <w:numFmt w:val="bullet"/>
+      <w:lvlText w:val=""/>
+      <w:lvlJc w:val="left"/>
+      <w:pPr>
+        <w:ind w:left="5040" w:hanging="360"/>
+      </w:pPr>
+      <w:rPr>
+        <w:rFonts w:ascii="Symbol" w:hAnsi="Symbol" w:hint="default"/>
+      </w:rPr>
+    </w:lvl>
+    <w:lvl w:ilvl="7" w:tplc="04090003" w:tentative="1">
+      <w:start w:val="1"/>
+      <w:numFmt w:val="bullet"/>
+      <w:lvlText w:val="o"/>
+      <w:lvlJc w:val="left"/>
+      <w:pPr>
+        <w:ind w:left="5760" w:hanging="360"/>
+      </w:pPr>
+      <w:rPr>
+        <w:rFonts w:ascii="Courier New" w:hAnsi="Courier New" w:cs="Courier New" w:hint="default"/>
+      </w:rPr>
+    </w:lvl>
+    <w:lvl w:ilvl="8" w:tplc="04090005" w:tentative="1">
+      <w:start w:val="1"/>
+      <w:numFmt w:val="bullet"/>
+      <w:lvlText w:val=""/>
+      <w:lvlJc w:val="left"/>
+      <w:pPr>
+        <w:ind w:left="6480" w:hanging="360"/>
+      </w:pPr>
+      <w:rPr>
+        <w:rFonts w:ascii="Wingdings" w:hAnsi="Wingdings" w:hint="default"/>
+      </w:rPr>
+    </w:lvl>
+  </w:abstractNum>
+  <w:abstractNum w:abstractNumId="5" w15:restartNumberingAfterBreak="0">
+    <w:nsid w:val="557A7D7F"/>
+    <w:multiLevelType w:val="hybridMultilevel"/>
+    <w:tmpl w:val="91BA2696"/>
+    <w:lvl w:ilvl="0" w:tplc="04090001">
+      <w:start w:val="1"/>
+      <w:numFmt w:val="bullet"/>
+      <w:lvlText w:val=""/>
+      <w:lvlJc w:val="left"/>
+      <w:pPr>
+        <w:ind w:left="720" w:hanging="360"/>
+      </w:pPr>
+      <w:rPr>
+        <w:rFonts w:ascii="Symbol" w:hAnsi="Symbol" w:hint="default"/>
+      </w:rPr>
+    </w:lvl>
+    <w:lvl w:ilvl="1" w:tplc="04090003" w:tentative="1">
+      <w:start w:val="1"/>
+      <w:numFmt w:val="bullet"/>
+      <w:lvlText w:val="o"/>
+      <w:lvlJc w:val="left"/>
+      <w:pPr>
+        <w:ind w:left="1440" w:hanging="360"/>
+      </w:pPr>
+      <w:rPr>
+        <w:rFonts w:ascii="Courier New" w:hAnsi="Courier New" w:cs="Courier New" w:hint="default"/>
+      </w:rPr>
+    </w:lvl>
+    <w:lvl w:ilvl="2" w:tplc="04090005" w:tentative="1">
+      <w:start w:val="1"/>
+      <w:numFmt w:val="bullet"/>
+      <w:lvlText w:val=""/>
+      <w:lvlJc w:val="left"/>
+      <w:pPr>
+        <w:ind w:left="2160" w:hanging="360"/>
+      </w:pPr>
+      <w:rPr>
+        <w:rFonts w:ascii="Wingdings" w:hAnsi="Wingdings" w:hint="default"/>
+      </w:rPr>
+    </w:lvl>
+    <w:lvl w:ilvl="3" w:tplc="04090001" w:tentative="1">
+      <w:start w:val="1"/>
+      <w:numFmt w:val="bullet"/>
+      <w:lvlText w:val=""/>
+      <w:lvlJc w:val="left"/>
+      <w:pPr>
+        <w:ind w:left="2880" w:hanging="360"/>
+      </w:pPr>
+      <w:rPr>
+        <w:rFonts w:ascii="Symbol" w:hAnsi="Symbol" w:hint="default"/>
+      </w:rPr>
+    </w:lvl>
+    <w:lvl w:ilvl="4" w:tplc="04090003" w:tentative="1">
+      <w:start w:val="1"/>
+      <w:numFmt w:val="bullet"/>
+      <w:lvlText w:val="o"/>
+      <w:lvlJc w:val="left"/>
+      <w:pPr>
+        <w:ind w:left="3600" w:hanging="360"/>
+      </w:pPr>
+      <w:rPr>
+        <w:rFonts w:ascii="Courier New" w:hAnsi="Courier New" w:cs="Courier New" w:hint="default"/>
+      </w:rPr>
+    </w:lvl>
+    <w:lvl w:ilvl="5" w:tplc="04090005" w:tentative="1">
+      <w:start w:val="1"/>
+      <w:numFmt w:val="bullet"/>
+      <w:lvlText w:val=""/>
+      <w:lvlJc w:val="left"/>
+      <w:pPr>
+        <w:ind w:left="4320" w:hanging="360"/>
+      </w:pPr>
+      <w:rPr>
+        <w:rFonts w:ascii="Wingdings" w:hAnsi="Wingdings" w:hint="default"/>
+      </w:rPr>
+    </w:lvl>
+    <w:lvl w:ilvl="6" w:tplc="04090001" w:tentative="1">
+      <w:start w:val="1"/>
+      <w:numFmt w:val="bullet"/>
+      <w:lvlText w:val=""/>
+      <w:lvlJc w:val="left"/>
+      <w:pPr>
+        <w:ind w:left="5040" w:hanging="360"/>
+      </w:pPr>
+      <w:rPr>
+        <w:rFonts w:ascii="Symbol" w:hAnsi="Symbol" w:hint="default"/>
+      </w:rPr>
+    </w:lvl>
+    <w:lvl w:ilvl="7" w:tplc="04090003" w:tentative="1">
+      <w:start w:val="1"/>
+      <w:numFmt w:val="bullet"/>
+      <w:lvlText w:val="o"/>
+      <w:lvlJc w:val="left"/>
+      <w:pPr>
+        <w:ind w:left="5760" w:hanging="360"/>
+      </w:pPr>
+      <w:rPr>
+        <w:rFonts w:ascii="Courier New" w:hAnsi="Courier New" w:cs="Courier New" w:hint="default"/>
+      </w:rPr>
+    </w:lvl>
+    <w:lvl w:ilvl="8" w:tplc="04090005" w:tentative="1">
+      <w:start w:val="1"/>
+      <w:numFmt w:val="bullet"/>
+      <w:lvlText w:val=""/>
+      <w:lvlJc w:val="left"/>
+      <w:pPr>
+        <w:ind w:left="6480" w:hanging="360"/>
+      </w:pPr>
+      <w:rPr>
+        <w:rFonts w:ascii="Wingdings" w:hAnsi="Wingdings" w:hint="default"/>
+      </w:rPr>
+    </w:lvl>
+  </w:abstractNum>
+  <w:abstractNum w:abstractNumId="6" w15:restartNumberingAfterBreak="0">
+    <w:nsid w:val="6B5E4C71"/>
+    <w:multiLevelType w:val="hybridMultilevel"/>
+    <w:tmpl w:val="9F22508C"/>
+    <w:lvl w:ilvl="0" w:tplc="18090001">
+      <w:start w:val="1"/>
+      <w:numFmt w:val="bullet"/>
+      <w:lvlText w:val=""/>
+      <w:lvlJc w:val="left"/>
+      <w:pPr>
+        <w:ind w:left="1140" w:hanging="360"/>
+      </w:pPr>
+      <w:rPr>
+        <w:rFonts w:ascii="Symbol" w:hAnsi="Symbol" w:hint="default"/>
+      </w:rPr>
+    </w:lvl>
+    <w:lvl w:ilvl="1" w:tplc="04090003" w:tentative="1">
+      <w:start w:val="1"/>
+      <w:numFmt w:val="bullet"/>
+      <w:lvlText w:val="o"/>
+      <w:lvlJc w:val="left"/>
+      <w:pPr>
+        <w:ind w:left="1860" w:hanging="360"/>
+      </w:pPr>
+      <w:rPr>
+        <w:rFonts w:ascii="Courier New" w:hAnsi="Courier New" w:cs="Courier New" w:hint="default"/>
+      </w:rPr>
+    </w:lvl>
+    <w:lvl w:ilvl="2" w:tplc="04090005" w:tentative="1">
+      <w:start w:val="1"/>
+      <w:numFmt w:val="bullet"/>
+      <w:lvlText w:val=""/>
+      <w:lvlJc w:val="left"/>
+      <w:pPr>
+        <w:ind w:left="2580" w:hanging="360"/>
+      </w:pPr>
+      <w:rPr>
+        <w:rFonts w:ascii="Wingdings" w:hAnsi="Wingdings" w:hint="default"/>
+      </w:rPr>
+    </w:lvl>
+    <w:lvl w:ilvl="3" w:tplc="04090001" w:tentative="1">
+      <w:start w:val="1"/>
+      <w:numFmt w:val="bullet"/>
+      <w:lvlText w:val=""/>
+      <w:lvlJc w:val="left"/>
+      <w:pPr>
+        <w:ind w:left="3300" w:hanging="360"/>
+      </w:pPr>
+      <w:rPr>
+        <w:rFonts w:ascii="Symbol" w:hAnsi="Symbol" w:hint="default"/>
+      </w:rPr>
+    </w:lvl>
+    <w:lvl w:ilvl="4" w:tplc="04090003" w:tentative="1">
+      <w:start w:val="1"/>
+      <w:numFmt w:val="bullet"/>
+      <w:lvlText w:val="o"/>
+      <w:lvlJc w:val="left"/>
+      <w:pPr>
+        <w:ind w:left="4020" w:hanging="360"/>
+      </w:pPr>
+      <w:rPr>
+        <w:rFonts w:ascii="Courier New" w:hAnsi="Courier New" w:cs="Courier New" w:hint="default"/>
+      </w:rPr>
+    </w:lvl>
+    <w:lvl w:ilvl="5" w:tplc="04090005" w:tentative="1">
+      <w:start w:val="1"/>
+      <w:numFmt w:val="bullet"/>
+      <w:lvlText w:val=""/>
+      <w:lvlJc w:val="left"/>
+      <w:pPr>
+        <w:ind w:left="4740" w:hanging="360"/>
+      </w:pPr>
+      <w:rPr>
+        <w:rFonts w:ascii="Wingdings" w:hAnsi="Wingdings" w:hint="default"/>
+      </w:rPr>
+    </w:lvl>
+    <w:lvl w:ilvl="6" w:tplc="04090001" w:tentative="1">
+      <w:start w:val="1"/>
+      <w:numFmt w:val="bullet"/>
+      <w:lvlText w:val=""/>
+      <w:lvlJc w:val="left"/>
+      <w:pPr>
+        <w:ind w:left="5460" w:hanging="360"/>
+      </w:pPr>
+      <w:rPr>
+        <w:rFonts w:ascii="Symbol" w:hAnsi="Symbol" w:hint="default"/>
+      </w:rPr>
+    </w:lvl>
+    <w:lvl w:ilvl="7" w:tplc="04090003" w:tentative="1">
+      <w:start w:val="1"/>
+      <w:numFmt w:val="bullet"/>
+      <w:lvlText w:val="o"/>
+      <w:lvlJc w:val="left"/>
+      <w:pPr>
+        <w:ind w:left="6180" w:hanging="360"/>
+      </w:pPr>
+      <w:rPr>
+        <w:rFonts w:ascii="Courier New" w:hAnsi="Courier New" w:cs="Courier New" w:hint="default"/>
+      </w:rPr>
+    </w:lvl>
+    <w:lvl w:ilvl="8" w:tplc="04090005" w:tentative="1">
+      <w:start w:val="1"/>
+      <w:numFmt w:val="bullet"/>
+      <w:lvlText w:val=""/>
+      <w:lvlJc w:val="left"/>
+      <w:pPr>
+        <w:ind w:left="6900" w:hanging="360"/>
+      </w:pPr>
+      <w:rPr>
+        <w:rFonts w:ascii="Wingdings" w:hAnsi="Wingdings" w:hint="default"/>
+      </w:rPr>
+    </w:lvl>
+  </w:abstractNum>
   <w:num w:numId="1" w16cid:durableId="1306160019">
     <w:abstractNumId w:val="1"/>
   </w:num>
   <w:num w:numId="2" w16cid:durableId="843127062">
     <w:abstractNumId w:val="0"/>
+  </w:num>
+  <w:num w:numId="3" w16cid:durableId="684669152">
+    <w:abstractNumId w:val="4"/>
+  </w:num>
+  <w:num w:numId="4" w16cid:durableId="446122464">
+    <w:abstractNumId w:val="5"/>
+  </w:num>
+  <w:num w:numId="5" w16cid:durableId="1013453338">
+    <w:abstractNumId w:val="2"/>
+  </w:num>
+  <w:num w:numId="6" w16cid:durableId="659313068">
+    <w:abstractNumId w:val="6"/>
+  </w:num>
+  <w:num w:numId="7" w16cid:durableId="587423610">
+    <w:abstractNumId w:val="3"/>
   </w:num>
 </w:numbering>
 </file>
@@ -4063,638 +6450,18 @@
       </w:tcPr>
     </w:tblStylePr>
   </w:style>
-</w:styles>
-</file>
-
-<file path=word/glossary/document.xml><?xml version="1.0" encoding="utf-8"?>
-<w:glossaryDocument xmlns:wpc="http://schemas.microsoft.com/office/word/2010/wordprocessingCanvas" xmlns:cx="http://schemas.microsoft.com/office/drawing/2014/chartex" xmlns:cx1="http://schemas.microsoft.com/office/drawing/2015/9/8/chartex" xmlns:cx2="http://schemas.microsoft.com/office/drawing/2015/10/21/chartex" xmlns:cx3="http://schemas.microsoft.com/office/drawing/2016/5/9/chartex" xmlns:cx4="http://schemas.microsoft.com/office/drawing/2016/5/10/chartex" xmlns:cx5="http://schemas.microsoft.com/office/drawing/2016/5/11/chartex" xmlns:cx6="http://schemas.microsoft.com/office/drawing/2016/5/12/chartex" xmlns:cx7="http://schemas.microsoft.com/office/drawing/2016/5/13/chartex" xmlns:cx8="http://schemas.microsoft.com/office/drawing/2016/5/14/chartex" xmlns:mc="http://schemas.openxmlformats.org/markup-compatibility/2006" xmlns:aink="http://schemas.microsoft.com/office/drawing/2016/ink" xmlns:am3d="http://schemas.microsoft.com/office/drawing/2017/model3d" xmlns:o="urn:schemas-microsoft-com:office:office" xmlns:oel="http://schemas.microsoft.com/office/2019/extlst" xmlns:r="http://schemas.openxmlformats.org/officeDocument/2006/relationships" xmlns:m="http://schemas.openxmlformats.org/officeDocument/2006/math" xmlns:v="urn:schemas-microsoft-com:vml" xmlns:wp14="http://schemas.microsoft.com/office/word/2010/wordprocessingDrawing" xmlns:wp="http://schemas.openxmlformats.org/drawingml/2006/wordprocessingDrawing" xmlns:w10="urn:schemas-microsoft-com:office:word" xmlns:w="http://schemas.openxmlformats.org/wordprocessingml/2006/main" xmlns:w14="http://schemas.microsoft.com/office/word/2010/wordml" xmlns:w15="http://schemas.microsoft.com/office/word/2012/wordml" xmlns:w16cex="http://schemas.microsoft.com/office/word/2018/wordml/cex" xmlns:w16cid="http://schemas.microsoft.com/office/word/2016/wordml/cid" xmlns:w16="http://schemas.microsoft.com/office/word/2018/wordml" xmlns:w16du="http://schemas.microsoft.com/office/word/2023/wordml/word16du" xmlns:w16sdtdh="http://schemas.microsoft.com/office/word/2020/wordml/sdtdatahash" xmlns:w16sdtfl="http://schemas.microsoft.com/office/word/2024/wordml/sdtformatlock" xmlns:w16se="http://schemas.microsoft.com/office/word/2015/wordml/symex" xmlns:wpg="http://schemas.microsoft.com/office/word/2010/wordprocessingGroup" xmlns:wpi="http://schemas.microsoft.com/office/word/2010/wordprocessingInk" xmlns:wne="http://schemas.microsoft.com/office/word/2006/wordml" xmlns:wps="http://schemas.microsoft.com/office/word/2010/wordprocessingShape" mc:Ignorable="w14 w15 w16se w16cid w16 w16cex w16sdtdh w16sdtfl w16du wp14">
-  <w:docParts>
-    <w:docPart>
-      <w:docPartPr>
-        <w:name w:val="47E774277D0F47669AB0A2C67AC546AF"/>
-        <w:category>
-          <w:name w:val="General"/>
-          <w:gallery w:val="placeholder"/>
-        </w:category>
-        <w:types>
-          <w:type w:val="bbPlcHdr"/>
-        </w:types>
-        <w:behaviors>
-          <w:behavior w:val="content"/>
-        </w:behaviors>
-        <w:guid w:val="{10A5E79E-0179-49D0-BFA2-E332FBCD8321}"/>
-      </w:docPartPr>
-      <w:docPartBody>
-        <w:p>
-          <w:pPr>
-            <w:pStyle w:val="47E774277D0F47669AB0A2C67AC546AF"/>
-          </w:pPr>
-          <w:r>
-            <w:t>Type chapter title (level 1)</w:t>
-          </w:r>
-        </w:p>
-      </w:docPartBody>
-    </w:docPart>
-    <w:docPart>
-      <w:docPartPr>
-        <w:name w:val="F94DB55F2BB04C748199D37BD6487319"/>
-        <w:category>
-          <w:name w:val="General"/>
-          <w:gallery w:val="placeholder"/>
-        </w:category>
-        <w:types>
-          <w:type w:val="bbPlcHdr"/>
-        </w:types>
-        <w:behaviors>
-          <w:behavior w:val="content"/>
-        </w:behaviors>
-        <w:guid w:val="{CD59E8CA-7857-4463-AA97-F54FB3A51817}"/>
-      </w:docPartPr>
-      <w:docPartBody>
-        <w:p>
-          <w:pPr>
-            <w:pStyle w:val="F94DB55F2BB04C748199D37BD6487319"/>
-          </w:pPr>
-          <w:r>
-            <w:t>Type chapter title (level 2)</w:t>
-          </w:r>
-        </w:p>
-      </w:docPartBody>
-    </w:docPart>
-    <w:docPart>
-      <w:docPartPr>
-        <w:name w:val="EE81D1A4A5874F458B2F579F40AA7516"/>
-        <w:category>
-          <w:name w:val="General"/>
-          <w:gallery w:val="placeholder"/>
-        </w:category>
-        <w:types>
-          <w:type w:val="bbPlcHdr"/>
-        </w:types>
-        <w:behaviors>
-          <w:behavior w:val="content"/>
-        </w:behaviors>
-        <w:guid w:val="{82A76D80-EE58-4DBC-A76A-F8E3C18F9A12}"/>
-      </w:docPartPr>
-      <w:docPartBody>
-        <w:p>
-          <w:pPr>
-            <w:pStyle w:val="EE81D1A4A5874F458B2F579F40AA7516"/>
-          </w:pPr>
-          <w:r>
-            <w:t>Type chapter title (level 3)</w:t>
-          </w:r>
-        </w:p>
-      </w:docPartBody>
-    </w:docPart>
-  </w:docParts>
-</w:glossaryDocument>
-</file>
-
-<file path=word/glossary/fontTable.xml><?xml version="1.0" encoding="utf-8"?>
-<w:fonts xmlns:mc="http://schemas.openxmlformats.org/markup-compatibility/2006" xmlns:r="http://schemas.openxmlformats.org/officeDocument/2006/relationships" xmlns:w="http://schemas.openxmlformats.org/wordprocessingml/2006/main" xmlns:w14="http://schemas.microsoft.com/office/word/2010/wordml" xmlns:w15="http://schemas.microsoft.com/office/word/2012/wordml" xmlns:w16cex="http://schemas.microsoft.com/office/word/2018/wordml/cex" xmlns:w16cid="http://schemas.microsoft.com/office/word/2016/wordml/cid" xmlns:w16="http://schemas.microsoft.com/office/word/2018/wordml" xmlns:w16du="http://schemas.microsoft.com/office/word/2023/wordml/word16du" xmlns:w16sdtdh="http://schemas.microsoft.com/office/word/2020/wordml/sdtdatahash" xmlns:w16sdtfl="http://schemas.microsoft.com/office/word/2024/wordml/sdtformatlock" xmlns:w16se="http://schemas.microsoft.com/office/word/2015/wordml/symex" mc:Ignorable="w14 w15 w16se w16cid w16 w16cex w16sdtdh w16sdtfl w16du">
-  <w:font w:name="Symbol">
-    <w:panose1 w:val="05050102010706020507"/>
-    <w:charset w:val="02"/>
-    <w:family w:val="roman"/>
-    <w:pitch w:val="variable"/>
-    <w:sig w:usb0="00000000" w:usb1="10000000" w:usb2="00000000" w:usb3="00000000" w:csb0="80000000" w:csb1="00000000"/>
-  </w:font>
-  <w:font w:name="Times New Roman">
-    <w:panose1 w:val="02020603050405020304"/>
-    <w:charset w:val="00"/>
-    <w:family w:val="roman"/>
-    <w:pitch w:val="variable"/>
-    <w:sig w:usb0="E0002EFF" w:usb1="C000785B" w:usb2="00000009" w:usb3="00000000" w:csb0="000001FF" w:csb1="00000000"/>
-  </w:font>
-  <w:font w:name="Courier New">
-    <w:panose1 w:val="02070309020205020404"/>
-    <w:charset w:val="00"/>
-    <w:family w:val="modern"/>
-    <w:pitch w:val="fixed"/>
-    <w:sig w:usb0="E0002EFF" w:usb1="C0007843" w:usb2="00000009" w:usb3="00000000" w:csb0="000001FF" w:csb1="00000000"/>
-  </w:font>
-  <w:font w:name="Wingdings">
-    <w:panose1 w:val="05000000000000000000"/>
-    <w:charset w:val="02"/>
-    <w:family w:val="auto"/>
-    <w:pitch w:val="variable"/>
-    <w:sig w:usb0="00000000" w:usb1="10000000" w:usb2="00000000" w:usb3="00000000" w:csb0="80000000" w:csb1="00000000"/>
-  </w:font>
-  <w:font w:name="Aptos">
-    <w:charset w:val="00"/>
-    <w:family w:val="swiss"/>
-    <w:pitch w:val="variable"/>
-    <w:sig w:usb0="20000287" w:usb1="00000003" w:usb2="00000000" w:usb3="00000000" w:csb0="0000019F" w:csb1="00000000"/>
-  </w:font>
-  <w:font w:name="Arial">
-    <w:panose1 w:val="020B0604020202020204"/>
-    <w:charset w:val="00"/>
-    <w:family w:val="swiss"/>
-    <w:pitch w:val="variable"/>
-    <w:sig w:usb0="E0002EFF" w:usb1="C000785B" w:usb2="00000009" w:usb3="00000000" w:csb0="000001FF" w:csb1="00000000"/>
-  </w:font>
-  <w:font w:name="Aptos Display">
-    <w:charset w:val="00"/>
-    <w:family w:val="swiss"/>
-    <w:pitch w:val="variable"/>
-    <w:sig w:usb0="20000287" w:usb1="00000003" w:usb2="00000000" w:usb3="00000000" w:csb0="0000019F" w:csb1="00000000"/>
-  </w:font>
-</w:fonts>
-</file>
-
-<file path=word/glossary/settings.xml><?xml version="1.0" encoding="utf-8"?>
-<w:settings xmlns:mc="http://schemas.openxmlformats.org/markup-compatibility/2006" xmlns:o="urn:schemas-microsoft-com:office:office" xmlns:r="http://schemas.openxmlformats.org/officeDocument/2006/relationships" xmlns:m="http://schemas.openxmlformats.org/officeDocument/2006/math" xmlns:v="urn:schemas-microsoft-com:vml" xmlns:w10="urn:schemas-microsoft-com:office:word" xmlns:w="http://schemas.openxmlformats.org/wordprocessingml/2006/main" xmlns:w14="http://schemas.microsoft.com/office/word/2010/wordml" xmlns:w15="http://schemas.microsoft.com/office/word/2012/wordml" xmlns:w16cex="http://schemas.microsoft.com/office/word/2018/wordml/cex" xmlns:w16cid="http://schemas.microsoft.com/office/word/2016/wordml/cid" xmlns:w16="http://schemas.microsoft.com/office/word/2018/wordml" xmlns:w16du="http://schemas.microsoft.com/office/word/2023/wordml/word16du" xmlns:w16sdtdh="http://schemas.microsoft.com/office/word/2020/wordml/sdtdatahash" xmlns:w16sdtfl="http://schemas.microsoft.com/office/word/2024/wordml/sdtformatlock" xmlns:w16se="http://schemas.microsoft.com/office/word/2015/wordml/symex" xmlns:sl="http://schemas.openxmlformats.org/schemaLibrary/2006/main" mc:Ignorable="w14 w15 w16se w16cid w16 w16cex w16sdtdh w16sdtfl w16du">
-  <w:view w:val="normal"/>
-  <w:defaultTabStop w:val="720"/>
-  <w:characterSpacingControl w:val="doNotCompress"/>
-  <w:compat>
-    <w:useFELayout/>
-    <w:compatSetting w:name="compatibilityMode" w:uri="http://schemas.microsoft.com/office/word" w:val="15"/>
-    <w:compatSetting w:name="overrideTableStyleFontSizeAndJustification" w:uri="http://schemas.microsoft.com/office/word" w:val="1"/>
-    <w:compatSetting w:name="enableOpenTypeFeatures" w:uri="http://schemas.microsoft.com/office/word" w:val="1"/>
-    <w:compatSetting w:name="doNotFlipMirrorIndents" w:uri="http://schemas.microsoft.com/office/word" w:val="1"/>
-    <w:compatSetting w:name="differentiateMultirowTableHeaders" w:uri="http://schemas.microsoft.com/office/word" w:val="1"/>
-    <w:compatSetting w:name="useWord2013TrackBottomHyphenation" w:uri="http://schemas.microsoft.com/office/word" w:val="0"/>
-  </w:compat>
-  <w:rsids>
-    <w:rsidRoot w:val="00575EB9"/>
-    <w:rsid w:val="003432F7"/>
-    <w:rsid w:val="003A50E0"/>
-    <w:rsid w:val="004A6801"/>
-    <w:rsid w:val="00575EB9"/>
-    <w:rsid w:val="00A7585A"/>
-    <w:rsid w:val="00C547D0"/>
-  </w:rsids>
-  <m:mathPr>
-    <m:mathFont m:val="Cambria Math"/>
-    <m:brkBin m:val="before"/>
-    <m:brkBinSub m:val="--"/>
-    <m:smallFrac m:val="0"/>
-    <m:dispDef/>
-    <m:lMargin m:val="0"/>
-    <m:rMargin m:val="0"/>
-    <m:defJc m:val="centerGroup"/>
-    <m:wrapIndent m:val="1440"/>
-    <m:intLim m:val="subSup"/>
-    <m:naryLim m:val="undOvr"/>
-  </m:mathPr>
-  <w:themeFontLang w:val="en-US"/>
-  <w:clrSchemeMapping w:bg1="light1" w:t1="dark1" w:bg2="light2" w:t2="dark2" w:accent1="accent1" w:accent2="accent2" w:accent3="accent3" w:accent4="accent4" w:accent5="accent5" w:accent6="accent6" w:hyperlink="hyperlink" w:followedHyperlink="followedHyperlink"/>
-  <w:decimalSymbol w:val="."/>
-  <w:listSeparator w:val=","/>
-  <w15:chartTrackingRefBased/>
-</w:settings>
-</file>
-
-<file path=word/glossary/styles.xml><?xml version="1.0" encoding="utf-8"?>
-<w:styles xmlns:mc="http://schemas.openxmlformats.org/markup-compatibility/2006" xmlns:r="http://schemas.openxmlformats.org/officeDocument/2006/relationships" xmlns:w="http://schemas.openxmlformats.org/wordprocessingml/2006/main" xmlns:w14="http://schemas.microsoft.com/office/word/2010/wordml" xmlns:w15="http://schemas.microsoft.com/office/word/2012/wordml" xmlns:w16cex="http://schemas.microsoft.com/office/word/2018/wordml/cex" xmlns:w16cid="http://schemas.microsoft.com/office/word/2016/wordml/cid" xmlns:w16="http://schemas.microsoft.com/office/word/2018/wordml" xmlns:w16du="http://schemas.microsoft.com/office/word/2023/wordml/word16du" xmlns:w16sdtdh="http://schemas.microsoft.com/office/word/2020/wordml/sdtdatahash" xmlns:w16sdtfl="http://schemas.microsoft.com/office/word/2024/wordml/sdtformatlock" xmlns:w16se="http://schemas.microsoft.com/office/word/2015/wordml/symex" mc:Ignorable="w14 w15 w16se w16cid w16 w16cex w16sdtdh w16sdtfl w16du">
-  <w:docDefaults>
-    <w:rPrDefault>
-      <w:rPr>
-        <w:rFonts w:asciiTheme="minorHAnsi" w:eastAsiaTheme="minorEastAsia" w:hAnsiTheme="minorHAnsi" w:cstheme="minorBidi"/>
-        <w:kern w:val="2"/>
-        <w:sz w:val="24"/>
-        <w:szCs w:val="24"/>
-        <w:lang w:val="en-US" w:eastAsia="en-US" w:bidi="ar-SA"/>
-        <w14:ligatures w14:val="standardContextual"/>
-      </w:rPr>
-    </w:rPrDefault>
-    <w:pPrDefault>
-      <w:pPr>
-        <w:spacing w:after="160" w:line="278" w:lineRule="auto"/>
-      </w:pPr>
-    </w:pPrDefault>
-  </w:docDefaults>
-  <w:latentStyles w:defLockedState="0" w:defUIPriority="99" w:defSemiHidden="0" w:defUnhideWhenUsed="0" w:defQFormat="0" w:count="376">
-    <w:lsdException w:name="Normal" w:uiPriority="0" w:qFormat="1"/>
-    <w:lsdException w:name="heading 1" w:uiPriority="9" w:qFormat="1"/>
-    <w:lsdException w:name="heading 2" w:semiHidden="1" w:uiPriority="9" w:unhideWhenUsed="1" w:qFormat="1"/>
-    <w:lsdException w:name="heading 3" w:semiHidden="1" w:uiPriority="9" w:unhideWhenUsed="1" w:qFormat="1"/>
-    <w:lsdException w:name="heading 4" w:semiHidden="1" w:uiPriority="9" w:unhideWhenUsed="1" w:qFormat="1"/>
-    <w:lsdException w:name="heading 5" w:semiHidden="1" w:uiPriority="9" w:unhideWhenUsed="1" w:qFormat="1"/>
-    <w:lsdException w:name="heading 6" w:semiHidden="1" w:uiPriority="9" w:unhideWhenUsed="1" w:qFormat="1"/>
-    <w:lsdException w:name="heading 7" w:semiHidden="1" w:uiPriority="9" w:unhideWhenUsed="1" w:qFormat="1"/>
-    <w:lsdException w:name="heading 8" w:semiHidden="1" w:uiPriority="9" w:unhideWhenUsed="1" w:qFormat="1"/>
-    <w:lsdException w:name="heading 9" w:semiHidden="1" w:uiPriority="9" w:unhideWhenUsed="1" w:qFormat="1"/>
-    <w:lsdException w:name="index 1" w:semiHidden="1" w:unhideWhenUsed="1"/>
-    <w:lsdException w:name="index 2" w:semiHidden="1" w:unhideWhenUsed="1"/>
-    <w:lsdException w:name="index 3" w:semiHidden="1" w:unhideWhenUsed="1"/>
-    <w:lsdException w:name="index 4" w:semiHidden="1" w:unhideWhenUsed="1"/>
-    <w:lsdException w:name="index 5" w:semiHidden="1" w:unhideWhenUsed="1"/>
-    <w:lsdException w:name="index 6" w:semiHidden="1" w:unhideWhenUsed="1"/>
-    <w:lsdException w:name="index 7" w:semiHidden="1" w:unhideWhenUsed="1"/>
-    <w:lsdException w:name="index 8" w:semiHidden="1" w:unhideWhenUsed="1"/>
-    <w:lsdException w:name="index 9" w:semiHidden="1" w:unhideWhenUsed="1"/>
-    <w:lsdException w:name="toc 1" w:semiHidden="1" w:uiPriority="39" w:unhideWhenUsed="1"/>
-    <w:lsdException w:name="toc 2" w:semiHidden="1" w:uiPriority="39" w:unhideWhenUsed="1"/>
-    <w:lsdException w:name="toc 3" w:semiHidden="1" w:uiPriority="39" w:unhideWhenUsed="1"/>
-    <w:lsdException w:name="toc 4" w:semiHidden="1" w:uiPriority="39" w:unhideWhenUsed="1"/>
-    <w:lsdException w:name="toc 5" w:semiHidden="1" w:uiPriority="39" w:unhideWhenUsed="1"/>
-    <w:lsdException w:name="toc 6" w:semiHidden="1" w:uiPriority="39" w:unhideWhenUsed="1"/>
-    <w:lsdException w:name="toc 7" w:semiHidden="1" w:uiPriority="39" w:unhideWhenUsed="1"/>
-    <w:lsdException w:name="toc 8" w:semiHidden="1" w:uiPriority="39" w:unhideWhenUsed="1"/>
-    <w:lsdException w:name="toc 9" w:semiHidden="1" w:uiPriority="39" w:unhideWhenUsed="1"/>
-    <w:lsdException w:name="Normal Indent" w:semiHidden="1" w:unhideWhenUsed="1"/>
-    <w:lsdException w:name="footnote text" w:semiHidden="1" w:unhideWhenUsed="1"/>
-    <w:lsdException w:name="annotation text" w:semiHidden="1" w:unhideWhenUsed="1"/>
-    <w:lsdException w:name="header" w:semiHidden="1" w:unhideWhenUsed="1"/>
-    <w:lsdException w:name="footer" w:semiHidden="1" w:unhideWhenUsed="1"/>
-    <w:lsdException w:name="index heading" w:semiHidden="1" w:unhideWhenUsed="1"/>
-    <w:lsdException w:name="caption" w:semiHidden="1" w:uiPriority="35" w:unhideWhenUsed="1" w:qFormat="1"/>
-    <w:lsdException w:name="table of figures" w:semiHidden="1" w:unhideWhenUsed="1"/>
-    <w:lsdException w:name="envelope address" w:semiHidden="1" w:unhideWhenUsed="1"/>
-    <w:lsdException w:name="envelope return" w:semiHidden="1" w:unhideWhenUsed="1"/>
-    <w:lsdException w:name="footnote reference" w:semiHidden="1" w:unhideWhenUsed="1"/>
-    <w:lsdException w:name="annotation reference" w:semiHidden="1" w:unhideWhenUsed="1"/>
-    <w:lsdException w:name="line number" w:semiHidden="1" w:unhideWhenUsed="1"/>
-    <w:lsdException w:name="page number" w:semiHidden="1" w:unhideWhenUsed="1"/>
-    <w:lsdException w:name="endnote reference" w:semiHidden="1" w:unhideWhenUsed="1"/>
-    <w:lsdException w:name="endnote text" w:semiHidden="1" w:unhideWhenUsed="1"/>
-    <w:lsdException w:name="table of authorities" w:semiHidden="1" w:unhideWhenUsed="1"/>
-    <w:lsdException w:name="macro" w:semiHidden="1" w:unhideWhenUsed="1"/>
-    <w:lsdException w:name="toa heading" w:semiHidden="1" w:unhideWhenUsed="1"/>
-    <w:lsdException w:name="List" w:semiHidden="1" w:unhideWhenUsed="1"/>
-    <w:lsdException w:name="List Bullet" w:semiHidden="1" w:unhideWhenUsed="1"/>
-    <w:lsdException w:name="List Number" w:semiHidden="1" w:unhideWhenUsed="1"/>
-    <w:lsdException w:name="List 2" w:semiHidden="1" w:unhideWhenUsed="1"/>
-    <w:lsdException w:name="List 3" w:semiHidden="1" w:unhideWhenUsed="1"/>
-    <w:lsdException w:name="List 4" w:semiHidden="1" w:unhideWhenUsed="1"/>
-    <w:lsdException w:name="List 5" w:semiHidden="1" w:unhideWhenUsed="1"/>
-    <w:lsdException w:name="List Bullet 2" w:semiHidden="1" w:unhideWhenUsed="1"/>
-    <w:lsdException w:name="List Bullet 3" w:semiHidden="1" w:unhideWhenUsed="1"/>
-    <w:lsdException w:name="List Bullet 4" w:semiHidden="1" w:unhideWhenUsed="1"/>
-    <w:lsdException w:name="List Bullet 5" w:semiHidden="1" w:unhideWhenUsed="1"/>
-    <w:lsdException w:name="List Number 2" w:semiHidden="1" w:unhideWhenUsed="1"/>
-    <w:lsdException w:name="List Number 3" w:semiHidden="1" w:unhideWhenUsed="1"/>
-    <w:lsdException w:name="List Number 4" w:semiHidden="1" w:unhideWhenUsed="1"/>
-    <w:lsdException w:name="List Number 5" w:semiHidden="1" w:unhideWhenUsed="1"/>
-    <w:lsdException w:name="Title" w:uiPriority="10" w:qFormat="1"/>
-    <w:lsdException w:name="Closing" w:semiHidden="1" w:unhideWhenUsed="1"/>
-    <w:lsdException w:name="Signature" w:semiHidden="1" w:unhideWhenUsed="1"/>
-    <w:lsdException w:name="Default Paragraph Font" w:semiHidden="1" w:uiPriority="1" w:unhideWhenUsed="1"/>
-    <w:lsdException w:name="Body Text" w:semiHidden="1" w:unhideWhenUsed="1"/>
-    <w:lsdException w:name="Body Text Indent" w:semiHidden="1" w:unhideWhenUsed="1"/>
-    <w:lsdException w:name="List Continue" w:semiHidden="1" w:unhideWhenUsed="1"/>
-    <w:lsdException w:name="List Continue 2" w:semiHidden="1" w:unhideWhenUsed="1"/>
-    <w:lsdException w:name="List Continue 3" w:semiHidden="1" w:unhideWhenUsed="1"/>
-    <w:lsdException w:name="List Continue 4" w:semiHidden="1" w:unhideWhenUsed="1"/>
-    <w:lsdException w:name="List Continue 5" w:semiHidden="1" w:unhideWhenUsed="1"/>
-    <w:lsdException w:name="Message Header" w:semiHidden="1" w:unhideWhenUsed="1"/>
-    <w:lsdException w:name="Subtitle" w:uiPriority="11" w:qFormat="1"/>
-    <w:lsdException w:name="Salutation" w:semiHidden="1" w:unhideWhenUsed="1"/>
-    <w:lsdException w:name="Date" w:semiHidden="1" w:unhideWhenUsed="1"/>
-    <w:lsdException w:name="Body Text First Indent" w:semiHidden="1" w:unhideWhenUsed="1"/>
-    <w:lsdException w:name="Body Text First Indent 2" w:semiHidden="1" w:unhideWhenUsed="1"/>
-    <w:lsdException w:name="Note Heading" w:semiHidden="1" w:unhideWhenUsed="1"/>
-    <w:lsdException w:name="Body Text 2" w:semiHidden="1" w:unhideWhenUsed="1"/>
-    <w:lsdException w:name="Body Text 3" w:semiHidden="1" w:unhideWhenUsed="1"/>
-    <w:lsdException w:name="Body Text Indent 2" w:semiHidden="1" w:unhideWhenUsed="1"/>
-    <w:lsdException w:name="Body Text Indent 3" w:semiHidden="1" w:unhideWhenUsed="1"/>
-    <w:lsdException w:name="Block Text" w:semiHidden="1" w:unhideWhenUsed="1"/>
-    <w:lsdException w:name="Hyperlink" w:semiHidden="1" w:unhideWhenUsed="1"/>
-    <w:lsdException w:name="FollowedHyperlink" w:semiHidden="1" w:unhideWhenUsed="1"/>
-    <w:lsdException w:name="Strong" w:uiPriority="22" w:qFormat="1"/>
-    <w:lsdException w:name="Emphasis" w:uiPriority="20" w:qFormat="1"/>
-    <w:lsdException w:name="Document Map" w:semiHidden="1" w:unhideWhenUsed="1"/>
-    <w:lsdException w:name="Plain Text" w:semiHidden="1" w:unhideWhenUsed="1"/>
-    <w:lsdException w:name="E-mail Signature" w:semiHidden="1" w:unhideWhenUsed="1"/>
-    <w:lsdException w:name="HTML Top of Form" w:semiHidden="1" w:unhideWhenUsed="1"/>
-    <w:lsdException w:name="HTML Bottom of Form" w:semiHidden="1" w:unhideWhenUsed="1"/>
-    <w:lsdException w:name="Normal (Web)" w:semiHidden="1" w:unhideWhenUsed="1"/>
-    <w:lsdException w:name="HTML Acronym" w:semiHidden="1" w:unhideWhenUsed="1"/>
-    <w:lsdException w:name="HTML Address" w:semiHidden="1" w:unhideWhenUsed="1"/>
-    <w:lsdException w:name="HTML Cite" w:semiHidden="1" w:unhideWhenUsed="1"/>
-    <w:lsdException w:name="HTML Code" w:semiHidden="1" w:unhideWhenUsed="1"/>
-    <w:lsdException w:name="HTML Definition" w:semiHidden="1" w:unhideWhenUsed="1"/>
-    <w:lsdException w:name="HTML Keyboard" w:semiHidden="1" w:unhideWhenUsed="1"/>
-    <w:lsdException w:name="HTML Preformatted" w:semiHidden="1" w:unhideWhenUsed="1"/>
-    <w:lsdException w:name="HTML Sample" w:semiHidden="1" w:unhideWhenUsed="1"/>
-    <w:lsdException w:name="HTML Typewriter" w:semiHidden="1" w:unhideWhenUsed="1"/>
-    <w:lsdException w:name="HTML Variable" w:semiHidden="1" w:unhideWhenUsed="1"/>
-    <w:lsdException w:name="Normal Table" w:semiHidden="1" w:unhideWhenUsed="1"/>
-    <w:lsdException w:name="annotation subject" w:semiHidden="1" w:unhideWhenUsed="1"/>
-    <w:lsdException w:name="No List" w:semiHidden="1" w:unhideWhenUsed="1"/>
-    <w:lsdException w:name="Outline List 1" w:semiHidden="1" w:unhideWhenUsed="1"/>
-    <w:lsdException w:name="Outline List 2" w:semiHidden="1" w:unhideWhenUsed="1"/>
-    <w:lsdException w:name="Outline List 3" w:semiHidden="1" w:unhideWhenUsed="1"/>
-    <w:lsdException w:name="Table Simple 1" w:semiHidden="1" w:unhideWhenUsed="1"/>
-    <w:lsdException w:name="Table Simple 2" w:semiHidden="1" w:unhideWhenUsed="1"/>
-    <w:lsdException w:name="Table Simple 3" w:semiHidden="1" w:unhideWhenUsed="1"/>
-    <w:lsdException w:name="Table Classic 1" w:semiHidden="1" w:unhideWhenUsed="1"/>
-    <w:lsdException w:name="Table Classic 2" w:semiHidden="1" w:unhideWhenUsed="1"/>
-    <w:lsdException w:name="Table Classic 3" w:semiHidden="1" w:unhideWhenUsed="1"/>
-    <w:lsdException w:name="Table Classic 4" w:semiHidden="1" w:unhideWhenUsed="1"/>
-    <w:lsdException w:name="Table Colorful 1" w:semiHidden="1" w:unhideWhenUsed="1"/>
-    <w:lsdException w:name="Table Colorful 2" w:semiHidden="1" w:unhideWhenUsed="1"/>
-    <w:lsdException w:name="Table Colorful 3" w:semiHidden="1" w:unhideWhenUsed="1"/>
-    <w:lsdException w:name="Table Columns 1" w:semiHidden="1" w:unhideWhenUsed="1"/>
-    <w:lsdException w:name="Table Columns 2" w:semiHidden="1" w:unhideWhenUsed="1"/>
-    <w:lsdException w:name="Table Columns 3" w:semiHidden="1" w:unhideWhenUsed="1"/>
-    <w:lsdException w:name="Table Columns 4" w:semiHidden="1" w:unhideWhenUsed="1"/>
-    <w:lsdException w:name="Table Columns 5" w:semiHidden="1" w:unhideWhenUsed="1"/>
-    <w:lsdException w:name="Table Grid 1" w:semiHidden="1" w:unhideWhenUsed="1"/>
-    <w:lsdException w:name="Table Grid 2" w:semiHidden="1" w:unhideWhenUsed="1"/>
-    <w:lsdException w:name="Table Grid 3" w:semiHidden="1" w:unhideWhenUsed="1"/>
-    <w:lsdException w:name="Table Grid 4" w:semiHidden="1" w:unhideWhenUsed="1"/>
-    <w:lsdException w:name="Table Grid 5" w:semiHidden="1" w:unhideWhenUsed="1"/>
-    <w:lsdException w:name="Table Grid 6" w:semiHidden="1" w:unhideWhenUsed="1"/>
-    <w:lsdException w:name="Table Grid 7" w:semiHidden="1" w:unhideWhenUsed="1"/>
-    <w:lsdException w:name="Table Grid 8" w:semiHidden="1" w:unhideWhenUsed="1"/>
-    <w:lsdException w:name="Table List 1" w:semiHidden="1" w:unhideWhenUsed="1"/>
-    <w:lsdException w:name="Table List 2" w:semiHidden="1" w:unhideWhenUsed="1"/>
-    <w:lsdException w:name="Table List 3" w:semiHidden="1" w:unhideWhenUsed="1"/>
-    <w:lsdException w:name="Table List 4" w:semiHidden="1" w:unhideWhenUsed="1"/>
-    <w:lsdException w:name="Table List 5" w:semiHidden="1" w:unhideWhenUsed="1"/>
-    <w:lsdException w:name="Table List 6" w:semiHidden="1" w:unhideWhenUsed="1"/>
-    <w:lsdException w:name="Table List 7" w:semiHidden="1" w:unhideWhenUsed="1"/>
-    <w:lsdException w:name="Table List 8" w:semiHidden="1" w:unhideWhenUsed="1"/>
-    <w:lsdException w:name="Table 3D effects 1" w:semiHidden="1" w:unhideWhenUsed="1"/>
-    <w:lsdException w:name="Table 3D effects 2" w:semiHidden="1" w:unhideWhenUsed="1"/>
-    <w:lsdException w:name="Table 3D effects 3" w:semiHidden="1" w:unhideWhenUsed="1"/>
-    <w:lsdException w:name="Table Contemporary" w:semiHidden="1" w:unhideWhenUsed="1"/>
-    <w:lsdException w:name="Table Elegant" w:semiHidden="1" w:unhideWhenUsed="1"/>
-    <w:lsdException w:name="Table Professional" w:semiHidden="1" w:unhideWhenUsed="1"/>
-    <w:lsdException w:name="Table Subtle 1" w:semiHidden="1" w:unhideWhenUsed="1"/>
-    <w:lsdException w:name="Table Subtle 2" w:semiHidden="1" w:unhideWhenUsed="1"/>
-    <w:lsdException w:name="Table Web 1" w:semiHidden="1" w:unhideWhenUsed="1"/>
-    <w:lsdException w:name="Table Web 2" w:semiHidden="1" w:unhideWhenUsed="1"/>
-    <w:lsdException w:name="Table Web 3" w:semiHidden="1" w:unhideWhenUsed="1"/>
-    <w:lsdException w:name="Balloon Text" w:semiHidden="1" w:unhideWhenUsed="1"/>
-    <w:lsdException w:name="Table Grid" w:uiPriority="39"/>
-    <w:lsdException w:name="Table Theme" w:semiHidden="1" w:unhideWhenUsed="1"/>
-    <w:lsdException w:name="Placeholder Text" w:semiHidden="1"/>
-    <w:lsdException w:name="No Spacing" w:uiPriority="1" w:qFormat="1"/>
-    <w:lsdException w:name="Light Shading" w:uiPriority="60"/>
-    <w:lsdException w:name="Light List" w:uiPriority="61"/>
-    <w:lsdException w:name="Light Grid" w:uiPriority="62"/>
-    <w:lsdException w:name="Medium Shading 1" w:uiPriority="63"/>
-    <w:lsdException w:name="Medium Shading 2" w:uiPriority="64"/>
-    <w:lsdException w:name="Medium List 1" w:uiPriority="65"/>
-    <w:lsdException w:name="Medium List 2" w:uiPriority="66"/>
-    <w:lsdException w:name="Medium Grid 1" w:uiPriority="67"/>
-    <w:lsdException w:name="Medium Grid 2" w:uiPriority="68"/>
-    <w:lsdException w:name="Medium Grid 3" w:uiPriority="69"/>
-    <w:lsdException w:name="Dark List" w:uiPriority="70"/>
-    <w:lsdException w:name="Colorful Shading" w:uiPriority="71"/>
-    <w:lsdException w:name="Colorful List" w:uiPriority="72"/>
-    <w:lsdException w:name="Colorful Grid" w:uiPriority="73"/>
-    <w:lsdException w:name="Light Shading Accent 1" w:uiPriority="60"/>
-    <w:lsdException w:name="Light List Accent 1" w:uiPriority="61"/>
-    <w:lsdException w:name="Light Grid Accent 1" w:uiPriority="62"/>
-    <w:lsdException w:name="Medium Shading 1 Accent 1" w:uiPriority="63"/>
-    <w:lsdException w:name="Medium Shading 2 Accent 1" w:uiPriority="64"/>
-    <w:lsdException w:name="Medium List 1 Accent 1" w:uiPriority="65"/>
-    <w:lsdException w:name="Revision" w:semiHidden="1"/>
-    <w:lsdException w:name="List Paragraph" w:uiPriority="34" w:qFormat="1"/>
-    <w:lsdException w:name="Quote" w:uiPriority="29" w:qFormat="1"/>
-    <w:lsdException w:name="Intense Quote" w:uiPriority="30" w:qFormat="1"/>
-    <w:lsdException w:name="Medium List 2 Accent 1" w:uiPriority="66"/>
-    <w:lsdException w:name="Medium Grid 1 Accent 1" w:uiPriority="67"/>
-    <w:lsdException w:name="Medium Grid 2 Accent 1" w:uiPriority="68"/>
-    <w:lsdException w:name="Medium Grid 3 Accent 1" w:uiPriority="69"/>
-    <w:lsdException w:name="Dark List Accent 1" w:uiPriority="70"/>
-    <w:lsdException w:name="Colorful Shading Accent 1" w:uiPriority="71"/>
-    <w:lsdException w:name="Colorful List Accent 1" w:uiPriority="72"/>
-    <w:lsdException w:name="Colorful Grid Accent 1" w:uiPriority="73"/>
-    <w:lsdException w:name="Light Shading Accent 2" w:uiPriority="60"/>
-    <w:lsdException w:name="Light List Accent 2" w:uiPriority="61"/>
-    <w:lsdException w:name="Light Grid Accent 2" w:uiPriority="62"/>
-    <w:lsdException w:name="Medium Shading 1 Accent 2" w:uiPriority="63"/>
-    <w:lsdException w:name="Medium Shading 2 Accent 2" w:uiPriority="64"/>
-    <w:lsdException w:name="Medium List 1 Accent 2" w:uiPriority="65"/>
-    <w:lsdException w:name="Medium List 2 Accent 2" w:uiPriority="66"/>
-    <w:lsdException w:name="Medium Grid 1 Accent 2" w:uiPriority="67"/>
-    <w:lsdException w:name="Medium Grid 2 Accent 2" w:uiPriority="68"/>
-    <w:lsdException w:name="Medium Grid 3 Accent 2" w:uiPriority="69"/>
-    <w:lsdException w:name="Dark List Accent 2" w:uiPriority="70"/>
-    <w:lsdException w:name="Colorful Shading Accent 2" w:uiPriority="71"/>
-    <w:lsdException w:name="Colorful List Accent 2" w:uiPriority="72"/>
-    <w:lsdException w:name="Colorful Grid Accent 2" w:uiPriority="73"/>
-    <w:lsdException w:name="Light Shading Accent 3" w:uiPriority="60"/>
-    <w:lsdException w:name="Light List Accent 3" w:uiPriority="61"/>
-    <w:lsdException w:name="Light Grid Accent 3" w:uiPriority="62"/>
-    <w:lsdException w:name="Medium Shading 1 Accent 3" w:uiPriority="63"/>
-    <w:lsdException w:name="Medium Shading 2 Accent 3" w:uiPriority="64"/>
-    <w:lsdException w:name="Medium List 1 Accent 3" w:uiPriority="65"/>
-    <w:lsdException w:name="Medium List 2 Accent 3" w:uiPriority="66"/>
-    <w:lsdException w:name="Medium Grid 1 Accent 3" w:uiPriority="67"/>
-    <w:lsdException w:name="Medium Grid 2 Accent 3" w:uiPriority="68"/>
-    <w:lsdException w:name="Medium Grid 3 Accent 3" w:uiPriority="69"/>
-    <w:lsdException w:name="Dark List Accent 3" w:uiPriority="70"/>
-    <w:lsdException w:name="Colorful Shading Accent 3" w:uiPriority="71"/>
-    <w:lsdException w:name="Colorful List Accent 3" w:uiPriority="72"/>
-    <w:lsdException w:name="Colorful Grid Accent 3" w:uiPriority="73"/>
-    <w:lsdException w:name="Light Shading Accent 4" w:uiPriority="60"/>
-    <w:lsdException w:name="Light List Accent 4" w:uiPriority="61"/>
-    <w:lsdException w:name="Light Grid Accent 4" w:uiPriority="62"/>
-    <w:lsdException w:name="Medium Shading 1 Accent 4" w:uiPriority="63"/>
-    <w:lsdException w:name="Medium Shading 2 Accent 4" w:uiPriority="64"/>
-    <w:lsdException w:name="Medium List 1 Accent 4" w:uiPriority="65"/>
-    <w:lsdException w:name="Medium List 2 Accent 4" w:uiPriority="66"/>
-    <w:lsdException w:name="Medium Grid 1 Accent 4" w:uiPriority="67"/>
-    <w:lsdException w:name="Medium Grid 2 Accent 4" w:uiPriority="68"/>
-    <w:lsdException w:name="Medium Grid 3 Accent 4" w:uiPriority="69"/>
-    <w:lsdException w:name="Dark List Accent 4" w:uiPriority="70"/>
-    <w:lsdException w:name="Colorful Shading Accent 4" w:uiPriority="71"/>
-    <w:lsdException w:name="Colorful List Accent 4" w:uiPriority="72"/>
-    <w:lsdException w:name="Colorful Grid Accent 4" w:uiPriority="73"/>
-    <w:lsdException w:name="Light Shading Accent 5" w:uiPriority="60"/>
-    <w:lsdException w:name="Light List Accent 5" w:uiPriority="61"/>
-    <w:lsdException w:name="Light Grid Accent 5" w:uiPriority="62"/>
-    <w:lsdException w:name="Medium Shading 1 Accent 5" w:uiPriority="63"/>
-    <w:lsdException w:name="Medium Shading 2 Accent 5" w:uiPriority="64"/>
-    <w:lsdException w:name="Medium List 1 Accent 5" w:uiPriority="65"/>
-    <w:lsdException w:name="Medium List 2 Accent 5" w:uiPriority="66"/>
-    <w:lsdException w:name="Medium Grid 1 Accent 5" w:uiPriority="67"/>
-    <w:lsdException w:name="Medium Grid 2 Accent 5" w:uiPriority="68"/>
-    <w:lsdException w:name="Medium Grid 3 Accent 5" w:uiPriority="69"/>
-    <w:lsdException w:name="Dark List Accent 5" w:uiPriority="70"/>
-    <w:lsdException w:name="Colorful Shading Accent 5" w:uiPriority="71"/>
-    <w:lsdException w:name="Colorful List Accent 5" w:uiPriority="72"/>
-    <w:lsdException w:name="Colorful Grid Accent 5" w:uiPriority="73"/>
-    <w:lsdException w:name="Light Shading Accent 6" w:uiPriority="60"/>
-    <w:lsdException w:name="Light List Accent 6" w:uiPriority="61"/>
-    <w:lsdException w:name="Light Grid Accent 6" w:uiPriority="62"/>
-    <w:lsdException w:name="Medium Shading 1 Accent 6" w:uiPriority="63"/>
-    <w:lsdException w:name="Medium Shading 2 Accent 6" w:uiPriority="64"/>
-    <w:lsdException w:name="Medium List 1 Accent 6" w:uiPriority="65"/>
-    <w:lsdException w:name="Medium List 2 Accent 6" w:uiPriority="66"/>
-    <w:lsdException w:name="Medium Grid 1 Accent 6" w:uiPriority="67"/>
-    <w:lsdException w:name="Medium Grid 2 Accent 6" w:uiPriority="68"/>
-    <w:lsdException w:name="Medium Grid 3 Accent 6" w:uiPriority="69"/>
-    <w:lsdException w:name="Dark List Accent 6" w:uiPriority="70"/>
-    <w:lsdException w:name="Colorful Shading Accent 6" w:uiPriority="71"/>
-    <w:lsdException w:name="Colorful List Accent 6" w:uiPriority="72"/>
-    <w:lsdException w:name="Colorful Grid Accent 6" w:uiPriority="73"/>
-    <w:lsdException w:name="Subtle Emphasis" w:uiPriority="19" w:qFormat="1"/>
-    <w:lsdException w:name="Intense Emphasis" w:uiPriority="21" w:qFormat="1"/>
-    <w:lsdException w:name="Subtle Reference" w:uiPriority="31" w:qFormat="1"/>
-    <w:lsdException w:name="Intense Reference" w:uiPriority="32" w:qFormat="1"/>
-    <w:lsdException w:name="Book Title" w:uiPriority="33" w:qFormat="1"/>
-    <w:lsdException w:name="Bibliography" w:semiHidden="1" w:uiPriority="37" w:unhideWhenUsed="1"/>
-    <w:lsdException w:name="TOC Heading" w:semiHidden="1" w:uiPriority="39" w:unhideWhenUsed="1" w:qFormat="1"/>
-    <w:lsdException w:name="Plain Table 1" w:uiPriority="41"/>
-    <w:lsdException w:name="Plain Table 2" w:uiPriority="42"/>
-    <w:lsdException w:name="Plain Table 3" w:uiPriority="43"/>
-    <w:lsdException w:name="Plain Table 4" w:uiPriority="44"/>
-    <w:lsdException w:name="Plain Table 5" w:uiPriority="45"/>
-    <w:lsdException w:name="Grid Table Light" w:uiPriority="40"/>
-    <w:lsdException w:name="Grid Table 1 Light" w:uiPriority="46"/>
-    <w:lsdException w:name="Grid Table 2" w:uiPriority="47"/>
-    <w:lsdException w:name="Grid Table 3" w:uiPriority="48"/>
-    <w:lsdException w:name="Grid Table 4" w:uiPriority="49"/>
-    <w:lsdException w:name="Grid Table 5 Dark" w:uiPriority="50"/>
-    <w:lsdException w:name="Grid Table 6 Colorful" w:uiPriority="51"/>
-    <w:lsdException w:name="Grid Table 7 Colorful" w:uiPriority="52"/>
-    <w:lsdException w:name="Grid Table 1 Light Accent 1" w:uiPriority="46"/>
-    <w:lsdException w:name="Grid Table 2 Accent 1" w:uiPriority="47"/>
-    <w:lsdException w:name="Grid Table 3 Accent 1" w:uiPriority="48"/>
-    <w:lsdException w:name="Grid Table 4 Accent 1" w:uiPriority="49"/>
-    <w:lsdException w:name="Grid Table 5 Dark Accent 1" w:uiPriority="50"/>
-    <w:lsdException w:name="Grid Table 6 Colorful Accent 1" w:uiPriority="51"/>
-    <w:lsdException w:name="Grid Table 7 Colorful Accent 1" w:uiPriority="52"/>
-    <w:lsdException w:name="Grid Table 1 Light Accent 2" w:uiPriority="46"/>
-    <w:lsdException w:name="Grid Table 2 Accent 2" w:uiPriority="47"/>
-    <w:lsdException w:name="Grid Table 3 Accent 2" w:uiPriority="48"/>
-    <w:lsdException w:name="Grid Table 4 Accent 2" w:uiPriority="49"/>
-    <w:lsdException w:name="Grid Table 5 Dark Accent 2" w:uiPriority="50"/>
-    <w:lsdException w:name="Grid Table 6 Colorful Accent 2" w:uiPriority="51"/>
-    <w:lsdException w:name="Grid Table 7 Colorful Accent 2" w:uiPriority="52"/>
-    <w:lsdException w:name="Grid Table 1 Light Accent 3" w:uiPriority="46"/>
-    <w:lsdException w:name="Grid Table 2 Accent 3" w:uiPriority="47"/>
-    <w:lsdException w:name="Grid Table 3 Accent 3" w:uiPriority="48"/>
-    <w:lsdException w:name="Grid Table 4 Accent 3" w:uiPriority="49"/>
-    <w:lsdException w:name="Grid Table 5 Dark Accent 3" w:uiPriority="50"/>
-    <w:lsdException w:name="Grid Table 6 Colorful Accent 3" w:uiPriority="51"/>
-    <w:lsdException w:name="Grid Table 7 Colorful Accent 3" w:uiPriority="52"/>
-    <w:lsdException w:name="Grid Table 1 Light Accent 4" w:uiPriority="46"/>
-    <w:lsdException w:name="Grid Table 2 Accent 4" w:uiPriority="47"/>
-    <w:lsdException w:name="Grid Table 3 Accent 4" w:uiPriority="48"/>
-    <w:lsdException w:name="Grid Table 4 Accent 4" w:uiPriority="49"/>
-    <w:lsdException w:name="Grid Table 5 Dark Accent 4" w:uiPriority="50"/>
-    <w:lsdException w:name="Grid Table 6 Colorful Accent 4" w:uiPriority="51"/>
-    <w:lsdException w:name="Grid Table 7 Colorful Accent 4" w:uiPriority="52"/>
-    <w:lsdException w:name="Grid Table 1 Light Accent 5" w:uiPriority="46"/>
-    <w:lsdException w:name="Grid Table 2 Accent 5" w:uiPriority="47"/>
-    <w:lsdException w:name="Grid Table 3 Accent 5" w:uiPriority="48"/>
-    <w:lsdException w:name="Grid Table 4 Accent 5" w:uiPriority="49"/>
-    <w:lsdException w:name="Grid Table 5 Dark Accent 5" w:uiPriority="50"/>
-    <w:lsdException w:name="Grid Table 6 Colorful Accent 5" w:uiPriority="51"/>
-    <w:lsdException w:name="Grid Table 7 Colorful Accent 5" w:uiPriority="52"/>
-    <w:lsdException w:name="Grid Table 1 Light Accent 6" w:uiPriority="46"/>
-    <w:lsdException w:name="Grid Table 2 Accent 6" w:uiPriority="47"/>
-    <w:lsdException w:name="Grid Table 3 Accent 6" w:uiPriority="48"/>
-    <w:lsdException w:name="Grid Table 4 Accent 6" w:uiPriority="49"/>
-    <w:lsdException w:name="Grid Table 5 Dark Accent 6" w:uiPriority="50"/>
-    <w:lsdException w:name="Grid Table 6 Colorful Accent 6" w:uiPriority="51"/>
-    <w:lsdException w:name="Grid Table 7 Colorful Accent 6" w:uiPriority="52"/>
-    <w:lsdException w:name="List Table 1 Light" w:uiPriority="46"/>
-    <w:lsdException w:name="List Table 2" w:uiPriority="47"/>
-    <w:lsdException w:name="List Table 3" w:uiPriority="48"/>
-    <w:lsdException w:name="List Table 4" w:uiPriority="49"/>
-    <w:lsdException w:name="List Table 5 Dark" w:uiPriority="50"/>
-    <w:lsdException w:name="List Table 6 Colorful" w:uiPriority="51"/>
-    <w:lsdException w:name="List Table 7 Colorful" w:uiPriority="52"/>
-    <w:lsdException w:name="List Table 1 Light Accent 1" w:uiPriority="46"/>
-    <w:lsdException w:name="List Table 2 Accent 1" w:uiPriority="47"/>
-    <w:lsdException w:name="List Table 3 Accent 1" w:uiPriority="48"/>
-    <w:lsdException w:name="List Table 4 Accent 1" w:uiPriority="49"/>
-    <w:lsdException w:name="List Table 5 Dark Accent 1" w:uiPriority="50"/>
-    <w:lsdException w:name="List Table 6 Colorful Accent 1" w:uiPriority="51"/>
-    <w:lsdException w:name="List Table 7 Colorful Accent 1" w:uiPriority="52"/>
-    <w:lsdException w:name="List Table 1 Light Accent 2" w:uiPriority="46"/>
-    <w:lsdException w:name="List Table 2 Accent 2" w:uiPriority="47"/>
-    <w:lsdException w:name="List Table 3 Accent 2" w:uiPriority="48"/>
-    <w:lsdException w:name="List Table 4 Accent 2" w:uiPriority="49"/>
-    <w:lsdException w:name="List Table 5 Dark Accent 2" w:uiPriority="50"/>
-    <w:lsdException w:name="List Table 6 Colorful Accent 2" w:uiPriority="51"/>
-    <w:lsdException w:name="List Table 7 Colorful Accent 2" w:uiPriority="52"/>
-    <w:lsdException w:name="List Table 1 Light Accent 3" w:uiPriority="46"/>
-    <w:lsdException w:name="List Table 2 Accent 3" w:uiPriority="47"/>
-    <w:lsdException w:name="List Table 3 Accent 3" w:uiPriority="48"/>
-    <w:lsdException w:name="List Table 4 Accent 3" w:uiPriority="49"/>
-    <w:lsdException w:name="List Table 5 Dark Accent 3" w:uiPriority="50"/>
-    <w:lsdException w:name="List Table 6 Colorful Accent 3" w:uiPriority="51"/>
-    <w:lsdException w:name="List Table 7 Colorful Accent 3" w:uiPriority="52"/>
-    <w:lsdException w:name="List Table 1 Light Accent 4" w:uiPriority="46"/>
-    <w:lsdException w:name="List Table 2 Accent 4" w:uiPriority="47"/>
-    <w:lsdException w:name="List Table 3 Accent 4" w:uiPriority="48"/>
-    <w:lsdException w:name="List Table 4 Accent 4" w:uiPriority="49"/>
-    <w:lsdException w:name="List Table 5 Dark Accent 4" w:uiPriority="50"/>
-    <w:lsdException w:name="List Table 6 Colorful Accent 4" w:uiPriority="51"/>
-    <w:lsdException w:name="List Table 7 Colorful Accent 4" w:uiPriority="52"/>
-    <w:lsdException w:name="List Table 1 Light Accent 5" w:uiPriority="46"/>
-    <w:lsdException w:name="List Table 2 Accent 5" w:uiPriority="47"/>
-    <w:lsdException w:name="List Table 3 Accent 5" w:uiPriority="48"/>
-    <w:lsdException w:name="List Table 4 Accent 5" w:uiPriority="49"/>
-    <w:lsdException w:name="List Table 5 Dark Accent 5" w:uiPriority="50"/>
-    <w:lsdException w:name="List Table 6 Colorful Accent 5" w:uiPriority="51"/>
-    <w:lsdException w:name="List Table 7 Colorful Accent 5" w:uiPriority="52"/>
-    <w:lsdException w:name="List Table 1 Light Accent 6" w:uiPriority="46"/>
-    <w:lsdException w:name="List Table 2 Accent 6" w:uiPriority="47"/>
-    <w:lsdException w:name="List Table 3 Accent 6" w:uiPriority="48"/>
-    <w:lsdException w:name="List Table 4 Accent 6" w:uiPriority="49"/>
-    <w:lsdException w:name="List Table 5 Dark Accent 6" w:uiPriority="50"/>
-    <w:lsdException w:name="List Table 6 Colorful Accent 6" w:uiPriority="51"/>
-    <w:lsdException w:name="List Table 7 Colorful Accent 6" w:uiPriority="52"/>
-    <w:lsdException w:name="Mention" w:semiHidden="1" w:unhideWhenUsed="1"/>
-    <w:lsdException w:name="Smart Hyperlink" w:semiHidden="1" w:unhideWhenUsed="1"/>
-    <w:lsdException w:name="Hashtag" w:semiHidden="1" w:unhideWhenUsed="1"/>
-    <w:lsdException w:name="Unresolved Mention" w:semiHidden="1" w:unhideWhenUsed="1"/>
-    <w:lsdException w:name="Smart Link" w:semiHidden="1" w:unhideWhenUsed="1"/>
-  </w:latentStyles>
-  <w:style w:type="paragraph" w:default="1" w:styleId="Normal">
-    <w:name w:val="Normal"/>
-    <w:qFormat/>
-  </w:style>
-  <w:style w:type="character" w:default="1" w:styleId="DefaultParagraphFont">
-    <w:name w:val="Default Paragraph Font"/>
-    <w:uiPriority w:val="1"/>
-    <w:semiHidden/>
+  <w:style w:type="character" w:styleId="Hyperlink">
+    <w:name w:val="Hyperlink"/>
+    <w:basedOn w:val="DefaultParagraphFont"/>
+    <w:uiPriority w:val="99"/>
     <w:unhideWhenUsed/>
-  </w:style>
-  <w:style w:type="table" w:default="1" w:styleId="TableNormal">
-    <w:name w:val="Normal Table"/>
-    <w:uiPriority w:val="99"/>
-    <w:semiHidden/>
-    <w:unhideWhenUsed/>
-    <w:tblPr>
-      <w:tblInd w:w="0" w:type="dxa"/>
-      <w:tblCellMar>
-        <w:top w:w="0" w:type="dxa"/>
-        <w:left w:w="108" w:type="dxa"/>
-        <w:bottom w:w="0" w:type="dxa"/>
-        <w:right w:w="108" w:type="dxa"/>
-      </w:tblCellMar>
-    </w:tblPr>
-  </w:style>
-  <w:style w:type="numbering" w:default="1" w:styleId="NoList">
-    <w:name w:val="No List"/>
-    <w:uiPriority w:val="99"/>
-    <w:semiHidden/>
-    <w:unhideWhenUsed/>
-  </w:style>
-  <w:style w:type="paragraph" w:customStyle="1" w:styleId="47E774277D0F47669AB0A2C67AC546AF">
-    <w:name w:val="47E774277D0F47669AB0A2C67AC546AF"/>
-    <w:rsid w:val="00575EB9"/>
-  </w:style>
-  <w:style w:type="paragraph" w:customStyle="1" w:styleId="F94DB55F2BB04C748199D37BD6487319">
-    <w:name w:val="F94DB55F2BB04C748199D37BD6487319"/>
-    <w:rsid w:val="00575EB9"/>
-  </w:style>
-  <w:style w:type="paragraph" w:customStyle="1" w:styleId="EE81D1A4A5874F458B2F579F40AA7516">
-    <w:name w:val="EE81D1A4A5874F458B2F579F40AA7516"/>
-    <w:rsid w:val="00575EB9"/>
+    <w:rsid w:val="00153CB2"/>
+    <w:rPr>
+      <w:color w:val="467886" w:themeColor="hyperlink"/>
+      <w:u w:val="single"/>
+    </w:rPr>
   </w:style>
 </w:styles>
-</file>
-
-<file path=word/glossary/webSettings.xml><?xml version="1.0" encoding="utf-8"?>
-<w:webSettings xmlns:mc="http://schemas.openxmlformats.org/markup-compatibility/2006" xmlns:r="http://schemas.openxmlformats.org/officeDocument/2006/relationships" xmlns:w="http://schemas.openxmlformats.org/wordprocessingml/2006/main" xmlns:w14="http://schemas.microsoft.com/office/word/2010/wordml" xmlns:w15="http://schemas.microsoft.com/office/word/2012/wordml" xmlns:w16cex="http://schemas.microsoft.com/office/word/2018/wordml/cex" xmlns:w16cid="http://schemas.microsoft.com/office/word/2016/wordml/cid" xmlns:w16="http://schemas.microsoft.com/office/word/2018/wordml" xmlns:w16du="http://schemas.microsoft.com/office/word/2023/wordml/word16du" xmlns:w16sdtdh="http://schemas.microsoft.com/office/word/2020/wordml/sdtdatahash" xmlns:w16sdtfl="http://schemas.microsoft.com/office/word/2024/wordml/sdtformatlock" xmlns:w16se="http://schemas.microsoft.com/office/word/2015/wordml/symex" mc:Ignorable="w14 w15 w16se w16cid w16 w16cex w16sdtdh w16sdtfl w16du">
-  <w:optimizeForBrowser/>
-  <w:allowPNG/>
-</w:webSettings>
 </file>
 
 <file path=word/theme/theme1.xml><?xml version="1.0" encoding="utf-8"?>

</xml_diff>

<commit_message>
A bit more work done since last commit filling out the Fucntional requirements (4.1)
</commit_message>
<xml_diff>
--- a/report/ca1-report.docx
+++ b/report/ca1-report.docx
@@ -892,6 +892,14 @@
     </w:sdt>
     <w:sdt>
       <w:sdtPr>
+        <w:rPr>
+          <w:rFonts w:asciiTheme="minorHAnsi" w:eastAsiaTheme="minorHAnsi" w:hAnsiTheme="minorHAnsi" w:cstheme="minorBidi"/>
+          <w:color w:val="auto"/>
+          <w:kern w:val="2"/>
+          <w:sz w:val="24"/>
+          <w:szCs w:val="24"/>
+          <w14:ligatures w14:val="standardContextual"/>
+        </w:rPr>
         <w:id w:val="117424358"/>
         <w:docPartObj>
           <w:docPartGallery w:val="Table of Contents"/>
@@ -900,15 +908,9 @@
       </w:sdtPr>
       <w:sdtEndPr>
         <w:rPr>
-          <w:rFonts w:asciiTheme="minorHAnsi" w:eastAsiaTheme="minorHAnsi" w:hAnsiTheme="minorHAnsi" w:cstheme="minorBidi"/>
           <w:b/>
           <w:bCs/>
           <w:noProof/>
-          <w:color w:val="auto"/>
-          <w:kern w:val="2"/>
-          <w:sz w:val="24"/>
-          <w:szCs w:val="24"/>
-          <w14:ligatures w14:val="standardContextual"/>
         </w:rPr>
       </w:sdtEndPr>
       <w:sdtContent>
@@ -3413,6 +3415,7 @@
         <w:t>Constraints</w:t>
       </w:r>
     </w:p>
+    <w:p/>
     <w:tbl>
       <w:tblPr>
         <w:tblStyle w:val="PlainTable1"/>
@@ -3762,16 +3765,6 @@
     </w:p>
     <w:p>
       <w:pPr>
-        <w:pStyle w:val="ListParagraph"/>
-      </w:pPr>
-    </w:p>
-    <w:p>
-      <w:pPr>
-        <w:pStyle w:val="ListParagraph"/>
-      </w:pPr>
-    </w:p>
-    <w:p>
-      <w:pPr>
         <w:pStyle w:val="Heading2"/>
         <w:numPr>
           <w:ilvl w:val="1"/>
@@ -3783,6 +3776,7 @@
         <w:t>System Boundary</w:t>
       </w:r>
     </w:p>
+    <w:p/>
     <w:tbl>
       <w:tblPr>
         <w:tblStyle w:val="PlainTable1"/>
@@ -4004,6 +3998,7 @@
         <w:t>A stakeholder is any person, group or organisation that affects the system or is effected by it. An actor is an external role or system that directly interacts with the system or is effected by it. An actor is an external role or system that directly interacts with the system boundary. A role may be both, but the terms are not the same.</w:t>
       </w:r>
     </w:p>
+    <w:p/>
     <w:tbl>
       <w:tblPr>
         <w:tblStyle w:val="PlainTable1"/>
@@ -4091,7 +4086,10 @@
               <w:cnfStyle w:val="000000100000" w:firstRow="0" w:lastRow="0" w:firstColumn="0" w:lastColumn="0" w:oddVBand="0" w:evenVBand="0" w:oddHBand="1" w:evenHBand="0" w:firstRowFirstColumn="0" w:firstRowLastColumn="0" w:lastRowFirstColumn="0" w:lastRowLastColumn="0"/>
             </w:pPr>
             <w:r>
-              <w:t>Who seeks value from the service ?</w:t>
+              <w:t xml:space="preserve">Who seeks value from the </w:t>
+            </w:r>
+            <w:r>
+              <w:t>service?</w:t>
             </w:r>
           </w:p>
         </w:tc>
@@ -4152,6 +4150,9 @@
             <w:pPr>
               <w:cnfStyle w:val="000000000000" w:firstRow="0" w:lastRow="0" w:firstColumn="0" w:lastColumn="0" w:oddVBand="0" w:evenVBand="0" w:oddHBand="0" w:evenHBand="0" w:firstRowFirstColumn="0" w:firstRowLastColumn="0" w:lastRowFirstColumn="0" w:lastRowLastColumn="0"/>
             </w:pPr>
+            <w:r>
+              <w:t>Mobile library staff member, driver, branch staff member</w:t>
+            </w:r>
           </w:p>
         </w:tc>
       </w:tr>
@@ -4164,7 +4165,21 @@
             <w:cnfStyle w:val="001000000000" w:firstRow="0" w:lastRow="0" w:firstColumn="1" w:lastColumn="0" w:oddVBand="0" w:evenVBand="0" w:oddHBand="0" w:evenHBand="0" w:firstRowFirstColumn="0" w:firstRowLastColumn="0" w:lastRowFirstColumn="0" w:lastRowLastColumn="0"/>
             <w:tcW w:w="3005" w:type="dxa"/>
           </w:tcPr>
-          <w:p/>
+          <w:p>
+            <w:pPr>
+              <w:rPr>
+                <w:b w:val="0"/>
+                <w:bCs w:val="0"/>
+              </w:rPr>
+            </w:pPr>
+            <w:r>
+              <w:rPr>
+                <w:b w:val="0"/>
+                <w:bCs w:val="0"/>
+              </w:rPr>
+              <w:t>Management</w:t>
+            </w:r>
+          </w:p>
         </w:tc>
         <w:tc>
           <w:tcPr>
@@ -4187,6 +4202,9 @@
             <w:pPr>
               <w:cnfStyle w:val="000000100000" w:firstRow="0" w:lastRow="0" w:firstColumn="0" w:lastColumn="0" w:oddVBand="0" w:evenVBand="0" w:oddHBand="1" w:evenHBand="0" w:firstRowFirstColumn="0" w:firstRowLastColumn="0" w:lastRowFirstColumn="0" w:lastRowLastColumn="0"/>
             </w:pPr>
+            <w:r>
+              <w:t>Route coordinator, Kerry Rural Library partnership</w:t>
+            </w:r>
           </w:p>
         </w:tc>
       </w:tr>
@@ -4196,7 +4214,21 @@
             <w:cnfStyle w:val="001000000000" w:firstRow="0" w:lastRow="0" w:firstColumn="1" w:lastColumn="0" w:oddVBand="0" w:evenVBand="0" w:oddHBand="0" w:evenHBand="0" w:firstRowFirstColumn="0" w:firstRowLastColumn="0" w:lastRowFirstColumn="0" w:lastRowLastColumn="0"/>
             <w:tcW w:w="3005" w:type="dxa"/>
           </w:tcPr>
-          <w:p/>
+          <w:p>
+            <w:pPr>
+              <w:rPr>
+                <w:b w:val="0"/>
+                <w:bCs w:val="0"/>
+              </w:rPr>
+            </w:pPr>
+            <w:r>
+              <w:rPr>
+                <w:b w:val="0"/>
+                <w:bCs w:val="0"/>
+              </w:rPr>
+              <w:t>Technical/support</w:t>
+            </w:r>
+          </w:p>
         </w:tc>
         <w:tc>
           <w:tcPr>
@@ -4219,6 +4251,15 @@
             <w:pPr>
               <w:cnfStyle w:val="000000000000" w:firstRow="0" w:lastRow="0" w:firstColumn="0" w:lastColumn="0" w:oddVBand="0" w:evenVBand="0" w:oddHBand="0" w:evenHBand="0" w:firstRowFirstColumn="0" w:firstRowLastColumn="0" w:lastRowFirstColumn="0" w:lastRowLastColumn="0"/>
             </w:pPr>
+            <w:r>
+              <w:t>Lib</w:t>
+            </w:r>
+            <w:r>
+              <w:t xml:space="preserve">rary management system shared with </w:t>
+            </w:r>
+            <w:r>
+              <w:t>the wider library service</w:t>
+            </w:r>
           </w:p>
         </w:tc>
       </w:tr>
@@ -4231,7 +4272,21 @@
             <w:cnfStyle w:val="001000000000" w:firstRow="0" w:lastRow="0" w:firstColumn="1" w:lastColumn="0" w:oddVBand="0" w:evenVBand="0" w:oddHBand="0" w:evenHBand="0" w:firstRowFirstColumn="0" w:firstRowLastColumn="0" w:lastRowFirstColumn="0" w:lastRowLastColumn="0"/>
             <w:tcW w:w="3005" w:type="dxa"/>
           </w:tcPr>
-          <w:p/>
+          <w:p>
+            <w:pPr>
+              <w:rPr>
+                <w:b w:val="0"/>
+                <w:bCs w:val="0"/>
+              </w:rPr>
+            </w:pPr>
+            <w:r>
+              <w:rPr>
+                <w:b w:val="0"/>
+                <w:bCs w:val="0"/>
+              </w:rPr>
+              <w:t>External/regulatory</w:t>
+            </w:r>
+          </w:p>
         </w:tc>
         <w:tc>
           <w:tcPr>
@@ -4263,7 +4318,21 @@
             <w:cnfStyle w:val="001000000000" w:firstRow="0" w:lastRow="0" w:firstColumn="1" w:lastColumn="0" w:oddVBand="0" w:evenVBand="0" w:oddHBand="0" w:evenHBand="0" w:firstRowFirstColumn="0" w:firstRowLastColumn="0" w:lastRowFirstColumn="0" w:lastRowLastColumn="0"/>
             <w:tcW w:w="3005" w:type="dxa"/>
           </w:tcPr>
-          <w:p/>
+          <w:p>
+            <w:pPr>
+              <w:rPr>
+                <w:b w:val="0"/>
+                <w:bCs w:val="0"/>
+              </w:rPr>
+            </w:pPr>
+            <w:r>
+              <w:rPr>
+                <w:b w:val="0"/>
+                <w:bCs w:val="0"/>
+              </w:rPr>
+              <w:t>Indirect</w:t>
+            </w:r>
+          </w:p>
         </w:tc>
         <w:tc>
           <w:tcPr>
@@ -4286,10 +4355,2540 @@
             <w:pPr>
               <w:cnfStyle w:val="000000000000" w:firstRow="0" w:lastRow="0" w:firstColumn="0" w:lastColumn="0" w:oddVBand="0" w:evenVBand="0" w:oddHBand="0" w:evenHBand="0" w:firstRowFirstColumn="0" w:firstRowLastColumn="0" w:lastRowFirstColumn="0" w:lastRowLastColumn="0"/>
             </w:pPr>
+            <w:r>
+              <w:t>Schools: host sites such as community centres and shared housing</w:t>
+            </w:r>
           </w:p>
         </w:tc>
       </w:tr>
     </w:tbl>
+    <w:p/>
+    <w:p>
+      <w:pPr>
+        <w:pStyle w:val="Heading2"/>
+      </w:pPr>
+      <w:r>
+        <w:lastRenderedPageBreak/>
+        <w:t>3.1 Stakeholder analysis</w:t>
+      </w:r>
+    </w:p>
+    <w:p/>
+    <w:tbl>
+      <w:tblPr>
+        <w:tblStyle w:val="PlainTable1"/>
+        <w:tblpPr w:leftFromText="180" w:rightFromText="180" w:vertAnchor="page" w:horzAnchor="margin" w:tblpXSpec="center" w:tblpY="2266"/>
+        <w:tblW w:w="11624" w:type="dxa"/>
+        <w:tblLayout w:type="fixed"/>
+        <w:tblLook w:val="04A0" w:firstRow="1" w:lastRow="0" w:firstColumn="1" w:lastColumn="0" w:noHBand="0" w:noVBand="1"/>
+      </w:tblPr>
+      <w:tblGrid>
+        <w:gridCol w:w="2269"/>
+        <w:gridCol w:w="2693"/>
+        <w:gridCol w:w="2268"/>
+        <w:gridCol w:w="1276"/>
+        <w:gridCol w:w="3118"/>
+      </w:tblGrid>
+      <w:tr>
+        <w:trPr>
+          <w:cnfStyle w:val="100000000000" w:firstRow="1" w:lastRow="0" w:firstColumn="0" w:lastColumn="0" w:oddVBand="0" w:evenVBand="0" w:oddHBand="0" w:evenHBand="0" w:firstRowFirstColumn="0" w:firstRowLastColumn="0" w:lastRowFirstColumn="0" w:lastRowLastColumn="0"/>
+        </w:trPr>
+        <w:tc>
+          <w:tcPr>
+            <w:cnfStyle w:val="001000000000" w:firstRow="0" w:lastRow="0" w:firstColumn="1" w:lastColumn="0" w:oddVBand="0" w:evenVBand="0" w:oddHBand="0" w:evenHBand="0" w:firstRowFirstColumn="0" w:firstRowLastColumn="0" w:lastRowFirstColumn="0" w:lastRowLastColumn="0"/>
+            <w:tcW w:w="2269" w:type="dxa"/>
+          </w:tcPr>
+          <w:p>
+            <w:r>
+              <w:t>Stakeholder</w:t>
+            </w:r>
+          </w:p>
+        </w:tc>
+        <w:tc>
+          <w:tcPr>
+            <w:tcW w:w="2693" w:type="dxa"/>
+          </w:tcPr>
+          <w:p>
+            <w:pPr>
+              <w:cnfStyle w:val="100000000000" w:firstRow="1" w:lastRow="0" w:firstColumn="0" w:lastColumn="0" w:oddVBand="0" w:evenVBand="0" w:oddHBand="0" w:evenHBand="0" w:firstRowFirstColumn="0" w:firstRowLastColumn="0" w:lastRowFirstColumn="0" w:lastRowLastColumn="0"/>
+            </w:pPr>
+            <w:r>
+              <w:t>Goals</w:t>
+            </w:r>
+          </w:p>
+        </w:tc>
+        <w:tc>
+          <w:tcPr>
+            <w:tcW w:w="2268" w:type="dxa"/>
+          </w:tcPr>
+          <w:p>
+            <w:pPr>
+              <w:cnfStyle w:val="100000000000" w:firstRow="1" w:lastRow="0" w:firstColumn="0" w:lastColumn="0" w:oddVBand="0" w:evenVBand="0" w:oddHBand="0" w:evenHBand="0" w:firstRowFirstColumn="0" w:firstRowLastColumn="0" w:lastRowFirstColumn="0" w:lastRowLastColumn="0"/>
+            </w:pPr>
+            <w:r>
+              <w:t>Concerns</w:t>
+            </w:r>
+          </w:p>
+        </w:tc>
+        <w:tc>
+          <w:tcPr>
+            <w:tcW w:w="1276" w:type="dxa"/>
+          </w:tcPr>
+          <w:p>
+            <w:pPr>
+              <w:cnfStyle w:val="100000000000" w:firstRow="1" w:lastRow="0" w:firstColumn="0" w:lastColumn="0" w:oddVBand="0" w:evenVBand="0" w:oddHBand="0" w:evenHBand="0" w:firstRowFirstColumn="0" w:firstRowLastColumn="0" w:lastRowFirstColumn="0" w:lastRowLastColumn="0"/>
+            </w:pPr>
+            <w:r>
+              <w:t>Influence</w:t>
+            </w:r>
+          </w:p>
+        </w:tc>
+        <w:tc>
+          <w:tcPr>
+            <w:tcW w:w="3118" w:type="dxa"/>
+          </w:tcPr>
+          <w:p>
+            <w:pPr>
+              <w:cnfStyle w:val="100000000000" w:firstRow="1" w:lastRow="0" w:firstColumn="0" w:lastColumn="0" w:oddVBand="0" w:evenVBand="0" w:oddHBand="0" w:evenHBand="0" w:firstRowFirstColumn="0" w:firstRowLastColumn="0" w:lastRowFirstColumn="0" w:lastRowLastColumn="0"/>
+            </w:pPr>
+            <w:r>
+              <w:t>Expected interaction</w:t>
+            </w:r>
+          </w:p>
+        </w:tc>
+      </w:tr>
+      <w:tr>
+        <w:trPr>
+          <w:cnfStyle w:val="000000100000" w:firstRow="0" w:lastRow="0" w:firstColumn="0" w:lastColumn="0" w:oddVBand="0" w:evenVBand="0" w:oddHBand="1" w:evenHBand="0" w:firstRowFirstColumn="0" w:firstRowLastColumn="0" w:lastRowFirstColumn="0" w:lastRowLastColumn="0"/>
+        </w:trPr>
+        <w:tc>
+          <w:tcPr>
+            <w:cnfStyle w:val="001000000000" w:firstRow="0" w:lastRow="0" w:firstColumn="1" w:lastColumn="0" w:oddVBand="0" w:evenVBand="0" w:oddHBand="0" w:evenHBand="0" w:firstRowFirstColumn="0" w:firstRowLastColumn="0" w:lastRowFirstColumn="0" w:lastRowLastColumn="0"/>
+            <w:tcW w:w="2269" w:type="dxa"/>
+          </w:tcPr>
+          <w:p>
+            <w:pPr>
+              <w:jc w:val="center"/>
+              <w:rPr>
+                <w:b w:val="0"/>
+                <w:bCs w:val="0"/>
+              </w:rPr>
+            </w:pPr>
+            <w:r>
+              <w:rPr>
+                <w:b w:val="0"/>
+                <w:bCs w:val="0"/>
+              </w:rPr>
+              <w:t>Route coordinator</w:t>
+            </w:r>
+          </w:p>
+        </w:tc>
+        <w:tc>
+          <w:tcPr>
+            <w:tcW w:w="2693" w:type="dxa"/>
+          </w:tcPr>
+          <w:p>
+            <w:pPr>
+              <w:cnfStyle w:val="000000100000" w:firstRow="0" w:lastRow="0" w:firstColumn="0" w:lastColumn="0" w:oddVBand="0" w:evenVBand="0" w:oddHBand="1" w:evenHBand="0" w:firstRowFirstColumn="0" w:firstRowLastColumn="0" w:lastRowFirstColumn="0" w:lastRowLastColumn="0"/>
+            </w:pPr>
+            <w:r>
+              <w:t>Reliable information about future routes, changed stops, loads and disruptions</w:t>
+            </w:r>
+          </w:p>
+        </w:tc>
+        <w:tc>
+          <w:tcPr>
+            <w:tcW w:w="2268" w:type="dxa"/>
+          </w:tcPr>
+          <w:p>
+            <w:pPr>
+              <w:cnfStyle w:val="000000100000" w:firstRow="0" w:lastRow="0" w:firstColumn="0" w:lastColumn="0" w:oddVBand="0" w:evenVBand="0" w:oddHBand="1" w:evenHBand="0" w:firstRowFirstColumn="0" w:firstRowLastColumn="0" w:lastRowFirstColumn="0" w:lastRowLastColumn="0"/>
+            </w:pPr>
+            <w:r>
+              <w:t>Stop order changing on the morning of the visit</w:t>
+            </w:r>
+          </w:p>
+        </w:tc>
+        <w:tc>
+          <w:tcPr>
+            <w:tcW w:w="1276" w:type="dxa"/>
+          </w:tcPr>
+          <w:p>
+            <w:pPr>
+              <w:cnfStyle w:val="000000100000" w:firstRow="0" w:lastRow="0" w:firstColumn="0" w:lastColumn="0" w:oddVBand="0" w:evenVBand="0" w:oddHBand="1" w:evenHBand="0" w:firstRowFirstColumn="0" w:firstRowLastColumn="0" w:lastRowFirstColumn="0" w:lastRowLastColumn="0"/>
+            </w:pPr>
+            <w:r>
+              <w:t>High</w:t>
+            </w:r>
+          </w:p>
+        </w:tc>
+        <w:tc>
+          <w:tcPr>
+            <w:tcW w:w="3118" w:type="dxa"/>
+          </w:tcPr>
+          <w:p>
+            <w:pPr>
+              <w:cnfStyle w:val="000000100000" w:firstRow="0" w:lastRow="0" w:firstColumn="0" w:lastColumn="0" w:oddVBand="0" w:evenVBand="0" w:oddHBand="1" w:evenHBand="0" w:firstRowFirstColumn="0" w:firstRowLastColumn="0" w:lastRowFirstColumn="0" w:lastRowLastColumn="0"/>
+            </w:pPr>
+            <w:r>
+              <w:t>Plan routes: change stops, check offline records</w:t>
+            </w:r>
+          </w:p>
+        </w:tc>
+      </w:tr>
+      <w:tr>
+        <w:tc>
+          <w:tcPr>
+            <w:cnfStyle w:val="001000000000" w:firstRow="0" w:lastRow="0" w:firstColumn="1" w:lastColumn="0" w:oddVBand="0" w:evenVBand="0" w:oddHBand="0" w:evenHBand="0" w:firstRowFirstColumn="0" w:firstRowLastColumn="0" w:lastRowFirstColumn="0" w:lastRowLastColumn="0"/>
+            <w:tcW w:w="2269" w:type="dxa"/>
+          </w:tcPr>
+          <w:p>
+            <w:pPr>
+              <w:rPr>
+                <w:b w:val="0"/>
+                <w:bCs w:val="0"/>
+              </w:rPr>
+            </w:pPr>
+            <w:r>
+              <w:rPr>
+                <w:b w:val="0"/>
+                <w:bCs w:val="0"/>
+              </w:rPr>
+              <w:t>Mobile library staff member</w:t>
+            </w:r>
+          </w:p>
+        </w:tc>
+        <w:tc>
+          <w:tcPr>
+            <w:tcW w:w="2693" w:type="dxa"/>
+          </w:tcPr>
+          <w:p>
+            <w:pPr>
+              <w:cnfStyle w:val="000000000000" w:firstRow="0" w:lastRow="0" w:firstColumn="0" w:lastColumn="0" w:oddVBand="0" w:evenVBand="0" w:oddHBand="0" w:evenHBand="0" w:firstRowFirstColumn="0" w:firstRowLastColumn="0" w:lastRowFirstColumn="0" w:lastRowLastColumn="0"/>
+            </w:pPr>
+            <w:r>
+              <w:t>Record loans, returns and requests at each stop</w:t>
+            </w:r>
+          </w:p>
+        </w:tc>
+        <w:tc>
+          <w:tcPr>
+            <w:tcW w:w="2268" w:type="dxa"/>
+          </w:tcPr>
+          <w:p>
+            <w:pPr>
+              <w:cnfStyle w:val="000000000000" w:firstRow="0" w:lastRow="0" w:firstColumn="0" w:lastColumn="0" w:oddVBand="0" w:evenVBand="0" w:oddHBand="0" w:evenHBand="0" w:firstRowFirstColumn="0" w:firstRowLastColumn="0" w:lastRowFirstColumn="0" w:lastRowLastColumn="0"/>
+            </w:pPr>
+            <w:r>
+              <w:t>Offline records leaving items shown as available</w:t>
+            </w:r>
+          </w:p>
+        </w:tc>
+        <w:tc>
+          <w:tcPr>
+            <w:tcW w:w="1276" w:type="dxa"/>
+          </w:tcPr>
+          <w:p>
+            <w:pPr>
+              <w:cnfStyle w:val="000000000000" w:firstRow="0" w:lastRow="0" w:firstColumn="0" w:lastColumn="0" w:oddVBand="0" w:evenVBand="0" w:oddHBand="0" w:evenHBand="0" w:firstRowFirstColumn="0" w:firstRowLastColumn="0" w:lastRowFirstColumn="0" w:lastRowLastColumn="0"/>
+            </w:pPr>
+            <w:r>
+              <w:t>Medium</w:t>
+            </w:r>
+          </w:p>
+        </w:tc>
+        <w:tc>
+          <w:tcPr>
+            <w:tcW w:w="3118" w:type="dxa"/>
+          </w:tcPr>
+          <w:p>
+            <w:pPr>
+              <w:cnfStyle w:val="000000000000" w:firstRow="0" w:lastRow="0" w:firstColumn="0" w:lastColumn="0" w:oddVBand="0" w:evenVBand="0" w:oddHBand="0" w:evenHBand="0" w:firstRowFirstColumn="0" w:firstRowLastColumn="0" w:lastRowFirstColumn="0" w:lastRowLastColumn="0"/>
+            </w:pPr>
+            <w:r>
+              <w:t>Record loans, returns, loading and visit status</w:t>
+            </w:r>
+          </w:p>
+        </w:tc>
+      </w:tr>
+      <w:tr>
+        <w:trPr>
+          <w:cnfStyle w:val="000000100000" w:firstRow="0" w:lastRow="0" w:firstColumn="0" w:lastColumn="0" w:oddVBand="0" w:evenVBand="0" w:oddHBand="1" w:evenHBand="0" w:firstRowFirstColumn="0" w:firstRowLastColumn="0" w:lastRowFirstColumn="0" w:lastRowLastColumn="0"/>
+        </w:trPr>
+        <w:tc>
+          <w:tcPr>
+            <w:cnfStyle w:val="001000000000" w:firstRow="0" w:lastRow="0" w:firstColumn="1" w:lastColumn="0" w:oddVBand="0" w:evenVBand="0" w:oddHBand="0" w:evenHBand="0" w:firstRowFirstColumn="0" w:firstRowLastColumn="0" w:lastRowFirstColumn="0" w:lastRowLastColumn="0"/>
+            <w:tcW w:w="2269" w:type="dxa"/>
+          </w:tcPr>
+          <w:p>
+            <w:pPr>
+              <w:rPr>
+                <w:b w:val="0"/>
+                <w:bCs w:val="0"/>
+              </w:rPr>
+            </w:pPr>
+            <w:r>
+              <w:rPr>
+                <w:b w:val="0"/>
+                <w:bCs w:val="0"/>
+              </w:rPr>
+              <w:t>Driver (including relief drivers)</w:t>
+            </w:r>
+          </w:p>
+        </w:tc>
+        <w:tc>
+          <w:tcPr>
+            <w:tcW w:w="2693" w:type="dxa"/>
+          </w:tcPr>
+          <w:p>
+            <w:pPr>
+              <w:cnfStyle w:val="000000100000" w:firstRow="0" w:lastRow="0" w:firstColumn="0" w:lastColumn="0" w:oddVBand="0" w:evenVBand="0" w:oddHBand="1" w:evenHBand="0" w:firstRowFirstColumn="0" w:firstRowLastColumn="0" w:lastRowFirstColumn="0" w:lastRowLastColumn="0"/>
+            </w:pPr>
+            <w:r>
+              <w:t>Know the route, stops and vehicle limits</w:t>
+            </w:r>
+          </w:p>
+        </w:tc>
+        <w:tc>
+          <w:tcPr>
+            <w:tcW w:w="2268" w:type="dxa"/>
+          </w:tcPr>
+          <w:p>
+            <w:pPr>
+              <w:cnfStyle w:val="000000100000" w:firstRow="0" w:lastRow="0" w:firstColumn="0" w:lastColumn="0" w:oddVBand="0" w:evenVBand="0" w:oddHBand="1" w:evenHBand="0" w:firstRowFirstColumn="0" w:firstRowLastColumn="0" w:lastRowFirstColumn="0" w:lastRowLastColumn="0"/>
+            </w:pPr>
+            <w:r>
+              <w:t>Replacement vehicle carries less (P6)</w:t>
+            </w:r>
+          </w:p>
+        </w:tc>
+        <w:tc>
+          <w:tcPr>
+            <w:tcW w:w="1276" w:type="dxa"/>
+          </w:tcPr>
+          <w:p>
+            <w:pPr>
+              <w:cnfStyle w:val="000000100000" w:firstRow="0" w:lastRow="0" w:firstColumn="0" w:lastColumn="0" w:oddVBand="0" w:evenVBand="0" w:oddHBand="1" w:evenHBand="0" w:firstRowFirstColumn="0" w:firstRowLastColumn="0" w:lastRowFirstColumn="0" w:lastRowLastColumn="0"/>
+            </w:pPr>
+            <w:r>
+              <w:t>Medium</w:t>
+            </w:r>
+          </w:p>
+        </w:tc>
+        <w:tc>
+          <w:tcPr>
+            <w:tcW w:w="3118" w:type="dxa"/>
+          </w:tcPr>
+          <w:p>
+            <w:pPr>
+              <w:cnfStyle w:val="000000100000" w:firstRow="0" w:lastRow="0" w:firstColumn="0" w:lastColumn="0" w:oddVBand="0" w:evenVBand="0" w:oddHBand="1" w:evenHBand="0" w:firstRowFirstColumn="0" w:firstRowLastColumn="0" w:lastRowFirstColumn="0" w:lastRowLastColumn="0"/>
+            </w:pPr>
+            <w:r>
+              <w:t>View route and stop information, record delays</w:t>
+            </w:r>
+          </w:p>
+        </w:tc>
+      </w:tr>
+      <w:tr>
+        <w:tc>
+          <w:tcPr>
+            <w:cnfStyle w:val="001000000000" w:firstRow="0" w:lastRow="0" w:firstColumn="1" w:lastColumn="0" w:oddVBand="0" w:evenVBand="0" w:oddHBand="0" w:evenHBand="0" w:firstRowFirstColumn="0" w:firstRowLastColumn="0" w:lastRowFirstColumn="0" w:lastRowLastColumn="0"/>
+            <w:tcW w:w="2269" w:type="dxa"/>
+          </w:tcPr>
+          <w:p>
+            <w:pPr>
+              <w:rPr>
+                <w:b w:val="0"/>
+                <w:bCs w:val="0"/>
+              </w:rPr>
+            </w:pPr>
+            <w:r>
+              <w:rPr>
+                <w:b w:val="0"/>
+                <w:bCs w:val="0"/>
+              </w:rPr>
+              <w:t>Branch staff member</w:t>
+            </w:r>
+          </w:p>
+        </w:tc>
+        <w:tc>
+          <w:tcPr>
+            <w:tcW w:w="2693" w:type="dxa"/>
+          </w:tcPr>
+          <w:p>
+            <w:pPr>
+              <w:cnfStyle w:val="000000000000" w:firstRow="0" w:lastRow="0" w:firstColumn="0" w:lastColumn="0" w:oddVBand="0" w:evenVBand="0" w:oddHBand="0" w:evenHBand="0" w:firstRowFirstColumn="0" w:firstRowLastColumn="0" w:lastRowFirstColumn="0" w:lastRowLastColumn="0"/>
+            </w:pPr>
+            <w:r>
+              <w:t>Know which request record is current</w:t>
+            </w:r>
+          </w:p>
+        </w:tc>
+        <w:tc>
+          <w:tcPr>
+            <w:tcW w:w="2268" w:type="dxa"/>
+          </w:tcPr>
+          <w:p>
+            <w:pPr>
+              <w:cnfStyle w:val="000000000000" w:firstRow="0" w:lastRow="0" w:firstColumn="0" w:lastColumn="0" w:oddVBand="0" w:evenVBand="0" w:oddHBand="0" w:evenHBand="0" w:firstRowFirstColumn="0" w:firstRowLastColumn="0" w:lastRowFirstColumn="0" w:lastRowLastColumn="0"/>
+            </w:pPr>
+            <w:r>
+              <w:t>Requests recorded in several places</w:t>
+            </w:r>
+          </w:p>
+        </w:tc>
+        <w:tc>
+          <w:tcPr>
+            <w:tcW w:w="1276" w:type="dxa"/>
+          </w:tcPr>
+          <w:p>
+            <w:pPr>
+              <w:cnfStyle w:val="000000000000" w:firstRow="0" w:lastRow="0" w:firstColumn="0" w:lastColumn="0" w:oddVBand="0" w:evenVBand="0" w:oddHBand="0" w:evenHBand="0" w:firstRowFirstColumn="0" w:firstRowLastColumn="0" w:lastRowFirstColumn="0" w:lastRowLastColumn="0"/>
+            </w:pPr>
+            <w:r>
+              <w:t>Medium</w:t>
+            </w:r>
+          </w:p>
+        </w:tc>
+        <w:tc>
+          <w:tcPr>
+            <w:tcW w:w="3118" w:type="dxa"/>
+          </w:tcPr>
+          <w:p>
+            <w:pPr>
+              <w:cnfStyle w:val="000000000000" w:firstRow="0" w:lastRow="0" w:firstColumn="0" w:lastColumn="0" w:oddVBand="0" w:evenVBand="0" w:oddHBand="0" w:evenHBand="0" w:firstRowFirstColumn="0" w:firstRowLastColumn="0" w:lastRowFirstColumn="0" w:lastRowLastColumn="0"/>
+            </w:pPr>
+            <w:r>
+              <w:t>Record requests for collection from the van</w:t>
+            </w:r>
+          </w:p>
+        </w:tc>
+      </w:tr>
+      <w:tr>
+        <w:trPr>
+          <w:cnfStyle w:val="000000100000" w:firstRow="0" w:lastRow="0" w:firstColumn="0" w:lastColumn="0" w:oddVBand="0" w:evenVBand="0" w:oddHBand="1" w:evenHBand="0" w:firstRowFirstColumn="0" w:firstRowLastColumn="0" w:lastRowFirstColumn="0" w:lastRowLastColumn="0"/>
+        </w:trPr>
+        <w:tc>
+          <w:tcPr>
+            <w:cnfStyle w:val="001000000000" w:firstRow="0" w:lastRow="0" w:firstColumn="1" w:lastColumn="0" w:oddVBand="0" w:evenVBand="0" w:oddHBand="0" w:evenHBand="0" w:firstRowFirstColumn="0" w:firstRowLastColumn="0" w:lastRowFirstColumn="0" w:lastRowLastColumn="0"/>
+            <w:tcW w:w="2269" w:type="dxa"/>
+          </w:tcPr>
+          <w:p>
+            <w:pPr>
+              <w:rPr>
+                <w:b w:val="0"/>
+                <w:bCs w:val="0"/>
+              </w:rPr>
+            </w:pPr>
+            <w:r>
+              <w:rPr>
+                <w:b w:val="0"/>
+                <w:bCs w:val="0"/>
+              </w:rPr>
+              <w:t>Borrower</w:t>
+            </w:r>
+          </w:p>
+        </w:tc>
+        <w:tc>
+          <w:tcPr>
+            <w:tcW w:w="2693" w:type="dxa"/>
+          </w:tcPr>
+          <w:p>
+            <w:pPr>
+              <w:cnfStyle w:val="000000100000" w:firstRow="0" w:lastRow="0" w:firstColumn="0" w:lastColumn="0" w:oddVBand="0" w:evenVBand="0" w:oddHBand="1" w:evenHBand="0" w:firstRowFirstColumn="0" w:firstRowLastColumn="0" w:lastRowFirstColumn="0" w:lastRowLastColumn="0"/>
+            </w:pPr>
+            <w:r>
+              <w:t>Receive requested items: know whether the van is coming</w:t>
+            </w:r>
+          </w:p>
+        </w:tc>
+        <w:tc>
+          <w:tcPr>
+            <w:tcW w:w="2268" w:type="dxa"/>
+          </w:tcPr>
+          <w:p>
+            <w:pPr>
+              <w:cnfStyle w:val="000000100000" w:firstRow="0" w:lastRow="0" w:firstColumn="0" w:lastColumn="0" w:oddVBand="0" w:evenVBand="0" w:oddHBand="1" w:evenHBand="0" w:firstRowFirstColumn="0" w:firstRowLastColumn="0" w:lastRowFirstColumn="0" w:lastRowLastColumn="0"/>
+            </w:pPr>
+            <w:r>
+              <w:t>Original request cancelled when an alternative is taken</w:t>
+            </w:r>
+          </w:p>
+        </w:tc>
+        <w:tc>
+          <w:tcPr>
+            <w:tcW w:w="1276" w:type="dxa"/>
+          </w:tcPr>
+          <w:p>
+            <w:pPr>
+              <w:cnfStyle w:val="000000100000" w:firstRow="0" w:lastRow="0" w:firstColumn="0" w:lastColumn="0" w:oddVBand="0" w:evenVBand="0" w:oddHBand="1" w:evenHBand="0" w:firstRowFirstColumn="0" w:firstRowLastColumn="0" w:lastRowFirstColumn="0" w:lastRowLastColumn="0"/>
+            </w:pPr>
+            <w:r>
+              <w:t>Medium</w:t>
+            </w:r>
+          </w:p>
+        </w:tc>
+        <w:tc>
+          <w:tcPr>
+            <w:tcW w:w="3118" w:type="dxa"/>
+          </w:tcPr>
+          <w:p>
+            <w:pPr>
+              <w:cnfStyle w:val="000000100000" w:firstRow="0" w:lastRow="0" w:firstColumn="0" w:lastColumn="0" w:oddVBand="0" w:evenVBand="0" w:oddHBand="1" w:evenHBand="0" w:firstRowFirstColumn="0" w:firstRowLastColumn="0" w:lastRowFirstColumn="0" w:lastRowLastColumn="0"/>
+            </w:pPr>
+            <w:r>
+              <w:t>Request and collect items: receive update notifications</w:t>
+            </w:r>
+          </w:p>
+        </w:tc>
+      </w:tr>
+      <w:tr>
+        <w:tc>
+          <w:tcPr>
+            <w:cnfStyle w:val="001000000000" w:firstRow="0" w:lastRow="0" w:firstColumn="1" w:lastColumn="0" w:oddVBand="0" w:evenVBand="0" w:oddHBand="0" w:evenHBand="0" w:firstRowFirstColumn="0" w:firstRowLastColumn="0" w:lastRowFirstColumn="0" w:lastRowLastColumn="0"/>
+            <w:tcW w:w="2269" w:type="dxa"/>
+          </w:tcPr>
+          <w:p>
+            <w:pPr>
+              <w:rPr>
+                <w:b w:val="0"/>
+                <w:bCs w:val="0"/>
+              </w:rPr>
+            </w:pPr>
+            <w:r>
+              <w:rPr>
+                <w:b w:val="0"/>
+                <w:bCs w:val="0"/>
+              </w:rPr>
+              <w:t>Community coordinator</w:t>
+            </w:r>
+          </w:p>
+        </w:tc>
+        <w:tc>
+          <w:tcPr>
+            <w:tcW w:w="2693" w:type="dxa"/>
+          </w:tcPr>
+          <w:p>
+            <w:pPr>
+              <w:cnfStyle w:val="000000000000" w:firstRow="0" w:lastRow="0" w:firstColumn="0" w:lastColumn="0" w:oddVBand="0" w:evenVBand="0" w:oddHBand="0" w:evenHBand="0" w:firstRowFirstColumn="0" w:firstRowLastColumn="0" w:lastRowFirstColumn="0" w:lastRowLastColumn="0"/>
+            </w:pPr>
+            <w:r>
+              <w:t>Enough notice of changes</w:t>
+            </w:r>
+          </w:p>
+        </w:tc>
+        <w:tc>
+          <w:tcPr>
+            <w:tcW w:w="2268" w:type="dxa"/>
+          </w:tcPr>
+          <w:p>
+            <w:pPr>
+              <w:cnfStyle w:val="000000000000" w:firstRow="0" w:lastRow="0" w:firstColumn="0" w:lastColumn="0" w:oddVBand="0" w:evenVBand="0" w:oddHBand="0" w:evenHBand="0" w:firstRowFirstColumn="0" w:firstRowLastColumn="0" w:lastRowFirstColumn="0" w:lastRowLastColumn="0"/>
+            </w:pPr>
+            <w:r>
+              <w:t>Not knowing whether the van is late or not coming</w:t>
+            </w:r>
+          </w:p>
+        </w:tc>
+        <w:tc>
+          <w:tcPr>
+            <w:tcW w:w="1276" w:type="dxa"/>
+          </w:tcPr>
+          <w:p>
+            <w:pPr>
+              <w:cnfStyle w:val="000000000000" w:firstRow="0" w:lastRow="0" w:firstColumn="0" w:lastColumn="0" w:oddVBand="0" w:evenVBand="0" w:oddHBand="0" w:evenHBand="0" w:firstRowFirstColumn="0" w:firstRowLastColumn="0" w:lastRowFirstColumn="0" w:lastRowLastColumn="0"/>
+            </w:pPr>
+            <w:r>
+              <w:t>Medium</w:t>
+            </w:r>
+          </w:p>
+        </w:tc>
+        <w:tc>
+          <w:tcPr>
+            <w:tcW w:w="3118" w:type="dxa"/>
+          </w:tcPr>
+          <w:p>
+            <w:pPr>
+              <w:cnfStyle w:val="000000000000" w:firstRow="0" w:lastRow="0" w:firstColumn="0" w:lastColumn="0" w:oddVBand="0" w:evenVBand="0" w:oddHBand="0" w:evenHBand="0" w:firstRowFirstColumn="0" w:firstRowLastColumn="0" w:lastRowFirstColumn="0" w:lastRowLastColumn="0"/>
+            </w:pPr>
+            <w:r>
+              <w:t>Receive notices: collect requested material</w:t>
+            </w:r>
+          </w:p>
+        </w:tc>
+      </w:tr>
+      <w:tr>
+        <w:trPr>
+          <w:cnfStyle w:val="000000100000" w:firstRow="0" w:lastRow="0" w:firstColumn="0" w:lastColumn="0" w:oddVBand="0" w:evenVBand="0" w:oddHBand="1" w:evenHBand="0" w:firstRowFirstColumn="0" w:firstRowLastColumn="0" w:lastRowFirstColumn="0" w:lastRowLastColumn="0"/>
+        </w:trPr>
+        <w:tc>
+          <w:tcPr>
+            <w:cnfStyle w:val="001000000000" w:firstRow="0" w:lastRow="0" w:firstColumn="1" w:lastColumn="0" w:oddVBand="0" w:evenVBand="0" w:oddHBand="0" w:evenHBand="0" w:firstRowFirstColumn="0" w:firstRowLastColumn="0" w:lastRowFirstColumn="0" w:lastRowLastColumn="0"/>
+            <w:tcW w:w="2269" w:type="dxa"/>
+          </w:tcPr>
+          <w:p>
+            <w:pPr>
+              <w:rPr>
+                <w:b w:val="0"/>
+                <w:bCs w:val="0"/>
+              </w:rPr>
+            </w:pPr>
+            <w:r>
+              <w:rPr>
+                <w:b w:val="0"/>
+                <w:bCs w:val="0"/>
+              </w:rPr>
+              <w:t>School</w:t>
+            </w:r>
+          </w:p>
+        </w:tc>
+        <w:tc>
+          <w:tcPr>
+            <w:tcW w:w="2693" w:type="dxa"/>
+          </w:tcPr>
+          <w:p>
+            <w:pPr>
+              <w:cnfStyle w:val="000000100000" w:firstRow="0" w:lastRow="0" w:firstColumn="0" w:lastColumn="0" w:oddVBand="0" w:evenVBand="0" w:oddHBand="1" w:evenHBand="0" w:firstRowFirstColumn="0" w:firstRowLastColumn="0" w:lastRowFirstColumn="0" w:lastRowLastColumn="0"/>
+            </w:pPr>
+            <w:r>
+              <w:t xml:space="preserve">Class sets delivered and collected </w:t>
+            </w:r>
+          </w:p>
+        </w:tc>
+        <w:tc>
+          <w:tcPr>
+            <w:tcW w:w="2268" w:type="dxa"/>
+          </w:tcPr>
+          <w:p>
+            <w:pPr>
+              <w:cnfStyle w:val="000000100000" w:firstRow="0" w:lastRow="0" w:firstColumn="0" w:lastColumn="0" w:oddVBand="0" w:evenVBand="0" w:oddHBand="1" w:evenHBand="0" w:firstRowFirstColumn="0" w:firstRowLastColumn="0" w:lastRowFirstColumn="0" w:lastRowLastColumn="0"/>
+            </w:pPr>
+            <w:r>
+              <w:t>Different staff nominated to collect</w:t>
+            </w:r>
+          </w:p>
+        </w:tc>
+        <w:tc>
+          <w:tcPr>
+            <w:tcW w:w="1276" w:type="dxa"/>
+          </w:tcPr>
+          <w:p>
+            <w:pPr>
+              <w:cnfStyle w:val="000000100000" w:firstRow="0" w:lastRow="0" w:firstColumn="0" w:lastColumn="0" w:oddVBand="0" w:evenVBand="0" w:oddHBand="1" w:evenHBand="0" w:firstRowFirstColumn="0" w:firstRowLastColumn="0" w:lastRowFirstColumn="0" w:lastRowLastColumn="0"/>
+            </w:pPr>
+            <w:r>
+              <w:t>Low</w:t>
+            </w:r>
+          </w:p>
+        </w:tc>
+        <w:tc>
+          <w:tcPr>
+            <w:tcW w:w="3118" w:type="dxa"/>
+          </w:tcPr>
+          <w:p>
+            <w:pPr>
+              <w:cnfStyle w:val="000000100000" w:firstRow="0" w:lastRow="0" w:firstColumn="0" w:lastColumn="0" w:oddVBand="0" w:evenVBand="0" w:oddHBand="1" w:evenHBand="0" w:firstRowFirstColumn="0" w:firstRowLastColumn="0" w:lastRowFirstColumn="0" w:lastRowLastColumn="0"/>
+            </w:pPr>
+            <w:r>
+              <w:t>Collect class materials</w:t>
+            </w:r>
+          </w:p>
+        </w:tc>
+      </w:tr>
+      <w:tr>
+        <w:tc>
+          <w:tcPr>
+            <w:cnfStyle w:val="001000000000" w:firstRow="0" w:lastRow="0" w:firstColumn="1" w:lastColumn="0" w:oddVBand="0" w:evenVBand="0" w:oddHBand="0" w:evenHBand="0" w:firstRowFirstColumn="0" w:firstRowLastColumn="0" w:lastRowFirstColumn="0" w:lastRowLastColumn="0"/>
+            <w:tcW w:w="2269" w:type="dxa"/>
+          </w:tcPr>
+          <w:p>
+            <w:pPr>
+              <w:rPr>
+                <w:b w:val="0"/>
+                <w:bCs w:val="0"/>
+              </w:rPr>
+            </w:pPr>
+            <w:r>
+              <w:rPr>
+                <w:b w:val="0"/>
+                <w:bCs w:val="0"/>
+              </w:rPr>
+              <w:t>Kerry Rural Library Partnership</w:t>
+            </w:r>
+          </w:p>
+        </w:tc>
+        <w:tc>
+          <w:tcPr>
+            <w:tcW w:w="2693" w:type="dxa"/>
+          </w:tcPr>
+          <w:p>
+            <w:pPr>
+              <w:cnfStyle w:val="000000000000" w:firstRow="0" w:lastRow="0" w:firstColumn="0" w:lastColumn="0" w:oddVBand="0" w:evenVBand="0" w:oddHBand="0" w:evenHBand="0" w:firstRowFirstColumn="0" w:firstRowLastColumn="0" w:lastRowFirstColumn="0" w:lastRowLastColumn="0"/>
+            </w:pPr>
+            <w:r>
+              <w:t>A reliable rural mobile service</w:t>
+            </w:r>
+          </w:p>
+        </w:tc>
+        <w:tc>
+          <w:tcPr>
+            <w:tcW w:w="2268" w:type="dxa"/>
+          </w:tcPr>
+          <w:p>
+            <w:pPr>
+              <w:cnfStyle w:val="000000000000" w:firstRow="0" w:lastRow="0" w:firstColumn="0" w:lastColumn="0" w:oddVBand="0" w:evenVBand="0" w:oddHBand="0" w:evenHBand="0" w:firstRowFirstColumn="0" w:firstRowLastColumn="0" w:lastRowFirstColumn="0" w:lastRowLastColumn="0"/>
+            </w:pPr>
+            <w:r>
+              <w:t>Loss of community confidence</w:t>
+            </w:r>
+          </w:p>
+        </w:tc>
+        <w:tc>
+          <w:tcPr>
+            <w:tcW w:w="1276" w:type="dxa"/>
+          </w:tcPr>
+          <w:p>
+            <w:pPr>
+              <w:cnfStyle w:val="000000000000" w:firstRow="0" w:lastRow="0" w:firstColumn="0" w:lastColumn="0" w:oddVBand="0" w:evenVBand="0" w:oddHBand="0" w:evenHBand="0" w:firstRowFirstColumn="0" w:firstRowLastColumn="0" w:lastRowFirstColumn="0" w:lastRowLastColumn="0"/>
+            </w:pPr>
+            <w:r>
+              <w:t>High</w:t>
+            </w:r>
+          </w:p>
+        </w:tc>
+        <w:tc>
+          <w:tcPr>
+            <w:tcW w:w="3118" w:type="dxa"/>
+          </w:tcPr>
+          <w:p>
+            <w:pPr>
+              <w:cnfStyle w:val="000000000000" w:firstRow="0" w:lastRow="0" w:firstColumn="0" w:lastColumn="0" w:oddVBand="0" w:evenVBand="0" w:oddHBand="0" w:evenHBand="0" w:firstRowFirstColumn="0" w:firstRowLastColumn="0" w:lastRowFirstColumn="0" w:lastRowLastColumn="0"/>
+            </w:pPr>
+            <w:r>
+              <w:t>Approve policy for the service</w:t>
+            </w:r>
+          </w:p>
+        </w:tc>
+      </w:tr>
+    </w:tbl>
+    <w:p/>
+    <w:p>
+      <w:pPr>
+        <w:pStyle w:val="Subtitle"/>
+      </w:pPr>
+      <w:r>
+        <w:t>Stakeholder Observation</w:t>
+      </w:r>
+    </w:p>
+    <w:p>
+      <w:pPr>
+        <w:pStyle w:val="ListParagraph"/>
+        <w:numPr>
+          <w:ilvl w:val="0"/>
+          <w:numId w:val="8"/>
+        </w:numPr>
+      </w:pPr>
+      <w:r>
+        <w:t>Not every stakeholder is a daily user. Schools and the partnership do not use the system directly</w:t>
+      </w:r>
+    </w:p>
+    <w:p>
+      <w:pPr>
+        <w:pStyle w:val="ListParagraph"/>
+        <w:numPr>
+          <w:ilvl w:val="0"/>
+          <w:numId w:val="8"/>
+        </w:numPr>
+      </w:pPr>
+      <w:r>
+        <w:t>Influential stakeholders may set policies or reject the solution. The partnership and the route coordinator have high influence</w:t>
+      </w:r>
+    </w:p>
+    <w:p>
+      <w:pPr>
+        <w:pStyle w:val="ListParagraph"/>
+        <w:numPr>
+          <w:ilvl w:val="0"/>
+          <w:numId w:val="8"/>
+        </w:numPr>
+      </w:pPr>
+      <w:r>
+        <w:t>Stakeholder goals can conflict. Community coordinators want a minimum visit per period protected, but drivers shorten visits to recover time. Partners want notice of changes, but staff do not want to publish borrower information.</w:t>
+      </w:r>
+    </w:p>
+    <w:p>
+      <w:pPr>
+        <w:pStyle w:val="ListParagraph"/>
+        <w:numPr>
+          <w:ilvl w:val="0"/>
+          <w:numId w:val="8"/>
+        </w:numPr>
+      </w:pPr>
+      <w:r>
+        <w:t>Stakeholders are sources of requirements, rules, constraints and clarification questions.</w:t>
+      </w:r>
+    </w:p>
+    <w:p/>
+    <w:p/>
+    <w:p>
+      <w:pPr>
+        <w:pStyle w:val="Heading2"/>
+      </w:pPr>
+      <w:r>
+        <w:lastRenderedPageBreak/>
+        <w:t>3.2 Actor catalogue</w:t>
+      </w:r>
+    </w:p>
+    <w:tbl>
+      <w:tblPr>
+        <w:tblStyle w:val="PlainTable1"/>
+        <w:tblW w:w="10206" w:type="dxa"/>
+        <w:tblInd w:w="-572" w:type="dxa"/>
+        <w:tblLook w:val="04A0" w:firstRow="1" w:lastRow="0" w:firstColumn="1" w:lastColumn="0" w:noHBand="0" w:noVBand="1"/>
+      </w:tblPr>
+      <w:tblGrid>
+        <w:gridCol w:w="2826"/>
+        <w:gridCol w:w="2254"/>
+        <w:gridCol w:w="2254"/>
+        <w:gridCol w:w="2872"/>
+      </w:tblGrid>
+      <w:tr>
+        <w:trPr>
+          <w:cnfStyle w:val="100000000000" w:firstRow="1" w:lastRow="0" w:firstColumn="0" w:lastColumn="0" w:oddVBand="0" w:evenVBand="0" w:oddHBand="0" w:evenHBand="0" w:firstRowFirstColumn="0" w:firstRowLastColumn="0" w:lastRowFirstColumn="0" w:lastRowLastColumn="0"/>
+        </w:trPr>
+        <w:tc>
+          <w:tcPr>
+            <w:cnfStyle w:val="001000000000" w:firstRow="0" w:lastRow="0" w:firstColumn="1" w:lastColumn="0" w:oddVBand="0" w:evenVBand="0" w:oddHBand="0" w:evenHBand="0" w:firstRowFirstColumn="0" w:firstRowLastColumn="0" w:lastRowFirstColumn="0" w:lastRowLastColumn="0"/>
+            <w:tcW w:w="2826" w:type="dxa"/>
+          </w:tcPr>
+          <w:p>
+            <w:r>
+              <w:t>Actor or stakeholder</w:t>
+            </w:r>
+          </w:p>
+        </w:tc>
+        <w:tc>
+          <w:tcPr>
+            <w:tcW w:w="2254" w:type="dxa"/>
+          </w:tcPr>
+          <w:p>
+            <w:pPr>
+              <w:cnfStyle w:val="100000000000" w:firstRow="1" w:lastRow="0" w:firstColumn="0" w:lastColumn="0" w:oddVBand="0" w:evenVBand="0" w:oddHBand="0" w:evenHBand="0" w:firstRowFirstColumn="0" w:firstRowLastColumn="0" w:lastRowFirstColumn="0" w:lastRowLastColumn="0"/>
+            </w:pPr>
+            <w:r>
+              <w:t>Type</w:t>
+            </w:r>
+          </w:p>
+        </w:tc>
+        <w:tc>
+          <w:tcPr>
+            <w:tcW w:w="2254" w:type="dxa"/>
+          </w:tcPr>
+          <w:p>
+            <w:pPr>
+              <w:cnfStyle w:val="100000000000" w:firstRow="1" w:lastRow="0" w:firstColumn="0" w:lastColumn="0" w:oddVBand="0" w:evenVBand="0" w:oddHBand="0" w:evenHBand="0" w:firstRowFirstColumn="0" w:firstRowLastColumn="0" w:lastRowFirstColumn="0" w:lastRowLastColumn="0"/>
+            </w:pPr>
+            <w:r>
+              <w:t>Goal or Interest</w:t>
+            </w:r>
+          </w:p>
+        </w:tc>
+        <w:tc>
+          <w:tcPr>
+            <w:tcW w:w="2872" w:type="dxa"/>
+          </w:tcPr>
+          <w:p>
+            <w:pPr>
+              <w:cnfStyle w:val="100000000000" w:firstRow="1" w:lastRow="0" w:firstColumn="0" w:lastColumn="0" w:oddVBand="0" w:evenVBand="0" w:oddHBand="0" w:evenHBand="0" w:firstRowFirstColumn="0" w:firstRowLastColumn="0" w:lastRowFirstColumn="0" w:lastRowLastColumn="0"/>
+            </w:pPr>
+            <w:r>
+              <w:t>Direct interaction</w:t>
+            </w:r>
+          </w:p>
+        </w:tc>
+      </w:tr>
+      <w:tr>
+        <w:trPr>
+          <w:cnfStyle w:val="000000100000" w:firstRow="0" w:lastRow="0" w:firstColumn="0" w:lastColumn="0" w:oddVBand="0" w:evenVBand="0" w:oddHBand="1" w:evenHBand="0" w:firstRowFirstColumn="0" w:firstRowLastColumn="0" w:lastRowFirstColumn="0" w:lastRowLastColumn="0"/>
+        </w:trPr>
+        <w:tc>
+          <w:tcPr>
+            <w:cnfStyle w:val="001000000000" w:firstRow="0" w:lastRow="0" w:firstColumn="1" w:lastColumn="0" w:oddVBand="0" w:evenVBand="0" w:oddHBand="0" w:evenHBand="0" w:firstRowFirstColumn="0" w:firstRowLastColumn="0" w:lastRowFirstColumn="0" w:lastRowLastColumn="0"/>
+            <w:tcW w:w="2826" w:type="dxa"/>
+          </w:tcPr>
+          <w:p>
+            <w:pPr>
+              <w:rPr>
+                <w:b w:val="0"/>
+                <w:bCs w:val="0"/>
+              </w:rPr>
+            </w:pPr>
+            <w:r>
+              <w:rPr>
+                <w:b w:val="0"/>
+                <w:bCs w:val="0"/>
+              </w:rPr>
+              <w:t>Route coordinator</w:t>
+            </w:r>
+          </w:p>
+        </w:tc>
+        <w:tc>
+          <w:tcPr>
+            <w:tcW w:w="2254" w:type="dxa"/>
+          </w:tcPr>
+          <w:p>
+            <w:pPr>
+              <w:cnfStyle w:val="000000100000" w:firstRow="0" w:lastRow="0" w:firstColumn="0" w:lastColumn="0" w:oddVBand="0" w:evenVBand="0" w:oddHBand="1" w:evenHBand="0" w:firstRowFirstColumn="0" w:firstRowLastColumn="0" w:lastRowFirstColumn="0" w:lastRowLastColumn="0"/>
+            </w:pPr>
+            <w:r>
+              <w:t>Primary actor</w:t>
+            </w:r>
+          </w:p>
+        </w:tc>
+        <w:tc>
+          <w:tcPr>
+            <w:tcW w:w="2254" w:type="dxa"/>
+          </w:tcPr>
+          <w:p>
+            <w:pPr>
+              <w:cnfStyle w:val="000000100000" w:firstRow="0" w:lastRow="0" w:firstColumn="0" w:lastColumn="0" w:oddVBand="0" w:evenVBand="0" w:oddHBand="1" w:evenHBand="0" w:firstRowFirstColumn="0" w:firstRowLastColumn="0" w:lastRowFirstColumn="0" w:lastRowLastColumn="0"/>
+            </w:pPr>
+            <w:r>
+              <w:t>Plan a route</w:t>
+            </w:r>
+            <w:r>
+              <w:t>, change the stop order for a visit, check offline records</w:t>
+            </w:r>
+          </w:p>
+        </w:tc>
+        <w:tc>
+          <w:tcPr>
+            <w:tcW w:w="2872" w:type="dxa"/>
+          </w:tcPr>
+          <w:p>
+            <w:pPr>
+              <w:cnfStyle w:val="000000100000" w:firstRow="0" w:lastRow="0" w:firstColumn="0" w:lastColumn="0" w:oddVBand="0" w:evenVBand="0" w:oddHBand="1" w:evenHBand="0" w:firstRowFirstColumn="0" w:firstRowLastColumn="0" w:lastRowFirstColumn="0" w:lastRowLastColumn="0"/>
+            </w:pPr>
+            <w:r>
+              <w:t>Yes</w:t>
+            </w:r>
+          </w:p>
+        </w:tc>
+      </w:tr>
+      <w:tr>
+        <w:tc>
+          <w:tcPr>
+            <w:cnfStyle w:val="001000000000" w:firstRow="0" w:lastRow="0" w:firstColumn="1" w:lastColumn="0" w:oddVBand="0" w:evenVBand="0" w:oddHBand="0" w:evenHBand="0" w:firstRowFirstColumn="0" w:firstRowLastColumn="0" w:lastRowFirstColumn="0" w:lastRowLastColumn="0"/>
+            <w:tcW w:w="2826" w:type="dxa"/>
+          </w:tcPr>
+          <w:p>
+            <w:pPr>
+              <w:rPr>
+                <w:b w:val="0"/>
+                <w:bCs w:val="0"/>
+              </w:rPr>
+            </w:pPr>
+            <w:r>
+              <w:rPr>
+                <w:b w:val="0"/>
+                <w:bCs w:val="0"/>
+              </w:rPr>
+              <w:t>Mobile library staff member</w:t>
+            </w:r>
+          </w:p>
+        </w:tc>
+        <w:tc>
+          <w:tcPr>
+            <w:tcW w:w="2254" w:type="dxa"/>
+          </w:tcPr>
+          <w:p>
+            <w:pPr>
+              <w:cnfStyle w:val="000000000000" w:firstRow="0" w:lastRow="0" w:firstColumn="0" w:lastColumn="0" w:oddVBand="0" w:evenVBand="0" w:oddHBand="0" w:evenHBand="0" w:firstRowFirstColumn="0" w:firstRowLastColumn="0" w:lastRowFirstColumn="0" w:lastRowLastColumn="0"/>
+            </w:pPr>
+            <w:r>
+              <w:t>Primary actor</w:t>
+            </w:r>
+          </w:p>
+        </w:tc>
+        <w:tc>
+          <w:tcPr>
+            <w:tcW w:w="2254" w:type="dxa"/>
+          </w:tcPr>
+          <w:p>
+            <w:pPr>
+              <w:cnfStyle w:val="000000000000" w:firstRow="0" w:lastRow="0" w:firstColumn="0" w:lastColumn="0" w:oddVBand="0" w:evenVBand="0" w:oddHBand="0" w:evenHBand="0" w:firstRowFirstColumn="0" w:firstRowLastColumn="0" w:lastRowFirstColumn="0" w:lastRowLastColumn="0"/>
+            </w:pPr>
+            <w:r>
+              <w:t>Record requests, loading, loans and returns, record visit status</w:t>
+            </w:r>
+          </w:p>
+        </w:tc>
+        <w:tc>
+          <w:tcPr>
+            <w:tcW w:w="2872" w:type="dxa"/>
+          </w:tcPr>
+          <w:p>
+            <w:pPr>
+              <w:cnfStyle w:val="000000000000" w:firstRow="0" w:lastRow="0" w:firstColumn="0" w:lastColumn="0" w:oddVBand="0" w:evenVBand="0" w:oddHBand="0" w:evenHBand="0" w:firstRowFirstColumn="0" w:firstRowLastColumn="0" w:lastRowFirstColumn="0" w:lastRowLastColumn="0"/>
+            </w:pPr>
+            <w:r>
+              <w:t>Yes</w:t>
+            </w:r>
+          </w:p>
+        </w:tc>
+      </w:tr>
+      <w:tr>
+        <w:trPr>
+          <w:cnfStyle w:val="000000100000" w:firstRow="0" w:lastRow="0" w:firstColumn="0" w:lastColumn="0" w:oddVBand="0" w:evenVBand="0" w:oddHBand="1" w:evenHBand="0" w:firstRowFirstColumn="0" w:firstRowLastColumn="0" w:lastRowFirstColumn="0" w:lastRowLastColumn="0"/>
+        </w:trPr>
+        <w:tc>
+          <w:tcPr>
+            <w:cnfStyle w:val="001000000000" w:firstRow="0" w:lastRow="0" w:firstColumn="1" w:lastColumn="0" w:oddVBand="0" w:evenVBand="0" w:oddHBand="0" w:evenHBand="0" w:firstRowFirstColumn="0" w:firstRowLastColumn="0" w:lastRowFirstColumn="0" w:lastRowLastColumn="0"/>
+            <w:tcW w:w="2826" w:type="dxa"/>
+          </w:tcPr>
+          <w:p>
+            <w:pPr>
+              <w:rPr>
+                <w:b w:val="0"/>
+                <w:bCs w:val="0"/>
+              </w:rPr>
+            </w:pPr>
+            <w:r>
+              <w:rPr>
+                <w:b w:val="0"/>
+                <w:bCs w:val="0"/>
+              </w:rPr>
+              <w:t xml:space="preserve">Driver </w:t>
+            </w:r>
+          </w:p>
+        </w:tc>
+        <w:tc>
+          <w:tcPr>
+            <w:tcW w:w="2254" w:type="dxa"/>
+          </w:tcPr>
+          <w:p>
+            <w:pPr>
+              <w:cnfStyle w:val="000000100000" w:firstRow="0" w:lastRow="0" w:firstColumn="0" w:lastColumn="0" w:oddVBand="0" w:evenVBand="0" w:oddHBand="1" w:evenHBand="0" w:firstRowFirstColumn="0" w:firstRowLastColumn="0" w:lastRowFirstColumn="0" w:lastRowLastColumn="0"/>
+            </w:pPr>
+            <w:r>
+              <w:t>Primary actor</w:t>
+            </w:r>
+          </w:p>
+        </w:tc>
+        <w:tc>
+          <w:tcPr>
+            <w:tcW w:w="2254" w:type="dxa"/>
+          </w:tcPr>
+          <w:p>
+            <w:pPr>
+              <w:cnfStyle w:val="000000100000" w:firstRow="0" w:lastRow="0" w:firstColumn="0" w:lastColumn="0" w:oddVBand="0" w:evenVBand="0" w:oddHBand="1" w:evenHBand="0" w:firstRowFirstColumn="0" w:firstRowLastColumn="0" w:lastRowFirstColumn="0" w:lastRowLastColumn="0"/>
+            </w:pPr>
+            <w:r>
+              <w:t>Record that a visit is late, moved or cancelled</w:t>
+            </w:r>
+          </w:p>
+        </w:tc>
+        <w:tc>
+          <w:tcPr>
+            <w:tcW w:w="2872" w:type="dxa"/>
+          </w:tcPr>
+          <w:p>
+            <w:pPr>
+              <w:cnfStyle w:val="000000100000" w:firstRow="0" w:lastRow="0" w:firstColumn="0" w:lastColumn="0" w:oddVBand="0" w:evenVBand="0" w:oddHBand="1" w:evenHBand="0" w:firstRowFirstColumn="0" w:firstRowLastColumn="0" w:lastRowFirstColumn="0" w:lastRowLastColumn="0"/>
+            </w:pPr>
+            <w:r>
+              <w:t>Yes</w:t>
+            </w:r>
+          </w:p>
+        </w:tc>
+      </w:tr>
+      <w:tr>
+        <w:tc>
+          <w:tcPr>
+            <w:cnfStyle w:val="001000000000" w:firstRow="0" w:lastRow="0" w:firstColumn="1" w:lastColumn="0" w:oddVBand="0" w:evenVBand="0" w:oddHBand="0" w:evenHBand="0" w:firstRowFirstColumn="0" w:firstRowLastColumn="0" w:lastRowFirstColumn="0" w:lastRowLastColumn="0"/>
+            <w:tcW w:w="2826" w:type="dxa"/>
+          </w:tcPr>
+          <w:p>
+            <w:pPr>
+              <w:rPr>
+                <w:b w:val="0"/>
+                <w:bCs w:val="0"/>
+              </w:rPr>
+            </w:pPr>
+            <w:r>
+              <w:rPr>
+                <w:b w:val="0"/>
+                <w:bCs w:val="0"/>
+              </w:rPr>
+              <w:t>Branch staff member</w:t>
+            </w:r>
+          </w:p>
+        </w:tc>
+        <w:tc>
+          <w:tcPr>
+            <w:tcW w:w="2254" w:type="dxa"/>
+          </w:tcPr>
+          <w:p>
+            <w:pPr>
+              <w:cnfStyle w:val="000000000000" w:firstRow="0" w:lastRow="0" w:firstColumn="0" w:lastColumn="0" w:oddVBand="0" w:evenVBand="0" w:oddHBand="0" w:evenHBand="0" w:firstRowFirstColumn="0" w:firstRowLastColumn="0" w:lastRowFirstColumn="0" w:lastRowLastColumn="0"/>
+            </w:pPr>
+            <w:r>
+              <w:t>Primary actor</w:t>
+            </w:r>
+          </w:p>
+        </w:tc>
+        <w:tc>
+          <w:tcPr>
+            <w:tcW w:w="2254" w:type="dxa"/>
+          </w:tcPr>
+          <w:p>
+            <w:pPr>
+              <w:cnfStyle w:val="000000000000" w:firstRow="0" w:lastRow="0" w:firstColumn="0" w:lastColumn="0" w:oddVBand="0" w:evenVBand="0" w:oddHBand="0" w:evenHBand="0" w:firstRowFirstColumn="0" w:firstRowLastColumn="0" w:lastRowFirstColumn="0" w:lastRowLastColumn="0"/>
+            </w:pPr>
+            <w:r>
+              <w:t>Record a request for collection from the van</w:t>
+            </w:r>
+          </w:p>
+        </w:tc>
+        <w:tc>
+          <w:tcPr>
+            <w:tcW w:w="2872" w:type="dxa"/>
+          </w:tcPr>
+          <w:p>
+            <w:pPr>
+              <w:cnfStyle w:val="000000000000" w:firstRow="0" w:lastRow="0" w:firstColumn="0" w:lastColumn="0" w:oddVBand="0" w:evenVBand="0" w:oddHBand="0" w:evenHBand="0" w:firstRowFirstColumn="0" w:firstRowLastColumn="0" w:lastRowFirstColumn="0" w:lastRowLastColumn="0"/>
+            </w:pPr>
+            <w:r>
+              <w:t>Yes</w:t>
+            </w:r>
+          </w:p>
+        </w:tc>
+      </w:tr>
+      <w:tr>
+        <w:trPr>
+          <w:cnfStyle w:val="000000100000" w:firstRow="0" w:lastRow="0" w:firstColumn="0" w:lastColumn="0" w:oddVBand="0" w:evenVBand="0" w:oddHBand="1" w:evenHBand="0" w:firstRowFirstColumn="0" w:firstRowLastColumn="0" w:lastRowFirstColumn="0" w:lastRowLastColumn="0"/>
+        </w:trPr>
+        <w:tc>
+          <w:tcPr>
+            <w:cnfStyle w:val="001000000000" w:firstRow="0" w:lastRow="0" w:firstColumn="1" w:lastColumn="0" w:oddVBand="0" w:evenVBand="0" w:oddHBand="0" w:evenHBand="0" w:firstRowFirstColumn="0" w:firstRowLastColumn="0" w:lastRowFirstColumn="0" w:lastRowLastColumn="0"/>
+            <w:tcW w:w="2826" w:type="dxa"/>
+          </w:tcPr>
+          <w:p>
+            <w:pPr>
+              <w:rPr>
+                <w:b w:val="0"/>
+                <w:bCs w:val="0"/>
+              </w:rPr>
+            </w:pPr>
+            <w:r>
+              <w:rPr>
+                <w:b w:val="0"/>
+                <w:bCs w:val="0"/>
+              </w:rPr>
+              <w:t>Community coordinator</w:t>
+            </w:r>
+          </w:p>
+        </w:tc>
+        <w:tc>
+          <w:tcPr>
+            <w:tcW w:w="2254" w:type="dxa"/>
+          </w:tcPr>
+          <w:p>
+            <w:pPr>
+              <w:cnfStyle w:val="000000100000" w:firstRow="0" w:lastRow="0" w:firstColumn="0" w:lastColumn="0" w:oddVBand="0" w:evenVBand="0" w:oddHBand="1" w:evenHBand="0" w:firstRowFirstColumn="0" w:firstRowLastColumn="0" w:lastRowFirstColumn="0" w:lastRowLastColumn="0"/>
+            </w:pPr>
+            <w:r>
+              <w:t>Primary actor</w:t>
+            </w:r>
+          </w:p>
+        </w:tc>
+        <w:tc>
+          <w:tcPr>
+            <w:tcW w:w="2254" w:type="dxa"/>
+          </w:tcPr>
+          <w:p>
+            <w:pPr>
+              <w:cnfStyle w:val="000000100000" w:firstRow="0" w:lastRow="0" w:firstColumn="0" w:lastColumn="0" w:oddVBand="0" w:evenVBand="0" w:oddHBand="1" w:evenHBand="0" w:firstRowFirstColumn="0" w:firstRowLastColumn="0" w:lastRowFirstColumn="0" w:lastRowLastColumn="0"/>
+            </w:pPr>
+            <w:r>
+              <w:t>Be told when a visit is moved or cancelled</w:t>
+            </w:r>
+          </w:p>
+        </w:tc>
+        <w:tc>
+          <w:tcPr>
+            <w:tcW w:w="2872" w:type="dxa"/>
+          </w:tcPr>
+          <w:p>
+            <w:pPr>
+              <w:cnfStyle w:val="000000100000" w:firstRow="0" w:lastRow="0" w:firstColumn="0" w:lastColumn="0" w:oddVBand="0" w:evenVBand="0" w:oddHBand="1" w:evenHBand="0" w:firstRowFirstColumn="0" w:firstRowLastColumn="0" w:lastRowFirstColumn="0" w:lastRowLastColumn="0"/>
+            </w:pPr>
+            <w:r>
+              <w:t>Yes</w:t>
+            </w:r>
+          </w:p>
+        </w:tc>
+      </w:tr>
+      <w:tr>
+        <w:tc>
+          <w:tcPr>
+            <w:cnfStyle w:val="001000000000" w:firstRow="0" w:lastRow="0" w:firstColumn="1" w:lastColumn="0" w:oddVBand="0" w:evenVBand="0" w:oddHBand="0" w:evenHBand="0" w:firstRowFirstColumn="0" w:firstRowLastColumn="0" w:lastRowFirstColumn="0" w:lastRowLastColumn="0"/>
+            <w:tcW w:w="2826" w:type="dxa"/>
+          </w:tcPr>
+          <w:p>
+            <w:pPr>
+              <w:rPr>
+                <w:b w:val="0"/>
+                <w:bCs w:val="0"/>
+              </w:rPr>
+            </w:pPr>
+            <w:r>
+              <w:rPr>
+                <w:b w:val="0"/>
+                <w:bCs w:val="0"/>
+              </w:rPr>
+              <w:t>Library management system</w:t>
+            </w:r>
+          </w:p>
+        </w:tc>
+        <w:tc>
+          <w:tcPr>
+            <w:tcW w:w="2254" w:type="dxa"/>
+          </w:tcPr>
+          <w:p>
+            <w:pPr>
+              <w:cnfStyle w:val="000000000000" w:firstRow="0" w:lastRow="0" w:firstColumn="0" w:lastColumn="0" w:oddVBand="0" w:evenVBand="0" w:oddHBand="0" w:evenHBand="0" w:firstRowFirstColumn="0" w:firstRowLastColumn="0" w:lastRowFirstColumn="0" w:lastRowLastColumn="0"/>
+            </w:pPr>
+            <w:r>
+              <w:t>Supporting actor</w:t>
+            </w:r>
+          </w:p>
+        </w:tc>
+        <w:tc>
+          <w:tcPr>
+            <w:tcW w:w="2254" w:type="dxa"/>
+          </w:tcPr>
+          <w:p>
+            <w:pPr>
+              <w:cnfStyle w:val="000000000000" w:firstRow="0" w:lastRow="0" w:firstColumn="0" w:lastColumn="0" w:oddVBand="0" w:evenVBand="0" w:oddHBand="0" w:evenHBand="0" w:firstRowFirstColumn="0" w:firstRowLastColumn="0" w:lastRowFirstColumn="0" w:lastRowLastColumn="0"/>
+            </w:pPr>
+            <w:r>
+              <w:t xml:space="preserve">Provide account and item status, receive loans and returns </w:t>
+            </w:r>
+          </w:p>
+        </w:tc>
+        <w:tc>
+          <w:tcPr>
+            <w:tcW w:w="2872" w:type="dxa"/>
+          </w:tcPr>
+          <w:p>
+            <w:pPr>
+              <w:cnfStyle w:val="000000000000" w:firstRow="0" w:lastRow="0" w:firstColumn="0" w:lastColumn="0" w:oddVBand="0" w:evenVBand="0" w:oddHBand="0" w:evenHBand="0" w:firstRowFirstColumn="0" w:firstRowLastColumn="0" w:lastRowFirstColumn="0" w:lastRowLastColumn="0"/>
+            </w:pPr>
+            <w:r>
+              <w:t>Yes</w:t>
+            </w:r>
+          </w:p>
+        </w:tc>
+      </w:tr>
+      <w:tr>
+        <w:trPr>
+          <w:cnfStyle w:val="000000100000" w:firstRow="0" w:lastRow="0" w:firstColumn="0" w:lastColumn="0" w:oddVBand="0" w:evenVBand="0" w:oddHBand="1" w:evenHBand="0" w:firstRowFirstColumn="0" w:firstRowLastColumn="0" w:lastRowFirstColumn="0" w:lastRowLastColumn="0"/>
+        </w:trPr>
+        <w:tc>
+          <w:tcPr>
+            <w:cnfStyle w:val="001000000000" w:firstRow="0" w:lastRow="0" w:firstColumn="1" w:lastColumn="0" w:oddVBand="0" w:evenVBand="0" w:oddHBand="0" w:evenHBand="0" w:firstRowFirstColumn="0" w:firstRowLastColumn="0" w:lastRowFirstColumn="0" w:lastRowLastColumn="0"/>
+            <w:tcW w:w="2826" w:type="dxa"/>
+          </w:tcPr>
+          <w:p>
+            <w:pPr>
+              <w:rPr>
+                <w:b w:val="0"/>
+                <w:bCs w:val="0"/>
+              </w:rPr>
+            </w:pPr>
+            <w:r>
+              <w:rPr>
+                <w:b w:val="0"/>
+                <w:bCs w:val="0"/>
+              </w:rPr>
+              <w:t>Borrower</w:t>
+            </w:r>
+          </w:p>
+        </w:tc>
+        <w:tc>
+          <w:tcPr>
+            <w:tcW w:w="2254" w:type="dxa"/>
+          </w:tcPr>
+          <w:p>
+            <w:pPr>
+              <w:cnfStyle w:val="000000100000" w:firstRow="0" w:lastRow="0" w:firstColumn="0" w:lastColumn="0" w:oddVBand="0" w:evenVBand="0" w:oddHBand="1" w:evenHBand="0" w:firstRowFirstColumn="0" w:firstRowLastColumn="0" w:lastRowFirstColumn="0" w:lastRowLastColumn="0"/>
+            </w:pPr>
+            <w:r>
+              <w:t>Offstage stakeholder</w:t>
+            </w:r>
+          </w:p>
+        </w:tc>
+        <w:tc>
+          <w:tcPr>
+            <w:tcW w:w="2254" w:type="dxa"/>
+          </w:tcPr>
+          <w:p>
+            <w:pPr>
+              <w:cnfStyle w:val="000000100000" w:firstRow="0" w:lastRow="0" w:firstColumn="0" w:lastColumn="0" w:oddVBand="0" w:evenVBand="0" w:oddHBand="1" w:evenHBand="0" w:firstRowFirstColumn="0" w:firstRowLastColumn="0" w:lastRowFirstColumn="0" w:lastRowLastColumn="0"/>
+            </w:pPr>
+            <w:r>
+              <w:t>Receive requested items, keep the original request</w:t>
+            </w:r>
+          </w:p>
+        </w:tc>
+        <w:tc>
+          <w:tcPr>
+            <w:tcW w:w="2872" w:type="dxa"/>
+          </w:tcPr>
+          <w:p>
+            <w:pPr>
+              <w:cnfStyle w:val="000000100000" w:firstRow="0" w:lastRow="0" w:firstColumn="0" w:lastColumn="0" w:oddVBand="0" w:evenVBand="0" w:oddHBand="1" w:evenHBand="0" w:firstRowFirstColumn="0" w:firstRowLastColumn="0" w:lastRowFirstColumn="0" w:lastRowLastColumn="0"/>
+            </w:pPr>
+            <w:r>
+              <w:t>No</w:t>
+            </w:r>
+          </w:p>
+        </w:tc>
+      </w:tr>
+      <w:tr>
+        <w:tc>
+          <w:tcPr>
+            <w:cnfStyle w:val="001000000000" w:firstRow="0" w:lastRow="0" w:firstColumn="1" w:lastColumn="0" w:oddVBand="0" w:evenVBand="0" w:oddHBand="0" w:evenHBand="0" w:firstRowFirstColumn="0" w:firstRowLastColumn="0" w:lastRowFirstColumn="0" w:lastRowLastColumn="0"/>
+            <w:tcW w:w="2826" w:type="dxa"/>
+          </w:tcPr>
+          <w:p>
+            <w:pPr>
+              <w:rPr>
+                <w:b w:val="0"/>
+                <w:bCs w:val="0"/>
+              </w:rPr>
+            </w:pPr>
+            <w:r>
+              <w:rPr>
+                <w:b w:val="0"/>
+                <w:bCs w:val="0"/>
+              </w:rPr>
+              <w:t>School</w:t>
+            </w:r>
+          </w:p>
+        </w:tc>
+        <w:tc>
+          <w:tcPr>
+            <w:tcW w:w="2254" w:type="dxa"/>
+          </w:tcPr>
+          <w:p>
+            <w:pPr>
+              <w:cnfStyle w:val="000000000000" w:firstRow="0" w:lastRow="0" w:firstColumn="0" w:lastColumn="0" w:oddVBand="0" w:evenVBand="0" w:oddHBand="0" w:evenHBand="0" w:firstRowFirstColumn="0" w:firstRowLastColumn="0" w:lastRowFirstColumn="0" w:lastRowLastColumn="0"/>
+            </w:pPr>
+            <w:r>
+              <w:t>Offstage stakeholder</w:t>
+            </w:r>
+          </w:p>
+        </w:tc>
+        <w:tc>
+          <w:tcPr>
+            <w:tcW w:w="2254" w:type="dxa"/>
+          </w:tcPr>
+          <w:p>
+            <w:pPr>
+              <w:cnfStyle w:val="000000000000" w:firstRow="0" w:lastRow="0" w:firstColumn="0" w:lastColumn="0" w:oddVBand="0" w:evenVBand="0" w:oddHBand="0" w:evenHBand="0" w:firstRowFirstColumn="0" w:firstRowLastColumn="0" w:lastRowFirstColumn="0" w:lastRowLastColumn="0"/>
+            </w:pPr>
+            <w:r>
+              <w:t>Receive class sets</w:t>
+            </w:r>
+          </w:p>
+        </w:tc>
+        <w:tc>
+          <w:tcPr>
+            <w:tcW w:w="2872" w:type="dxa"/>
+          </w:tcPr>
+          <w:p>
+            <w:pPr>
+              <w:cnfStyle w:val="000000000000" w:firstRow="0" w:lastRow="0" w:firstColumn="0" w:lastColumn="0" w:oddVBand="0" w:evenVBand="0" w:oddHBand="0" w:evenHBand="0" w:firstRowFirstColumn="0" w:firstRowLastColumn="0" w:lastRowFirstColumn="0" w:lastRowLastColumn="0"/>
+            </w:pPr>
+            <w:r>
+              <w:t>No</w:t>
+            </w:r>
+          </w:p>
+        </w:tc>
+      </w:tr>
+      <w:tr>
+        <w:trPr>
+          <w:cnfStyle w:val="000000100000" w:firstRow="0" w:lastRow="0" w:firstColumn="0" w:lastColumn="0" w:oddVBand="0" w:evenVBand="0" w:oddHBand="1" w:evenHBand="0" w:firstRowFirstColumn="0" w:firstRowLastColumn="0" w:lastRowFirstColumn="0" w:lastRowLastColumn="0"/>
+        </w:trPr>
+        <w:tc>
+          <w:tcPr>
+            <w:cnfStyle w:val="001000000000" w:firstRow="0" w:lastRow="0" w:firstColumn="1" w:lastColumn="0" w:oddVBand="0" w:evenVBand="0" w:oddHBand="0" w:evenHBand="0" w:firstRowFirstColumn="0" w:firstRowLastColumn="0" w:lastRowFirstColumn="0" w:lastRowLastColumn="0"/>
+            <w:tcW w:w="2826" w:type="dxa"/>
+          </w:tcPr>
+          <w:p>
+            <w:pPr>
+              <w:rPr>
+                <w:b w:val="0"/>
+                <w:bCs w:val="0"/>
+              </w:rPr>
+            </w:pPr>
+            <w:r>
+              <w:rPr>
+                <w:b w:val="0"/>
+                <w:bCs w:val="0"/>
+              </w:rPr>
+              <w:t>Route spreadsheet</w:t>
+            </w:r>
+          </w:p>
+        </w:tc>
+        <w:tc>
+          <w:tcPr>
+            <w:tcW w:w="2254" w:type="dxa"/>
+          </w:tcPr>
+          <w:p>
+            <w:pPr>
+              <w:cnfStyle w:val="000000100000" w:firstRow="0" w:lastRow="0" w:firstColumn="0" w:lastColumn="0" w:oddVBand="0" w:evenVBand="0" w:oddHBand="1" w:evenHBand="0" w:firstRowFirstColumn="0" w:firstRowLastColumn="0" w:lastRowFirstColumn="0" w:lastRowLastColumn="0"/>
+            </w:pPr>
+            <w:r>
+              <w:t>Not an actor</w:t>
+            </w:r>
+          </w:p>
+        </w:tc>
+        <w:tc>
+          <w:tcPr>
+            <w:tcW w:w="2254" w:type="dxa"/>
+          </w:tcPr>
+          <w:p>
+            <w:pPr>
+              <w:cnfStyle w:val="000000100000" w:firstRow="0" w:lastRow="0" w:firstColumn="0" w:lastColumn="0" w:oddVBand="0" w:evenVBand="0" w:oddHBand="1" w:evenHBand="0" w:firstRowFirstColumn="0" w:firstRowLastColumn="0" w:lastRowFirstColumn="0" w:lastRowLastColumn="0"/>
+            </w:pPr>
+            <w:r>
+              <w:t>Part of the current process, not an external role</w:t>
+            </w:r>
+          </w:p>
+        </w:tc>
+        <w:tc>
+          <w:tcPr>
+            <w:tcW w:w="2872" w:type="dxa"/>
+          </w:tcPr>
+          <w:p>
+            <w:pPr>
+              <w:cnfStyle w:val="000000100000" w:firstRow="0" w:lastRow="0" w:firstColumn="0" w:lastColumn="0" w:oddVBand="0" w:evenVBand="0" w:oddHBand="1" w:evenHBand="0" w:firstRowFirstColumn="0" w:firstRowLastColumn="0" w:lastRowFirstColumn="0" w:lastRowLastColumn="0"/>
+            </w:pPr>
+            <w:r>
+              <w:t>N/A</w:t>
+            </w:r>
+          </w:p>
+        </w:tc>
+      </w:tr>
+    </w:tbl>
+    <w:p/>
+    <w:p>
+      <w:pPr>
+        <w:pStyle w:val="Heading1"/>
+        <w:numPr>
+          <w:ilvl w:val="0"/>
+          <w:numId w:val="1"/>
+        </w:numPr>
+      </w:pPr>
+      <w:r>
+        <w:t xml:space="preserve"> </w:t>
+      </w:r>
+      <w:r>
+        <w:t>Requirements catalogue</w:t>
+      </w:r>
+    </w:p>
+    <w:p>
+      <w:r>
+        <w:t>The Mobile Library Support Service must help staff plan routes, link each request to the right visit and check the correct items are loaded. It must record whether each stop is on time, delayed, or cancelled, tell the people effected and work at stops with no signal. The functional requirements set out what the system does, the non-functional requirements set out how well it must do it.</w:t>
+      </w:r>
+    </w:p>
+    <w:p/>
+    <w:p/>
+    <w:p>
+      <w:pPr>
+        <w:pStyle w:val="Heading2"/>
+        <w:numPr>
+          <w:ilvl w:val="1"/>
+          <w:numId w:val="1"/>
+        </w:numPr>
+      </w:pPr>
+      <w:r>
+        <w:lastRenderedPageBreak/>
+        <w:t>Functional requirements</w:t>
+      </w:r>
+    </w:p>
+    <w:tbl>
+      <w:tblPr>
+        <w:tblStyle w:val="PlainTable1"/>
+        <w:tblW w:w="9776" w:type="dxa"/>
+        <w:tblLook w:val="04A0" w:firstRow="1" w:lastRow="0" w:firstColumn="1" w:lastColumn="0" w:noHBand="0" w:noVBand="1"/>
+      </w:tblPr>
+      <w:tblGrid>
+        <w:gridCol w:w="846"/>
+        <w:gridCol w:w="3827"/>
+        <w:gridCol w:w="1276"/>
+        <w:gridCol w:w="3827"/>
+      </w:tblGrid>
+      <w:tr>
+        <w:trPr>
+          <w:cnfStyle w:val="100000000000" w:firstRow="1" w:lastRow="0" w:firstColumn="0" w:lastColumn="0" w:oddVBand="0" w:evenVBand="0" w:oddHBand="0" w:evenHBand="0" w:firstRowFirstColumn="0" w:firstRowLastColumn="0" w:lastRowFirstColumn="0" w:lastRowLastColumn="0"/>
+        </w:trPr>
+        <w:tc>
+          <w:tcPr>
+            <w:cnfStyle w:val="001000000000" w:firstRow="0" w:lastRow="0" w:firstColumn="1" w:lastColumn="0" w:oddVBand="0" w:evenVBand="0" w:oddHBand="0" w:evenHBand="0" w:firstRowFirstColumn="0" w:firstRowLastColumn="0" w:lastRowFirstColumn="0" w:lastRowLastColumn="0"/>
+            <w:tcW w:w="846" w:type="dxa"/>
+          </w:tcPr>
+          <w:p>
+            <w:pPr>
+              <w:pStyle w:val="ListParagraph"/>
+              <w:ind w:left="0"/>
+            </w:pPr>
+            <w:r>
+              <w:t>ID</w:t>
+            </w:r>
+          </w:p>
+        </w:tc>
+        <w:tc>
+          <w:tcPr>
+            <w:tcW w:w="3827" w:type="dxa"/>
+          </w:tcPr>
+          <w:p>
+            <w:pPr>
+              <w:pStyle w:val="ListParagraph"/>
+              <w:ind w:left="0"/>
+              <w:cnfStyle w:val="100000000000" w:firstRow="1" w:lastRow="0" w:firstColumn="0" w:lastColumn="0" w:oddVBand="0" w:evenVBand="0" w:oddHBand="0" w:evenHBand="0" w:firstRowFirstColumn="0" w:firstRowLastColumn="0" w:lastRowFirstColumn="0" w:lastRowLastColumn="0"/>
+            </w:pPr>
+            <w:r>
+              <w:t>Functional requirement</w:t>
+            </w:r>
+          </w:p>
+        </w:tc>
+        <w:tc>
+          <w:tcPr>
+            <w:tcW w:w="1276" w:type="dxa"/>
+          </w:tcPr>
+          <w:p>
+            <w:pPr>
+              <w:pStyle w:val="ListParagraph"/>
+              <w:ind w:left="0"/>
+              <w:cnfStyle w:val="100000000000" w:firstRow="1" w:lastRow="0" w:firstColumn="0" w:lastColumn="0" w:oddVBand="0" w:evenVBand="0" w:oddHBand="0" w:evenHBand="0" w:firstRowFirstColumn="0" w:firstRowLastColumn="0" w:lastRowFirstColumn="0" w:lastRowLastColumn="0"/>
+            </w:pPr>
+            <w:r>
+              <w:t>MoSCoW</w:t>
+            </w:r>
+          </w:p>
+        </w:tc>
+        <w:tc>
+          <w:tcPr>
+            <w:tcW w:w="3827" w:type="dxa"/>
+          </w:tcPr>
+          <w:p>
+            <w:pPr>
+              <w:pStyle w:val="ListParagraph"/>
+              <w:ind w:left="0"/>
+              <w:cnfStyle w:val="100000000000" w:firstRow="1" w:lastRow="0" w:firstColumn="0" w:lastColumn="0" w:oddVBand="0" w:evenVBand="0" w:oddHBand="0" w:evenHBand="0" w:firstRowFirstColumn="0" w:firstRowLastColumn="0" w:lastRowFirstColumn="0" w:lastRowLastColumn="0"/>
+            </w:pPr>
+            <w:r>
+              <w:t>Source / rationale</w:t>
+            </w:r>
+          </w:p>
+        </w:tc>
+      </w:tr>
+      <w:tr>
+        <w:trPr>
+          <w:cnfStyle w:val="000000100000" w:firstRow="0" w:lastRow="0" w:firstColumn="0" w:lastColumn="0" w:oddVBand="0" w:evenVBand="0" w:oddHBand="1" w:evenHBand="0" w:firstRowFirstColumn="0" w:firstRowLastColumn="0" w:lastRowFirstColumn="0" w:lastRowLastColumn="0"/>
+        </w:trPr>
+        <w:tc>
+          <w:tcPr>
+            <w:cnfStyle w:val="001000000000" w:firstRow="0" w:lastRow="0" w:firstColumn="1" w:lastColumn="0" w:oddVBand="0" w:evenVBand="0" w:oddHBand="0" w:evenHBand="0" w:firstRowFirstColumn="0" w:firstRowLastColumn="0" w:lastRowFirstColumn="0" w:lastRowLastColumn="0"/>
+            <w:tcW w:w="846" w:type="dxa"/>
+          </w:tcPr>
+          <w:p>
+            <w:pPr>
+              <w:pStyle w:val="ListParagraph"/>
+              <w:ind w:left="0"/>
+              <w:rPr>
+                <w:b w:val="0"/>
+                <w:bCs w:val="0"/>
+              </w:rPr>
+            </w:pPr>
+            <w:r>
+              <w:rPr>
+                <w:b w:val="0"/>
+                <w:bCs w:val="0"/>
+              </w:rPr>
+              <w:t>FR01</w:t>
+            </w:r>
+          </w:p>
+        </w:tc>
+        <w:tc>
+          <w:tcPr>
+            <w:tcW w:w="3827" w:type="dxa"/>
+          </w:tcPr>
+          <w:p>
+            <w:pPr>
+              <w:pStyle w:val="ListParagraph"/>
+              <w:ind w:left="0"/>
+              <w:cnfStyle w:val="000000100000" w:firstRow="0" w:lastRow="0" w:firstColumn="0" w:lastColumn="0" w:oddVBand="0" w:evenVBand="0" w:oddHBand="1" w:evenHBand="0" w:firstRowFirstColumn="0" w:firstRowLastColumn="0" w:lastRowFirstColumn="0" w:lastRowLastColumn="0"/>
+            </w:pPr>
+            <w:r>
+              <w:t>The system shall record a route as an ordered set of stops, each with a usual day</w:t>
+            </w:r>
+            <w:r>
+              <w:t>, arrival time, visit duration and visit frequency.</w:t>
+            </w:r>
+          </w:p>
+        </w:tc>
+        <w:tc>
+          <w:tcPr>
+            <w:tcW w:w="1276" w:type="dxa"/>
+          </w:tcPr>
+          <w:p>
+            <w:pPr>
+              <w:pStyle w:val="ListParagraph"/>
+              <w:ind w:left="0"/>
+              <w:cnfStyle w:val="000000100000" w:firstRow="0" w:lastRow="0" w:firstColumn="0" w:lastColumn="0" w:oddVBand="0" w:evenVBand="0" w:oddHBand="1" w:evenHBand="0" w:firstRowFirstColumn="0" w:firstRowLastColumn="0" w:lastRowFirstColumn="0" w:lastRowLastColumn="0"/>
+            </w:pPr>
+            <w:r>
+              <w:t>Must</w:t>
+            </w:r>
+          </w:p>
+        </w:tc>
+        <w:tc>
+          <w:tcPr>
+            <w:tcW w:w="3827" w:type="dxa"/>
+          </w:tcPr>
+          <w:p>
+            <w:pPr>
+              <w:pStyle w:val="ListParagraph"/>
+              <w:ind w:left="0"/>
+              <w:cnfStyle w:val="000000100000" w:firstRow="0" w:lastRow="0" w:firstColumn="0" w:lastColumn="0" w:oddVBand="0" w:evenVBand="0" w:oddHBand="1" w:evenHBand="0" w:firstRowFirstColumn="0" w:firstRowLastColumn="0" w:lastRowFirstColumn="0" w:lastRowLastColumn="0"/>
+            </w:pPr>
+            <w:r>
+              <w:t>Route coordinator: routes are kept in a spread sheet</w:t>
+            </w:r>
+          </w:p>
+        </w:tc>
+      </w:tr>
+      <w:tr>
+        <w:tc>
+          <w:tcPr>
+            <w:cnfStyle w:val="001000000000" w:firstRow="0" w:lastRow="0" w:firstColumn="1" w:lastColumn="0" w:oddVBand="0" w:evenVBand="0" w:oddHBand="0" w:evenHBand="0" w:firstRowFirstColumn="0" w:firstRowLastColumn="0" w:lastRowFirstColumn="0" w:lastRowLastColumn="0"/>
+            <w:tcW w:w="846" w:type="dxa"/>
+          </w:tcPr>
+          <w:p>
+            <w:pPr>
+              <w:pStyle w:val="ListParagraph"/>
+              <w:ind w:left="0"/>
+              <w:rPr>
+                <w:b w:val="0"/>
+                <w:bCs w:val="0"/>
+              </w:rPr>
+            </w:pPr>
+            <w:r>
+              <w:rPr>
+                <w:b w:val="0"/>
+                <w:bCs w:val="0"/>
+              </w:rPr>
+              <w:t>FR02</w:t>
+            </w:r>
+          </w:p>
+        </w:tc>
+        <w:tc>
+          <w:tcPr>
+            <w:tcW w:w="3827" w:type="dxa"/>
+          </w:tcPr>
+          <w:p>
+            <w:pPr>
+              <w:pStyle w:val="ListParagraph"/>
+              <w:ind w:left="0"/>
+              <w:cnfStyle w:val="000000000000" w:firstRow="0" w:lastRow="0" w:firstColumn="0" w:lastColumn="0" w:oddVBand="0" w:evenVBand="0" w:oddHBand="0" w:evenHBand="0" w:firstRowFirstColumn="0" w:firstRowLastColumn="0" w:lastRowFirstColumn="0" w:lastRowLastColumn="0"/>
+            </w:pPr>
+            <w:r>
+              <w:t xml:space="preserve">The system </w:t>
+            </w:r>
+            <w:r>
+              <w:t>shall</w:t>
+            </w:r>
+            <w:r>
+              <w:t xml:space="preserve"> allow the route coordinator to change the stop order for a single route visit without changing the planned route.</w:t>
+            </w:r>
+          </w:p>
+        </w:tc>
+        <w:tc>
+          <w:tcPr>
+            <w:tcW w:w="1276" w:type="dxa"/>
+          </w:tcPr>
+          <w:p>
+            <w:pPr>
+              <w:pStyle w:val="ListParagraph"/>
+              <w:ind w:left="0"/>
+              <w:cnfStyle w:val="000000000000" w:firstRow="0" w:lastRow="0" w:firstColumn="0" w:lastColumn="0" w:oddVBand="0" w:evenVBand="0" w:oddHBand="0" w:evenHBand="0" w:firstRowFirstColumn="0" w:firstRowLastColumn="0" w:lastRowFirstColumn="0" w:lastRowLastColumn="0"/>
+            </w:pPr>
+            <w:r>
+              <w:t>Must</w:t>
+            </w:r>
+          </w:p>
+        </w:tc>
+        <w:tc>
+          <w:tcPr>
+            <w:tcW w:w="3827" w:type="dxa"/>
+          </w:tcPr>
+          <w:p>
+            <w:pPr>
+              <w:pStyle w:val="ListParagraph"/>
+              <w:ind w:left="0"/>
+              <w:cnfStyle w:val="000000000000" w:firstRow="0" w:lastRow="0" w:firstColumn="0" w:lastColumn="0" w:oddVBand="0" w:evenVBand="0" w:oddHBand="0" w:evenHBand="0" w:firstRowFirstColumn="0" w:firstRowLastColumn="0" w:lastRowFirstColumn="0" w:lastRowLastColumn="0"/>
+            </w:pPr>
+            <w:r>
+              <w:t>Route coordinator: the order matters, but it may change on the morning of the visit</w:t>
+            </w:r>
+          </w:p>
+        </w:tc>
+      </w:tr>
+      <w:tr>
+        <w:trPr>
+          <w:cnfStyle w:val="000000100000" w:firstRow="0" w:lastRow="0" w:firstColumn="0" w:lastColumn="0" w:oddVBand="0" w:evenVBand="0" w:oddHBand="1" w:evenHBand="0" w:firstRowFirstColumn="0" w:firstRowLastColumn="0" w:lastRowFirstColumn="0" w:lastRowLastColumn="0"/>
+        </w:trPr>
+        <w:tc>
+          <w:tcPr>
+            <w:cnfStyle w:val="001000000000" w:firstRow="0" w:lastRow="0" w:firstColumn="1" w:lastColumn="0" w:oddVBand="0" w:evenVBand="0" w:oddHBand="0" w:evenHBand="0" w:firstRowFirstColumn="0" w:firstRowLastColumn="0" w:lastRowFirstColumn="0" w:lastRowLastColumn="0"/>
+            <w:tcW w:w="846" w:type="dxa"/>
+          </w:tcPr>
+          <w:p>
+            <w:pPr>
+              <w:pStyle w:val="ListParagraph"/>
+              <w:ind w:left="0"/>
+              <w:rPr>
+                <w:b w:val="0"/>
+                <w:bCs w:val="0"/>
+              </w:rPr>
+            </w:pPr>
+            <w:r>
+              <w:rPr>
+                <w:b w:val="0"/>
+                <w:bCs w:val="0"/>
+              </w:rPr>
+              <w:t>FR03</w:t>
+            </w:r>
+          </w:p>
+        </w:tc>
+        <w:tc>
+          <w:tcPr>
+            <w:tcW w:w="3827" w:type="dxa"/>
+          </w:tcPr>
+          <w:p>
+            <w:pPr>
+              <w:pStyle w:val="ListParagraph"/>
+              <w:ind w:left="0"/>
+              <w:cnfStyle w:val="000000100000" w:firstRow="0" w:lastRow="0" w:firstColumn="0" w:lastColumn="0" w:oddVBand="0" w:evenVBand="0" w:oddHBand="1" w:evenHBand="0" w:firstRowFirstColumn="0" w:firstRowLastColumn="0" w:lastRowFirstColumn="0" w:lastRowLastColumn="0"/>
+            </w:pPr>
+            <w:r>
+              <w:t>The system shall allow the route coordinator to pause a stop without removing it from its route</w:t>
+            </w:r>
+          </w:p>
+        </w:tc>
+        <w:tc>
+          <w:tcPr>
+            <w:tcW w:w="1276" w:type="dxa"/>
+          </w:tcPr>
+          <w:p>
+            <w:pPr>
+              <w:pStyle w:val="ListParagraph"/>
+              <w:ind w:left="0"/>
+              <w:cnfStyle w:val="000000100000" w:firstRow="0" w:lastRow="0" w:firstColumn="0" w:lastColumn="0" w:oddVBand="0" w:evenVBand="0" w:oddHBand="1" w:evenHBand="0" w:firstRowFirstColumn="0" w:firstRowLastColumn="0" w:lastRowFirstColumn="0" w:lastRowLastColumn="0"/>
+            </w:pPr>
+            <w:r>
+              <w:t>Should</w:t>
+            </w:r>
+          </w:p>
+        </w:tc>
+        <w:tc>
+          <w:tcPr>
+            <w:tcW w:w="3827" w:type="dxa"/>
+          </w:tcPr>
+          <w:p>
+            <w:pPr>
+              <w:pStyle w:val="ListParagraph"/>
+              <w:ind w:left="0"/>
+              <w:cnfStyle w:val="000000100000" w:firstRow="0" w:lastRow="0" w:firstColumn="0" w:lastColumn="0" w:oddVBand="0" w:evenVBand="0" w:oddHBand="1" w:evenHBand="0" w:firstRowFirstColumn="0" w:firstRowLastColumn="0" w:lastRowFirstColumn="0" w:lastRowLastColumn="0"/>
+            </w:pPr>
+            <w:r>
+              <w:t>A stop may temporarily suspended</w:t>
+            </w:r>
+          </w:p>
+        </w:tc>
+      </w:tr>
+      <w:tr>
+        <w:tc>
+          <w:tcPr>
+            <w:cnfStyle w:val="001000000000" w:firstRow="0" w:lastRow="0" w:firstColumn="1" w:lastColumn="0" w:oddVBand="0" w:evenVBand="0" w:oddHBand="0" w:evenHBand="0" w:firstRowFirstColumn="0" w:firstRowLastColumn="0" w:lastRowFirstColumn="0" w:lastRowLastColumn="0"/>
+            <w:tcW w:w="846" w:type="dxa"/>
+          </w:tcPr>
+          <w:p>
+            <w:pPr>
+              <w:pStyle w:val="ListParagraph"/>
+              <w:ind w:left="0"/>
+            </w:pPr>
+            <w:r>
+              <w:rPr>
+                <w:b w:val="0"/>
+                <w:bCs w:val="0"/>
+              </w:rPr>
+              <w:t>FR0</w:t>
+            </w:r>
+            <w:r>
+              <w:rPr>
+                <w:b w:val="0"/>
+                <w:bCs w:val="0"/>
+              </w:rPr>
+              <w:t>4</w:t>
+            </w:r>
+          </w:p>
+        </w:tc>
+        <w:tc>
+          <w:tcPr>
+            <w:tcW w:w="3827" w:type="dxa"/>
+          </w:tcPr>
+          <w:p>
+            <w:pPr>
+              <w:pStyle w:val="ListParagraph"/>
+              <w:ind w:left="0"/>
+              <w:cnfStyle w:val="000000000000" w:firstRow="0" w:lastRow="0" w:firstColumn="0" w:lastColumn="0" w:oddVBand="0" w:evenVBand="0" w:oddHBand="0" w:evenHBand="0" w:firstRowFirstColumn="0" w:firstRowLastColumn="0" w:lastRowFirstColumn="0" w:lastRowLastColumn="0"/>
+            </w:pPr>
+            <w:r>
+              <w:t xml:space="preserve">The system shall record a borrower request for a specific title, a </w:t>
+            </w:r>
+            <w:r>
+              <w:t>particular edition or any suitable item on a topic</w:t>
+            </w:r>
+          </w:p>
+        </w:tc>
+        <w:tc>
+          <w:tcPr>
+            <w:tcW w:w="1276" w:type="dxa"/>
+          </w:tcPr>
+          <w:p>
+            <w:pPr>
+              <w:pStyle w:val="ListParagraph"/>
+              <w:ind w:left="0"/>
+              <w:cnfStyle w:val="000000000000" w:firstRow="0" w:lastRow="0" w:firstColumn="0" w:lastColumn="0" w:oddVBand="0" w:evenVBand="0" w:oddHBand="0" w:evenHBand="0" w:firstRowFirstColumn="0" w:firstRowLastColumn="0" w:lastRowFirstColumn="0" w:lastRowLastColumn="0"/>
+            </w:pPr>
+            <w:r>
+              <w:t>Must</w:t>
+            </w:r>
+          </w:p>
+        </w:tc>
+        <w:tc>
+          <w:tcPr>
+            <w:tcW w:w="3827" w:type="dxa"/>
+          </w:tcPr>
+          <w:p>
+            <w:pPr>
+              <w:pStyle w:val="ListParagraph"/>
+              <w:ind w:left="0"/>
+              <w:cnfStyle w:val="000000000000" w:firstRow="0" w:lastRow="0" w:firstColumn="0" w:lastColumn="0" w:oddVBand="0" w:evenVBand="0" w:oddHBand="0" w:evenHBand="0" w:firstRowFirstColumn="0" w:firstRowLastColumn="0" w:lastRowFirstColumn="0" w:lastRowLastColumn="0"/>
+            </w:pPr>
+            <w:r>
+              <w:t>Branch staff: P2</w:t>
+            </w:r>
+          </w:p>
+        </w:tc>
+      </w:tr>
+      <w:tr>
+        <w:trPr>
+          <w:cnfStyle w:val="000000100000" w:firstRow="0" w:lastRow="0" w:firstColumn="0" w:lastColumn="0" w:oddVBand="0" w:evenVBand="0" w:oddHBand="1" w:evenHBand="0" w:firstRowFirstColumn="0" w:firstRowLastColumn="0" w:lastRowFirstColumn="0" w:lastRowLastColumn="0"/>
+        </w:trPr>
+        <w:tc>
+          <w:tcPr>
+            <w:cnfStyle w:val="001000000000" w:firstRow="0" w:lastRow="0" w:firstColumn="1" w:lastColumn="0" w:oddVBand="0" w:evenVBand="0" w:oddHBand="0" w:evenHBand="0" w:firstRowFirstColumn="0" w:firstRowLastColumn="0" w:lastRowFirstColumn="0" w:lastRowLastColumn="0"/>
+            <w:tcW w:w="846" w:type="dxa"/>
+          </w:tcPr>
+          <w:p>
+            <w:pPr>
+              <w:pStyle w:val="ListParagraph"/>
+              <w:ind w:left="0"/>
+            </w:pPr>
+            <w:r>
+              <w:rPr>
+                <w:b w:val="0"/>
+                <w:bCs w:val="0"/>
+              </w:rPr>
+              <w:t>FR0</w:t>
+            </w:r>
+            <w:r>
+              <w:rPr>
+                <w:b w:val="0"/>
+                <w:bCs w:val="0"/>
+              </w:rPr>
+              <w:t>5</w:t>
+            </w:r>
+          </w:p>
+        </w:tc>
+        <w:tc>
+          <w:tcPr>
+            <w:tcW w:w="3827" w:type="dxa"/>
+          </w:tcPr>
+          <w:p>
+            <w:pPr>
+              <w:pStyle w:val="ListParagraph"/>
+              <w:ind w:left="0"/>
+              <w:cnfStyle w:val="000000100000" w:firstRow="0" w:lastRow="0" w:firstColumn="0" w:lastColumn="0" w:oddVBand="0" w:evenVBand="0" w:oddHBand="1" w:evenHBand="0" w:firstRowFirstColumn="0" w:firstRowLastColumn="0" w:lastRowFirstColumn="0" w:lastRowLastColumn="0"/>
+            </w:pPr>
+            <w:r>
+              <w:t>The system shall link each requested item to one route visit.</w:t>
+            </w:r>
+          </w:p>
+        </w:tc>
+        <w:tc>
+          <w:tcPr>
+            <w:tcW w:w="1276" w:type="dxa"/>
+          </w:tcPr>
+          <w:p>
+            <w:pPr>
+              <w:pStyle w:val="ListParagraph"/>
+              <w:ind w:left="0"/>
+              <w:cnfStyle w:val="000000100000" w:firstRow="0" w:lastRow="0" w:firstColumn="0" w:lastColumn="0" w:oddVBand="0" w:evenVBand="0" w:oddHBand="1" w:evenHBand="0" w:firstRowFirstColumn="0" w:firstRowLastColumn="0" w:lastRowFirstColumn="0" w:lastRowLastColumn="0"/>
+            </w:pPr>
+            <w:r>
+              <w:t>Must</w:t>
+            </w:r>
+          </w:p>
+        </w:tc>
+        <w:tc>
+          <w:tcPr>
+            <w:tcW w:w="3827" w:type="dxa"/>
+          </w:tcPr>
+          <w:p>
+            <w:pPr>
+              <w:pStyle w:val="ListParagraph"/>
+              <w:ind w:left="0"/>
+              <w:cnfStyle w:val="000000100000" w:firstRow="0" w:lastRow="0" w:firstColumn="0" w:lastColumn="0" w:oddVBand="0" w:evenVBand="0" w:oddHBand="1" w:evenHBand="0" w:firstRowFirstColumn="0" w:firstRowLastColumn="0" w:lastRowFirstColumn="0" w:lastRowLastColumn="0"/>
+            </w:pPr>
+            <w:r>
+              <w:t>P1 and P2: “we do not always know which note is current”</w:t>
+            </w:r>
+          </w:p>
+        </w:tc>
+      </w:tr>
+      <w:tr>
+        <w:tc>
+          <w:tcPr>
+            <w:cnfStyle w:val="001000000000" w:firstRow="0" w:lastRow="0" w:firstColumn="1" w:lastColumn="0" w:oddVBand="0" w:evenVBand="0" w:oddHBand="0" w:evenHBand="0" w:firstRowFirstColumn="0" w:firstRowLastColumn="0" w:lastRowFirstColumn="0" w:lastRowLastColumn="0"/>
+            <w:tcW w:w="846" w:type="dxa"/>
+          </w:tcPr>
+          <w:p>
+            <w:pPr>
+              <w:pStyle w:val="ListParagraph"/>
+              <w:ind w:left="0"/>
+            </w:pPr>
+            <w:r>
+              <w:rPr>
+                <w:b w:val="0"/>
+                <w:bCs w:val="0"/>
+              </w:rPr>
+              <w:t>FR0</w:t>
+            </w:r>
+            <w:r>
+              <w:rPr>
+                <w:b w:val="0"/>
+                <w:bCs w:val="0"/>
+              </w:rPr>
+              <w:t>6</w:t>
+            </w:r>
+          </w:p>
+        </w:tc>
+        <w:tc>
+          <w:tcPr>
+            <w:tcW w:w="3827" w:type="dxa"/>
+          </w:tcPr>
+          <w:p>
+            <w:pPr>
+              <w:pStyle w:val="ListParagraph"/>
+              <w:ind w:left="0"/>
+              <w:cnfStyle w:val="000000000000" w:firstRow="0" w:lastRow="0" w:firstColumn="0" w:lastColumn="0" w:oddVBand="0" w:evenVBand="0" w:oddHBand="0" w:evenHBand="0" w:firstRowFirstColumn="0" w:firstRowLastColumn="0" w:lastRowFirstColumn="0" w:lastRowLastColumn="0"/>
+            </w:pPr>
+            <w:r>
+              <w:t>The system shall produce a load list for each route visit showing requested items, expected collections and returns going back to branches</w:t>
+            </w:r>
+          </w:p>
+        </w:tc>
+        <w:tc>
+          <w:tcPr>
+            <w:tcW w:w="1276" w:type="dxa"/>
+          </w:tcPr>
+          <w:p>
+            <w:pPr>
+              <w:pStyle w:val="ListParagraph"/>
+              <w:ind w:left="0"/>
+              <w:cnfStyle w:val="000000000000" w:firstRow="0" w:lastRow="0" w:firstColumn="0" w:lastColumn="0" w:oddVBand="0" w:evenVBand="0" w:oddHBand="0" w:evenHBand="0" w:firstRowFirstColumn="0" w:firstRowLastColumn="0" w:lastRowFirstColumn="0" w:lastRowLastColumn="0"/>
+            </w:pPr>
+            <w:r>
+              <w:t>Must</w:t>
+            </w:r>
+          </w:p>
+        </w:tc>
+        <w:tc>
+          <w:tcPr>
+            <w:tcW w:w="3827" w:type="dxa"/>
+          </w:tcPr>
+          <w:p>
+            <w:pPr>
+              <w:pStyle w:val="ListParagraph"/>
+              <w:ind w:left="0"/>
+              <w:cnfStyle w:val="000000000000" w:firstRow="0" w:lastRow="0" w:firstColumn="0" w:lastColumn="0" w:oddVBand="0" w:evenVBand="0" w:oddHBand="0" w:evenHBand="0" w:firstRowFirstColumn="0" w:firstRowLastColumn="0" w:lastRowFirstColumn="0" w:lastRowLastColumn="0"/>
+            </w:pPr>
+            <w:r>
+              <w:t>P1: requested material should be checked against the route plan</w:t>
+            </w:r>
+          </w:p>
+        </w:tc>
+      </w:tr>
+      <w:tr>
+        <w:trPr>
+          <w:cnfStyle w:val="000000100000" w:firstRow="0" w:lastRow="0" w:firstColumn="0" w:lastColumn="0" w:oddVBand="0" w:evenVBand="0" w:oddHBand="1" w:evenHBand="0" w:firstRowFirstColumn="0" w:firstRowLastColumn="0" w:lastRowFirstColumn="0" w:lastRowLastColumn="0"/>
+        </w:trPr>
+        <w:tc>
+          <w:tcPr>
+            <w:cnfStyle w:val="001000000000" w:firstRow="0" w:lastRow="0" w:firstColumn="1" w:lastColumn="0" w:oddVBand="0" w:evenVBand="0" w:oddHBand="0" w:evenHBand="0" w:firstRowFirstColumn="0" w:firstRowLastColumn="0" w:lastRowFirstColumn="0" w:lastRowLastColumn="0"/>
+            <w:tcW w:w="846" w:type="dxa"/>
+          </w:tcPr>
+          <w:p>
+            <w:pPr>
+              <w:pStyle w:val="ListParagraph"/>
+              <w:ind w:left="0"/>
+            </w:pPr>
+            <w:r>
+              <w:rPr>
+                <w:b w:val="0"/>
+                <w:bCs w:val="0"/>
+              </w:rPr>
+              <w:t>FR0</w:t>
+            </w:r>
+            <w:r>
+              <w:rPr>
+                <w:b w:val="0"/>
+                <w:bCs w:val="0"/>
+              </w:rPr>
+              <w:t>7</w:t>
+            </w:r>
+          </w:p>
+        </w:tc>
+        <w:tc>
+          <w:tcPr>
+            <w:tcW w:w="3827" w:type="dxa"/>
+          </w:tcPr>
+          <w:p>
+            <w:pPr>
+              <w:pStyle w:val="ListParagraph"/>
+              <w:ind w:left="0"/>
+              <w:cnfStyle w:val="000000100000" w:firstRow="0" w:lastRow="0" w:firstColumn="0" w:lastColumn="0" w:oddVBand="0" w:evenVBand="0" w:oddHBand="1" w:evenHBand="0" w:firstRowFirstColumn="0" w:firstRowLastColumn="0" w:lastRowFirstColumn="0" w:lastRowLastColumn="0"/>
+            </w:pPr>
+            <w:r>
+              <w:t>The system shall record that each item on the load list has been loaded and report any item not loaded before departure</w:t>
+            </w:r>
+          </w:p>
+        </w:tc>
+        <w:tc>
+          <w:tcPr>
+            <w:tcW w:w="1276" w:type="dxa"/>
+          </w:tcPr>
+          <w:p>
+            <w:pPr>
+              <w:pStyle w:val="ListParagraph"/>
+              <w:ind w:left="0"/>
+              <w:cnfStyle w:val="000000100000" w:firstRow="0" w:lastRow="0" w:firstColumn="0" w:lastColumn="0" w:oddVBand="0" w:evenVBand="0" w:oddHBand="1" w:evenHBand="0" w:firstRowFirstColumn="0" w:firstRowLastColumn="0" w:lastRowFirstColumn="0" w:lastRowLastColumn="0"/>
+            </w:pPr>
+            <w:r>
+              <w:t>Must</w:t>
+            </w:r>
+          </w:p>
+        </w:tc>
+        <w:tc>
+          <w:tcPr>
+            <w:tcW w:w="3827" w:type="dxa"/>
+          </w:tcPr>
+          <w:p>
+            <w:pPr>
+              <w:pStyle w:val="ListParagraph"/>
+              <w:ind w:left="0"/>
+              <w:cnfStyle w:val="000000100000" w:firstRow="0" w:lastRow="0" w:firstColumn="0" w:lastColumn="0" w:oddVBand="0" w:evenVBand="0" w:oddHBand="1" w:evenHBand="0" w:firstRowFirstColumn="0" w:firstRowLastColumn="0" w:lastRowFirstColumn="0" w:lastRowLastColumn="0"/>
+            </w:pPr>
+            <w:r>
+              <w:t>P1: Material loaded onto the wrong vehicle</w:t>
+            </w:r>
+          </w:p>
+        </w:tc>
+      </w:tr>
+      <w:tr>
+        <w:tc>
+          <w:tcPr>
+            <w:cnfStyle w:val="001000000000" w:firstRow="0" w:lastRow="0" w:firstColumn="1" w:lastColumn="0" w:oddVBand="0" w:evenVBand="0" w:oddHBand="0" w:evenHBand="0" w:firstRowFirstColumn="0" w:firstRowLastColumn="0" w:lastRowFirstColumn="0" w:lastRowLastColumn="0"/>
+            <w:tcW w:w="846" w:type="dxa"/>
+          </w:tcPr>
+          <w:p>
+            <w:pPr>
+              <w:pStyle w:val="ListParagraph"/>
+              <w:ind w:left="0"/>
+            </w:pPr>
+            <w:r>
+              <w:rPr>
+                <w:b w:val="0"/>
+                <w:bCs w:val="0"/>
+              </w:rPr>
+              <w:t>FR0</w:t>
+            </w:r>
+            <w:r>
+              <w:rPr>
+                <w:b w:val="0"/>
+                <w:bCs w:val="0"/>
+              </w:rPr>
+              <w:t>8</w:t>
+            </w:r>
+          </w:p>
+        </w:tc>
+        <w:tc>
+          <w:tcPr>
+            <w:tcW w:w="3827" w:type="dxa"/>
+          </w:tcPr>
+          <w:p>
+            <w:pPr>
+              <w:pStyle w:val="ListParagraph"/>
+              <w:ind w:left="0"/>
+              <w:cnfStyle w:val="000000000000" w:firstRow="0" w:lastRow="0" w:firstColumn="0" w:lastColumn="0" w:oddVBand="0" w:evenVBand="0" w:oddHBand="0" w:evenHBand="0" w:firstRowFirstColumn="0" w:firstRowLastColumn="0" w:lastRowFirstColumn="0" w:lastRowLastColumn="0"/>
+            </w:pPr>
+            <w:r>
+              <w:t>The system shall record the status of each stop visit as on time, delayed, moved or cancelled.</w:t>
+            </w:r>
+          </w:p>
+        </w:tc>
+        <w:tc>
+          <w:tcPr>
+            <w:tcW w:w="1276" w:type="dxa"/>
+          </w:tcPr>
+          <w:p>
+            <w:pPr>
+              <w:pStyle w:val="ListParagraph"/>
+              <w:ind w:left="0"/>
+              <w:cnfStyle w:val="000000000000" w:firstRow="0" w:lastRow="0" w:firstColumn="0" w:lastColumn="0" w:oddVBand="0" w:evenVBand="0" w:oddHBand="0" w:evenHBand="0" w:firstRowFirstColumn="0" w:firstRowLastColumn="0" w:lastRowFirstColumn="0" w:lastRowLastColumn="0"/>
+            </w:pPr>
+            <w:r>
+              <w:t>Must</w:t>
+            </w:r>
+          </w:p>
+        </w:tc>
+        <w:tc>
+          <w:tcPr>
+            <w:tcW w:w="3827" w:type="dxa"/>
+          </w:tcPr>
+          <w:p>
+            <w:pPr>
+              <w:pStyle w:val="ListParagraph"/>
+              <w:ind w:left="0"/>
+              <w:cnfStyle w:val="000000000000" w:firstRow="0" w:lastRow="0" w:firstColumn="0" w:lastColumn="0" w:oddVBand="0" w:evenVBand="0" w:oddHBand="0" w:evenHBand="0" w:firstRowFirstColumn="0" w:firstRowLastColumn="0" w:lastRowFirstColumn="0" w:lastRowLastColumn="0"/>
+            </w:pPr>
+            <w:r>
+              <w:t>P4: community coordinator quote</w:t>
+            </w:r>
+          </w:p>
+        </w:tc>
+      </w:tr>
+      <w:tr>
+        <w:trPr>
+          <w:cnfStyle w:val="000000100000" w:firstRow="0" w:lastRow="0" w:firstColumn="0" w:lastColumn="0" w:oddVBand="0" w:evenVBand="0" w:oddHBand="1" w:evenHBand="0" w:firstRowFirstColumn="0" w:firstRowLastColumn="0" w:lastRowFirstColumn="0" w:lastRowLastColumn="0"/>
+        </w:trPr>
+        <w:tc>
+          <w:tcPr>
+            <w:cnfStyle w:val="001000000000" w:firstRow="0" w:lastRow="0" w:firstColumn="1" w:lastColumn="0" w:oddVBand="0" w:evenVBand="0" w:oddHBand="0" w:evenHBand="0" w:firstRowFirstColumn="0" w:firstRowLastColumn="0" w:lastRowFirstColumn="0" w:lastRowLastColumn="0"/>
+            <w:tcW w:w="846" w:type="dxa"/>
+          </w:tcPr>
+          <w:p>
+            <w:pPr>
+              <w:pStyle w:val="ListParagraph"/>
+              <w:ind w:left="0"/>
+            </w:pPr>
+            <w:r>
+              <w:rPr>
+                <w:b w:val="0"/>
+                <w:bCs w:val="0"/>
+              </w:rPr>
+              <w:t>FR0</w:t>
+            </w:r>
+            <w:r>
+              <w:rPr>
+                <w:b w:val="0"/>
+                <w:bCs w:val="0"/>
+              </w:rPr>
+              <w:t>9</w:t>
+            </w:r>
+          </w:p>
+        </w:tc>
+        <w:tc>
+          <w:tcPr>
+            <w:tcW w:w="3827" w:type="dxa"/>
+          </w:tcPr>
+          <w:p>
+            <w:pPr>
+              <w:pStyle w:val="ListParagraph"/>
+              <w:ind w:left="0"/>
+              <w:cnfStyle w:val="000000100000" w:firstRow="0" w:lastRow="0" w:firstColumn="0" w:lastColumn="0" w:oddVBand="0" w:evenVBand="0" w:oddHBand="1" w:evenHBand="0" w:firstRowFirstColumn="0" w:firstRowLastColumn="0" w:lastRowFirstColumn="0" w:lastRowLastColumn="0"/>
+            </w:pPr>
+            <w:r>
+              <w:t xml:space="preserve">The system shall notify borrowers with items for a stop, and that stop’s community coordinator when the visit is moved or cancelled. </w:t>
+            </w:r>
+          </w:p>
+        </w:tc>
+        <w:tc>
+          <w:tcPr>
+            <w:tcW w:w="1276" w:type="dxa"/>
+          </w:tcPr>
+          <w:p>
+            <w:pPr>
+              <w:pStyle w:val="ListParagraph"/>
+              <w:ind w:left="0"/>
+              <w:cnfStyle w:val="000000100000" w:firstRow="0" w:lastRow="0" w:firstColumn="0" w:lastColumn="0" w:oddVBand="0" w:evenVBand="0" w:oddHBand="1" w:evenHBand="0" w:firstRowFirstColumn="0" w:firstRowLastColumn="0" w:lastRowFirstColumn="0" w:lastRowLastColumn="0"/>
+            </w:pPr>
+            <w:r>
+              <w:t xml:space="preserve">Must </w:t>
+            </w:r>
+          </w:p>
+        </w:tc>
+        <w:tc>
+          <w:tcPr>
+            <w:tcW w:w="3827" w:type="dxa"/>
+          </w:tcPr>
+          <w:p>
+            <w:pPr>
+              <w:pStyle w:val="ListParagraph"/>
+              <w:ind w:left="0"/>
+              <w:cnfStyle w:val="000000100000" w:firstRow="0" w:lastRow="0" w:firstColumn="0" w:lastColumn="0" w:oddVBand="0" w:evenVBand="0" w:oddHBand="1" w:evenHBand="0" w:firstRowFirstColumn="0" w:firstRowLastColumn="0" w:lastRowFirstColumn="0" w:lastRowLastColumn="0"/>
+            </w:pPr>
+            <w:r>
+              <w:t>P4: messages are not always consistent</w:t>
+            </w:r>
+          </w:p>
+        </w:tc>
+      </w:tr>
+      <w:tr>
+        <w:tc>
+          <w:tcPr>
+            <w:cnfStyle w:val="001000000000" w:firstRow="0" w:lastRow="0" w:firstColumn="1" w:lastColumn="0" w:oddVBand="0" w:evenVBand="0" w:oddHBand="0" w:evenHBand="0" w:firstRowFirstColumn="0" w:firstRowLastColumn="0" w:lastRowFirstColumn="0" w:lastRowLastColumn="0"/>
+            <w:tcW w:w="846" w:type="dxa"/>
+          </w:tcPr>
+          <w:p>
+            <w:pPr>
+              <w:pStyle w:val="ListParagraph"/>
+              <w:ind w:left="0"/>
+            </w:pPr>
+            <w:r>
+              <w:rPr>
+                <w:b w:val="0"/>
+                <w:bCs w:val="0"/>
+              </w:rPr>
+              <w:t>FR</w:t>
+            </w:r>
+            <w:r>
+              <w:rPr>
+                <w:b w:val="0"/>
+                <w:bCs w:val="0"/>
+              </w:rPr>
+              <w:t>10</w:t>
+            </w:r>
+          </w:p>
+        </w:tc>
+        <w:tc>
+          <w:tcPr>
+            <w:tcW w:w="3827" w:type="dxa"/>
+          </w:tcPr>
+          <w:p>
+            <w:pPr>
+              <w:pStyle w:val="ListParagraph"/>
+              <w:ind w:left="0"/>
+              <w:cnfStyle w:val="000000000000" w:firstRow="0" w:lastRow="0" w:firstColumn="0" w:lastColumn="0" w:oddVBand="0" w:evenVBand="0" w:oddHBand="0" w:evenHBand="0" w:firstRowFirstColumn="0" w:firstRowLastColumn="0" w:lastRowFirstColumn="0" w:lastRowLastColumn="0"/>
+            </w:pPr>
+            <w:r>
+              <w:t xml:space="preserve">The system shall record </w:t>
+            </w:r>
+            <w:r>
+              <w:t>whether</w:t>
+            </w:r>
+            <w:r>
+              <w:t xml:space="preserve"> a borrower accepts an alternative item, keeps the original request active or cancels the request</w:t>
+            </w:r>
+          </w:p>
+        </w:tc>
+        <w:tc>
+          <w:tcPr>
+            <w:tcW w:w="1276" w:type="dxa"/>
+          </w:tcPr>
+          <w:p>
+            <w:pPr>
+              <w:pStyle w:val="ListParagraph"/>
+              <w:ind w:left="0"/>
+              <w:cnfStyle w:val="000000000000" w:firstRow="0" w:lastRow="0" w:firstColumn="0" w:lastColumn="0" w:oddVBand="0" w:evenVBand="0" w:oddHBand="0" w:evenHBand="0" w:firstRowFirstColumn="0" w:firstRowLastColumn="0" w:lastRowFirstColumn="0" w:lastRowLastColumn="0"/>
+            </w:pPr>
+            <w:r>
+              <w:t xml:space="preserve">Should </w:t>
+            </w:r>
+          </w:p>
+        </w:tc>
+        <w:tc>
+          <w:tcPr>
+            <w:tcW w:w="3827" w:type="dxa"/>
+          </w:tcPr>
+          <w:p>
+            <w:pPr>
+              <w:pStyle w:val="ListParagraph"/>
+              <w:ind w:left="0"/>
+              <w:cnfStyle w:val="000000000000" w:firstRow="0" w:lastRow="0" w:firstColumn="0" w:lastColumn="0" w:oddVBand="0" w:evenVBand="0" w:oddHBand="0" w:evenHBand="0" w:firstRowFirstColumn="0" w:firstRowLastColumn="0" w:lastRowFirstColumn="0" w:lastRowLastColumn="0"/>
+            </w:pPr>
+            <w:r>
+              <w:t>P5: borrower quote</w:t>
+            </w:r>
+          </w:p>
+        </w:tc>
+      </w:tr>
+      <w:tr>
+        <w:trPr>
+          <w:cnfStyle w:val="000000100000" w:firstRow="0" w:lastRow="0" w:firstColumn="0" w:lastColumn="0" w:oddVBand="0" w:evenVBand="0" w:oddHBand="1" w:evenHBand="0" w:firstRowFirstColumn="0" w:firstRowLastColumn="0" w:lastRowFirstColumn="0" w:lastRowLastColumn="0"/>
+        </w:trPr>
+        <w:tc>
+          <w:tcPr>
+            <w:cnfStyle w:val="001000000000" w:firstRow="0" w:lastRow="0" w:firstColumn="1" w:lastColumn="0" w:oddVBand="0" w:evenVBand="0" w:oddHBand="0" w:evenHBand="0" w:firstRowFirstColumn="0" w:firstRowLastColumn="0" w:lastRowFirstColumn="0" w:lastRowLastColumn="0"/>
+            <w:tcW w:w="846" w:type="dxa"/>
+          </w:tcPr>
+          <w:p>
+            <w:pPr>
+              <w:pStyle w:val="ListParagraph"/>
+              <w:ind w:left="0"/>
+            </w:pPr>
+            <w:r>
+              <w:rPr>
+                <w:b w:val="0"/>
+                <w:bCs w:val="0"/>
+              </w:rPr>
+              <w:t>FR</w:t>
+            </w:r>
+            <w:r>
+              <w:rPr>
+                <w:b w:val="0"/>
+                <w:bCs w:val="0"/>
+              </w:rPr>
+              <w:t>11</w:t>
+            </w:r>
+          </w:p>
+        </w:tc>
+        <w:tc>
+          <w:tcPr>
+            <w:tcW w:w="3827" w:type="dxa"/>
+          </w:tcPr>
+          <w:p>
+            <w:pPr>
+              <w:pStyle w:val="ListParagraph"/>
+              <w:ind w:left="0"/>
+              <w:cnfStyle w:val="000000100000" w:firstRow="0" w:lastRow="0" w:firstColumn="0" w:lastColumn="0" w:oddVBand="0" w:evenVBand="0" w:oddHBand="1" w:evenHBand="0" w:firstRowFirstColumn="0" w:firstRowLastColumn="0" w:lastRowFirstColumn="0" w:lastRowLastColumn="0"/>
+            </w:pPr>
+            <w:r>
+              <w:t>The system shall allow staff to record loans and returns when there is no connection.</w:t>
+            </w:r>
+          </w:p>
+        </w:tc>
+        <w:tc>
+          <w:tcPr>
+            <w:tcW w:w="1276" w:type="dxa"/>
+          </w:tcPr>
+          <w:p>
+            <w:pPr>
+              <w:pStyle w:val="ListParagraph"/>
+              <w:ind w:left="0"/>
+              <w:cnfStyle w:val="000000100000" w:firstRow="0" w:lastRow="0" w:firstColumn="0" w:lastColumn="0" w:oddVBand="0" w:evenVBand="0" w:oddHBand="1" w:evenHBand="0" w:firstRowFirstColumn="0" w:firstRowLastColumn="0" w:lastRowFirstColumn="0" w:lastRowLastColumn="0"/>
+            </w:pPr>
+            <w:r>
+              <w:t>Must</w:t>
+            </w:r>
+          </w:p>
+        </w:tc>
+        <w:tc>
+          <w:tcPr>
+            <w:tcW w:w="3827" w:type="dxa"/>
+          </w:tcPr>
+          <w:p>
+            <w:pPr>
+              <w:pStyle w:val="ListParagraph"/>
+              <w:ind w:left="0"/>
+              <w:cnfStyle w:val="000000100000" w:firstRow="0" w:lastRow="0" w:firstColumn="0" w:lastColumn="0" w:oddVBand="0" w:evenVBand="0" w:oddHBand="1" w:evenHBand="0" w:firstRowFirstColumn="0" w:firstRowLastColumn="0" w:lastRowFirstColumn="0" w:lastRowLastColumn="0"/>
+            </w:pPr>
+            <w:r>
+              <w:t>P3: offline loans show as items in stock at another brach.</w:t>
+            </w:r>
+          </w:p>
+        </w:tc>
+      </w:tr>
+      <w:tr>
+        <w:tc>
+          <w:tcPr>
+            <w:cnfStyle w:val="001000000000" w:firstRow="0" w:lastRow="0" w:firstColumn="1" w:lastColumn="0" w:oddVBand="0" w:evenVBand="0" w:oddHBand="0" w:evenHBand="0" w:firstRowFirstColumn="0" w:firstRowLastColumn="0" w:lastRowFirstColumn="0" w:lastRowLastColumn="0"/>
+            <w:tcW w:w="846" w:type="dxa"/>
+          </w:tcPr>
+          <w:p>
+            <w:pPr>
+              <w:pStyle w:val="ListParagraph"/>
+              <w:ind w:left="0"/>
+            </w:pPr>
+            <w:r>
+              <w:rPr>
+                <w:b w:val="0"/>
+                <w:bCs w:val="0"/>
+              </w:rPr>
+              <w:t>FR</w:t>
+            </w:r>
+            <w:r>
+              <w:rPr>
+                <w:b w:val="0"/>
+                <w:bCs w:val="0"/>
+              </w:rPr>
+              <w:t>12</w:t>
+            </w:r>
+          </w:p>
+        </w:tc>
+        <w:tc>
+          <w:tcPr>
+            <w:tcW w:w="3827" w:type="dxa"/>
+          </w:tcPr>
+          <w:p>
+            <w:pPr>
+              <w:pStyle w:val="ListParagraph"/>
+              <w:ind w:left="0"/>
+              <w:cnfStyle w:val="000000000000" w:firstRow="0" w:lastRow="0" w:firstColumn="0" w:lastColumn="0" w:oddVBand="0" w:evenVBand="0" w:oddHBand="0" w:evenHBand="0" w:firstRowFirstColumn="0" w:firstRowLastColumn="0" w:lastRowFirstColumn="0" w:lastRowLastColumn="0"/>
+            </w:pPr>
+            <w:r>
+              <w:t>The system shall identify possible duplicate offline loans and returns before they update loan records</w:t>
+            </w:r>
+          </w:p>
+        </w:tc>
+        <w:tc>
+          <w:tcPr>
+            <w:tcW w:w="1276" w:type="dxa"/>
+          </w:tcPr>
+          <w:p>
+            <w:pPr>
+              <w:pStyle w:val="ListParagraph"/>
+              <w:ind w:left="0"/>
+              <w:cnfStyle w:val="000000000000" w:firstRow="0" w:lastRow="0" w:firstColumn="0" w:lastColumn="0" w:oddVBand="0" w:evenVBand="0" w:oddHBand="0" w:evenHBand="0" w:firstRowFirstColumn="0" w:firstRowLastColumn="0" w:lastRowFirstColumn="0" w:lastRowLastColumn="0"/>
+            </w:pPr>
+            <w:r>
+              <w:t xml:space="preserve">Should </w:t>
+            </w:r>
+          </w:p>
+        </w:tc>
+        <w:tc>
+          <w:tcPr>
+            <w:tcW w:w="3827" w:type="dxa"/>
+          </w:tcPr>
+          <w:p>
+            <w:pPr>
+              <w:pStyle w:val="ListParagraph"/>
+              <w:ind w:left="0"/>
+              <w:cnfStyle w:val="000000000000" w:firstRow="0" w:lastRow="0" w:firstColumn="0" w:lastColumn="0" w:oddVBand="0" w:evenVBand="0" w:oddHBand="0" w:evenHBand="0" w:firstRowFirstColumn="0" w:firstRowLastColumn="0" w:lastRowFirstColumn="0" w:lastRowLastColumn="0"/>
+            </w:pPr>
+            <w:r>
+              <w:t>P3: duplicate entries have occured</w:t>
+            </w:r>
+          </w:p>
+        </w:tc>
+      </w:tr>
+      <w:tr>
+        <w:trPr>
+          <w:cnfStyle w:val="000000100000" w:firstRow="0" w:lastRow="0" w:firstColumn="0" w:lastColumn="0" w:oddVBand="0" w:evenVBand="0" w:oddHBand="1" w:evenHBand="0" w:firstRowFirstColumn="0" w:firstRowLastColumn="0" w:lastRowFirstColumn="0" w:lastRowLastColumn="0"/>
+        </w:trPr>
+        <w:tc>
+          <w:tcPr>
+            <w:cnfStyle w:val="001000000000" w:firstRow="0" w:lastRow="0" w:firstColumn="1" w:lastColumn="0" w:oddVBand="0" w:evenVBand="0" w:oddHBand="0" w:evenHBand="0" w:firstRowFirstColumn="0" w:firstRowLastColumn="0" w:lastRowFirstColumn="0" w:lastRowLastColumn="0"/>
+            <w:tcW w:w="846" w:type="dxa"/>
+          </w:tcPr>
+          <w:p>
+            <w:pPr>
+              <w:pStyle w:val="ListParagraph"/>
+              <w:ind w:left="0"/>
+            </w:pPr>
+            <w:r>
+              <w:rPr>
+                <w:b w:val="0"/>
+                <w:bCs w:val="0"/>
+              </w:rPr>
+              <w:lastRenderedPageBreak/>
+              <w:t>FR</w:t>
+            </w:r>
+            <w:r>
+              <w:rPr>
+                <w:b w:val="0"/>
+                <w:bCs w:val="0"/>
+              </w:rPr>
+              <w:t>13</w:t>
+            </w:r>
+          </w:p>
+        </w:tc>
+        <w:tc>
+          <w:tcPr>
+            <w:tcW w:w="3827" w:type="dxa"/>
+          </w:tcPr>
+          <w:p>
+            <w:pPr>
+              <w:pStyle w:val="ListParagraph"/>
+              <w:ind w:left="0"/>
+              <w:cnfStyle w:val="000000100000" w:firstRow="0" w:lastRow="0" w:firstColumn="0" w:lastColumn="0" w:oddVBand="0" w:evenVBand="0" w:oddHBand="1" w:evenHBand="0" w:firstRowFirstColumn="0" w:firstRowLastColumn="0" w:lastRowFirstColumn="0" w:lastRowLastColumn="0"/>
+            </w:pPr>
+            <w:r>
+              <w:t>The system shall record the person who collected the requested material on behalf of a borrower</w:t>
+            </w:r>
+          </w:p>
+        </w:tc>
+        <w:tc>
+          <w:tcPr>
+            <w:tcW w:w="1276" w:type="dxa"/>
+          </w:tcPr>
+          <w:p>
+            <w:pPr>
+              <w:pStyle w:val="ListParagraph"/>
+              <w:ind w:left="0"/>
+              <w:cnfStyle w:val="000000100000" w:firstRow="0" w:lastRow="0" w:firstColumn="0" w:lastColumn="0" w:oddVBand="0" w:evenVBand="0" w:oddHBand="1" w:evenHBand="0" w:firstRowFirstColumn="0" w:firstRowLastColumn="0" w:lastRowFirstColumn="0" w:lastRowLastColumn="0"/>
+            </w:pPr>
+            <w:r>
+              <w:t xml:space="preserve">Should </w:t>
+            </w:r>
+          </w:p>
+        </w:tc>
+        <w:tc>
+          <w:tcPr>
+            <w:tcW w:w="3827" w:type="dxa"/>
+          </w:tcPr>
+          <w:p>
+            <w:pPr>
+              <w:pStyle w:val="ListParagraph"/>
+              <w:ind w:left="0"/>
+              <w:cnfStyle w:val="000000100000" w:firstRow="0" w:lastRow="0" w:firstColumn="0" w:lastColumn="0" w:oddVBand="0" w:evenVBand="0" w:oddHBand="1" w:evenHBand="0" w:firstRowFirstColumn="0" w:firstRowLastColumn="0" w:lastRowFirstColumn="0" w:lastRowLastColumn="0"/>
+            </w:pPr>
+            <w:r>
+              <w:t>P7</w:t>
+            </w:r>
+          </w:p>
+        </w:tc>
+      </w:tr>
+    </w:tbl>
+    <w:p>
+      <w:pPr>
+        <w:pStyle w:val="ListParagraph"/>
+        <w:ind w:left="840"/>
+      </w:pPr>
+    </w:p>
+    <w:p/>
+    <w:p/>
+    <w:p/>
+    <w:p/>
+    <w:p/>
+    <w:p/>
     <w:p/>
     <w:sectPr>
       <w:footerReference w:type="default" r:id="rId8"/>
@@ -4973,10 +7572,10 @@
     </w:lvl>
   </w:abstractNum>
   <w:abstractNum w:abstractNumId="5" w15:restartNumberingAfterBreak="0">
-    <w:nsid w:val="557A7D7F"/>
+    <w:nsid w:val="525A0BBE"/>
     <w:multiLevelType w:val="hybridMultilevel"/>
-    <w:tmpl w:val="91BA2696"/>
-    <w:lvl w:ilvl="0" w:tplc="04090001">
+    <w:tmpl w:val="41BAF154"/>
+    <w:lvl w:ilvl="0" w:tplc="18090001">
       <w:start w:val="1"/>
       <w:numFmt w:val="bullet"/>
       <w:lvlText w:val=""/>
@@ -5086,6 +7685,119 @@
     </w:lvl>
   </w:abstractNum>
   <w:abstractNum w:abstractNumId="6" w15:restartNumberingAfterBreak="0">
+    <w:nsid w:val="557A7D7F"/>
+    <w:multiLevelType w:val="hybridMultilevel"/>
+    <w:tmpl w:val="91BA2696"/>
+    <w:lvl w:ilvl="0" w:tplc="04090001">
+      <w:start w:val="1"/>
+      <w:numFmt w:val="bullet"/>
+      <w:lvlText w:val=""/>
+      <w:lvlJc w:val="left"/>
+      <w:pPr>
+        <w:ind w:left="720" w:hanging="360"/>
+      </w:pPr>
+      <w:rPr>
+        <w:rFonts w:ascii="Symbol" w:hAnsi="Symbol" w:hint="default"/>
+      </w:rPr>
+    </w:lvl>
+    <w:lvl w:ilvl="1" w:tplc="04090003" w:tentative="1">
+      <w:start w:val="1"/>
+      <w:numFmt w:val="bullet"/>
+      <w:lvlText w:val="o"/>
+      <w:lvlJc w:val="left"/>
+      <w:pPr>
+        <w:ind w:left="1440" w:hanging="360"/>
+      </w:pPr>
+      <w:rPr>
+        <w:rFonts w:ascii="Courier New" w:hAnsi="Courier New" w:cs="Courier New" w:hint="default"/>
+      </w:rPr>
+    </w:lvl>
+    <w:lvl w:ilvl="2" w:tplc="04090005" w:tentative="1">
+      <w:start w:val="1"/>
+      <w:numFmt w:val="bullet"/>
+      <w:lvlText w:val=""/>
+      <w:lvlJc w:val="left"/>
+      <w:pPr>
+        <w:ind w:left="2160" w:hanging="360"/>
+      </w:pPr>
+      <w:rPr>
+        <w:rFonts w:ascii="Wingdings" w:hAnsi="Wingdings" w:hint="default"/>
+      </w:rPr>
+    </w:lvl>
+    <w:lvl w:ilvl="3" w:tplc="04090001" w:tentative="1">
+      <w:start w:val="1"/>
+      <w:numFmt w:val="bullet"/>
+      <w:lvlText w:val=""/>
+      <w:lvlJc w:val="left"/>
+      <w:pPr>
+        <w:ind w:left="2880" w:hanging="360"/>
+      </w:pPr>
+      <w:rPr>
+        <w:rFonts w:ascii="Symbol" w:hAnsi="Symbol" w:hint="default"/>
+      </w:rPr>
+    </w:lvl>
+    <w:lvl w:ilvl="4" w:tplc="04090003" w:tentative="1">
+      <w:start w:val="1"/>
+      <w:numFmt w:val="bullet"/>
+      <w:lvlText w:val="o"/>
+      <w:lvlJc w:val="left"/>
+      <w:pPr>
+        <w:ind w:left="3600" w:hanging="360"/>
+      </w:pPr>
+      <w:rPr>
+        <w:rFonts w:ascii="Courier New" w:hAnsi="Courier New" w:cs="Courier New" w:hint="default"/>
+      </w:rPr>
+    </w:lvl>
+    <w:lvl w:ilvl="5" w:tplc="04090005" w:tentative="1">
+      <w:start w:val="1"/>
+      <w:numFmt w:val="bullet"/>
+      <w:lvlText w:val=""/>
+      <w:lvlJc w:val="left"/>
+      <w:pPr>
+        <w:ind w:left="4320" w:hanging="360"/>
+      </w:pPr>
+      <w:rPr>
+        <w:rFonts w:ascii="Wingdings" w:hAnsi="Wingdings" w:hint="default"/>
+      </w:rPr>
+    </w:lvl>
+    <w:lvl w:ilvl="6" w:tplc="04090001" w:tentative="1">
+      <w:start w:val="1"/>
+      <w:numFmt w:val="bullet"/>
+      <w:lvlText w:val=""/>
+      <w:lvlJc w:val="left"/>
+      <w:pPr>
+        <w:ind w:left="5040" w:hanging="360"/>
+      </w:pPr>
+      <w:rPr>
+        <w:rFonts w:ascii="Symbol" w:hAnsi="Symbol" w:hint="default"/>
+      </w:rPr>
+    </w:lvl>
+    <w:lvl w:ilvl="7" w:tplc="04090003" w:tentative="1">
+      <w:start w:val="1"/>
+      <w:numFmt w:val="bullet"/>
+      <w:lvlText w:val="o"/>
+      <w:lvlJc w:val="left"/>
+      <w:pPr>
+        <w:ind w:left="5760" w:hanging="360"/>
+      </w:pPr>
+      <w:rPr>
+        <w:rFonts w:ascii="Courier New" w:hAnsi="Courier New" w:cs="Courier New" w:hint="default"/>
+      </w:rPr>
+    </w:lvl>
+    <w:lvl w:ilvl="8" w:tplc="04090005" w:tentative="1">
+      <w:start w:val="1"/>
+      <w:numFmt w:val="bullet"/>
+      <w:lvlText w:val=""/>
+      <w:lvlJc w:val="left"/>
+      <w:pPr>
+        <w:ind w:left="6480" w:hanging="360"/>
+      </w:pPr>
+      <w:rPr>
+        <w:rFonts w:ascii="Wingdings" w:hAnsi="Wingdings" w:hint="default"/>
+      </w:rPr>
+    </w:lvl>
+  </w:abstractNum>
+  <w:abstractNum w:abstractNumId="7" w15:restartNumberingAfterBreak="0">
     <w:nsid w:val="6B5E4C71"/>
     <w:multiLevelType w:val="hybridMultilevel"/>
     <w:tmpl w:val="9F22508C"/>
@@ -5208,16 +7920,19 @@
     <w:abstractNumId w:val="4"/>
   </w:num>
   <w:num w:numId="4" w16cid:durableId="446122464">
-    <w:abstractNumId w:val="5"/>
+    <w:abstractNumId w:val="6"/>
   </w:num>
   <w:num w:numId="5" w16cid:durableId="1013453338">
     <w:abstractNumId w:val="2"/>
   </w:num>
   <w:num w:numId="6" w16cid:durableId="659313068">
-    <w:abstractNumId w:val="6"/>
+    <w:abstractNumId w:val="7"/>
   </w:num>
   <w:num w:numId="7" w16cid:durableId="587423610">
     <w:abstractNumId w:val="3"/>
+  </w:num>
+  <w:num w:numId="8" w16cid:durableId="948584270">
+    <w:abstractNumId w:val="5"/>
   </w:num>
 </w:numbering>
 </file>

</xml_diff>

<commit_message>
A bit more done since the last commit, i used AI to touch up on any mistakes in grammer or simple error mistakes. continuing to work on part 8. Gherkin files have been added to the feature folder also but will be able to preview in the report as i took screenshots of the code.
</commit_message>
<xml_diff>
--- a/report/ca1-report.docx
+++ b/report/ca1-report.docx
@@ -948,7 +948,7 @@
           <w:r>
             <w:fldChar w:fldCharType="separate"/>
           </w:r>
-          <w:hyperlink w:anchor="_Toc243227323" w:history="1">
+          <w:hyperlink w:anchor="_Toc243295393" w:history="1">
             <w:r>
               <w:rPr>
                 <w:rStyle w:val="Hyperlink"/>
@@ -994,7 +994,7 @@
                 <w:noProof/>
                 <w:webHidden/>
               </w:rPr>
-              <w:instrText xml:space="preserve"> PAGEREF _Toc243227323 \h </w:instrText>
+              <w:instrText xml:space="preserve"> PAGEREF _Toc243295393 \h </w:instrText>
             </w:r>
             <w:r>
               <w:rPr>
@@ -1014,7 +1014,7 @@
                 <w:noProof/>
                 <w:webHidden/>
               </w:rPr>
-              <w:t>2</w:t>
+              <w:t>3</w:t>
             </w:r>
             <w:r>
               <w:rPr>
@@ -1042,7 +1042,7 @@
               <w14:ligatures w14:val="standardContextual"/>
             </w:rPr>
           </w:pPr>
-          <w:hyperlink w:anchor="_Toc243227324" w:history="1">
+          <w:hyperlink w:anchor="_Toc243295394" w:history="1">
             <w:r>
               <w:rPr>
                 <w:rStyle w:val="Hyperlink"/>
@@ -1088,7 +1088,7 @@
                 <w:noProof/>
                 <w:webHidden/>
               </w:rPr>
-              <w:instrText xml:space="preserve"> PAGEREF _Toc243227324 \h </w:instrText>
+              <w:instrText xml:space="preserve"> PAGEREF _Toc243295394 \h </w:instrText>
             </w:r>
             <w:r>
               <w:rPr>
@@ -1108,7 +1108,7 @@
                 <w:noProof/>
                 <w:webHidden/>
               </w:rPr>
-              <w:t>2</w:t>
+              <w:t>3</w:t>
             </w:r>
             <w:r>
               <w:rPr>
@@ -1136,7 +1136,7 @@
               <w14:ligatures w14:val="standardContextual"/>
             </w:rPr>
           </w:pPr>
-          <w:hyperlink w:anchor="_Toc243227325" w:history="1">
+          <w:hyperlink w:anchor="_Toc243295395" w:history="1">
             <w:r>
               <w:rPr>
                 <w:rStyle w:val="Hyperlink"/>
@@ -1182,7 +1182,7 @@
                 <w:noProof/>
                 <w:webHidden/>
               </w:rPr>
-              <w:instrText xml:space="preserve"> PAGEREF _Toc243227325 \h </w:instrText>
+              <w:instrText xml:space="preserve"> PAGEREF _Toc243295395 \h </w:instrText>
             </w:r>
             <w:r>
               <w:rPr>
@@ -1202,7 +1202,7 @@
                 <w:noProof/>
                 <w:webHidden/>
               </w:rPr>
-              <w:t>3</w:t>
+              <w:t>4</w:t>
             </w:r>
             <w:r>
               <w:rPr>
@@ -1230,7 +1230,7 @@
               <w14:ligatures w14:val="standardContextual"/>
             </w:rPr>
           </w:pPr>
-          <w:hyperlink w:anchor="_Toc243227326" w:history="1">
+          <w:hyperlink w:anchor="_Toc243295396" w:history="1">
             <w:r>
               <w:rPr>
                 <w:rStyle w:val="Hyperlink"/>
@@ -1276,7 +1276,7 @@
                 <w:noProof/>
                 <w:webHidden/>
               </w:rPr>
-              <w:instrText xml:space="preserve"> PAGEREF _Toc243227326 \h </w:instrText>
+              <w:instrText xml:space="preserve"> PAGEREF _Toc243295396 \h </w:instrText>
             </w:r>
             <w:r>
               <w:rPr>
@@ -1296,7 +1296,7 @@
                 <w:noProof/>
                 <w:webHidden/>
               </w:rPr>
-              <w:t>4</w:t>
+              <w:t>5</w:t>
             </w:r>
             <w:r>
               <w:rPr>
@@ -1324,7 +1324,7 @@
               <w14:ligatures w14:val="standardContextual"/>
             </w:rPr>
           </w:pPr>
-          <w:hyperlink w:anchor="_Toc243227327" w:history="1">
+          <w:hyperlink w:anchor="_Toc243295397" w:history="1">
             <w:r>
               <w:rPr>
                 <w:rStyle w:val="Hyperlink"/>
@@ -1370,7 +1370,7 @@
                 <w:noProof/>
                 <w:webHidden/>
               </w:rPr>
-              <w:instrText xml:space="preserve"> PAGEREF _Toc243227327 \h </w:instrText>
+              <w:instrText xml:space="preserve"> PAGEREF _Toc243295397 \h </w:instrText>
             </w:r>
             <w:r>
               <w:rPr>
@@ -1390,7 +1390,7 @@
                 <w:noProof/>
                 <w:webHidden/>
               </w:rPr>
-              <w:t>4</w:t>
+              <w:t>5</w:t>
             </w:r>
             <w:r>
               <w:rPr>
@@ -1418,7 +1418,7 @@
               <w14:ligatures w14:val="standardContextual"/>
             </w:rPr>
           </w:pPr>
-          <w:hyperlink w:anchor="_Toc243227328" w:history="1">
+          <w:hyperlink w:anchor="_Toc243295398" w:history="1">
             <w:r>
               <w:rPr>
                 <w:rStyle w:val="Hyperlink"/>
@@ -1464,7 +1464,7 @@
                 <w:noProof/>
                 <w:webHidden/>
               </w:rPr>
-              <w:instrText xml:space="preserve"> PAGEREF _Toc243227328 \h </w:instrText>
+              <w:instrText xml:space="preserve"> PAGEREF _Toc243295398 \h </w:instrText>
             </w:r>
             <w:r>
               <w:rPr>
@@ -1484,7 +1484,7 @@
                 <w:noProof/>
                 <w:webHidden/>
               </w:rPr>
-              <w:t>5</w:t>
+              <w:t>6</w:t>
             </w:r>
             <w:r>
               <w:rPr>
@@ -1511,7 +1511,7 @@
               <w14:ligatures w14:val="standardContextual"/>
             </w:rPr>
           </w:pPr>
-          <w:hyperlink w:anchor="_Toc243227329" w:history="1">
+          <w:hyperlink w:anchor="_Toc243295399" w:history="1">
             <w:r>
               <w:rPr>
                 <w:rStyle w:val="Hyperlink"/>
@@ -1538,7 +1538,7 @@
                 <w:noProof/>
                 <w:webHidden/>
               </w:rPr>
-              <w:instrText xml:space="preserve"> PAGEREF _Toc243227329 \h </w:instrText>
+              <w:instrText xml:space="preserve"> PAGEREF _Toc243295399 \h </w:instrText>
             </w:r>
             <w:r>
               <w:rPr>
@@ -1558,7 +1558,7 @@
                 <w:noProof/>
                 <w:webHidden/>
               </w:rPr>
-              <w:t>5</w:t>
+              <w:t>6</w:t>
             </w:r>
             <w:r>
               <w:rPr>
@@ -1585,7 +1585,7 @@
               <w14:ligatures w14:val="standardContextual"/>
             </w:rPr>
           </w:pPr>
-          <w:hyperlink w:anchor="_Toc243227330" w:history="1">
+          <w:hyperlink w:anchor="_Toc243295400" w:history="1">
             <w:r>
               <w:rPr>
                 <w:rStyle w:val="Hyperlink"/>
@@ -1612,7 +1612,7 @@
                 <w:noProof/>
                 <w:webHidden/>
               </w:rPr>
-              <w:instrText xml:space="preserve"> PAGEREF _Toc243227330 \h </w:instrText>
+              <w:instrText xml:space="preserve"> PAGEREF _Toc243295400 \h </w:instrText>
             </w:r>
             <w:r>
               <w:rPr>
@@ -1632,7 +1632,7 @@
                 <w:noProof/>
                 <w:webHidden/>
               </w:rPr>
-              <w:t>6</w:t>
+              <w:t>7</w:t>
             </w:r>
             <w:r>
               <w:rPr>
@@ -1660,7 +1660,7 @@
               <w14:ligatures w14:val="standardContextual"/>
             </w:rPr>
           </w:pPr>
-          <w:hyperlink w:anchor="_Toc243227331" w:history="1">
+          <w:hyperlink w:anchor="_Toc243295401" w:history="1">
             <w:r>
               <w:rPr>
                 <w:rStyle w:val="Hyperlink"/>
@@ -1706,7 +1706,7 @@
                 <w:noProof/>
                 <w:webHidden/>
               </w:rPr>
-              <w:instrText xml:space="preserve"> PAGEREF _Toc243227331 \h </w:instrText>
+              <w:instrText xml:space="preserve"> PAGEREF _Toc243295401 \h </w:instrText>
             </w:r>
             <w:r>
               <w:rPr>
@@ -1726,7 +1726,7 @@
                 <w:noProof/>
                 <w:webHidden/>
               </w:rPr>
-              <w:t>6</w:t>
+              <w:t>7</w:t>
             </w:r>
             <w:r>
               <w:rPr>
@@ -1754,7 +1754,7 @@
               <w14:ligatures w14:val="standardContextual"/>
             </w:rPr>
           </w:pPr>
-          <w:hyperlink w:anchor="_Toc243227332" w:history="1">
+          <w:hyperlink w:anchor="_Toc243295402" w:history="1">
             <w:r>
               <w:rPr>
                 <w:rStyle w:val="Hyperlink"/>
@@ -1800,7 +1800,7 @@
                 <w:noProof/>
                 <w:webHidden/>
               </w:rPr>
-              <w:instrText xml:space="preserve"> PAGEREF _Toc243227332 \h </w:instrText>
+              <w:instrText xml:space="preserve"> PAGEREF _Toc243295402 \h </w:instrText>
             </w:r>
             <w:r>
               <w:rPr>
@@ -1820,7 +1820,7 @@
                 <w:noProof/>
                 <w:webHidden/>
               </w:rPr>
-              <w:t>7</w:t>
+              <w:t>8</w:t>
             </w:r>
             <w:r>
               <w:rPr>
@@ -1848,7 +1848,7 @@
               <w14:ligatures w14:val="standardContextual"/>
             </w:rPr>
           </w:pPr>
-          <w:hyperlink w:anchor="_Toc243227333" w:history="1">
+          <w:hyperlink w:anchor="_Toc243295403" w:history="1">
             <w:r>
               <w:rPr>
                 <w:rStyle w:val="Hyperlink"/>
@@ -1894,7 +1894,7 @@
                 <w:noProof/>
                 <w:webHidden/>
               </w:rPr>
-              <w:instrText xml:space="preserve"> PAGEREF _Toc243227333 \h </w:instrText>
+              <w:instrText xml:space="preserve"> PAGEREF _Toc243295403 \h </w:instrText>
             </w:r>
             <w:r>
               <w:rPr>
@@ -1914,7 +1914,7 @@
                 <w:noProof/>
                 <w:webHidden/>
               </w:rPr>
-              <w:t>7</w:t>
+              <w:t>8</w:t>
             </w:r>
             <w:r>
               <w:rPr>
@@ -1941,7 +1941,7 @@
               <w14:ligatures w14:val="standardContextual"/>
             </w:rPr>
           </w:pPr>
-          <w:hyperlink w:anchor="_Toc243227334" w:history="1">
+          <w:hyperlink w:anchor="_Toc243295404" w:history="1">
             <w:r>
               <w:rPr>
                 <w:rStyle w:val="Hyperlink"/>
@@ -1968,7 +1968,7 @@
                 <w:noProof/>
                 <w:webHidden/>
               </w:rPr>
-              <w:instrText xml:space="preserve"> PAGEREF _Toc243227334 \h </w:instrText>
+              <w:instrText xml:space="preserve"> PAGEREF _Toc243295404 \h </w:instrText>
             </w:r>
             <w:r>
               <w:rPr>
@@ -1988,7 +1988,7 @@
                 <w:noProof/>
                 <w:webHidden/>
               </w:rPr>
-              <w:t>8</w:t>
+              <w:t>9</w:t>
             </w:r>
             <w:r>
               <w:rPr>
@@ -2015,7 +2015,7 @@
               <w14:ligatures w14:val="standardContextual"/>
             </w:rPr>
           </w:pPr>
-          <w:hyperlink w:anchor="_Toc243227335" w:history="1">
+          <w:hyperlink w:anchor="_Toc243295405" w:history="1">
             <w:r>
               <w:rPr>
                 <w:rStyle w:val="Hyperlink"/>
@@ -2042,7 +2042,7 @@
                 <w:noProof/>
                 <w:webHidden/>
               </w:rPr>
-              <w:instrText xml:space="preserve"> PAGEREF _Toc243227335 \h </w:instrText>
+              <w:instrText xml:space="preserve"> PAGEREF _Toc243295405 \h </w:instrText>
             </w:r>
             <w:r>
               <w:rPr>
@@ -2062,7 +2062,7 @@
                 <w:noProof/>
                 <w:webHidden/>
               </w:rPr>
-              <w:t>9</w:t>
+              <w:t>10</w:t>
             </w:r>
             <w:r>
               <w:rPr>
@@ -2090,7 +2090,7 @@
               <w14:ligatures w14:val="standardContextual"/>
             </w:rPr>
           </w:pPr>
-          <w:hyperlink w:anchor="_Toc243227336" w:history="1">
+          <w:hyperlink w:anchor="_Toc243295406" w:history="1">
             <w:r>
               <w:rPr>
                 <w:rStyle w:val="Hyperlink"/>
@@ -2136,7 +2136,7 @@
                 <w:noProof/>
                 <w:webHidden/>
               </w:rPr>
-              <w:instrText xml:space="preserve"> PAGEREF _Toc243227336 \h </w:instrText>
+              <w:instrText xml:space="preserve"> PAGEREF _Toc243295406 \h </w:instrText>
             </w:r>
             <w:r>
               <w:rPr>
@@ -2156,7 +2156,7 @@
                 <w:noProof/>
                 <w:webHidden/>
               </w:rPr>
-              <w:t>9</w:t>
+              <w:t>10</w:t>
             </w:r>
             <w:r>
               <w:rPr>
@@ -2184,7 +2184,7 @@
               <w14:ligatures w14:val="standardContextual"/>
             </w:rPr>
           </w:pPr>
-          <w:hyperlink w:anchor="_Toc243227337" w:history="1">
+          <w:hyperlink w:anchor="_Toc243295407" w:history="1">
             <w:r>
               <w:rPr>
                 <w:rStyle w:val="Hyperlink"/>
@@ -2230,7 +2230,7 @@
                 <w:noProof/>
                 <w:webHidden/>
               </w:rPr>
-              <w:instrText xml:space="preserve"> PAGEREF _Toc243227337 \h </w:instrText>
+              <w:instrText xml:space="preserve"> PAGEREF _Toc243295407 \h </w:instrText>
             </w:r>
             <w:r>
               <w:rPr>
@@ -2250,7 +2250,7 @@
                 <w:noProof/>
                 <w:webHidden/>
               </w:rPr>
-              <w:t>10</w:t>
+              <w:t>11</w:t>
             </w:r>
             <w:r>
               <w:rPr>
@@ -2278,7 +2278,7 @@
               <w14:ligatures w14:val="standardContextual"/>
             </w:rPr>
           </w:pPr>
-          <w:hyperlink w:anchor="_Toc243227338" w:history="1">
+          <w:hyperlink w:anchor="_Toc243295408" w:history="1">
             <w:r>
               <w:rPr>
                 <w:rStyle w:val="Hyperlink"/>
@@ -2324,7 +2324,7 @@
                 <w:noProof/>
                 <w:webHidden/>
               </w:rPr>
-              <w:instrText xml:space="preserve"> PAGEREF _Toc243227338 \h </w:instrText>
+              <w:instrText xml:space="preserve"> PAGEREF _Toc243295408 \h </w:instrText>
             </w:r>
             <w:r>
               <w:rPr>
@@ -2344,7 +2344,7 @@
                 <w:noProof/>
                 <w:webHidden/>
               </w:rPr>
-              <w:t>11</w:t>
+              <w:t>12</w:t>
             </w:r>
             <w:r>
               <w:rPr>
@@ -2372,7 +2372,7 @@
               <w14:ligatures w14:val="standardContextual"/>
             </w:rPr>
           </w:pPr>
-          <w:hyperlink w:anchor="_Toc243227339" w:history="1">
+          <w:hyperlink w:anchor="_Toc243295409" w:history="1">
             <w:r>
               <w:rPr>
                 <w:rStyle w:val="Hyperlink"/>
@@ -2418,7 +2418,7 @@
                 <w:noProof/>
                 <w:webHidden/>
               </w:rPr>
-              <w:instrText xml:space="preserve"> PAGEREF _Toc243227339 \h </w:instrText>
+              <w:instrText xml:space="preserve"> PAGEREF _Toc243295409 \h </w:instrText>
             </w:r>
             <w:r>
               <w:rPr>
@@ -2438,7 +2438,7 @@
                 <w:noProof/>
                 <w:webHidden/>
               </w:rPr>
-              <w:t>11</w:t>
+              <w:t>12</w:t>
             </w:r>
             <w:r>
               <w:rPr>
@@ -2466,7 +2466,7 @@
               <w14:ligatures w14:val="standardContextual"/>
             </w:rPr>
           </w:pPr>
-          <w:hyperlink w:anchor="_Toc243227340" w:history="1">
+          <w:hyperlink w:anchor="_Toc243295410" w:history="1">
             <w:r>
               <w:rPr>
                 <w:rStyle w:val="Hyperlink"/>
@@ -2512,7 +2512,7 @@
                 <w:noProof/>
                 <w:webHidden/>
               </w:rPr>
-              <w:instrText xml:space="preserve"> PAGEREF _Toc243227340 \h </w:instrText>
+              <w:instrText xml:space="preserve"> PAGEREF _Toc243295410 \h </w:instrText>
             </w:r>
             <w:r>
               <w:rPr>
@@ -2532,7 +2532,7 @@
                 <w:noProof/>
                 <w:webHidden/>
               </w:rPr>
-              <w:t>12</w:t>
+              <w:t>13</w:t>
             </w:r>
             <w:r>
               <w:rPr>
@@ -2560,7 +2560,7 @@
               <w14:ligatures w14:val="standardContextual"/>
             </w:rPr>
           </w:pPr>
-          <w:hyperlink w:anchor="_Toc243227341" w:history="1">
+          <w:hyperlink w:anchor="_Toc243295411" w:history="1">
             <w:r>
               <w:rPr>
                 <w:rStyle w:val="Hyperlink"/>
@@ -2606,7 +2606,7 @@
                 <w:noProof/>
                 <w:webHidden/>
               </w:rPr>
-              <w:instrText xml:space="preserve"> PAGEREF _Toc243227341 \h </w:instrText>
+              <w:instrText xml:space="preserve"> PAGEREF _Toc243295411 \h </w:instrText>
             </w:r>
             <w:r>
               <w:rPr>
@@ -2626,7 +2626,7 @@
                 <w:noProof/>
                 <w:webHidden/>
               </w:rPr>
-              <w:t>13</w:t>
+              <w:t>14</w:t>
             </w:r>
             <w:r>
               <w:rPr>
@@ -2653,7 +2653,7 @@
               <w14:ligatures w14:val="standardContextual"/>
             </w:rPr>
           </w:pPr>
-          <w:hyperlink w:anchor="_Toc243227342" w:history="1">
+          <w:hyperlink w:anchor="_Toc243295412" w:history="1">
             <w:r>
               <w:rPr>
                 <w:rStyle w:val="Hyperlink"/>
@@ -2680,7 +2680,7 @@
                 <w:noProof/>
                 <w:webHidden/>
               </w:rPr>
-              <w:instrText xml:space="preserve"> PAGEREF _Toc243227342 \h </w:instrText>
+              <w:instrText xml:space="preserve"> PAGEREF _Toc243295412 \h </w:instrText>
             </w:r>
             <w:r>
               <w:rPr>
@@ -2700,7 +2700,7 @@
                 <w:noProof/>
                 <w:webHidden/>
               </w:rPr>
-              <w:t>13</w:t>
+              <w:t>14</w:t>
             </w:r>
             <w:r>
               <w:rPr>
@@ -2727,7 +2727,7 @@
               <w14:ligatures w14:val="standardContextual"/>
             </w:rPr>
           </w:pPr>
-          <w:hyperlink w:anchor="_Toc243227343" w:history="1">
+          <w:hyperlink w:anchor="_Toc243295413" w:history="1">
             <w:r>
               <w:rPr>
                 <w:rStyle w:val="Hyperlink"/>
@@ -2754,7 +2754,7 @@
                 <w:noProof/>
                 <w:webHidden/>
               </w:rPr>
-              <w:instrText xml:space="preserve"> PAGEREF _Toc243227343 \h </w:instrText>
+              <w:instrText xml:space="preserve"> PAGEREF _Toc243295413 \h </w:instrText>
             </w:r>
             <w:r>
               <w:rPr>
@@ -2774,7 +2774,7 @@
                 <w:noProof/>
                 <w:webHidden/>
               </w:rPr>
-              <w:t>14</w:t>
+              <w:t>15</w:t>
             </w:r>
             <w:r>
               <w:rPr>
@@ -2802,7 +2802,7 @@
               <w14:ligatures w14:val="standardContextual"/>
             </w:rPr>
           </w:pPr>
-          <w:hyperlink w:anchor="_Toc243227344" w:history="1">
+          <w:hyperlink w:anchor="_Toc243295414" w:history="1">
             <w:r>
               <w:rPr>
                 <w:rStyle w:val="Hyperlink"/>
@@ -2848,7 +2848,7 @@
                 <w:noProof/>
                 <w:webHidden/>
               </w:rPr>
-              <w:instrText xml:space="preserve"> PAGEREF _Toc243227344 \h </w:instrText>
+              <w:instrText xml:space="preserve"> PAGEREF _Toc243295414 \h </w:instrText>
             </w:r>
             <w:r>
               <w:rPr>
@@ -2868,7 +2868,7 @@
                 <w:noProof/>
                 <w:webHidden/>
               </w:rPr>
-              <w:t>15</w:t>
+              <w:t>16</w:t>
             </w:r>
             <w:r>
               <w:rPr>
@@ -2896,7 +2896,7 @@
               <w14:ligatures w14:val="standardContextual"/>
             </w:rPr>
           </w:pPr>
-          <w:hyperlink w:anchor="_Toc243227345" w:history="1">
+          <w:hyperlink w:anchor="_Toc243295415" w:history="1">
             <w:r>
               <w:rPr>
                 <w:rStyle w:val="Hyperlink"/>
@@ -2942,7 +2942,7 @@
                 <w:noProof/>
                 <w:webHidden/>
               </w:rPr>
-              <w:instrText xml:space="preserve"> PAGEREF _Toc243227345 \h </w:instrText>
+              <w:instrText xml:space="preserve"> PAGEREF _Toc243295415 \h </w:instrText>
             </w:r>
             <w:r>
               <w:rPr>
@@ -2962,7 +2962,7 @@
                 <w:noProof/>
                 <w:webHidden/>
               </w:rPr>
-              <w:t>15</w:t>
+              <w:t>16</w:t>
             </w:r>
             <w:r>
               <w:rPr>
@@ -2990,7 +2990,7 @@
               <w14:ligatures w14:val="standardContextual"/>
             </w:rPr>
           </w:pPr>
-          <w:hyperlink w:anchor="_Toc243227346" w:history="1">
+          <w:hyperlink w:anchor="_Toc243295416" w:history="1">
             <w:r>
               <w:rPr>
                 <w:rStyle w:val="Hyperlink"/>
@@ -3036,7 +3036,7 @@
                 <w:noProof/>
                 <w:webHidden/>
               </w:rPr>
-              <w:instrText xml:space="preserve"> PAGEREF _Toc243227346 \h </w:instrText>
+              <w:instrText xml:space="preserve"> PAGEREF _Toc243295416 \h </w:instrText>
             </w:r>
             <w:r>
               <w:rPr>
@@ -3056,7 +3056,7 @@
                 <w:noProof/>
                 <w:webHidden/>
               </w:rPr>
-              <w:t>16</w:t>
+              <w:t>17</w:t>
             </w:r>
             <w:r>
               <w:rPr>
@@ -3084,7 +3084,7 @@
               <w14:ligatures w14:val="standardContextual"/>
             </w:rPr>
           </w:pPr>
-          <w:hyperlink w:anchor="_Toc243227347" w:history="1">
+          <w:hyperlink w:anchor="_Toc243295417" w:history="1">
             <w:r>
               <w:rPr>
                 <w:rStyle w:val="Hyperlink"/>
@@ -3130,7 +3130,7 @@
                 <w:noProof/>
                 <w:webHidden/>
               </w:rPr>
-              <w:instrText xml:space="preserve"> PAGEREF _Toc243227347 \h </w:instrText>
+              <w:instrText xml:space="preserve"> PAGEREF _Toc243295417 \h </w:instrText>
             </w:r>
             <w:r>
               <w:rPr>
@@ -3150,7 +3150,665 @@
                 <w:noProof/>
                 <w:webHidden/>
               </w:rPr>
-              <w:t>17</w:t>
+              <w:t>18</w:t>
+            </w:r>
+            <w:r>
+              <w:rPr>
+                <w:noProof/>
+                <w:webHidden/>
+              </w:rPr>
+              <w:fldChar w:fldCharType="end"/>
+            </w:r>
+          </w:hyperlink>
+        </w:p>
+        <w:p>
+          <w:pPr>
+            <w:pStyle w:val="TOC1"/>
+            <w:tabs>
+              <w:tab w:val="left" w:pos="440"/>
+              <w:tab w:val="right" w:leader="dot" w:pos="9016"/>
+            </w:tabs>
+            <w:rPr>
+              <w:rFonts w:cstheme="minorBidi"/>
+              <w:noProof/>
+              <w:kern w:val="2"/>
+              <w:sz w:val="24"/>
+              <w:szCs w:val="24"/>
+              <w:lang w:val="en-US"/>
+              <w14:ligatures w14:val="standardContextual"/>
+            </w:rPr>
+          </w:pPr>
+          <w:hyperlink w:anchor="_Toc243295418" w:history="1">
+            <w:r>
+              <w:rPr>
+                <w:rStyle w:val="Hyperlink"/>
+                <w:noProof/>
+              </w:rPr>
+              <w:t>7.</w:t>
+            </w:r>
+            <w:r>
+              <w:rPr>
+                <w:rFonts w:cstheme="minorBidi"/>
+                <w:noProof/>
+                <w:kern w:val="2"/>
+                <w:sz w:val="24"/>
+                <w:szCs w:val="24"/>
+                <w:lang w:val="en-US"/>
+                <w14:ligatures w14:val="standardContextual"/>
+              </w:rPr>
+              <w:tab/>
+            </w:r>
+            <w:r>
+              <w:rPr>
+                <w:rStyle w:val="Hyperlink"/>
+                <w:noProof/>
+              </w:rPr>
+              <w:t>Behavioural examples (Gherkin)</w:t>
+            </w:r>
+            <w:r>
+              <w:rPr>
+                <w:noProof/>
+                <w:webHidden/>
+              </w:rPr>
+              <w:tab/>
+            </w:r>
+            <w:r>
+              <w:rPr>
+                <w:noProof/>
+                <w:webHidden/>
+              </w:rPr>
+              <w:fldChar w:fldCharType="begin"/>
+            </w:r>
+            <w:r>
+              <w:rPr>
+                <w:noProof/>
+                <w:webHidden/>
+              </w:rPr>
+              <w:instrText xml:space="preserve"> PAGEREF _Toc243295418 \h </w:instrText>
+            </w:r>
+            <w:r>
+              <w:rPr>
+                <w:noProof/>
+                <w:webHidden/>
+              </w:rPr>
+            </w:r>
+            <w:r>
+              <w:rPr>
+                <w:noProof/>
+                <w:webHidden/>
+              </w:rPr>
+              <w:fldChar w:fldCharType="separate"/>
+            </w:r>
+            <w:r>
+              <w:rPr>
+                <w:noProof/>
+                <w:webHidden/>
+              </w:rPr>
+              <w:t>19</w:t>
+            </w:r>
+            <w:r>
+              <w:rPr>
+                <w:noProof/>
+                <w:webHidden/>
+              </w:rPr>
+              <w:fldChar w:fldCharType="end"/>
+            </w:r>
+          </w:hyperlink>
+        </w:p>
+        <w:p>
+          <w:pPr>
+            <w:pStyle w:val="TOC2"/>
+            <w:tabs>
+              <w:tab w:val="left" w:pos="960"/>
+              <w:tab w:val="right" w:leader="dot" w:pos="9016"/>
+            </w:tabs>
+            <w:rPr>
+              <w:rFonts w:cstheme="minorBidi"/>
+              <w:noProof/>
+              <w:kern w:val="2"/>
+              <w:sz w:val="24"/>
+              <w:szCs w:val="24"/>
+              <w:lang w:val="en-US"/>
+              <w14:ligatures w14:val="standardContextual"/>
+            </w:rPr>
+          </w:pPr>
+          <w:hyperlink w:anchor="_Toc243295419" w:history="1">
+            <w:r>
+              <w:rPr>
+                <w:rStyle w:val="Hyperlink"/>
+                <w:noProof/>
+              </w:rPr>
+              <w:t>7.1</w:t>
+            </w:r>
+            <w:r>
+              <w:rPr>
+                <w:rFonts w:cstheme="minorBidi"/>
+                <w:noProof/>
+                <w:kern w:val="2"/>
+                <w:sz w:val="24"/>
+                <w:szCs w:val="24"/>
+                <w:lang w:val="en-US"/>
+                <w14:ligatures w14:val="standardContextual"/>
+              </w:rPr>
+              <w:tab/>
+            </w:r>
+            <w:r>
+              <w:rPr>
+                <w:rStyle w:val="Hyperlink"/>
+                <w:noProof/>
+              </w:rPr>
+              <w:t>From paths and rules to focused examples</w:t>
+            </w:r>
+            <w:r>
+              <w:rPr>
+                <w:noProof/>
+                <w:webHidden/>
+              </w:rPr>
+              <w:tab/>
+            </w:r>
+            <w:r>
+              <w:rPr>
+                <w:noProof/>
+                <w:webHidden/>
+              </w:rPr>
+              <w:fldChar w:fldCharType="begin"/>
+            </w:r>
+            <w:r>
+              <w:rPr>
+                <w:noProof/>
+                <w:webHidden/>
+              </w:rPr>
+              <w:instrText xml:space="preserve"> PAGEREF _Toc243295419 \h </w:instrText>
+            </w:r>
+            <w:r>
+              <w:rPr>
+                <w:noProof/>
+                <w:webHidden/>
+              </w:rPr>
+            </w:r>
+            <w:r>
+              <w:rPr>
+                <w:noProof/>
+                <w:webHidden/>
+              </w:rPr>
+              <w:fldChar w:fldCharType="separate"/>
+            </w:r>
+            <w:r>
+              <w:rPr>
+                <w:noProof/>
+                <w:webHidden/>
+              </w:rPr>
+              <w:t>19</w:t>
+            </w:r>
+            <w:r>
+              <w:rPr>
+                <w:noProof/>
+                <w:webHidden/>
+              </w:rPr>
+              <w:fldChar w:fldCharType="end"/>
+            </w:r>
+          </w:hyperlink>
+        </w:p>
+        <w:p>
+          <w:pPr>
+            <w:pStyle w:val="TOC2"/>
+            <w:tabs>
+              <w:tab w:val="left" w:pos="960"/>
+              <w:tab w:val="right" w:leader="dot" w:pos="9016"/>
+            </w:tabs>
+            <w:rPr>
+              <w:rFonts w:cstheme="minorBidi"/>
+              <w:noProof/>
+              <w:kern w:val="2"/>
+              <w:sz w:val="24"/>
+              <w:szCs w:val="24"/>
+              <w:lang w:val="en-US"/>
+              <w14:ligatures w14:val="standardContextual"/>
+            </w:rPr>
+          </w:pPr>
+          <w:hyperlink w:anchor="_Toc243295420" w:history="1">
+            <w:r>
+              <w:rPr>
+                <w:rStyle w:val="Hyperlink"/>
+                <w:noProof/>
+              </w:rPr>
+              <w:t>7.2</w:t>
+            </w:r>
+            <w:r>
+              <w:rPr>
+                <w:rFonts w:cstheme="minorBidi"/>
+                <w:noProof/>
+                <w:kern w:val="2"/>
+                <w:sz w:val="24"/>
+                <w:szCs w:val="24"/>
+                <w:lang w:val="en-US"/>
+                <w14:ligatures w14:val="standardContextual"/>
+              </w:rPr>
+              <w:tab/>
+            </w:r>
+            <w:r>
+              <w:rPr>
+                <w:rStyle w:val="Hyperlink"/>
+                <w:noProof/>
+              </w:rPr>
+              <w:t>Gherkin Examples</w:t>
+            </w:r>
+            <w:r>
+              <w:rPr>
+                <w:noProof/>
+                <w:webHidden/>
+              </w:rPr>
+              <w:tab/>
+            </w:r>
+            <w:r>
+              <w:rPr>
+                <w:noProof/>
+                <w:webHidden/>
+              </w:rPr>
+              <w:fldChar w:fldCharType="begin"/>
+            </w:r>
+            <w:r>
+              <w:rPr>
+                <w:noProof/>
+                <w:webHidden/>
+              </w:rPr>
+              <w:instrText xml:space="preserve"> PAGEREF _Toc243295420 \h </w:instrText>
+            </w:r>
+            <w:r>
+              <w:rPr>
+                <w:noProof/>
+                <w:webHidden/>
+              </w:rPr>
+            </w:r>
+            <w:r>
+              <w:rPr>
+                <w:noProof/>
+                <w:webHidden/>
+              </w:rPr>
+              <w:fldChar w:fldCharType="separate"/>
+            </w:r>
+            <w:r>
+              <w:rPr>
+                <w:noProof/>
+                <w:webHidden/>
+              </w:rPr>
+              <w:t>19</w:t>
+            </w:r>
+            <w:r>
+              <w:rPr>
+                <w:noProof/>
+                <w:webHidden/>
+              </w:rPr>
+              <w:fldChar w:fldCharType="end"/>
+            </w:r>
+          </w:hyperlink>
+        </w:p>
+        <w:p>
+          <w:pPr>
+            <w:pStyle w:val="TOC1"/>
+            <w:tabs>
+              <w:tab w:val="left" w:pos="440"/>
+              <w:tab w:val="right" w:leader="dot" w:pos="9016"/>
+            </w:tabs>
+            <w:rPr>
+              <w:rFonts w:cstheme="minorBidi"/>
+              <w:noProof/>
+              <w:kern w:val="2"/>
+              <w:sz w:val="24"/>
+              <w:szCs w:val="24"/>
+              <w:lang w:val="en-US"/>
+              <w14:ligatures w14:val="standardContextual"/>
+            </w:rPr>
+          </w:pPr>
+          <w:hyperlink w:anchor="_Toc243295421" w:history="1">
+            <w:r>
+              <w:rPr>
+                <w:rStyle w:val="Hyperlink"/>
+                <w:noProof/>
+              </w:rPr>
+              <w:t>8.</w:t>
+            </w:r>
+            <w:r>
+              <w:rPr>
+                <w:rFonts w:cstheme="minorBidi"/>
+                <w:noProof/>
+                <w:kern w:val="2"/>
+                <w:sz w:val="24"/>
+                <w:szCs w:val="24"/>
+                <w:lang w:val="en-US"/>
+                <w14:ligatures w14:val="standardContextual"/>
+              </w:rPr>
+              <w:tab/>
+            </w:r>
+            <w:r>
+              <w:rPr>
+                <w:rStyle w:val="Hyperlink"/>
+                <w:noProof/>
+              </w:rPr>
+              <w:t>User stories and acceptance criteria</w:t>
+            </w:r>
+            <w:r>
+              <w:rPr>
+                <w:noProof/>
+                <w:webHidden/>
+              </w:rPr>
+              <w:tab/>
+            </w:r>
+            <w:r>
+              <w:rPr>
+                <w:noProof/>
+                <w:webHidden/>
+              </w:rPr>
+              <w:fldChar w:fldCharType="begin"/>
+            </w:r>
+            <w:r>
+              <w:rPr>
+                <w:noProof/>
+                <w:webHidden/>
+              </w:rPr>
+              <w:instrText xml:space="preserve"> PAGEREF _Toc243295421 \h </w:instrText>
+            </w:r>
+            <w:r>
+              <w:rPr>
+                <w:noProof/>
+                <w:webHidden/>
+              </w:rPr>
+            </w:r>
+            <w:r>
+              <w:rPr>
+                <w:noProof/>
+                <w:webHidden/>
+              </w:rPr>
+              <w:fldChar w:fldCharType="separate"/>
+            </w:r>
+            <w:r>
+              <w:rPr>
+                <w:noProof/>
+                <w:webHidden/>
+              </w:rPr>
+              <w:t>21</w:t>
+            </w:r>
+            <w:r>
+              <w:rPr>
+                <w:noProof/>
+                <w:webHidden/>
+              </w:rPr>
+              <w:fldChar w:fldCharType="end"/>
+            </w:r>
+          </w:hyperlink>
+        </w:p>
+        <w:p>
+          <w:pPr>
+            <w:pStyle w:val="TOC2"/>
+            <w:tabs>
+              <w:tab w:val="left" w:pos="960"/>
+              <w:tab w:val="right" w:leader="dot" w:pos="9016"/>
+            </w:tabs>
+            <w:rPr>
+              <w:rFonts w:cstheme="minorBidi"/>
+              <w:noProof/>
+              <w:kern w:val="2"/>
+              <w:sz w:val="24"/>
+              <w:szCs w:val="24"/>
+              <w:lang w:val="en-US"/>
+              <w14:ligatures w14:val="standardContextual"/>
+            </w:rPr>
+          </w:pPr>
+          <w:hyperlink w:anchor="_Toc243295422" w:history="1">
+            <w:r>
+              <w:rPr>
+                <w:rStyle w:val="Hyperlink"/>
+                <w:noProof/>
+              </w:rPr>
+              <w:t>8.1</w:t>
+            </w:r>
+            <w:r>
+              <w:rPr>
+                <w:rFonts w:cstheme="minorBidi"/>
+                <w:noProof/>
+                <w:kern w:val="2"/>
+                <w:sz w:val="24"/>
+                <w:szCs w:val="24"/>
+                <w:lang w:val="en-US"/>
+                <w14:ligatures w14:val="standardContextual"/>
+              </w:rPr>
+              <w:tab/>
+            </w:r>
+            <w:r>
+              <w:rPr>
+                <w:rStyle w:val="Hyperlink"/>
+                <w:noProof/>
+              </w:rPr>
+              <w:t>Story parts</w:t>
+            </w:r>
+            <w:r>
+              <w:rPr>
+                <w:noProof/>
+                <w:webHidden/>
+              </w:rPr>
+              <w:tab/>
+            </w:r>
+            <w:r>
+              <w:rPr>
+                <w:noProof/>
+                <w:webHidden/>
+              </w:rPr>
+              <w:fldChar w:fldCharType="begin"/>
+            </w:r>
+            <w:r>
+              <w:rPr>
+                <w:noProof/>
+                <w:webHidden/>
+              </w:rPr>
+              <w:instrText xml:space="preserve"> PAGEREF _Toc243295422 \h </w:instrText>
+            </w:r>
+            <w:r>
+              <w:rPr>
+                <w:noProof/>
+                <w:webHidden/>
+              </w:rPr>
+            </w:r>
+            <w:r>
+              <w:rPr>
+                <w:noProof/>
+                <w:webHidden/>
+              </w:rPr>
+              <w:fldChar w:fldCharType="separate"/>
+            </w:r>
+            <w:r>
+              <w:rPr>
+                <w:noProof/>
+                <w:webHidden/>
+              </w:rPr>
+              <w:t>21</w:t>
+            </w:r>
+            <w:r>
+              <w:rPr>
+                <w:noProof/>
+                <w:webHidden/>
+              </w:rPr>
+              <w:fldChar w:fldCharType="end"/>
+            </w:r>
+          </w:hyperlink>
+        </w:p>
+        <w:p>
+          <w:pPr>
+            <w:pStyle w:val="TOC2"/>
+            <w:tabs>
+              <w:tab w:val="left" w:pos="960"/>
+              <w:tab w:val="right" w:leader="dot" w:pos="9016"/>
+            </w:tabs>
+            <w:rPr>
+              <w:rFonts w:cstheme="minorBidi"/>
+              <w:noProof/>
+              <w:kern w:val="2"/>
+              <w:sz w:val="24"/>
+              <w:szCs w:val="24"/>
+              <w:lang w:val="en-US"/>
+              <w14:ligatures w14:val="standardContextual"/>
+            </w:rPr>
+          </w:pPr>
+          <w:hyperlink w:anchor="_Toc243295423" w:history="1">
+            <w:r>
+              <w:rPr>
+                <w:rStyle w:val="Hyperlink"/>
+                <w:noProof/>
+              </w:rPr>
+              <w:t>8.2</w:t>
+            </w:r>
+            <w:r>
+              <w:rPr>
+                <w:rFonts w:cstheme="minorBidi"/>
+                <w:noProof/>
+                <w:kern w:val="2"/>
+                <w:sz w:val="24"/>
+                <w:szCs w:val="24"/>
+                <w:lang w:val="en-US"/>
+                <w14:ligatures w14:val="standardContextual"/>
+              </w:rPr>
+              <w:tab/>
+            </w:r>
+            <w:r>
+              <w:rPr>
+                <w:rStyle w:val="Hyperlink"/>
+                <w:noProof/>
+              </w:rPr>
+              <w:t>Develop user stories</w:t>
+            </w:r>
+            <w:r>
+              <w:rPr>
+                <w:noProof/>
+                <w:webHidden/>
+              </w:rPr>
+              <w:tab/>
+            </w:r>
+            <w:r>
+              <w:rPr>
+                <w:noProof/>
+                <w:webHidden/>
+              </w:rPr>
+              <w:fldChar w:fldCharType="begin"/>
+            </w:r>
+            <w:r>
+              <w:rPr>
+                <w:noProof/>
+                <w:webHidden/>
+              </w:rPr>
+              <w:instrText xml:space="preserve"> PAGEREF _Toc243295423 \h </w:instrText>
+            </w:r>
+            <w:r>
+              <w:rPr>
+                <w:noProof/>
+                <w:webHidden/>
+              </w:rPr>
+            </w:r>
+            <w:r>
+              <w:rPr>
+                <w:noProof/>
+                <w:webHidden/>
+              </w:rPr>
+              <w:fldChar w:fldCharType="separate"/>
+            </w:r>
+            <w:r>
+              <w:rPr>
+                <w:noProof/>
+                <w:webHidden/>
+              </w:rPr>
+              <w:t>22</w:t>
+            </w:r>
+            <w:r>
+              <w:rPr>
+                <w:noProof/>
+                <w:webHidden/>
+              </w:rPr>
+              <w:fldChar w:fldCharType="end"/>
+            </w:r>
+          </w:hyperlink>
+        </w:p>
+        <w:p>
+          <w:pPr>
+            <w:pStyle w:val="TOC2"/>
+            <w:tabs>
+              <w:tab w:val="left" w:pos="960"/>
+              <w:tab w:val="right" w:leader="dot" w:pos="9016"/>
+            </w:tabs>
+            <w:rPr>
+              <w:rFonts w:cstheme="minorBidi"/>
+              <w:noProof/>
+              <w:kern w:val="2"/>
+              <w:sz w:val="24"/>
+              <w:szCs w:val="24"/>
+              <w:lang w:val="en-US"/>
+              <w14:ligatures w14:val="standardContextual"/>
+            </w:rPr>
+          </w:pPr>
+          <w:hyperlink w:anchor="_Toc243295424" w:history="1">
+            <w:r>
+              <w:rPr>
+                <w:rStyle w:val="Hyperlink"/>
+                <w:noProof/>
+              </w:rPr>
+              <w:t>8.3</w:t>
+            </w:r>
+            <w:r>
+              <w:rPr>
+                <w:rFonts w:cstheme="minorBidi"/>
+                <w:noProof/>
+                <w:kern w:val="2"/>
+                <w:sz w:val="24"/>
+                <w:szCs w:val="24"/>
+                <w:lang w:val="en-US"/>
+                <w14:ligatures w14:val="standardContextual"/>
+              </w:rPr>
+              <w:tab/>
+            </w:r>
+            <w:r>
+              <w:rPr>
+                <w:rStyle w:val="Hyperlink"/>
+                <w:noProof/>
+              </w:rPr>
+              <w:t>Acceptance criteria</w:t>
+            </w:r>
+            <w:r>
+              <w:rPr>
+                <w:noProof/>
+                <w:webHidden/>
+              </w:rPr>
+              <w:tab/>
+            </w:r>
+            <w:r>
+              <w:rPr>
+                <w:noProof/>
+                <w:webHidden/>
+              </w:rPr>
+              <w:fldChar w:fldCharType="begin"/>
+            </w:r>
+            <w:r>
+              <w:rPr>
+                <w:noProof/>
+                <w:webHidden/>
+              </w:rPr>
+              <w:instrText xml:space="preserve"> PAGEREF _Toc243295424 \h </w:instrText>
+            </w:r>
+            <w:r>
+              <w:rPr>
+                <w:noProof/>
+                <w:webHidden/>
+              </w:rPr>
+            </w:r>
+            <w:r>
+              <w:rPr>
+                <w:noProof/>
+                <w:webHidden/>
+              </w:rPr>
+              <w:fldChar w:fldCharType="separate"/>
+            </w:r>
+            <w:r>
+              <w:rPr>
+                <w:noProof/>
+                <w:webHidden/>
+              </w:rPr>
+              <w:t>23</w:t>
             </w:r>
             <w:r>
               <w:rPr>
@@ -3176,6 +3834,7 @@
     <w:p/>
     <w:p>
       <w:r>
+        <w:lastRenderedPageBreak/>
         <w:br w:type="page"/>
       </w:r>
     </w:p>
@@ -3187,7 +3846,7 @@
           <w:numId w:val="1"/>
         </w:numPr>
       </w:pPr>
-      <w:bookmarkStart w:id="0" w:name="_Toc243227323"/>
+      <w:bookmarkStart w:id="0" w:name="_Toc243295393"/>
       <w:r>
         <w:lastRenderedPageBreak/>
         <w:t>Scenario Interpretation</w:t>
@@ -3202,7 +3861,7 @@
           <w:numId w:val="1"/>
         </w:numPr>
       </w:pPr>
-      <w:bookmarkStart w:id="1" w:name="_Toc243227324"/>
+      <w:bookmarkStart w:id="1" w:name="_Toc243295394"/>
       <w:r>
         <w:t>Organi</w:t>
       </w:r>
@@ -3241,13 +3900,39 @@
         <w:t>is a service for small communities and towns that do not have direct access to a permanent library</w:t>
       </w:r>
       <w:r>
-        <w:t xml:space="preserve"> it runs on recurring routes enabling remote locations access to library resources</w:t>
-      </w:r>
-      <w:r>
         <w:t>.</w:t>
       </w:r>
       <w:r>
-        <w:t xml:space="preserve"> Information about the routes, requests, loads and disruptions is spread across spreadsheets, printed route sheets, phone calls and social media. The problem is not the lack of any particular technology but the unreliable and inconsistent information between staff and customer. </w:t>
+        <w:t xml:space="preserve"> </w:t>
+      </w:r>
+      <w:r>
+        <w:t>I</w:t>
+      </w:r>
+      <w:r>
+        <w:t>t runs on recurring routes enabling remote locations access to library resources</w:t>
+      </w:r>
+      <w:r>
+        <w:t>.</w:t>
+      </w:r>
+      <w:r>
+        <w:t xml:space="preserve"> Information about the routes, requests, loads and disruptions is spread across spreadsheets, printed route sheets, phone calls and social media. The problem is not the lack of any particular technology but the unreliable and inconsistent information between staff and </w:t>
+      </w:r>
+      <w:r>
+        <w:t>borrowers</w:t>
+      </w:r>
+      <w:r>
+        <w:t xml:space="preserve">. </w:t>
+      </w:r>
+      <w:r>
+        <w:t xml:space="preserve">The scenario leaves several policies </w:t>
+      </w:r>
+      <w:proofErr w:type="gramStart"/>
+      <w:r>
+        <w:t>unconfirmed,</w:t>
+      </w:r>
+      <w:proofErr w:type="gramEnd"/>
+      <w:r>
+        <w:t xml:space="preserve"> these are recorded as questions in section 5.2.</w:t>
       </w:r>
     </w:p>
     <w:p>
@@ -3407,7 +4092,14 @@
                 <w:b w:val="0"/>
                 <w:bCs w:val="0"/>
               </w:rPr>
-              <w:t>Most requests are taken at a branch, by phone or at a stop. Some requests go through the library system, and others go through the printed route sheet.</w:t>
+              <w:t>R</w:t>
+            </w:r>
+            <w:r>
+              <w:rPr>
+                <w:b w:val="0"/>
+                <w:bCs w:val="0"/>
+              </w:rPr>
+              <w:t>equests are taken at a branch, by phone or at a stop. Some requests go through the library system, and others go through the printed route sheet.</w:t>
             </w:r>
           </w:p>
         </w:tc>
@@ -3598,7 +4290,13 @@
               <w:cnfStyle w:val="000000100000" w:firstRow="0" w:lastRow="0" w:firstColumn="0" w:lastColumn="0" w:oddVBand="0" w:evenVBand="0" w:oddHBand="1" w:evenHBand="0" w:firstRowFirstColumn="0" w:firstRowLastColumn="0" w:lastRowFirstColumn="0" w:lastRowLastColumn="0"/>
             </w:pPr>
             <w:r>
-              <w:t xml:space="preserve">Delayed or cancelled visits may not be counted for. </w:t>
+              <w:t xml:space="preserve">Delayed or cancelled visits may not be </w:t>
+            </w:r>
+            <w:r>
+              <w:t>ac</w:t>
+            </w:r>
+            <w:r>
+              <w:t xml:space="preserve">counted for. </w:t>
             </w:r>
           </w:p>
         </w:tc>
@@ -3623,7 +4321,21 @@
                 <w:b w:val="0"/>
                 <w:bCs w:val="0"/>
               </w:rPr>
-              <w:t>No single retention period applies to uncontrolled items.</w:t>
+              <w:t>No single retention period applies to unco</w:t>
+            </w:r>
+            <w:r>
+              <w:rPr>
+                <w:b w:val="0"/>
+                <w:bCs w:val="0"/>
+              </w:rPr>
+              <w:t xml:space="preserve">llected </w:t>
+            </w:r>
+            <w:r>
+              <w:rPr>
+                <w:b w:val="0"/>
+                <w:bCs w:val="0"/>
+              </w:rPr>
+              <w:t>items.</w:t>
             </w:r>
           </w:p>
         </w:tc>
@@ -3667,7 +4379,7 @@
           <w:numId w:val="1"/>
         </w:numPr>
       </w:pPr>
-      <w:bookmarkStart w:id="2" w:name="_Toc243227325"/>
+      <w:bookmarkStart w:id="2" w:name="_Toc243295395"/>
       <w:r>
         <w:lastRenderedPageBreak/>
         <w:t>Symptoms, Problems and Consequences</w:t>
@@ -3872,7 +4584,10 @@
               <w:cnfStyle w:val="000000100000" w:firstRow="0" w:lastRow="0" w:firstColumn="0" w:lastColumn="0" w:oddVBand="0" w:evenVBand="0" w:oddHBand="1" w:evenHBand="0" w:firstRowFirstColumn="0" w:firstRowLastColumn="0" w:lastRowFirstColumn="0" w:lastRowLastColumn="0"/>
             </w:pPr>
             <w:r>
-              <w:t xml:space="preserve">Offline loans show items on shelf. </w:t>
+              <w:t xml:space="preserve">Offline loans </w:t>
+            </w:r>
+            <w:r>
+              <w:t>leave items shown as on the shelf</w:t>
             </w:r>
           </w:p>
         </w:tc>
@@ -3885,7 +4600,13 @@
               <w:cnfStyle w:val="000000100000" w:firstRow="0" w:lastRow="0" w:firstColumn="0" w:lastColumn="0" w:oddVBand="0" w:evenVBand="0" w:oddHBand="1" w:evenHBand="0" w:firstRowFirstColumn="0" w:firstRowLastColumn="0" w:lastRowFirstColumn="0" w:lastRowLastColumn="0"/>
             </w:pPr>
             <w:r>
-              <w:t>Offline transitions could be late and inconsistent.</w:t>
+              <w:t>Offline trans</w:t>
+            </w:r>
+            <w:r>
+              <w:t xml:space="preserve">actions </w:t>
+            </w:r>
+            <w:r>
+              <w:t>could be late and inconsistent.</w:t>
             </w:r>
           </w:p>
         </w:tc>
@@ -3943,7 +4664,13 @@
               <w:cnfStyle w:val="000000000000" w:firstRow="0" w:lastRow="0" w:firstColumn="0" w:lastColumn="0" w:oddVBand="0" w:evenVBand="0" w:oddHBand="0" w:evenHBand="0" w:firstRowFirstColumn="0" w:firstRowLastColumn="0" w:lastRowFirstColumn="0" w:lastRowLastColumn="0"/>
             </w:pPr>
             <w:r>
-              <w:t>Status of the loan is not recorded or communicated inconsistently</w:t>
+              <w:t xml:space="preserve">Status of the </w:t>
+            </w:r>
+            <w:r>
+              <w:t>visit</w:t>
+            </w:r>
+            <w:r>
+              <w:t xml:space="preserve"> is not recorded or communicated inconsistently</w:t>
             </w:r>
             <w:r>
               <w:t>.</w:t>
@@ -4019,11 +4746,9 @@
             <w:r>
               <w:t xml:space="preserve">Requests could be wrongly </w:t>
             </w:r>
-            <w:proofErr w:type="spellStart"/>
-            <w:r>
-              <w:t>canceled</w:t>
-            </w:r>
-            <w:proofErr w:type="spellEnd"/>
+            <w:r>
+              <w:t>cancelled</w:t>
+            </w:r>
             <w:r>
               <w:t xml:space="preserve"> if the borrowers do accept or status left open.</w:t>
             </w:r>
@@ -4077,7 +4802,10 @@
               <w:cnfStyle w:val="000000000000" w:firstRow="0" w:lastRow="0" w:firstColumn="0" w:lastColumn="0" w:oddVBand="0" w:evenVBand="0" w:oddHBand="0" w:evenHBand="0" w:firstRowFirstColumn="0" w:firstRowLastColumn="0" w:lastRowFirstColumn="0" w:lastRowLastColumn="0"/>
             </w:pPr>
             <w:r>
-              <w:t>Material could be left behind and prioritised deliveries could.</w:t>
+              <w:t xml:space="preserve">Material could be left behind and </w:t>
+            </w:r>
+            <w:r>
+              <w:t>there is no agreed rule for which items come first.</w:t>
             </w:r>
           </w:p>
         </w:tc>
@@ -4152,7 +4880,7 @@
           <w:numId w:val="1"/>
         </w:numPr>
       </w:pPr>
-      <w:bookmarkStart w:id="3" w:name="_Toc243227326"/>
+      <w:bookmarkStart w:id="3" w:name="_Toc243295396"/>
       <w:r>
         <w:lastRenderedPageBreak/>
         <w:t>Business Problem statement</w:t>
@@ -4198,7 +4926,13 @@
         <w:ind w:left="840"/>
       </w:pPr>
       <w:r>
-        <w:t>The consequences are wasted staff effort, material that is loaded incorrectly, items given to the wrong individual, inaccurate item status across the library service system</w:t>
+        <w:t>The consequences are wasted staff effort, material that is loaded incorrectly, items given to the wrong individual</w:t>
+      </w:r>
+      <w:r>
+        <w:t xml:space="preserve"> and </w:t>
+      </w:r>
+      <w:r>
+        <w:t>inaccurate item status across the library service system</w:t>
       </w:r>
       <w:r>
         <w:t xml:space="preserve">. </w:t>
@@ -4224,7 +4958,7 @@
           <w:numId w:val="1"/>
         </w:numPr>
       </w:pPr>
-      <w:bookmarkStart w:id="4" w:name="_Toc243227327"/>
+      <w:bookmarkStart w:id="4" w:name="_Toc243295397"/>
       <w:r>
         <w:t>Desired outcomes</w:t>
       </w:r>
@@ -4251,7 +4985,10 @@
         </w:numPr>
       </w:pPr>
       <w:r>
-        <w:t>Revery request has its own record, including the borrows choice of their alternative item.</w:t>
+        <w:t>E</w:t>
+      </w:r>
+      <w:r>
+        <w:t>very request has its own record, including the borrows choice of their alternative item.</w:t>
       </w:r>
     </w:p>
     <w:p>
@@ -4275,7 +5012,13 @@
         </w:numPr>
       </w:pPr>
       <w:r>
-        <w:t>Borrowers and coordinators are notified if a visit is delayed or cancelled.</w:t>
+        <w:t xml:space="preserve">Borrowers and coordinators are notified if a visit is </w:t>
+      </w:r>
+      <w:r>
+        <w:t>moved</w:t>
+      </w:r>
+      <w:r>
+        <w:t xml:space="preserve"> or cancelled.</w:t>
       </w:r>
     </w:p>
     <w:p>
@@ -4306,7 +5049,7 @@
           <w:numId w:val="1"/>
         </w:numPr>
       </w:pPr>
-      <w:bookmarkStart w:id="5" w:name="_Toc243227328"/>
+      <w:bookmarkStart w:id="5" w:name="_Toc243295398"/>
       <w:r>
         <w:lastRenderedPageBreak/>
         <w:t>Purpose, scope and boundary</w:t>
@@ -4318,7 +5061,25 @@
         <w:ind w:left="360"/>
       </w:pPr>
       <w:r>
-        <w:t>The proposed Mobile library support service will support route and stop scheduling, request</w:t>
+        <w:t xml:space="preserve">The proposed Mobile </w:t>
+      </w:r>
+      <w:r>
+        <w:t>L</w:t>
+      </w:r>
+      <w:r>
+        <w:t xml:space="preserve">ibrary </w:t>
+      </w:r>
+      <w:r>
+        <w:t>S</w:t>
+      </w:r>
+      <w:r>
+        <w:t xml:space="preserve">upport </w:t>
+      </w:r>
+      <w:r>
+        <w:t>S</w:t>
+      </w:r>
+      <w:r>
+        <w:t>ervice will support route and stop scheduling, request</w:t>
       </w:r>
       <w:r>
         <w:t xml:space="preserve"> assignment to route visits, visit preparation and loading checks, recording of service status and disruption, borrower and partner notification and reconciliation of offline transactions, all applied for the two mobile library vehicles. </w:t>
@@ -4553,7 +5314,21 @@
                 <w:b w:val="0"/>
                 <w:bCs w:val="0"/>
               </w:rPr>
-              <w:t>Stop status: on time, late, moved or cancelled</w:t>
+              <w:t xml:space="preserve">Stop status: on time, </w:t>
+            </w:r>
+            <w:r>
+              <w:rPr>
+                <w:b w:val="0"/>
+                <w:bCs w:val="0"/>
+              </w:rPr>
+              <w:t>delayed</w:t>
+            </w:r>
+            <w:r>
+              <w:rPr>
+                <w:b w:val="0"/>
+                <w:bCs w:val="0"/>
+              </w:rPr>
+              <w:t>, moved or cancelled</w:t>
             </w:r>
           </w:p>
         </w:tc>
@@ -4617,7 +5392,7 @@
       <w:pPr>
         <w:pStyle w:val="Heading2"/>
       </w:pPr>
-      <w:bookmarkStart w:id="6" w:name="_Toc243227329"/>
+      <w:bookmarkStart w:id="6" w:name="_Toc243295399"/>
       <w:r>
         <w:t>What the in</w:t>
       </w:r>
@@ -4645,7 +5420,19 @@
         <w:t>Route and stop planning</w:t>
       </w:r>
       <w:r>
-        <w:t>: each van follows a set route, and each spot has a usual arrival time and visit length. Today this kept in a spreadsheet.</w:t>
+        <w:t xml:space="preserve">: each van follows a set route, and each </w:t>
+      </w:r>
+      <w:r>
+        <w:t xml:space="preserve">stop </w:t>
+      </w:r>
+      <w:r>
+        <w:t xml:space="preserve">has a usual arrival time and visit length. Today this </w:t>
+      </w:r>
+      <w:r>
+        <w:t xml:space="preserve">is </w:t>
+      </w:r>
+      <w:r>
+        <w:t>kept in a spreadsheet.</w:t>
       </w:r>
     </w:p>
     <w:p>
@@ -4718,7 +5505,13 @@
         <w:t>Van load lists and load checks:</w:t>
       </w:r>
       <w:r>
-        <w:t xml:space="preserve"> books have been put on the wrong van because of similar place names and handwritten notes. Staff needs a list to check against before the van leaves.</w:t>
+        <w:t xml:space="preserve"> books have been put on the wrong van because of similar place names and handwritten notes. Staff nee</w:t>
+      </w:r>
+      <w:r>
+        <w:t>d</w:t>
+      </w:r>
+      <w:r>
+        <w:t xml:space="preserve"> a list to check against before the van leaves.</w:t>
       </w:r>
     </w:p>
     <w:p>
@@ -4769,10 +5562,16 @@
       <w:pPr>
         <w:pStyle w:val="Heading2"/>
       </w:pPr>
-      <w:bookmarkStart w:id="7" w:name="_Toc243227330"/>
+      <w:bookmarkStart w:id="7" w:name="_Toc243295400"/>
       <w:r>
         <w:lastRenderedPageBreak/>
-        <w:t xml:space="preserve">What the </w:t>
+        <w:t>Wh</w:t>
+      </w:r>
+      <w:r>
+        <w:t>y</w:t>
+      </w:r>
+      <w:r>
+        <w:t xml:space="preserve"> the </w:t>
       </w:r>
       <w:r>
         <w:t>out</w:t>
@@ -4860,7 +5659,10 @@
         <w:t xml:space="preserve"> the scenario says the initial scope is the </w:t>
       </w:r>
       <w:r>
-        <w:t>operate</w:t>
+        <w:t>operat</w:t>
+      </w:r>
+      <w:r>
+        <w:t>ion of the two mobile library vehicles and their community stops.</w:t>
       </w:r>
     </w:p>
     <w:p>
@@ -4933,7 +5735,7 @@
           <w:numId w:val="1"/>
         </w:numPr>
       </w:pPr>
-      <w:bookmarkStart w:id="8" w:name="_Toc243227331"/>
+      <w:bookmarkStart w:id="8" w:name="_Toc243295401"/>
       <w:r>
         <w:t>Dependencies</w:t>
       </w:r>
@@ -4941,7 +5743,7 @@
         <w:t xml:space="preserve">, </w:t>
       </w:r>
       <w:r>
-        <w:t>Rules</w:t>
+        <w:t>Assumptions</w:t>
       </w:r>
       <w:r>
         <w:t xml:space="preserve"> and </w:t>
@@ -5307,9 +6109,8 @@
           <w:numId w:val="1"/>
         </w:numPr>
       </w:pPr>
-      <w:bookmarkStart w:id="9" w:name="_Toc243227332"/>
-      <w:r>
-        <w:lastRenderedPageBreak/>
+      <w:bookmarkStart w:id="9" w:name="_Toc243295402"/>
+      <w:r>
         <w:t>System Boundary</w:t>
       </w:r>
       <w:bookmarkEnd w:id="9"/>
@@ -5376,6 +6177,13 @@
                 <w:bCs w:val="0"/>
               </w:rPr>
               <w:t xml:space="preserve">System </w:t>
+            </w:r>
+            <w:r>
+              <w:rPr>
+                <w:b w:val="0"/>
+                <w:bCs w:val="0"/>
+              </w:rPr>
+              <w:t>Boundary</w:t>
             </w:r>
           </w:p>
         </w:tc>
@@ -5530,7 +6338,7 @@
       <w:r>
         <w:t xml:space="preserve"> </w:t>
       </w:r>
-      <w:bookmarkStart w:id="10" w:name="_Toc243227333"/>
+      <w:bookmarkStart w:id="10" w:name="_Toc243295403"/>
       <w:r>
         <w:t>Stakeholder and actor catalogue</w:t>
       </w:r>
@@ -5539,12 +6347,6 @@
     <w:p>
       <w:r>
         <w:t xml:space="preserve">A stakeholder is any person, group or organisation that affects the system or is </w:t>
-      </w:r>
-      <w:r>
-        <w:t>affected</w:t>
-      </w:r>
-      <w:r>
-        <w:t xml:space="preserve"> by it. An actor is an external role or system that directly interacts with the system or is </w:t>
       </w:r>
       <w:r>
         <w:t>affected</w:t>
@@ -5864,6 +6666,9 @@
             <w:pPr>
               <w:cnfStyle w:val="000000100000" w:firstRow="0" w:lastRow="0" w:firstColumn="0" w:lastColumn="0" w:oddVBand="0" w:evenVBand="0" w:oddHBand="1" w:evenHBand="0" w:firstRowFirstColumn="0" w:firstRowLastColumn="0" w:lastRowFirstColumn="0" w:lastRowLastColumn="0"/>
             </w:pPr>
+            <w:r>
+              <w:t>Not named in the scenario</w:t>
+            </w:r>
           </w:p>
         </w:tc>
       </w:tr>
@@ -5922,7 +6727,7 @@
       <w:pPr>
         <w:pStyle w:val="Heading2"/>
       </w:pPr>
-      <w:bookmarkStart w:id="11" w:name="_Toc243227334"/>
+      <w:bookmarkStart w:id="11" w:name="_Toc243295404"/>
       <w:r>
         <w:lastRenderedPageBreak/>
         <w:t>3.1 Stakeholder analysis</w:t>
@@ -6669,7 +7474,7 @@
         </w:numPr>
       </w:pPr>
       <w:r>
-        <w:t>Stakeholder goals can conflict. Community coordinators want a minimum visit per period protected, but drivers shorten visits to recover time. Partners want notice of changes, but staff do not want to publish borrower information.</w:t>
+        <w:t>Stakeholder goals can conflict. Community coordinators want a minimum visit period protected, but drivers shorten visits to recover time. Partners want notice of changes, but staff do not want to publish borrower information.</w:t>
       </w:r>
     </w:p>
     <w:p>
@@ -6690,7 +7495,7 @@
       <w:pPr>
         <w:pStyle w:val="Heading2"/>
       </w:pPr>
-      <w:bookmarkStart w:id="12" w:name="_Toc243227335"/>
+      <w:bookmarkStart w:id="12" w:name="_Toc243295405"/>
       <w:r>
         <w:lastRenderedPageBreak/>
         <w:t>3.2 Actor catalogue</w:t>
@@ -7362,7 +8167,7 @@
       <w:r>
         <w:t xml:space="preserve"> </w:t>
       </w:r>
-      <w:bookmarkStart w:id="13" w:name="_Toc243227336"/>
+      <w:bookmarkStart w:id="13" w:name="_Toc243295406"/>
       <w:r>
         <w:t>Requirements catalogue</w:t>
       </w:r>
@@ -7370,7 +8175,13 @@
     </w:p>
     <w:p>
       <w:r>
-        <w:t>The Mobile Library Support Service must help staff plan routes, link each request to the right visit and check the correct items are loaded. It must record whether each stop is on time, delayed, or cancelled, tell the people effected and work at stops with no signal. The functional requirements set out what the system does, the non-functional requirements set out how well it must do it.</w:t>
+        <w:t xml:space="preserve">The Mobile Library Support Service must help staff plan routes, link each request to the right visit and check the correct items are loaded. It must record whether each stop is on time, delayed, </w:t>
+      </w:r>
+      <w:r>
+        <w:t xml:space="preserve">moved </w:t>
+      </w:r>
+      <w:r>
+        <w:t>or cancelled, tell the people effected and work at stops with no signal. The functional requirements set out what the system does, the non-functional requirements set out how well it must do it.</w:t>
       </w:r>
     </w:p>
     <w:p/>
@@ -7383,7 +8194,7 @@
           <w:numId w:val="1"/>
         </w:numPr>
       </w:pPr>
-      <w:bookmarkStart w:id="14" w:name="_Toc243227337"/>
+      <w:bookmarkStart w:id="14" w:name="_Toc243295407"/>
       <w:r>
         <w:lastRenderedPageBreak/>
         <w:t>Functional requirements</w:t>
@@ -8317,11 +9128,9 @@
             <w:r>
               <w:t xml:space="preserve">P3: duplicate entries have </w:t>
             </w:r>
-            <w:proofErr w:type="spellStart"/>
-            <w:r>
-              <w:t>occured</w:t>
-            </w:r>
-            <w:proofErr w:type="spellEnd"/>
+            <w:r>
+              <w:t>occurred</w:t>
+            </w:r>
           </w:p>
         </w:tc>
       </w:tr>
@@ -8390,6 +9199,9 @@
             </w:pPr>
             <w:r>
               <w:t>P7</w:t>
+            </w:r>
+            <w:r>
+              <w:t>: staff are unsure what permission is needed to collect for others</w:t>
             </w:r>
           </w:p>
         </w:tc>
@@ -8409,7 +9221,7 @@
           <w:numId w:val="1"/>
         </w:numPr>
       </w:pPr>
-      <w:bookmarkStart w:id="15" w:name="_Toc243227338"/>
+      <w:bookmarkStart w:id="15" w:name="_Toc243295408"/>
       <w:r>
         <w:t>Non-functional requirements</w:t>
       </w:r>
@@ -8663,7 +9475,13 @@
               <w:cnfStyle w:val="000000100000" w:firstRow="0" w:lastRow="0" w:firstColumn="0" w:lastColumn="0" w:oddVBand="0" w:evenVBand="0" w:oddHBand="1" w:evenHBand="0" w:firstRowFirstColumn="0" w:firstRowLastColumn="0" w:lastRowFirstColumn="0" w:lastRowLastColumn="0"/>
             </w:pPr>
             <w:r>
-              <w:t>Only the route coordinator and mobile library staff shall see borrower contact details: driver and community coordinators shall see route, stop and collection information only.</w:t>
+              <w:t>Only the route coordinator and mobile library staff shall see borrower contact details: driver</w:t>
+            </w:r>
+            <w:r>
+              <w:t>s</w:t>
+            </w:r>
+            <w:r>
+              <w:t xml:space="preserve"> and community coordinators shall see route, stop and collection information only.</w:t>
             </w:r>
           </w:p>
         </w:tc>
@@ -8823,7 +9641,7 @@
           <w:numId w:val="1"/>
         </w:numPr>
       </w:pPr>
-      <w:bookmarkStart w:id="16" w:name="_Toc243227339"/>
+      <w:bookmarkStart w:id="16" w:name="_Toc243295409"/>
       <w:r>
         <w:t>MoSCoW</w:t>
       </w:r>
@@ -8985,15 +9803,7 @@
               <w:t xml:space="preserve">Record the </w:t>
             </w:r>
             <w:r>
-              <w:t>borrower</w:t>
-            </w:r>
-            <w:proofErr w:type="gramStart"/>
-            <w:r>
-              <w:t>’[</w:t>
-            </w:r>
-            <w:proofErr w:type="gramEnd"/>
-            <w:r>
-              <w:t>s choice on an alternative (FR10): staff can note it by hand for now</w:t>
+              <w:t>borrower’s choice on an alternative (FR10): staff can note it by hand for now</w:t>
             </w:r>
           </w:p>
         </w:tc>
@@ -9033,7 +9843,21 @@
               <w:cnfStyle w:val="000000100000" w:firstRow="0" w:lastRow="0" w:firstColumn="0" w:lastColumn="0" w:oddVBand="0" w:evenVBand="0" w:oddHBand="1" w:evenHBand="0" w:firstRowFirstColumn="0" w:firstRowLastColumn="0" w:lastRowFirstColumn="0" w:lastRowLastColumn="0"/>
             </w:pPr>
             <w:r>
-              <w:t>Desirable if the time and recourses permit</w:t>
+              <w:t xml:space="preserve">Desirable if the time and </w:t>
+            </w:r>
+            <w:proofErr w:type="spellStart"/>
+            <w:r>
+              <w:t>re</w:t>
+            </w:r>
+            <w:r>
+              <w:t>s</w:t>
+            </w:r>
+            <w:r>
+              <w:t>ourses</w:t>
+            </w:r>
+            <w:proofErr w:type="spellEnd"/>
+            <w:r>
+              <w:t xml:space="preserve"> permit</w:t>
             </w:r>
           </w:p>
         </w:tc>
@@ -9110,7 +9934,7 @@
           <w:numId w:val="1"/>
         </w:numPr>
       </w:pPr>
-      <w:bookmarkStart w:id="17" w:name="_Toc243227340"/>
+      <w:bookmarkStart w:id="17" w:name="_Toc243295410"/>
       <w:r>
         <w:t>Requirement quality review</w:t>
       </w:r>
@@ -9270,7 +10094,19 @@
               <w:cnfStyle w:val="000000000000" w:firstRow="0" w:lastRow="0" w:firstColumn="0" w:lastColumn="0" w:oddVBand="0" w:evenVBand="0" w:oddHBand="0" w:evenHBand="0" w:firstRowFirstColumn="0" w:firstRowLastColumn="0" w:lastRowFirstColumn="0" w:lastRowLastColumn="0"/>
             </w:pPr>
             <w:r>
-              <w:t>Define “Route visit” and “Load list” better</w:t>
+              <w:t xml:space="preserve">Define “Route </w:t>
+            </w:r>
+            <w:r>
+              <w:t>V</w:t>
+            </w:r>
+            <w:r>
+              <w:t xml:space="preserve">isit” and “Load </w:t>
+            </w:r>
+            <w:r>
+              <w:t>L</w:t>
+            </w:r>
+            <w:r>
+              <w:t>ist” better</w:t>
             </w:r>
           </w:p>
         </w:tc>
@@ -9326,9 +10162,6 @@
             <w:pPr>
               <w:cnfStyle w:val="000000100000" w:firstRow="0" w:lastRow="0" w:firstColumn="0" w:lastColumn="0" w:oddVBand="0" w:evenVBand="0" w:oddHBand="1" w:evenHBand="0" w:firstRowFirstColumn="0" w:firstRowLastColumn="0" w:lastRowFirstColumn="0" w:lastRowLastColumn="0"/>
             </w:pPr>
-            <w:r>
-              <w:t>See quick fixes</w:t>
-            </w:r>
           </w:p>
         </w:tc>
       </w:tr>
@@ -9684,7 +10517,24 @@
               <w:cnfStyle w:val="000000000000" w:firstRow="0" w:lastRow="0" w:firstColumn="0" w:lastColumn="0" w:oddVBand="0" w:evenVBand="0" w:oddHBand="0" w:evenHBand="0" w:firstRowFirstColumn="0" w:firstRowLastColumn="0" w:lastRowFirstColumn="0" w:lastRowLastColumn="0"/>
             </w:pPr>
             <w:r>
-              <w:t>The delay triggers a notice and the collection permission go in section 5 as questions</w:t>
+              <w:t xml:space="preserve">The delay triggers a </w:t>
+            </w:r>
+            <w:proofErr w:type="gramStart"/>
+            <w:r>
+              <w:t>notice</w:t>
+            </w:r>
+            <w:proofErr w:type="gramEnd"/>
+            <w:r>
+              <w:t xml:space="preserve"> and the collection permission</w:t>
+            </w:r>
+            <w:r>
+              <w:t xml:space="preserve">s are recorded as questions </w:t>
+            </w:r>
+            <w:r>
+              <w:t xml:space="preserve">in </w:t>
+            </w:r>
+            <w:r>
+              <w:t>5.2</w:t>
             </w:r>
           </w:p>
         </w:tc>
@@ -9710,7 +10560,7 @@
           <w:numId w:val="1"/>
         </w:numPr>
       </w:pPr>
-      <w:bookmarkStart w:id="18" w:name="_Toc243227341"/>
+      <w:bookmarkStart w:id="18" w:name="_Toc243295411"/>
       <w:r>
         <w:lastRenderedPageBreak/>
         <w:t>Business rules and uncertainty register</w:t>
@@ -9728,7 +10578,7 @@
       <w:pPr>
         <w:pStyle w:val="Heading2"/>
       </w:pPr>
-      <w:bookmarkStart w:id="19" w:name="_Toc243227342"/>
+      <w:bookmarkStart w:id="19" w:name="_Toc243295412"/>
       <w:r>
         <w:t>5.1 Rules, assumptions, constraints and risks</w:t>
       </w:r>
@@ -10447,7 +11297,7 @@
       <w:pPr>
         <w:pStyle w:val="Heading2"/>
       </w:pPr>
-      <w:bookmarkStart w:id="20" w:name="_Toc243227343"/>
+      <w:bookmarkStart w:id="20" w:name="_Toc243295413"/>
       <w:r>
         <w:t>5.2 Questions for stakeholders</w:t>
       </w:r>
@@ -10465,8 +11315,8 @@
         <w:tblLook w:val="04A0" w:firstRow="1" w:lastRow="0" w:firstColumn="1" w:lastColumn="0" w:noHBand="0" w:noVBand="1"/>
       </w:tblPr>
       <w:tblGrid>
-        <w:gridCol w:w="3256"/>
-        <w:gridCol w:w="3402"/>
+        <w:gridCol w:w="3397"/>
+        <w:gridCol w:w="3261"/>
         <w:gridCol w:w="2358"/>
       </w:tblGrid>
       <w:tr>
@@ -10476,7 +11326,7 @@
         <w:tc>
           <w:tcPr>
             <w:cnfStyle w:val="001000000000" w:firstRow="0" w:lastRow="0" w:firstColumn="1" w:lastColumn="0" w:oddVBand="0" w:evenVBand="0" w:oddHBand="0" w:evenHBand="0" w:firstRowFirstColumn="0" w:firstRowLastColumn="0" w:lastRowFirstColumn="0" w:lastRowLastColumn="0"/>
-            <w:tcW w:w="3256" w:type="dxa"/>
+            <w:tcW w:w="3397" w:type="dxa"/>
           </w:tcPr>
           <w:p>
             <w:r>
@@ -10486,7 +11336,7 @@
         </w:tc>
         <w:tc>
           <w:tcPr>
-            <w:tcW w:w="3402" w:type="dxa"/>
+            <w:tcW w:w="3261" w:type="dxa"/>
           </w:tcPr>
           <w:p>
             <w:pPr>
@@ -10518,7 +11368,7 @@
         <w:tc>
           <w:tcPr>
             <w:cnfStyle w:val="001000000000" w:firstRow="0" w:lastRow="0" w:firstColumn="1" w:lastColumn="0" w:oddVBand="0" w:evenVBand="0" w:oddHBand="0" w:evenHBand="0" w:firstRowFirstColumn="0" w:firstRowLastColumn="0" w:lastRowFirstColumn="0" w:lastRowLastColumn="0"/>
-            <w:tcW w:w="3256" w:type="dxa"/>
+            <w:tcW w:w="3397" w:type="dxa"/>
           </w:tcPr>
           <w:p>
             <w:r>
@@ -10539,7 +11389,7 @@
         </w:tc>
         <w:tc>
           <w:tcPr>
-            <w:tcW w:w="3402" w:type="dxa"/>
+            <w:tcW w:w="3261" w:type="dxa"/>
           </w:tcPr>
           <w:p>
             <w:pPr>
@@ -10568,7 +11418,7 @@
         <w:tc>
           <w:tcPr>
             <w:cnfStyle w:val="001000000000" w:firstRow="0" w:lastRow="0" w:firstColumn="1" w:lastColumn="0" w:oddVBand="0" w:evenVBand="0" w:oddHBand="0" w:evenHBand="0" w:firstRowFirstColumn="0" w:firstRowLastColumn="0" w:lastRowFirstColumn="0" w:lastRowLastColumn="0"/>
-            <w:tcW w:w="3256" w:type="dxa"/>
+            <w:tcW w:w="3397" w:type="dxa"/>
           </w:tcPr>
           <w:p>
             <w:pPr>
@@ -10588,7 +11438,7 @@
         </w:tc>
         <w:tc>
           <w:tcPr>
-            <w:tcW w:w="3402" w:type="dxa"/>
+            <w:tcW w:w="3261" w:type="dxa"/>
           </w:tcPr>
           <w:p>
             <w:pPr>
@@ -10620,7 +11470,7 @@
         <w:tc>
           <w:tcPr>
             <w:cnfStyle w:val="001000000000" w:firstRow="0" w:lastRow="0" w:firstColumn="1" w:lastColumn="0" w:oddVBand="0" w:evenVBand="0" w:oddHBand="0" w:evenHBand="0" w:firstRowFirstColumn="0" w:firstRowLastColumn="0" w:lastRowFirstColumn="0" w:lastRowLastColumn="0"/>
-            <w:tcW w:w="3256" w:type="dxa"/>
+            <w:tcW w:w="3397" w:type="dxa"/>
           </w:tcPr>
           <w:p>
             <w:pPr>
@@ -10647,7 +11497,7 @@
         </w:tc>
         <w:tc>
           <w:tcPr>
-            <w:tcW w:w="3402" w:type="dxa"/>
+            <w:tcW w:w="3261" w:type="dxa"/>
           </w:tcPr>
           <w:p>
             <w:pPr>
@@ -10676,7 +11526,7 @@
         <w:tc>
           <w:tcPr>
             <w:cnfStyle w:val="001000000000" w:firstRow="0" w:lastRow="0" w:firstColumn="1" w:lastColumn="0" w:oddVBand="0" w:evenVBand="0" w:oddHBand="0" w:evenHBand="0" w:firstRowFirstColumn="0" w:firstRowLastColumn="0" w:lastRowFirstColumn="0" w:lastRowLastColumn="0"/>
-            <w:tcW w:w="3256" w:type="dxa"/>
+            <w:tcW w:w="3397" w:type="dxa"/>
           </w:tcPr>
           <w:p>
             <w:pPr>
@@ -10703,7 +11553,7 @@
         </w:tc>
         <w:tc>
           <w:tcPr>
-            <w:tcW w:w="3402" w:type="dxa"/>
+            <w:tcW w:w="3261" w:type="dxa"/>
           </w:tcPr>
           <w:p>
             <w:pPr>
@@ -10735,7 +11585,7 @@
         <w:tc>
           <w:tcPr>
             <w:cnfStyle w:val="001000000000" w:firstRow="0" w:lastRow="0" w:firstColumn="1" w:lastColumn="0" w:oddVBand="0" w:evenVBand="0" w:oddHBand="0" w:evenHBand="0" w:firstRowFirstColumn="0" w:firstRowLastColumn="0" w:lastRowFirstColumn="0" w:lastRowLastColumn="0"/>
-            <w:tcW w:w="3256" w:type="dxa"/>
+            <w:tcW w:w="3397" w:type="dxa"/>
           </w:tcPr>
           <w:p>
             <w:pPr>
@@ -10769,7 +11619,7 @@
         </w:tc>
         <w:tc>
           <w:tcPr>
-            <w:tcW w:w="3402" w:type="dxa"/>
+            <w:tcW w:w="3261" w:type="dxa"/>
           </w:tcPr>
           <w:p>
             <w:pPr>
@@ -10798,7 +11648,7 @@
         <w:tc>
           <w:tcPr>
             <w:cnfStyle w:val="001000000000" w:firstRow="0" w:lastRow="0" w:firstColumn="1" w:lastColumn="0" w:oddVBand="0" w:evenVBand="0" w:oddHBand="0" w:evenHBand="0" w:firstRowFirstColumn="0" w:firstRowLastColumn="0" w:lastRowFirstColumn="0" w:lastRowLastColumn="0"/>
-            <w:tcW w:w="3256" w:type="dxa"/>
+            <w:tcW w:w="3397" w:type="dxa"/>
           </w:tcPr>
           <w:p>
             <w:pPr>
@@ -10825,7 +11675,7 @@
         </w:tc>
         <w:tc>
           <w:tcPr>
-            <w:tcW w:w="3402" w:type="dxa"/>
+            <w:tcW w:w="3261" w:type="dxa"/>
           </w:tcPr>
           <w:p>
             <w:pPr>
@@ -10857,27 +11707,41 @@
         <w:tc>
           <w:tcPr>
             <w:cnfStyle w:val="001000000000" w:firstRow="0" w:lastRow="0" w:firstColumn="1" w:lastColumn="0" w:oddVBand="0" w:evenVBand="0" w:oddHBand="0" w:evenHBand="0" w:firstRowFirstColumn="0" w:firstRowLastColumn="0" w:lastRowFirstColumn="0" w:lastRowLastColumn="0"/>
-            <w:tcW w:w="3256" w:type="dxa"/>
-          </w:tcPr>
-          <w:p>
-            <w:pPr>
-              <w:rPr>
-                <w:b w:val="0"/>
-                <w:bCs w:val="0"/>
-              </w:rPr>
-            </w:pPr>
-            <w:r>
-              <w:rPr>
-                <w:b w:val="0"/>
-                <w:bCs w:val="0"/>
-              </w:rPr>
-              <w:t>Q7: What should relief drivers and community coordinators be allowed see?</w:t>
-            </w:r>
-          </w:p>
-        </w:tc>
-        <w:tc>
-          <w:tcPr>
-            <w:tcW w:w="3402" w:type="dxa"/>
+            <w:tcW w:w="3397" w:type="dxa"/>
+          </w:tcPr>
+          <w:p>
+            <w:pPr>
+              <w:rPr>
+                <w:b w:val="0"/>
+                <w:bCs w:val="0"/>
+              </w:rPr>
+            </w:pPr>
+            <w:r>
+              <w:rPr>
+                <w:b w:val="0"/>
+                <w:bCs w:val="0"/>
+              </w:rPr>
+              <w:t>Q7: What should relief drivers and community coordinators be allowed</w:t>
+            </w:r>
+            <w:r>
+              <w:rPr>
+                <w:b w:val="0"/>
+                <w:bCs w:val="0"/>
+              </w:rPr>
+              <w:t xml:space="preserve"> to</w:t>
+            </w:r>
+            <w:r>
+              <w:rPr>
+                <w:b w:val="0"/>
+                <w:bCs w:val="0"/>
+              </w:rPr>
+              <w:t xml:space="preserve"> see?</w:t>
+            </w:r>
+          </w:p>
+        </w:tc>
+        <w:tc>
+          <w:tcPr>
+            <w:tcW w:w="3261" w:type="dxa"/>
           </w:tcPr>
           <w:p>
             <w:pPr>
@@ -10906,27 +11770,41 @@
         <w:tc>
           <w:tcPr>
             <w:cnfStyle w:val="001000000000" w:firstRow="0" w:lastRow="0" w:firstColumn="1" w:lastColumn="0" w:oddVBand="0" w:evenVBand="0" w:oddHBand="0" w:evenHBand="0" w:firstRowFirstColumn="0" w:firstRowLastColumn="0" w:lastRowFirstColumn="0" w:lastRowLastColumn="0"/>
-            <w:tcW w:w="3256" w:type="dxa"/>
-          </w:tcPr>
-          <w:p>
-            <w:pPr>
-              <w:rPr>
-                <w:b w:val="0"/>
-                <w:bCs w:val="0"/>
-              </w:rPr>
-            </w:pPr>
-            <w:r>
-              <w:rPr>
-                <w:b w:val="0"/>
-                <w:bCs w:val="0"/>
-              </w:rPr>
-              <w:t>Q8: should a minimum visit time be protected, and how long should it be?</w:t>
-            </w:r>
-          </w:p>
-        </w:tc>
-        <w:tc>
-          <w:tcPr>
-            <w:tcW w:w="3402" w:type="dxa"/>
+            <w:tcW w:w="3397" w:type="dxa"/>
+          </w:tcPr>
+          <w:p>
+            <w:pPr>
+              <w:rPr>
+                <w:b w:val="0"/>
+                <w:bCs w:val="0"/>
+              </w:rPr>
+            </w:pPr>
+            <w:r>
+              <w:rPr>
+                <w:b w:val="0"/>
+                <w:bCs w:val="0"/>
+              </w:rPr>
+              <w:t xml:space="preserve">Q8: </w:t>
+            </w:r>
+            <w:r>
+              <w:rPr>
+                <w:b w:val="0"/>
+                <w:bCs w:val="0"/>
+              </w:rPr>
+              <w:t>S</w:t>
+            </w:r>
+            <w:r>
+              <w:rPr>
+                <w:b w:val="0"/>
+                <w:bCs w:val="0"/>
+              </w:rPr>
+              <w:t>hould a minimum visit time be protected, and how long should it be?</w:t>
+            </w:r>
+          </w:p>
+        </w:tc>
+        <w:tc>
+          <w:tcPr>
+            <w:tcW w:w="3261" w:type="dxa"/>
           </w:tcPr>
           <w:p>
             <w:pPr>
@@ -10934,6 +11812,9 @@
             </w:pPr>
             <w:r>
               <w:t>Coordinators want one</w:t>
+            </w:r>
+            <w:r>
+              <w:t>, but drivers shorten visits</w:t>
             </w:r>
           </w:p>
         </w:tc>
@@ -10965,7 +11846,7 @@
           <w:numId w:val="1"/>
         </w:numPr>
       </w:pPr>
-      <w:bookmarkStart w:id="21" w:name="_Toc243227344"/>
+      <w:bookmarkStart w:id="21" w:name="_Toc243295414"/>
       <w:r>
         <w:lastRenderedPageBreak/>
         <w:t>Use-case model</w:t>
@@ -10974,15 +11855,34 @@
     </w:p>
     <w:p>
       <w:r>
-        <w:t xml:space="preserve">Use-case model shows how each actor reaches a goal through the mobile library support services. Each use case is named as an actor goal, and </w:t>
-      </w:r>
-      <w:proofErr w:type="gramStart"/>
-      <w:r>
-        <w:t>every one</w:t>
-      </w:r>
-      <w:proofErr w:type="gramEnd"/>
-      <w:r>
-        <w:t xml:space="preserve"> traces back to a requirement in section 4.</w:t>
+        <w:t>The u</w:t>
+      </w:r>
+      <w:r>
+        <w:t xml:space="preserve">se-case model shows how each actor reaches a goal through the </w:t>
+      </w:r>
+      <w:r>
+        <w:t>M</w:t>
+      </w:r>
+      <w:r>
+        <w:t xml:space="preserve">obile </w:t>
+      </w:r>
+      <w:r>
+        <w:t>L</w:t>
+      </w:r>
+      <w:r>
+        <w:t xml:space="preserve">ibrary </w:t>
+      </w:r>
+      <w:r>
+        <w:t>S</w:t>
+      </w:r>
+      <w:r>
+        <w:t xml:space="preserve">upport </w:t>
+      </w:r>
+      <w:r>
+        <w:t>S</w:t>
+      </w:r>
+      <w:r>
+        <w:t>ervices. Each use case is named as an actor goal, and everyone traces back to a requirement in section 4.</w:t>
       </w:r>
     </w:p>
     <w:p/>
@@ -10994,7 +11894,7 @@
           <w:numId w:val="1"/>
         </w:numPr>
       </w:pPr>
-      <w:bookmarkStart w:id="22" w:name="_Toc243227345"/>
+      <w:bookmarkStart w:id="22" w:name="_Toc243295415"/>
       <w:r>
         <w:t>Use-case catalogue</w:t>
       </w:r>
@@ -11478,6 +12378,13 @@
               </w:rPr>
               <w:t>UC07</w:t>
             </w:r>
+            <w:r>
+              <w:rPr>
+                <w:b w:val="0"/>
+                <w:bCs w:val="0"/>
+              </w:rPr>
+              <w:t xml:space="preserve"> Release Requested Item</w:t>
+            </w:r>
           </w:p>
         </w:tc>
         <w:tc>
@@ -11592,7 +12499,7 @@
           <w:numId w:val="1"/>
         </w:numPr>
       </w:pPr>
-      <w:bookmarkStart w:id="23" w:name="_Toc243227346"/>
+      <w:bookmarkStart w:id="23" w:name="_Toc243295416"/>
       <w:r>
         <w:lastRenderedPageBreak/>
         <w:t>Use-case diagram</w:t>
@@ -11646,23 +12553,21 @@
         <w:ind w:left="360"/>
       </w:pPr>
       <w:r>
-        <w:t xml:space="preserve">I used </w:t>
-      </w:r>
-      <w:proofErr w:type="spellStart"/>
-      <w:r>
-        <w:t>PlantUML</w:t>
-      </w:r>
-      <w:proofErr w:type="spellEnd"/>
-      <w:r>
-        <w:t xml:space="preserve"> to do the use-case diagram. You can view the actual code in the diagram/use-case-</w:t>
-      </w:r>
-      <w:proofErr w:type="spellStart"/>
-      <w:r>
-        <w:t>model.puml</w:t>
-      </w:r>
-      <w:proofErr w:type="spellEnd"/>
-      <w:r>
-        <w:t xml:space="preserve">. </w:t>
+        <w:t xml:space="preserve">I used PlantUML to do the use-case diagram. You can view the actual code in the diagram/use-case-model.puml. </w:t>
+      </w:r>
+      <w:r>
+        <w:t xml:space="preserve">I also used this reference guide to assist me with the creation of the use case diagram, </w:t>
+      </w:r>
+      <w:hyperlink r:id="rId9" w:history="1">
+        <w:r>
+          <w:rPr>
+            <w:rStyle w:val="Hyperlink"/>
+          </w:rPr>
+          <w:t>PlantUML Language Reference Guide</w:t>
+        </w:r>
+      </w:hyperlink>
+      <w:r>
+        <w:t>.</w:t>
       </w:r>
     </w:p>
     <w:p>
@@ -11681,7 +12586,7 @@
           <w:numId w:val="1"/>
         </w:numPr>
       </w:pPr>
-      <w:bookmarkStart w:id="24" w:name="_Toc243227347"/>
+      <w:bookmarkStart w:id="24" w:name="_Toc243295417"/>
       <w:r>
         <w:lastRenderedPageBreak/>
         <w:t xml:space="preserve">Detailed use case: UC04 </w:t>
@@ -11998,7 +12903,7 @@
               <w:cnfStyle w:val="000000100000" w:firstRow="0" w:lastRow="0" w:firstColumn="0" w:lastColumn="0" w:oddVBand="0" w:evenVBand="0" w:oddHBand="1" w:evenHBand="0" w:firstRowFirstColumn="0" w:firstRowLastColumn="0" w:lastRowFirstColumn="0" w:lastRowLastColumn="0"/>
             </w:pPr>
             <w:r>
-              <w:t>Noi item is recorded as loaded for the wrong visit: a reason is given when the goal cannot be completed.</w:t>
+              <w:t>No item is recorded as loaded for the wrong visit: a reason is given when the goal cannot be completed.</w:t>
             </w:r>
           </w:p>
         </w:tc>
@@ -12034,7 +12939,13 @@
               <w:cnfStyle w:val="000000000000" w:firstRow="0" w:lastRow="0" w:firstColumn="0" w:lastColumn="0" w:oddVBand="0" w:evenVBand="0" w:oddHBand="0" w:evenHBand="0" w:firstRowFirstColumn="0" w:firstRowLastColumn="0" w:lastRowFirstColumn="0" w:lastRowLastColumn="0"/>
             </w:pPr>
             <w:r>
-              <w:t>Every item on the load list is recorded as loaded and every visit is recorded as ready</w:t>
+              <w:t xml:space="preserve">Every item on the load list is recorded as loaded and </w:t>
+            </w:r>
+            <w:r>
+              <w:t xml:space="preserve">the </w:t>
+            </w:r>
+            <w:r>
+              <w:t>visit is recorded as ready</w:t>
             </w:r>
           </w:p>
         </w:tc>
@@ -12516,6 +13427,13 @@
                 <w:bCs w:val="0"/>
               </w:rPr>
             </w:pPr>
+            <w:r>
+              <w:rPr>
+                <w:b w:val="0"/>
+                <w:bCs w:val="0"/>
+              </w:rPr>
+              <w:t>3a</w:t>
+            </w:r>
           </w:p>
         </w:tc>
         <w:tc>
@@ -12526,6 +13444,9 @@
             <w:pPr>
               <w:cnfStyle w:val="000000100000" w:firstRow="0" w:lastRow="0" w:firstColumn="0" w:lastColumn="0" w:oddVBand="0" w:evenVBand="0" w:oddHBand="1" w:evenHBand="0" w:firstRowFirstColumn="0" w:firstRowLastColumn="0" w:lastRowFirstColumn="0" w:lastRowLastColumn="0"/>
             </w:pPr>
+            <w:r>
+              <w:t xml:space="preserve">The replacement vehicle cannot carry the full load list. </w:t>
+            </w:r>
           </w:p>
         </w:tc>
         <w:tc>
@@ -12536,6 +13457,27 @@
             <w:pPr>
               <w:cnfStyle w:val="000000100000" w:firstRow="0" w:lastRow="0" w:firstColumn="0" w:lastColumn="0" w:oddVBand="0" w:evenVBand="0" w:oddHBand="1" w:evenHBand="0" w:firstRowFirstColumn="0" w:firstRowLastColumn="0" w:lastRowFirstColumn="0" w:lastRowLastColumn="0"/>
             </w:pPr>
+            <w:r>
+              <w:t>Show that the load is too large: staff reduce what is carried (Q3)</w:t>
+            </w:r>
+            <w:r>
+              <w:t>,</w:t>
+            </w:r>
+            <w:r>
+              <w:t xml:space="preserve"> re</w:t>
+            </w:r>
+            <w:r>
+              <w:t>turn</w:t>
+            </w:r>
+            <w:r>
+              <w:t xml:space="preserve"> </w:t>
+            </w:r>
+            <w:r>
+              <w:t>to</w:t>
+            </w:r>
+            <w:r>
+              <w:t xml:space="preserve"> step 3.</w:t>
+            </w:r>
           </w:p>
         </w:tc>
       </w:tr>
@@ -12552,6 +13494,13 @@
                 <w:bCs w:val="0"/>
               </w:rPr>
             </w:pPr>
+            <w:r>
+              <w:rPr>
+                <w:b w:val="0"/>
+                <w:bCs w:val="0"/>
+              </w:rPr>
+              <w:t>5a</w:t>
+            </w:r>
           </w:p>
         </w:tc>
         <w:tc>
@@ -12562,6 +13511,9 @@
             <w:pPr>
               <w:cnfStyle w:val="000000000000" w:firstRow="0" w:lastRow="0" w:firstColumn="0" w:lastColumn="0" w:oddVBand="0" w:evenVBand="0" w:oddHBand="0" w:evenHBand="0" w:firstRowFirstColumn="0" w:firstRowLastColumn="0" w:lastRowFirstColumn="0" w:lastRowLastColumn="0"/>
             </w:pPr>
+            <w:r>
+              <w:t>The item is linked to a different route visit.</w:t>
+            </w:r>
           </w:p>
         </w:tc>
         <w:tc>
@@ -12572,6 +13524,9 @@
             <w:pPr>
               <w:cnfStyle w:val="000000000000" w:firstRow="0" w:lastRow="0" w:firstColumn="0" w:lastColumn="0" w:oddVBand="0" w:evenVBand="0" w:oddHBand="0" w:evenHBand="0" w:firstRowFirstColumn="0" w:firstRowLastColumn="0" w:lastRowFirstColumn="0" w:lastRowLastColumn="0"/>
             </w:pPr>
+            <w:r>
+              <w:t>Name the correct visit: do not record the item as loaded, return to step 4</w:t>
+            </w:r>
           </w:p>
         </w:tc>
       </w:tr>
@@ -12584,7 +13539,22 @@
             <w:cnfStyle w:val="001000000000" w:firstRow="0" w:lastRow="0" w:firstColumn="1" w:lastColumn="0" w:oddVBand="0" w:evenVBand="0" w:oddHBand="0" w:evenHBand="0" w:firstRowFirstColumn="0" w:firstRowLastColumn="0" w:lastRowFirstColumn="0" w:lastRowLastColumn="0"/>
             <w:tcW w:w="846" w:type="dxa"/>
           </w:tcPr>
-          <w:p/>
+          <w:p>
+            <w:pPr>
+              <w:rPr>
+                <w:b w:val="0"/>
+                <w:bCs w:val="0"/>
+              </w:rPr>
+            </w:pPr>
+            <w:r>
+              <w:rPr>
+                <w:b w:val="0"/>
+                <w:bCs w:val="0"/>
+              </w:rPr>
+              <w:lastRenderedPageBreak/>
+              <w:t>5b</w:t>
+            </w:r>
+          </w:p>
         </w:tc>
         <w:tc>
           <w:tcPr>
@@ -12594,6 +13564,9 @@
             <w:pPr>
               <w:cnfStyle w:val="000000100000" w:firstRow="0" w:lastRow="0" w:firstColumn="0" w:lastColumn="0" w:oddVBand="0" w:evenVBand="0" w:oddHBand="1" w:evenHBand="0" w:firstRowFirstColumn="0" w:firstRowLastColumn="0" w:lastRowFirstColumn="0" w:lastRowLastColumn="0"/>
             </w:pPr>
+            <w:r>
+              <w:t>An item on the list is on loan, in transit or reserved for someone else.</w:t>
+            </w:r>
           </w:p>
         </w:tc>
         <w:tc>
@@ -12604,6 +13577,9 @@
             <w:pPr>
               <w:cnfStyle w:val="000000100000" w:firstRow="0" w:lastRow="0" w:firstColumn="0" w:lastColumn="0" w:oddVBand="0" w:evenVBand="0" w:oddHBand="1" w:evenHBand="0" w:firstRowFirstColumn="0" w:firstRowLastColumn="0" w:lastRowFirstColumn="0" w:lastRowLastColumn="0"/>
             </w:pPr>
+            <w:r>
+              <w:t>Record it as unavailable: the request stays open, return to step 4</w:t>
+            </w:r>
           </w:p>
         </w:tc>
       </w:tr>
@@ -12613,7 +13589,21 @@
             <w:cnfStyle w:val="001000000000" w:firstRow="0" w:lastRow="0" w:firstColumn="1" w:lastColumn="0" w:oddVBand="0" w:evenVBand="0" w:oddHBand="0" w:evenHBand="0" w:firstRowFirstColumn="0" w:firstRowLastColumn="0" w:lastRowFirstColumn="0" w:lastRowLastColumn="0"/>
             <w:tcW w:w="846" w:type="dxa"/>
           </w:tcPr>
-          <w:p/>
+          <w:p>
+            <w:pPr>
+              <w:rPr>
+                <w:b w:val="0"/>
+                <w:bCs w:val="0"/>
+              </w:rPr>
+            </w:pPr>
+            <w:r>
+              <w:rPr>
+                <w:b w:val="0"/>
+                <w:bCs w:val="0"/>
+              </w:rPr>
+              <w:t xml:space="preserve">7a </w:t>
+            </w:r>
+          </w:p>
         </w:tc>
         <w:tc>
           <w:tcPr>
@@ -12623,6 +13613,9 @@
             <w:pPr>
               <w:cnfStyle w:val="000000000000" w:firstRow="0" w:lastRow="0" w:firstColumn="0" w:lastColumn="0" w:oddVBand="0" w:evenVBand="0" w:oddHBand="0" w:evenHBand="0" w:firstRowFirstColumn="0" w:firstRowLastColumn="0" w:lastRowFirstColumn="0" w:lastRowLastColumn="0"/>
             </w:pPr>
+            <w:r>
+              <w:t>Items are still unloaded at departure time</w:t>
+            </w:r>
           </w:p>
         </w:tc>
         <w:tc>
@@ -12633,6 +13626,9 @@
             <w:pPr>
               <w:cnfStyle w:val="000000000000" w:firstRow="0" w:lastRow="0" w:firstColumn="0" w:lastColumn="0" w:oddVBand="0" w:evenVBand="0" w:oddHBand="0" w:evenHBand="0" w:firstRowFirstColumn="0" w:firstRowLastColumn="0" w:lastRowFirstColumn="0" w:lastRowLastColumn="0"/>
             </w:pPr>
+            <w:r>
+              <w:t>Report the unloaded items to the route coordinator: end</w:t>
+            </w:r>
           </w:p>
         </w:tc>
       </w:tr>
@@ -12645,7 +13641,21 @@
             <w:cnfStyle w:val="001000000000" w:firstRow="0" w:lastRow="0" w:firstColumn="1" w:lastColumn="0" w:oddVBand="0" w:evenVBand="0" w:oddHBand="0" w:evenHBand="0" w:firstRowFirstColumn="0" w:firstRowLastColumn="0" w:lastRowFirstColumn="0" w:lastRowLastColumn="0"/>
             <w:tcW w:w="846" w:type="dxa"/>
           </w:tcPr>
-          <w:p/>
+          <w:p>
+            <w:pPr>
+              <w:rPr>
+                <w:b w:val="0"/>
+                <w:bCs w:val="0"/>
+              </w:rPr>
+            </w:pPr>
+            <w:r>
+              <w:rPr>
+                <w:b w:val="0"/>
+                <w:bCs w:val="0"/>
+              </w:rPr>
+              <w:t>7b</w:t>
+            </w:r>
+          </w:p>
         </w:tc>
         <w:tc>
           <w:tcPr>
@@ -12655,6 +13665,9 @@
             <w:pPr>
               <w:cnfStyle w:val="000000100000" w:firstRow="0" w:lastRow="0" w:firstColumn="0" w:lastColumn="0" w:oddVBand="0" w:evenVBand="0" w:oddHBand="1" w:evenHBand="0" w:firstRowFirstColumn="0" w:firstRowLastColumn="0" w:lastRowFirstColumn="0" w:lastRowLastColumn="0"/>
             </w:pPr>
+            <w:r>
+              <w:t>The staff member stops preparing the visit</w:t>
+            </w:r>
           </w:p>
         </w:tc>
         <w:tc>
@@ -12665,6 +13678,9 @@
             <w:pPr>
               <w:cnfStyle w:val="000000100000" w:firstRow="0" w:lastRow="0" w:firstColumn="0" w:lastColumn="0" w:oddVBand="0" w:evenVBand="0" w:oddHBand="1" w:evenHBand="0" w:firstRowFirstColumn="0" w:firstRowLastColumn="0" w:lastRowFirstColumn="0" w:lastRowLastColumn="0"/>
             </w:pPr>
+            <w:r>
+              <w:t>Keep the items already recorded as loaded; end.</w:t>
+            </w:r>
           </w:p>
         </w:tc>
       </w:tr>
@@ -12673,12 +13689,2069 @@
     <w:p/>
     <w:p>
       <w:pPr>
-        <w:ind w:left="360"/>
+        <w:pStyle w:val="Heading1"/>
+        <w:numPr>
+          <w:ilvl w:val="0"/>
+          <w:numId w:val="1"/>
+        </w:numPr>
+      </w:pPr>
+      <w:bookmarkStart w:id="25" w:name="_Toc243295418"/>
+      <w:r>
+        <w:t>Behavioural examples (Gherkin)</w:t>
+      </w:r>
+      <w:bookmarkEnd w:id="25"/>
+    </w:p>
+    <w:p>
+      <w:r>
+        <w:t xml:space="preserve">These examples show exactly what the system should do in concrete situations. The success example </w:t>
+      </w:r>
+      <w:r>
+        <w:t>comes</w:t>
+      </w:r>
+      <w:r>
+        <w:t xml:space="preserve"> from the UC04 Main Success Scenario, the failure example from an extension and the rule examples from the business </w:t>
+      </w:r>
+      <w:r>
+        <w:t>rules in section 5.</w:t>
+      </w:r>
+    </w:p>
+    <w:p/>
+    <w:p>
+      <w:pPr>
+        <w:pStyle w:val="Heading2"/>
+        <w:numPr>
+          <w:ilvl w:val="1"/>
+          <w:numId w:val="1"/>
+        </w:numPr>
+      </w:pPr>
+      <w:bookmarkStart w:id="26" w:name="_Toc243295419"/>
+      <w:r>
+        <w:t>From paths and rules to focused examples</w:t>
+      </w:r>
+      <w:bookmarkEnd w:id="26"/>
+    </w:p>
+    <w:tbl>
+      <w:tblPr>
+        <w:tblStyle w:val="PlainTable1"/>
+        <w:tblW w:w="0" w:type="auto"/>
+        <w:tblLook w:val="04A0" w:firstRow="1" w:lastRow="0" w:firstColumn="1" w:lastColumn="0" w:noHBand="0" w:noVBand="1"/>
+      </w:tblPr>
+      <w:tblGrid>
+        <w:gridCol w:w="3005"/>
+        <w:gridCol w:w="3005"/>
+        <w:gridCol w:w="3006"/>
+      </w:tblGrid>
+      <w:tr>
+        <w:trPr>
+          <w:cnfStyle w:val="100000000000" w:firstRow="1" w:lastRow="0" w:firstColumn="0" w:lastColumn="0" w:oddVBand="0" w:evenVBand="0" w:oddHBand="0" w:evenHBand="0" w:firstRowFirstColumn="0" w:firstRowLastColumn="0" w:lastRowFirstColumn="0" w:lastRowLastColumn="0"/>
+        </w:trPr>
+        <w:tc>
+          <w:tcPr>
+            <w:cnfStyle w:val="001000000000" w:firstRow="0" w:lastRow="0" w:firstColumn="1" w:lastColumn="0" w:oddVBand="0" w:evenVBand="0" w:oddHBand="0" w:evenHBand="0" w:firstRowFirstColumn="0" w:firstRowLastColumn="0" w:lastRowFirstColumn="0" w:lastRowLastColumn="0"/>
+            <w:tcW w:w="3005" w:type="dxa"/>
+          </w:tcPr>
+          <w:p>
+            <w:r>
+              <w:t>Source</w:t>
+            </w:r>
+          </w:p>
+        </w:tc>
+        <w:tc>
+          <w:tcPr>
+            <w:tcW w:w="3005" w:type="dxa"/>
+          </w:tcPr>
+          <w:p>
+            <w:pPr>
+              <w:cnfStyle w:val="100000000000" w:firstRow="1" w:lastRow="0" w:firstColumn="0" w:lastColumn="0" w:oddVBand="0" w:evenVBand="0" w:oddHBand="0" w:evenHBand="0" w:firstRowFirstColumn="0" w:firstRowLastColumn="0" w:lastRowFirstColumn="0" w:lastRowLastColumn="0"/>
+            </w:pPr>
+            <w:r>
+              <w:t>Concrete example</w:t>
+            </w:r>
+          </w:p>
+        </w:tc>
+        <w:tc>
+          <w:tcPr>
+            <w:tcW w:w="3006" w:type="dxa"/>
+          </w:tcPr>
+          <w:p>
+            <w:pPr>
+              <w:cnfStyle w:val="100000000000" w:firstRow="1" w:lastRow="0" w:firstColumn="0" w:lastColumn="0" w:oddVBand="0" w:evenVBand="0" w:oddHBand="0" w:evenHBand="0" w:firstRowFirstColumn="0" w:firstRowLastColumn="0" w:lastRowFirstColumn="0" w:lastRowLastColumn="0"/>
+            </w:pPr>
+            <w:r>
+              <w:t>Reason</w:t>
+            </w:r>
+          </w:p>
+        </w:tc>
+      </w:tr>
+      <w:tr>
+        <w:trPr>
+          <w:cnfStyle w:val="000000100000" w:firstRow="0" w:lastRow="0" w:firstColumn="0" w:lastColumn="0" w:oddVBand="0" w:evenVBand="0" w:oddHBand="1" w:evenHBand="0" w:firstRowFirstColumn="0" w:firstRowLastColumn="0" w:lastRowFirstColumn="0" w:lastRowLastColumn="0"/>
+        </w:trPr>
+        <w:tc>
+          <w:tcPr>
+            <w:cnfStyle w:val="001000000000" w:firstRow="0" w:lastRow="0" w:firstColumn="1" w:lastColumn="0" w:oddVBand="0" w:evenVBand="0" w:oddHBand="0" w:evenHBand="0" w:firstRowFirstColumn="0" w:firstRowLastColumn="0" w:lastRowFirstColumn="0" w:lastRowLastColumn="0"/>
+            <w:tcW w:w="3005" w:type="dxa"/>
+          </w:tcPr>
+          <w:p>
+            <w:pPr>
+              <w:rPr>
+                <w:b w:val="0"/>
+                <w:bCs w:val="0"/>
+              </w:rPr>
+            </w:pPr>
+            <w:r>
+              <w:rPr>
+                <w:b w:val="0"/>
+                <w:bCs w:val="0"/>
+              </w:rPr>
+              <w:t>Main Success Scenario</w:t>
+            </w:r>
+          </w:p>
+        </w:tc>
+        <w:tc>
+          <w:tcPr>
+            <w:tcW w:w="3005" w:type="dxa"/>
+          </w:tcPr>
+          <w:p>
+            <w:pPr>
+              <w:cnfStyle w:val="000000100000" w:firstRow="0" w:lastRow="0" w:firstColumn="0" w:lastColumn="0" w:oddVBand="0" w:evenVBand="0" w:oddHBand="1" w:evenHBand="0" w:firstRowFirstColumn="0" w:firstRowLastColumn="0" w:lastRowFirstColumn="0" w:lastRowLastColumn="0"/>
+            </w:pPr>
+            <w:r>
+              <w:t>All three items on the load list are loaded</w:t>
+            </w:r>
+          </w:p>
+        </w:tc>
+        <w:tc>
+          <w:tcPr>
+            <w:tcW w:w="3006" w:type="dxa"/>
+          </w:tcPr>
+          <w:p>
+            <w:pPr>
+              <w:cnfStyle w:val="000000100000" w:firstRow="0" w:lastRow="0" w:firstColumn="0" w:lastColumn="0" w:oddVBand="0" w:evenVBand="0" w:oddHBand="1" w:evenHBand="0" w:firstRowFirstColumn="0" w:firstRowLastColumn="0" w:lastRowFirstColumn="0" w:lastRowLastColumn="0"/>
+            </w:pPr>
+            <w:r>
+              <w:t>Representative success</w:t>
+            </w:r>
+          </w:p>
+        </w:tc>
+      </w:tr>
+      <w:tr>
+        <w:tc>
+          <w:tcPr>
+            <w:cnfStyle w:val="001000000000" w:firstRow="0" w:lastRow="0" w:firstColumn="1" w:lastColumn="0" w:oddVBand="0" w:evenVBand="0" w:oddHBand="0" w:evenHBand="0" w:firstRowFirstColumn="0" w:firstRowLastColumn="0" w:lastRowFirstColumn="0" w:lastRowLastColumn="0"/>
+            <w:tcW w:w="3005" w:type="dxa"/>
+          </w:tcPr>
+          <w:p>
+            <w:pPr>
+              <w:rPr>
+                <w:b w:val="0"/>
+                <w:bCs w:val="0"/>
+              </w:rPr>
+            </w:pPr>
+            <w:r>
+              <w:rPr>
+                <w:b w:val="0"/>
+                <w:bCs w:val="0"/>
+              </w:rPr>
+              <w:t>Extension 5a</w:t>
+            </w:r>
+            <w:r>
+              <w:rPr>
+                <w:b w:val="0"/>
+                <w:bCs w:val="0"/>
+              </w:rPr>
+              <w:t xml:space="preserve"> (UC04)</w:t>
+            </w:r>
+          </w:p>
+        </w:tc>
+        <w:tc>
+          <w:tcPr>
+            <w:tcW w:w="3005" w:type="dxa"/>
+          </w:tcPr>
+          <w:p>
+            <w:pPr>
+              <w:cnfStyle w:val="000000000000" w:firstRow="0" w:lastRow="0" w:firstColumn="0" w:lastColumn="0" w:oddVBand="0" w:evenVBand="0" w:oddHBand="0" w:evenHBand="0" w:firstRowFirstColumn="0" w:firstRowLastColumn="0" w:lastRowFirstColumn="0" w:lastRowLastColumn="0"/>
+            </w:pPr>
+            <w:r>
+              <w:t>Item linked to a different route visit</w:t>
+            </w:r>
+          </w:p>
+        </w:tc>
+        <w:tc>
+          <w:tcPr>
+            <w:tcW w:w="3006" w:type="dxa"/>
+          </w:tcPr>
+          <w:p>
+            <w:pPr>
+              <w:cnfStyle w:val="000000000000" w:firstRow="0" w:lastRow="0" w:firstColumn="0" w:lastColumn="0" w:oddVBand="0" w:evenVBand="0" w:oddHBand="0" w:evenHBand="0" w:firstRowFirstColumn="0" w:firstRowLastColumn="0" w:lastRowFirstColumn="0" w:lastRowLastColumn="0"/>
+            </w:pPr>
+            <w:r>
+              <w:t>Wrong-vehicle failure (P1)</w:t>
+            </w:r>
+          </w:p>
+        </w:tc>
+      </w:tr>
+      <w:tr>
+        <w:trPr>
+          <w:cnfStyle w:val="000000100000" w:firstRow="0" w:lastRow="0" w:firstColumn="0" w:lastColumn="0" w:oddVBand="0" w:evenVBand="0" w:oddHBand="1" w:evenHBand="0" w:firstRowFirstColumn="0" w:firstRowLastColumn="0" w:lastRowFirstColumn="0" w:lastRowLastColumn="0"/>
+        </w:trPr>
+        <w:tc>
+          <w:tcPr>
+            <w:cnfStyle w:val="001000000000" w:firstRow="0" w:lastRow="0" w:firstColumn="1" w:lastColumn="0" w:oddVBand="0" w:evenVBand="0" w:oddHBand="0" w:evenHBand="0" w:firstRowFirstColumn="0" w:firstRowLastColumn="0" w:lastRowFirstColumn="0" w:lastRowLastColumn="0"/>
+            <w:tcW w:w="3005" w:type="dxa"/>
+          </w:tcPr>
+          <w:p>
+            <w:pPr>
+              <w:rPr>
+                <w:b w:val="0"/>
+                <w:bCs w:val="0"/>
+              </w:rPr>
+            </w:pPr>
+            <w:r>
+              <w:rPr>
+                <w:b w:val="0"/>
+                <w:bCs w:val="0"/>
+              </w:rPr>
+              <w:t>BR04</w:t>
+            </w:r>
+          </w:p>
+        </w:tc>
+        <w:tc>
+          <w:tcPr>
+            <w:tcW w:w="3005" w:type="dxa"/>
+          </w:tcPr>
+          <w:p>
+            <w:pPr>
+              <w:cnfStyle w:val="000000100000" w:firstRow="0" w:lastRow="0" w:firstColumn="0" w:lastColumn="0" w:oddVBand="0" w:evenVBand="0" w:oddHBand="1" w:evenHBand="0" w:firstRowFirstColumn="0" w:firstRowLastColumn="0" w:lastRowFirstColumn="0" w:lastRowLastColumn="0"/>
+            </w:pPr>
+            <w:r>
+              <w:t>Item reserved for another borrower</w:t>
+            </w:r>
+          </w:p>
+        </w:tc>
+        <w:tc>
+          <w:tcPr>
+            <w:tcW w:w="3006" w:type="dxa"/>
+          </w:tcPr>
+          <w:p>
+            <w:pPr>
+              <w:cnfStyle w:val="000000100000" w:firstRow="0" w:lastRow="0" w:firstColumn="0" w:lastColumn="0" w:oddVBand="0" w:evenVBand="0" w:oddHBand="1" w:evenHBand="0" w:firstRowFirstColumn="0" w:firstRowLastColumn="0" w:lastRowFirstColumn="0" w:lastRowLastColumn="0"/>
+            </w:pPr>
+            <w:r>
+              <w:t>Eligibility rule (p7)</w:t>
+            </w:r>
+          </w:p>
+        </w:tc>
+      </w:tr>
+      <w:tr>
+        <w:tc>
+          <w:tcPr>
+            <w:cnfStyle w:val="001000000000" w:firstRow="0" w:lastRow="0" w:firstColumn="1" w:lastColumn="0" w:oddVBand="0" w:evenVBand="0" w:oddHBand="0" w:evenHBand="0" w:firstRowFirstColumn="0" w:firstRowLastColumn="0" w:lastRowFirstColumn="0" w:lastRowLastColumn="0"/>
+            <w:tcW w:w="3005" w:type="dxa"/>
+          </w:tcPr>
+          <w:p>
+            <w:pPr>
+              <w:rPr>
+                <w:b w:val="0"/>
+                <w:bCs w:val="0"/>
+              </w:rPr>
+            </w:pPr>
+            <w:r>
+              <w:rPr>
+                <w:b w:val="0"/>
+                <w:bCs w:val="0"/>
+              </w:rPr>
+              <w:t>BR05/FR09</w:t>
+            </w:r>
+          </w:p>
+        </w:tc>
+        <w:tc>
+          <w:tcPr>
+            <w:tcW w:w="3005" w:type="dxa"/>
+          </w:tcPr>
+          <w:p>
+            <w:pPr>
+              <w:cnfStyle w:val="000000000000" w:firstRow="0" w:lastRow="0" w:firstColumn="0" w:lastColumn="0" w:oddVBand="0" w:evenVBand="0" w:oddHBand="0" w:evenHBand="0" w:firstRowFirstColumn="0" w:firstRowLastColumn="0" w:lastRowFirstColumn="0" w:lastRowLastColumn="0"/>
+            </w:pPr>
+            <w:r>
+              <w:t>Moved and cancelled visits</w:t>
+            </w:r>
+          </w:p>
+        </w:tc>
+        <w:tc>
+          <w:tcPr>
+            <w:tcW w:w="3006" w:type="dxa"/>
+          </w:tcPr>
+          <w:p>
+            <w:pPr>
+              <w:cnfStyle w:val="000000000000" w:firstRow="0" w:lastRow="0" w:firstColumn="0" w:lastColumn="0" w:oddVBand="0" w:evenVBand="0" w:oddHBand="0" w:evenHBand="0" w:firstRowFirstColumn="0" w:firstRowLastColumn="0" w:lastRowFirstColumn="0" w:lastRowLastColumn="0"/>
+            </w:pPr>
+            <w:r>
+              <w:t>Rule behaviour for each status (P4)</w:t>
+            </w:r>
+          </w:p>
+        </w:tc>
+      </w:tr>
+      <w:tr>
+        <w:trPr>
+          <w:cnfStyle w:val="000000100000" w:firstRow="0" w:lastRow="0" w:firstColumn="0" w:lastColumn="0" w:oddVBand="0" w:evenVBand="0" w:oddHBand="1" w:evenHBand="0" w:firstRowFirstColumn="0" w:firstRowLastColumn="0" w:lastRowFirstColumn="0" w:lastRowLastColumn="0"/>
+        </w:trPr>
+        <w:tc>
+          <w:tcPr>
+            <w:cnfStyle w:val="001000000000" w:firstRow="0" w:lastRow="0" w:firstColumn="1" w:lastColumn="0" w:oddVBand="0" w:evenVBand="0" w:oddHBand="0" w:evenHBand="0" w:firstRowFirstColumn="0" w:firstRowLastColumn="0" w:lastRowFirstColumn="0" w:lastRowLastColumn="0"/>
+            <w:tcW w:w="3005" w:type="dxa"/>
+          </w:tcPr>
+          <w:p>
+            <w:pPr>
+              <w:rPr>
+                <w:b w:val="0"/>
+                <w:bCs w:val="0"/>
+              </w:rPr>
+            </w:pPr>
+            <w:r>
+              <w:rPr>
+                <w:b w:val="0"/>
+                <w:bCs w:val="0"/>
+              </w:rPr>
+              <w:t>FR10</w:t>
+            </w:r>
+          </w:p>
+        </w:tc>
+        <w:tc>
+          <w:tcPr>
+            <w:tcW w:w="3005" w:type="dxa"/>
+          </w:tcPr>
+          <w:p>
+            <w:pPr>
+              <w:cnfStyle w:val="000000100000" w:firstRow="0" w:lastRow="0" w:firstColumn="0" w:lastColumn="0" w:oddVBand="0" w:evenVBand="0" w:oddHBand="1" w:evenHBand="0" w:firstRowFirstColumn="0" w:firstRowLastColumn="0" w:lastRowFirstColumn="0" w:lastRowLastColumn="0"/>
+            </w:pPr>
+            <w:r>
+              <w:t>Borrower takes an alternative but keeps the request</w:t>
+            </w:r>
+          </w:p>
+        </w:tc>
+        <w:tc>
+          <w:tcPr>
+            <w:tcW w:w="3006" w:type="dxa"/>
+          </w:tcPr>
+          <w:p>
+            <w:pPr>
+              <w:cnfStyle w:val="000000100000" w:firstRow="0" w:lastRow="0" w:firstColumn="0" w:lastColumn="0" w:oddVBand="0" w:evenVBand="0" w:oddHBand="1" w:evenHBand="0" w:firstRowFirstColumn="0" w:firstRowLastColumn="0" w:lastRowFirstColumn="0" w:lastRowLastColumn="0"/>
+            </w:pPr>
+            <w:r>
+              <w:t>Alternative path (P5)</w:t>
+            </w:r>
+          </w:p>
+        </w:tc>
+      </w:tr>
+    </w:tbl>
+    <w:p/>
+    <w:p>
+      <w:pPr>
+        <w:pStyle w:val="Heading2"/>
+        <w:numPr>
+          <w:ilvl w:val="1"/>
+          <w:numId w:val="1"/>
+        </w:numPr>
+      </w:pPr>
+      <w:bookmarkStart w:id="27" w:name="_Toc243295420"/>
+      <w:r>
+        <w:t>Gherkin Examples</w:t>
+      </w:r>
+      <w:bookmarkEnd w:id="27"/>
+    </w:p>
+    <w:p>
+      <w:r>
+        <w:t>For the Gherkin examples, I used Session 7 (Detailed Use Cases and Executable Gherkin) and the Cucumber Gherkin reference listed at the end of that lab to help with the structure. I made up a few naming conventions such as B-1001 for a book, RV-0412 for a route visit and ST-07 for a stop.</w:t>
+      </w:r>
+      <w:r>
+        <w:t xml:space="preserve"> The three feature files check to see if the right items are loaded onto the correct van, that reserved items are not given out, that people are told when a visit is moved or cancelled and that a borrower can take an alternative book while keeping their original request. </w:t>
+      </w:r>
+    </w:p>
+    <w:p/>
+    <w:p>
+      <w:pPr>
+        <w:pStyle w:val="Subtitle"/>
+      </w:pPr>
+      <w:r>
+        <w:lastRenderedPageBreak/>
+        <w:t>f</w:t>
+      </w:r>
+      <w:r>
+        <w:t>eatures/visit-</w:t>
+      </w:r>
+      <w:proofErr w:type="spellStart"/>
+      <w:r>
+        <w:t>load.feature</w:t>
+      </w:r>
+      <w:proofErr w:type="spellEnd"/>
+    </w:p>
+    <w:p>
+      <w:r>
+        <w:rPr>
+          <w:noProof/>
+        </w:rPr>
+        <w:drawing>
+          <wp:inline distT="0" distB="0" distL="0" distR="0" wp14:anchorId="29F0CB86" wp14:editId="15909F82">
+            <wp:extent cx="6336665" cy="3114483"/>
+            <wp:effectExtent l="0" t="0" r="6985" b="0"/>
+            <wp:docPr id="2059622039" name="Picture 1"/>
+            <wp:cNvGraphicFramePr>
+              <a:graphicFrameLocks xmlns:a="http://schemas.openxmlformats.org/drawingml/2006/main" noChangeAspect="1"/>
+            </wp:cNvGraphicFramePr>
+            <a:graphic xmlns:a="http://schemas.openxmlformats.org/drawingml/2006/main">
+              <a:graphicData uri="http://schemas.openxmlformats.org/drawingml/2006/picture">
+                <pic:pic xmlns:pic="http://schemas.openxmlformats.org/drawingml/2006/picture">
+                  <pic:nvPicPr>
+                    <pic:cNvPr id="2059622039" name=""/>
+                    <pic:cNvPicPr/>
+                  </pic:nvPicPr>
+                  <pic:blipFill>
+                    <a:blip r:embed="rId10"/>
+                    <a:stretch>
+                      <a:fillRect/>
+                    </a:stretch>
+                  </pic:blipFill>
+                  <pic:spPr>
+                    <a:xfrm>
+                      <a:off x="0" y="0"/>
+                      <a:ext cx="6349621" cy="3120851"/>
+                    </a:xfrm>
+                    <a:prstGeom prst="rect">
+                      <a:avLst/>
+                    </a:prstGeom>
+                  </pic:spPr>
+                </pic:pic>
+              </a:graphicData>
+            </a:graphic>
+          </wp:inline>
+        </w:drawing>
+      </w:r>
+    </w:p>
+    <w:p/>
+    <w:p>
+      <w:pPr>
+        <w:pStyle w:val="Subtitle"/>
+      </w:pPr>
+      <w:r>
+        <w:t>f</w:t>
+      </w:r>
+      <w:r>
+        <w:t>eatures/release-and-status.feature</w:t>
+      </w:r>
+    </w:p>
+    <w:p>
+      <w:r>
+        <w:rPr>
+          <w:noProof/>
+        </w:rPr>
+        <w:drawing>
+          <wp:inline distT="0" distB="0" distL="0" distR="0" wp14:anchorId="772DE2F5" wp14:editId="6CB0799D">
+            <wp:extent cx="5731510" cy="3928110"/>
+            <wp:effectExtent l="0" t="0" r="2540" b="0"/>
+            <wp:docPr id="1535210066" name="Picture 1"/>
+            <wp:cNvGraphicFramePr>
+              <a:graphicFrameLocks xmlns:a="http://schemas.openxmlformats.org/drawingml/2006/main" noChangeAspect="1"/>
+            </wp:cNvGraphicFramePr>
+            <a:graphic xmlns:a="http://schemas.openxmlformats.org/drawingml/2006/main">
+              <a:graphicData uri="http://schemas.openxmlformats.org/drawingml/2006/picture">
+                <pic:pic xmlns:pic="http://schemas.openxmlformats.org/drawingml/2006/picture">
+                  <pic:nvPicPr>
+                    <pic:cNvPr id="1535210066" name=""/>
+                    <pic:cNvPicPr/>
+                  </pic:nvPicPr>
+                  <pic:blipFill>
+                    <a:blip r:embed="rId11"/>
+                    <a:stretch>
+                      <a:fillRect/>
+                    </a:stretch>
+                  </pic:blipFill>
+                  <pic:spPr>
+                    <a:xfrm>
+                      <a:off x="0" y="0"/>
+                      <a:ext cx="5731510" cy="3928110"/>
+                    </a:xfrm>
+                    <a:prstGeom prst="rect">
+                      <a:avLst/>
+                    </a:prstGeom>
+                  </pic:spPr>
+                </pic:pic>
+              </a:graphicData>
+            </a:graphic>
+          </wp:inline>
+        </w:drawing>
+      </w:r>
+    </w:p>
+    <w:p/>
+    <w:p/>
+    <w:p>
+      <w:pPr>
+        <w:pStyle w:val="Subtitle"/>
+      </w:pPr>
+      <w:r>
+        <w:lastRenderedPageBreak/>
+        <w:t>f</w:t>
+      </w:r>
+      <w:r>
+        <w:t>eatures/</w:t>
+      </w:r>
+      <w:proofErr w:type="spellStart"/>
+      <w:r>
+        <w:t>requests.feature</w:t>
+      </w:r>
+      <w:proofErr w:type="spellEnd"/>
+    </w:p>
+    <w:p>
+      <w:r>
+        <w:rPr>
+          <w:noProof/>
+        </w:rPr>
+        <w:drawing>
+          <wp:inline distT="0" distB="0" distL="0" distR="0" wp14:anchorId="432864AF" wp14:editId="4190ACB1">
+            <wp:extent cx="5731510" cy="2653665"/>
+            <wp:effectExtent l="0" t="0" r="2540" b="0"/>
+            <wp:docPr id="565482411" name="Picture 1"/>
+            <wp:cNvGraphicFramePr>
+              <a:graphicFrameLocks xmlns:a="http://schemas.openxmlformats.org/drawingml/2006/main" noChangeAspect="1"/>
+            </wp:cNvGraphicFramePr>
+            <a:graphic xmlns:a="http://schemas.openxmlformats.org/drawingml/2006/main">
+              <a:graphicData uri="http://schemas.openxmlformats.org/drawingml/2006/picture">
+                <pic:pic xmlns:pic="http://schemas.openxmlformats.org/drawingml/2006/picture">
+                  <pic:nvPicPr>
+                    <pic:cNvPr id="565482411" name=""/>
+                    <pic:cNvPicPr/>
+                  </pic:nvPicPr>
+                  <pic:blipFill>
+                    <a:blip r:embed="rId12"/>
+                    <a:stretch>
+                      <a:fillRect/>
+                    </a:stretch>
+                  </pic:blipFill>
+                  <pic:spPr>
+                    <a:xfrm>
+                      <a:off x="0" y="0"/>
+                      <a:ext cx="5731510" cy="2653665"/>
+                    </a:xfrm>
+                    <a:prstGeom prst="rect">
+                      <a:avLst/>
+                    </a:prstGeom>
+                  </pic:spPr>
+                </pic:pic>
+              </a:graphicData>
+            </a:graphic>
+          </wp:inline>
+        </w:drawing>
+      </w:r>
+    </w:p>
+    <w:p/>
+    <w:p/>
+    <w:p>
+      <w:pPr>
+        <w:pStyle w:val="Heading1"/>
+        <w:numPr>
+          <w:ilvl w:val="0"/>
+          <w:numId w:val="1"/>
+        </w:numPr>
+      </w:pPr>
+      <w:bookmarkStart w:id="28" w:name="_Toc243295421"/>
+      <w:r>
+        <w:t>User stories and acceptance criteria</w:t>
+      </w:r>
+      <w:bookmarkEnd w:id="28"/>
+    </w:p>
+    <w:p>
+      <w:r>
+        <w:t>The user stories show who gets value from the main requirements and why, using the pattern as &lt;role&gt;, I want &lt;goal&gt;, so that &lt;</w:t>
+      </w:r>
+      <w:proofErr w:type="spellStart"/>
+      <w:r>
+        <w:t>benifit</w:t>
+      </w:r>
+      <w:proofErr w:type="spellEnd"/>
+      <w:r>
+        <w:t>&gt;</w:t>
+      </w:r>
+    </w:p>
+    <w:p>
+      <w:pPr>
+        <w:pStyle w:val="Heading2"/>
+        <w:numPr>
+          <w:ilvl w:val="1"/>
+          <w:numId w:val="1"/>
+        </w:numPr>
+      </w:pPr>
+      <w:bookmarkStart w:id="29" w:name="_Toc243295422"/>
+      <w:r>
+        <w:t>Story parts</w:t>
+      </w:r>
+      <w:bookmarkEnd w:id="29"/>
+    </w:p>
+    <w:tbl>
+      <w:tblPr>
+        <w:tblStyle w:val="PlainTable1"/>
+        <w:tblW w:w="0" w:type="auto"/>
+        <w:tblLook w:val="04A0" w:firstRow="1" w:lastRow="0" w:firstColumn="1" w:lastColumn="0" w:noHBand="0" w:noVBand="1"/>
+      </w:tblPr>
+      <w:tblGrid>
+        <w:gridCol w:w="1555"/>
+        <w:gridCol w:w="3402"/>
+        <w:gridCol w:w="4059"/>
+      </w:tblGrid>
+      <w:tr>
+        <w:trPr>
+          <w:cnfStyle w:val="100000000000" w:firstRow="1" w:lastRow="0" w:firstColumn="0" w:lastColumn="0" w:oddVBand="0" w:evenVBand="0" w:oddHBand="0" w:evenHBand="0" w:firstRowFirstColumn="0" w:firstRowLastColumn="0" w:lastRowFirstColumn="0" w:lastRowLastColumn="0"/>
+        </w:trPr>
+        <w:tc>
+          <w:tcPr>
+            <w:cnfStyle w:val="001000000000" w:firstRow="0" w:lastRow="0" w:firstColumn="1" w:lastColumn="0" w:oddVBand="0" w:evenVBand="0" w:oddHBand="0" w:evenHBand="0" w:firstRowFirstColumn="0" w:firstRowLastColumn="0" w:lastRowFirstColumn="0" w:lastRowLastColumn="0"/>
+            <w:tcW w:w="1555" w:type="dxa"/>
+          </w:tcPr>
+          <w:p>
+            <w:r>
+              <w:t xml:space="preserve">Story part </w:t>
+            </w:r>
+          </w:p>
+        </w:tc>
+        <w:tc>
+          <w:tcPr>
+            <w:tcW w:w="3402" w:type="dxa"/>
+          </w:tcPr>
+          <w:p>
+            <w:pPr>
+              <w:cnfStyle w:val="100000000000" w:firstRow="1" w:lastRow="0" w:firstColumn="0" w:lastColumn="0" w:oddVBand="0" w:evenVBand="0" w:oddHBand="0" w:evenHBand="0" w:firstRowFirstColumn="0" w:firstRowLastColumn="0" w:lastRowFirstColumn="0" w:lastRowLastColumn="0"/>
+            </w:pPr>
+            <w:r>
+              <w:t>Worked content</w:t>
+            </w:r>
+          </w:p>
+        </w:tc>
+        <w:tc>
+          <w:tcPr>
+            <w:tcW w:w="4059" w:type="dxa"/>
+          </w:tcPr>
+          <w:p>
+            <w:pPr>
+              <w:cnfStyle w:val="100000000000" w:firstRow="1" w:lastRow="0" w:firstColumn="0" w:lastColumn="0" w:oddVBand="0" w:evenVBand="0" w:oddHBand="0" w:evenHBand="0" w:firstRowFirstColumn="0" w:firstRowLastColumn="0" w:lastRowFirstColumn="0" w:lastRowLastColumn="0"/>
+            </w:pPr>
+            <w:r>
+              <w:t>Reason</w:t>
+            </w:r>
+          </w:p>
+        </w:tc>
+      </w:tr>
+      <w:tr>
+        <w:trPr>
+          <w:cnfStyle w:val="000000100000" w:firstRow="0" w:lastRow="0" w:firstColumn="0" w:lastColumn="0" w:oddVBand="0" w:evenVBand="0" w:oddHBand="1" w:evenHBand="0" w:firstRowFirstColumn="0" w:firstRowLastColumn="0" w:lastRowFirstColumn="0" w:lastRowLastColumn="0"/>
+        </w:trPr>
+        <w:tc>
+          <w:tcPr>
+            <w:cnfStyle w:val="001000000000" w:firstRow="0" w:lastRow="0" w:firstColumn="1" w:lastColumn="0" w:oddVBand="0" w:evenVBand="0" w:oddHBand="0" w:evenHBand="0" w:firstRowFirstColumn="0" w:firstRowLastColumn="0" w:lastRowFirstColumn="0" w:lastRowLastColumn="0"/>
+            <w:tcW w:w="1555" w:type="dxa"/>
+          </w:tcPr>
+          <w:p>
+            <w:pPr>
+              <w:rPr>
+                <w:b w:val="0"/>
+                <w:bCs w:val="0"/>
+              </w:rPr>
+            </w:pPr>
+            <w:r>
+              <w:rPr>
+                <w:b w:val="0"/>
+                <w:bCs w:val="0"/>
+              </w:rPr>
+              <w:t>Role</w:t>
+            </w:r>
+          </w:p>
+        </w:tc>
+        <w:tc>
+          <w:tcPr>
+            <w:tcW w:w="3402" w:type="dxa"/>
+          </w:tcPr>
+          <w:p>
+            <w:pPr>
+              <w:cnfStyle w:val="000000100000" w:firstRow="0" w:lastRow="0" w:firstColumn="0" w:lastColumn="0" w:oddVBand="0" w:evenVBand="0" w:oddHBand="1" w:evenHBand="0" w:firstRowFirstColumn="0" w:firstRowLastColumn="0" w:lastRowFirstColumn="0" w:lastRowLastColumn="0"/>
+            </w:pPr>
+            <w:r>
+              <w:t>Mobile-library staff member</w:t>
+            </w:r>
+          </w:p>
+        </w:tc>
+        <w:tc>
+          <w:tcPr>
+            <w:tcW w:w="4059" w:type="dxa"/>
+          </w:tcPr>
+          <w:p>
+            <w:pPr>
+              <w:cnfStyle w:val="000000100000" w:firstRow="0" w:lastRow="0" w:firstColumn="0" w:lastColumn="0" w:oddVBand="0" w:evenVBand="0" w:oddHBand="1" w:evenHBand="0" w:firstRowFirstColumn="0" w:firstRowLastColumn="0" w:lastRowFirstColumn="0" w:lastRowLastColumn="0"/>
+            </w:pPr>
+            <w:r>
+              <w:t>The role is specific: this person prepares the van.</w:t>
+            </w:r>
+          </w:p>
+        </w:tc>
+      </w:tr>
+      <w:tr>
+        <w:tc>
+          <w:tcPr>
+            <w:cnfStyle w:val="001000000000" w:firstRow="0" w:lastRow="0" w:firstColumn="1" w:lastColumn="0" w:oddVBand="0" w:evenVBand="0" w:oddHBand="0" w:evenHBand="0" w:firstRowFirstColumn="0" w:firstRowLastColumn="0" w:lastRowFirstColumn="0" w:lastRowLastColumn="0"/>
+            <w:tcW w:w="1555" w:type="dxa"/>
+          </w:tcPr>
+          <w:p>
+            <w:pPr>
+              <w:rPr>
+                <w:b w:val="0"/>
+                <w:bCs w:val="0"/>
+              </w:rPr>
+            </w:pPr>
+            <w:r>
+              <w:rPr>
+                <w:b w:val="0"/>
+                <w:bCs w:val="0"/>
+              </w:rPr>
+              <w:t>Goal</w:t>
+            </w:r>
+          </w:p>
+        </w:tc>
+        <w:tc>
+          <w:tcPr>
+            <w:tcW w:w="3402" w:type="dxa"/>
+          </w:tcPr>
+          <w:p>
+            <w:pPr>
+              <w:cnfStyle w:val="000000000000" w:firstRow="0" w:lastRow="0" w:firstColumn="0" w:lastColumn="0" w:oddVBand="0" w:evenVBand="0" w:oddHBand="0" w:evenHBand="0" w:firstRowFirstColumn="0" w:firstRowLastColumn="0" w:lastRowFirstColumn="0" w:lastRowLastColumn="0"/>
+            </w:pPr>
+            <w:r>
+              <w:t>Check each requested item against the load list as its loaded</w:t>
+            </w:r>
+          </w:p>
+        </w:tc>
+        <w:tc>
+          <w:tcPr>
+            <w:tcW w:w="4059" w:type="dxa"/>
+          </w:tcPr>
+          <w:p>
+            <w:pPr>
+              <w:cnfStyle w:val="000000000000" w:firstRow="0" w:lastRow="0" w:firstColumn="0" w:lastColumn="0" w:oddVBand="0" w:evenVBand="0" w:oddHBand="0" w:evenHBand="0" w:firstRowFirstColumn="0" w:firstRowLastColumn="0" w:lastRowFirstColumn="0" w:lastRowLastColumn="0"/>
+            </w:pPr>
+            <w:r>
+              <w:t>The goal is meaningful and visible outside the system</w:t>
+            </w:r>
+            <w:r>
+              <w:t>.</w:t>
+            </w:r>
+          </w:p>
+        </w:tc>
+      </w:tr>
+      <w:tr>
+        <w:trPr>
+          <w:cnfStyle w:val="000000100000" w:firstRow="0" w:lastRow="0" w:firstColumn="0" w:lastColumn="0" w:oddVBand="0" w:evenVBand="0" w:oddHBand="1" w:evenHBand="0" w:firstRowFirstColumn="0" w:firstRowLastColumn="0" w:lastRowFirstColumn="0" w:lastRowLastColumn="0"/>
+        </w:trPr>
+        <w:tc>
+          <w:tcPr>
+            <w:cnfStyle w:val="001000000000" w:firstRow="0" w:lastRow="0" w:firstColumn="1" w:lastColumn="0" w:oddVBand="0" w:evenVBand="0" w:oddHBand="0" w:evenHBand="0" w:firstRowFirstColumn="0" w:firstRowLastColumn="0" w:lastRowFirstColumn="0" w:lastRowLastColumn="0"/>
+            <w:tcW w:w="1555" w:type="dxa"/>
+          </w:tcPr>
+          <w:p>
+            <w:pPr>
+              <w:rPr>
+                <w:b w:val="0"/>
+                <w:bCs w:val="0"/>
+              </w:rPr>
+            </w:pPr>
+            <w:r>
+              <w:rPr>
+                <w:b w:val="0"/>
+                <w:bCs w:val="0"/>
+              </w:rPr>
+              <w:t>Benefit</w:t>
+            </w:r>
+          </w:p>
+        </w:tc>
+        <w:tc>
+          <w:tcPr>
+            <w:tcW w:w="3402" w:type="dxa"/>
+          </w:tcPr>
+          <w:p>
+            <w:pPr>
+              <w:cnfStyle w:val="000000100000" w:firstRow="0" w:lastRow="0" w:firstColumn="0" w:lastColumn="0" w:oddVBand="0" w:evenVBand="0" w:oddHBand="1" w:evenHBand="0" w:firstRowFirstColumn="0" w:firstRowLastColumn="0" w:lastRowFirstColumn="0" w:lastRowLastColumn="0"/>
+            </w:pPr>
+            <w:r>
+              <w:t>Requested material reaches the correct stop</w:t>
+            </w:r>
+          </w:p>
+        </w:tc>
+        <w:tc>
+          <w:tcPr>
+            <w:tcW w:w="4059" w:type="dxa"/>
+          </w:tcPr>
+          <w:p>
+            <w:pPr>
+              <w:cnfStyle w:val="000000100000" w:firstRow="0" w:lastRow="0" w:firstColumn="0" w:lastColumn="0" w:oddVBand="0" w:evenVBand="0" w:oddHBand="1" w:evenHBand="0" w:firstRowFirstColumn="0" w:firstRowLastColumn="0" w:lastRowFirstColumn="0" w:lastRowLastColumn="0"/>
+            </w:pPr>
+            <w:r>
+              <w:t xml:space="preserve">The benefit links to material being loaded </w:t>
+            </w:r>
+            <w:r>
+              <w:t>onto</w:t>
+            </w:r>
+            <w:r>
+              <w:t xml:space="preserve"> the wrong vehicle</w:t>
+            </w:r>
+            <w:r>
+              <w:t xml:space="preserve"> (P1).</w:t>
+            </w:r>
+          </w:p>
+        </w:tc>
+      </w:tr>
+    </w:tbl>
+    <w:p>
+      <w:pPr>
+        <w:ind w:left="709"/>
       </w:pPr>
     </w:p>
+    <w:p>
+      <w:pPr>
+        <w:ind w:left="709"/>
+      </w:pPr>
+    </w:p>
+    <w:p>
+      <w:pPr>
+        <w:ind w:left="709"/>
+      </w:pPr>
+    </w:p>
+    <w:p>
+      <w:pPr>
+        <w:ind w:left="709"/>
+      </w:pPr>
+    </w:p>
+    <w:p>
+      <w:pPr>
+        <w:ind w:left="709"/>
+      </w:pPr>
+    </w:p>
+    <w:p>
+      <w:pPr>
+        <w:ind w:left="709"/>
+      </w:pPr>
+    </w:p>
+    <w:p>
+      <w:pPr>
+        <w:ind w:left="709"/>
+      </w:pPr>
+    </w:p>
+    <w:p>
+      <w:pPr>
+        <w:ind w:left="709"/>
+      </w:pPr>
+    </w:p>
+    <w:p>
+      <w:pPr>
+        <w:pStyle w:val="Heading2"/>
+        <w:numPr>
+          <w:ilvl w:val="1"/>
+          <w:numId w:val="1"/>
+        </w:numPr>
+      </w:pPr>
+      <w:bookmarkStart w:id="30" w:name="_Toc243295423"/>
+      <w:r>
+        <w:t>Develop user stories</w:t>
+      </w:r>
+      <w:bookmarkEnd w:id="30"/>
+    </w:p>
+    <w:tbl>
+      <w:tblPr>
+        <w:tblStyle w:val="PlainTable1"/>
+        <w:tblW w:w="0" w:type="auto"/>
+        <w:tblLook w:val="04A0" w:firstRow="1" w:lastRow="0" w:firstColumn="1" w:lastColumn="0" w:noHBand="0" w:noVBand="1"/>
+      </w:tblPr>
+      <w:tblGrid>
+        <w:gridCol w:w="1123"/>
+        <w:gridCol w:w="1637"/>
+        <w:gridCol w:w="4025"/>
+        <w:gridCol w:w="2231"/>
+      </w:tblGrid>
+      <w:tr>
+        <w:trPr>
+          <w:cnfStyle w:val="100000000000" w:firstRow="1" w:lastRow="0" w:firstColumn="0" w:lastColumn="0" w:oddVBand="0" w:evenVBand="0" w:oddHBand="0" w:evenHBand="0" w:firstRowFirstColumn="0" w:firstRowLastColumn="0" w:lastRowFirstColumn="0" w:lastRowLastColumn="0"/>
+        </w:trPr>
+        <w:tc>
+          <w:tcPr>
+            <w:cnfStyle w:val="001000000000" w:firstRow="0" w:lastRow="0" w:firstColumn="1" w:lastColumn="0" w:oddVBand="0" w:evenVBand="0" w:oddHBand="0" w:evenHBand="0" w:firstRowFirstColumn="0" w:firstRowLastColumn="0" w:lastRowFirstColumn="0" w:lastRowLastColumn="0"/>
+            <w:tcW w:w="1129" w:type="dxa"/>
+          </w:tcPr>
+          <w:p>
+            <w:r>
+              <w:t>Story ID</w:t>
+            </w:r>
+          </w:p>
+        </w:tc>
+        <w:tc>
+          <w:tcPr>
+            <w:tcW w:w="1560" w:type="dxa"/>
+          </w:tcPr>
+          <w:p>
+            <w:pPr>
+              <w:cnfStyle w:val="100000000000" w:firstRow="1" w:lastRow="0" w:firstColumn="0" w:lastColumn="0" w:oddVBand="0" w:evenVBand="0" w:oddHBand="0" w:evenHBand="0" w:firstRowFirstColumn="0" w:firstRowLastColumn="0" w:lastRowFirstColumn="0" w:lastRowLastColumn="0"/>
+            </w:pPr>
+            <w:r>
+              <w:t>Requirement</w:t>
+            </w:r>
+          </w:p>
+        </w:tc>
+        <w:tc>
+          <w:tcPr>
+            <w:tcW w:w="4076" w:type="dxa"/>
+          </w:tcPr>
+          <w:p>
+            <w:pPr>
+              <w:cnfStyle w:val="100000000000" w:firstRow="1" w:lastRow="0" w:firstColumn="0" w:lastColumn="0" w:oddVBand="0" w:evenVBand="0" w:oddHBand="0" w:evenHBand="0" w:firstRowFirstColumn="0" w:firstRowLastColumn="0" w:lastRowFirstColumn="0" w:lastRowLastColumn="0"/>
+            </w:pPr>
+            <w:r>
+              <w:t>Role-goal</w:t>
+            </w:r>
+            <w:r>
+              <w:t>-benefit user story</w:t>
+            </w:r>
+          </w:p>
+        </w:tc>
+        <w:tc>
+          <w:tcPr>
+            <w:tcW w:w="2251" w:type="dxa"/>
+          </w:tcPr>
+          <w:p>
+            <w:pPr>
+              <w:cnfStyle w:val="100000000000" w:firstRow="1" w:lastRow="0" w:firstColumn="0" w:lastColumn="0" w:oddVBand="0" w:evenVBand="0" w:oddHBand="0" w:evenHBand="0" w:firstRowFirstColumn="0" w:firstRowLastColumn="0" w:lastRowFirstColumn="0" w:lastRowLastColumn="0"/>
+            </w:pPr>
+            <w:r>
+              <w:t>MoSCoW</w:t>
+            </w:r>
+          </w:p>
+        </w:tc>
+      </w:tr>
+      <w:tr>
+        <w:trPr>
+          <w:cnfStyle w:val="000000100000" w:firstRow="0" w:lastRow="0" w:firstColumn="0" w:lastColumn="0" w:oddVBand="0" w:evenVBand="0" w:oddHBand="1" w:evenHBand="0" w:firstRowFirstColumn="0" w:firstRowLastColumn="0" w:lastRowFirstColumn="0" w:lastRowLastColumn="0"/>
+        </w:trPr>
+        <w:tc>
+          <w:tcPr>
+            <w:cnfStyle w:val="001000000000" w:firstRow="0" w:lastRow="0" w:firstColumn="1" w:lastColumn="0" w:oddVBand="0" w:evenVBand="0" w:oddHBand="0" w:evenHBand="0" w:firstRowFirstColumn="0" w:firstRowLastColumn="0" w:lastRowFirstColumn="0" w:lastRowLastColumn="0"/>
+            <w:tcW w:w="1129" w:type="dxa"/>
+          </w:tcPr>
+          <w:p>
+            <w:pPr>
+              <w:rPr>
+                <w:b w:val="0"/>
+                <w:bCs w:val="0"/>
+              </w:rPr>
+            </w:pPr>
+            <w:r>
+              <w:rPr>
+                <w:b w:val="0"/>
+                <w:bCs w:val="0"/>
+              </w:rPr>
+              <w:t>US01</w:t>
+            </w:r>
+          </w:p>
+        </w:tc>
+        <w:tc>
+          <w:tcPr>
+            <w:tcW w:w="1560" w:type="dxa"/>
+          </w:tcPr>
+          <w:p>
+            <w:pPr>
+              <w:cnfStyle w:val="000000100000" w:firstRow="0" w:lastRow="0" w:firstColumn="0" w:lastColumn="0" w:oddVBand="0" w:evenVBand="0" w:oddHBand="1" w:evenHBand="0" w:firstRowFirstColumn="0" w:firstRowLastColumn="0" w:lastRowFirstColumn="0" w:lastRowLastColumn="0"/>
+            </w:pPr>
+            <w:r>
+              <w:t>FR02</w:t>
+            </w:r>
+          </w:p>
+        </w:tc>
+        <w:tc>
+          <w:tcPr>
+            <w:tcW w:w="4076" w:type="dxa"/>
+          </w:tcPr>
+          <w:p>
+            <w:pPr>
+              <w:cnfStyle w:val="000000100000" w:firstRow="0" w:lastRow="0" w:firstColumn="0" w:lastColumn="0" w:oddVBand="0" w:evenVBand="0" w:oddHBand="1" w:evenHBand="0" w:firstRowFirstColumn="0" w:firstRowLastColumn="0" w:lastRowFirstColumn="0" w:lastRowLastColumn="0"/>
+            </w:pPr>
+            <w:r>
+              <w:t>As a route coordinator, I want to change the stop order for a single visit, so that the driver follows the order that applies that day</w:t>
+            </w:r>
+          </w:p>
+        </w:tc>
+        <w:tc>
+          <w:tcPr>
+            <w:tcW w:w="2251" w:type="dxa"/>
+          </w:tcPr>
+          <w:p>
+            <w:pPr>
+              <w:cnfStyle w:val="000000100000" w:firstRow="0" w:lastRow="0" w:firstColumn="0" w:lastColumn="0" w:oddVBand="0" w:evenVBand="0" w:oddHBand="1" w:evenHBand="0" w:firstRowFirstColumn="0" w:firstRowLastColumn="0" w:lastRowFirstColumn="0" w:lastRowLastColumn="0"/>
+            </w:pPr>
+            <w:r>
+              <w:t>Must</w:t>
+            </w:r>
+          </w:p>
+        </w:tc>
+      </w:tr>
+      <w:tr>
+        <w:tc>
+          <w:tcPr>
+            <w:cnfStyle w:val="001000000000" w:firstRow="0" w:lastRow="0" w:firstColumn="1" w:lastColumn="0" w:oddVBand="0" w:evenVBand="0" w:oddHBand="0" w:evenHBand="0" w:firstRowFirstColumn="0" w:firstRowLastColumn="0" w:lastRowFirstColumn="0" w:lastRowLastColumn="0"/>
+            <w:tcW w:w="1129" w:type="dxa"/>
+          </w:tcPr>
+          <w:p>
+            <w:pPr>
+              <w:rPr>
+                <w:b w:val="0"/>
+                <w:bCs w:val="0"/>
+              </w:rPr>
+            </w:pPr>
+            <w:r>
+              <w:rPr>
+                <w:b w:val="0"/>
+                <w:bCs w:val="0"/>
+              </w:rPr>
+              <w:t>US02</w:t>
+            </w:r>
+          </w:p>
+        </w:tc>
+        <w:tc>
+          <w:tcPr>
+            <w:tcW w:w="1560" w:type="dxa"/>
+          </w:tcPr>
+          <w:p>
+            <w:pPr>
+              <w:cnfStyle w:val="000000000000" w:firstRow="0" w:lastRow="0" w:firstColumn="0" w:lastColumn="0" w:oddVBand="0" w:evenVBand="0" w:oddHBand="0" w:evenHBand="0" w:firstRowFirstColumn="0" w:firstRowLastColumn="0" w:lastRowFirstColumn="0" w:lastRowLastColumn="0"/>
+            </w:pPr>
+            <w:r>
+              <w:t>FR04</w:t>
+            </w:r>
+          </w:p>
+        </w:tc>
+        <w:tc>
+          <w:tcPr>
+            <w:tcW w:w="4076" w:type="dxa"/>
+          </w:tcPr>
+          <w:p>
+            <w:pPr>
+              <w:cnfStyle w:val="000000000000" w:firstRow="0" w:lastRow="0" w:firstColumn="0" w:lastColumn="0" w:oddVBand="0" w:evenVBand="0" w:oddHBand="0" w:evenHBand="0" w:firstRowFirstColumn="0" w:firstRowLastColumn="0" w:lastRowFirstColumn="0" w:lastRowLastColumn="0"/>
+            </w:pPr>
+            <w:r>
+              <w:t>As a branch staff member, I want to record a request for a title, edition or topic, so that the borrower can collect it from the van.</w:t>
+            </w:r>
+          </w:p>
+        </w:tc>
+        <w:tc>
+          <w:tcPr>
+            <w:tcW w:w="2251" w:type="dxa"/>
+          </w:tcPr>
+          <w:p>
+            <w:pPr>
+              <w:cnfStyle w:val="000000000000" w:firstRow="0" w:lastRow="0" w:firstColumn="0" w:lastColumn="0" w:oddVBand="0" w:evenVBand="0" w:oddHBand="0" w:evenHBand="0" w:firstRowFirstColumn="0" w:firstRowLastColumn="0" w:lastRowFirstColumn="0" w:lastRowLastColumn="0"/>
+            </w:pPr>
+            <w:r>
+              <w:t>Must</w:t>
+            </w:r>
+          </w:p>
+        </w:tc>
+      </w:tr>
+      <w:tr>
+        <w:trPr>
+          <w:cnfStyle w:val="000000100000" w:firstRow="0" w:lastRow="0" w:firstColumn="0" w:lastColumn="0" w:oddVBand="0" w:evenVBand="0" w:oddHBand="1" w:evenHBand="0" w:firstRowFirstColumn="0" w:firstRowLastColumn="0" w:lastRowFirstColumn="0" w:lastRowLastColumn="0"/>
+        </w:trPr>
+        <w:tc>
+          <w:tcPr>
+            <w:cnfStyle w:val="001000000000" w:firstRow="0" w:lastRow="0" w:firstColumn="1" w:lastColumn="0" w:oddVBand="0" w:evenVBand="0" w:oddHBand="0" w:evenHBand="0" w:firstRowFirstColumn="0" w:firstRowLastColumn="0" w:lastRowFirstColumn="0" w:lastRowLastColumn="0"/>
+            <w:tcW w:w="1129" w:type="dxa"/>
+          </w:tcPr>
+          <w:p>
+            <w:pPr>
+              <w:rPr>
+                <w:b w:val="0"/>
+                <w:bCs w:val="0"/>
+              </w:rPr>
+            </w:pPr>
+            <w:r>
+              <w:rPr>
+                <w:b w:val="0"/>
+                <w:bCs w:val="0"/>
+              </w:rPr>
+              <w:t>US03</w:t>
+            </w:r>
+          </w:p>
+        </w:tc>
+        <w:tc>
+          <w:tcPr>
+            <w:tcW w:w="1560" w:type="dxa"/>
+          </w:tcPr>
+          <w:p>
+            <w:pPr>
+              <w:cnfStyle w:val="000000100000" w:firstRow="0" w:lastRow="0" w:firstColumn="0" w:lastColumn="0" w:oddVBand="0" w:evenVBand="0" w:oddHBand="1" w:evenHBand="0" w:firstRowFirstColumn="0" w:firstRowLastColumn="0" w:lastRowFirstColumn="0" w:lastRowLastColumn="0"/>
+            </w:pPr>
+            <w:r>
+              <w:t>FR05</w:t>
+            </w:r>
+          </w:p>
+        </w:tc>
+        <w:tc>
+          <w:tcPr>
+            <w:tcW w:w="4076" w:type="dxa"/>
+          </w:tcPr>
+          <w:p>
+            <w:pPr>
+              <w:cnfStyle w:val="000000100000" w:firstRow="0" w:lastRow="0" w:firstColumn="0" w:lastColumn="0" w:oddVBand="0" w:evenVBand="0" w:oddHBand="1" w:evenHBand="0" w:firstRowFirstColumn="0" w:firstRowLastColumn="0" w:lastRowFirstColumn="0" w:lastRowLastColumn="0"/>
+            </w:pPr>
+            <w:r>
+              <w:t xml:space="preserve">As a branch staff member, I want each requested item linked to one route visit, so that I know which record is </w:t>
+            </w:r>
+            <w:r>
+              <w:t>current.</w:t>
+            </w:r>
+          </w:p>
+        </w:tc>
+        <w:tc>
+          <w:tcPr>
+            <w:tcW w:w="2251" w:type="dxa"/>
+          </w:tcPr>
+          <w:p>
+            <w:pPr>
+              <w:cnfStyle w:val="000000100000" w:firstRow="0" w:lastRow="0" w:firstColumn="0" w:lastColumn="0" w:oddVBand="0" w:evenVBand="0" w:oddHBand="1" w:evenHBand="0" w:firstRowFirstColumn="0" w:firstRowLastColumn="0" w:lastRowFirstColumn="0" w:lastRowLastColumn="0"/>
+            </w:pPr>
+            <w:r>
+              <w:t xml:space="preserve">Must </w:t>
+            </w:r>
+          </w:p>
+        </w:tc>
+      </w:tr>
+      <w:tr>
+        <w:tc>
+          <w:tcPr>
+            <w:cnfStyle w:val="001000000000" w:firstRow="0" w:lastRow="0" w:firstColumn="1" w:lastColumn="0" w:oddVBand="0" w:evenVBand="0" w:oddHBand="0" w:evenHBand="0" w:firstRowFirstColumn="0" w:firstRowLastColumn="0" w:lastRowFirstColumn="0" w:lastRowLastColumn="0"/>
+            <w:tcW w:w="1129" w:type="dxa"/>
+          </w:tcPr>
+          <w:p>
+            <w:pPr>
+              <w:rPr>
+                <w:b w:val="0"/>
+                <w:bCs w:val="0"/>
+              </w:rPr>
+            </w:pPr>
+            <w:r>
+              <w:rPr>
+                <w:b w:val="0"/>
+                <w:bCs w:val="0"/>
+              </w:rPr>
+              <w:t>US04</w:t>
+            </w:r>
+          </w:p>
+        </w:tc>
+        <w:tc>
+          <w:tcPr>
+            <w:tcW w:w="1560" w:type="dxa"/>
+          </w:tcPr>
+          <w:p>
+            <w:pPr>
+              <w:cnfStyle w:val="000000000000" w:firstRow="0" w:lastRow="0" w:firstColumn="0" w:lastColumn="0" w:oddVBand="0" w:evenVBand="0" w:oddHBand="0" w:evenHBand="0" w:firstRowFirstColumn="0" w:firstRowLastColumn="0" w:lastRowFirstColumn="0" w:lastRowLastColumn="0"/>
+            </w:pPr>
+            <w:r>
+              <w:t>FR07</w:t>
+            </w:r>
+          </w:p>
+        </w:tc>
+        <w:tc>
+          <w:tcPr>
+            <w:tcW w:w="4076" w:type="dxa"/>
+          </w:tcPr>
+          <w:p>
+            <w:pPr>
+              <w:cnfStyle w:val="000000000000" w:firstRow="0" w:lastRow="0" w:firstColumn="0" w:lastColumn="0" w:oddVBand="0" w:evenVBand="0" w:oddHBand="0" w:evenHBand="0" w:firstRowFirstColumn="0" w:firstRowLastColumn="0" w:lastRowFirstColumn="0" w:lastRowLastColumn="0"/>
+            </w:pPr>
+            <w:r>
+              <w:t xml:space="preserve">As a mobile-library staff member, I want to check each requested item against the load list as it is loaded, so that the requested material reaches the correct stop. </w:t>
+            </w:r>
+          </w:p>
+        </w:tc>
+        <w:tc>
+          <w:tcPr>
+            <w:tcW w:w="2251" w:type="dxa"/>
+          </w:tcPr>
+          <w:p>
+            <w:pPr>
+              <w:cnfStyle w:val="000000000000" w:firstRow="0" w:lastRow="0" w:firstColumn="0" w:lastColumn="0" w:oddVBand="0" w:evenVBand="0" w:oddHBand="0" w:evenHBand="0" w:firstRowFirstColumn="0" w:firstRowLastColumn="0" w:lastRowFirstColumn="0" w:lastRowLastColumn="0"/>
+            </w:pPr>
+            <w:r>
+              <w:t>Must</w:t>
+            </w:r>
+          </w:p>
+        </w:tc>
+      </w:tr>
+      <w:tr>
+        <w:trPr>
+          <w:cnfStyle w:val="000000100000" w:firstRow="0" w:lastRow="0" w:firstColumn="0" w:lastColumn="0" w:oddVBand="0" w:evenVBand="0" w:oddHBand="1" w:evenHBand="0" w:firstRowFirstColumn="0" w:firstRowLastColumn="0" w:lastRowFirstColumn="0" w:lastRowLastColumn="0"/>
+        </w:trPr>
+        <w:tc>
+          <w:tcPr>
+            <w:cnfStyle w:val="001000000000" w:firstRow="0" w:lastRow="0" w:firstColumn="1" w:lastColumn="0" w:oddVBand="0" w:evenVBand="0" w:oddHBand="0" w:evenHBand="0" w:firstRowFirstColumn="0" w:firstRowLastColumn="0" w:lastRowFirstColumn="0" w:lastRowLastColumn="0"/>
+            <w:tcW w:w="1129" w:type="dxa"/>
+          </w:tcPr>
+          <w:p>
+            <w:pPr>
+              <w:rPr>
+                <w:b w:val="0"/>
+                <w:bCs w:val="0"/>
+              </w:rPr>
+            </w:pPr>
+            <w:r>
+              <w:rPr>
+                <w:b w:val="0"/>
+                <w:bCs w:val="0"/>
+              </w:rPr>
+              <w:t>US05</w:t>
+            </w:r>
+          </w:p>
+        </w:tc>
+        <w:tc>
+          <w:tcPr>
+            <w:tcW w:w="1560" w:type="dxa"/>
+          </w:tcPr>
+          <w:p>
+            <w:pPr>
+              <w:cnfStyle w:val="000000100000" w:firstRow="0" w:lastRow="0" w:firstColumn="0" w:lastColumn="0" w:oddVBand="0" w:evenVBand="0" w:oddHBand="1" w:evenHBand="0" w:firstRowFirstColumn="0" w:firstRowLastColumn="0" w:lastRowFirstColumn="0" w:lastRowLastColumn="0"/>
+            </w:pPr>
+            <w:r>
+              <w:t>FR09</w:t>
+            </w:r>
+          </w:p>
+        </w:tc>
+        <w:tc>
+          <w:tcPr>
+            <w:tcW w:w="4076" w:type="dxa"/>
+          </w:tcPr>
+          <w:p>
+            <w:pPr>
+              <w:cnfStyle w:val="000000100000" w:firstRow="0" w:lastRow="0" w:firstColumn="0" w:lastColumn="0" w:oddVBand="0" w:evenVBand="0" w:oddHBand="1" w:evenHBand="0" w:firstRowFirstColumn="0" w:firstRowLastColumn="0" w:lastRowFirstColumn="0" w:lastRowLastColumn="0"/>
+            </w:pPr>
+            <w:r>
+              <w:t xml:space="preserve">As a community coordinator, I want to be told when a visit to my stop </w:t>
+            </w:r>
+            <w:r>
+              <w:t>is moved or cancelled, so that I can tell local borrowers in advance whether the van is coming or not</w:t>
+            </w:r>
+          </w:p>
+        </w:tc>
+        <w:tc>
+          <w:tcPr>
+            <w:tcW w:w="2251" w:type="dxa"/>
+          </w:tcPr>
+          <w:p>
+            <w:pPr>
+              <w:cnfStyle w:val="000000100000" w:firstRow="0" w:lastRow="0" w:firstColumn="0" w:lastColumn="0" w:oddVBand="0" w:evenVBand="0" w:oddHBand="1" w:evenHBand="0" w:firstRowFirstColumn="0" w:firstRowLastColumn="0" w:lastRowFirstColumn="0" w:lastRowLastColumn="0"/>
+            </w:pPr>
+            <w:r>
+              <w:t>Must</w:t>
+            </w:r>
+          </w:p>
+        </w:tc>
+      </w:tr>
+      <w:tr>
+        <w:tc>
+          <w:tcPr>
+            <w:cnfStyle w:val="001000000000" w:firstRow="0" w:lastRow="0" w:firstColumn="1" w:lastColumn="0" w:oddVBand="0" w:evenVBand="0" w:oddHBand="0" w:evenHBand="0" w:firstRowFirstColumn="0" w:firstRowLastColumn="0" w:lastRowFirstColumn="0" w:lastRowLastColumn="0"/>
+            <w:tcW w:w="1129" w:type="dxa"/>
+          </w:tcPr>
+          <w:p>
+            <w:pPr>
+              <w:rPr>
+                <w:b w:val="0"/>
+                <w:bCs w:val="0"/>
+              </w:rPr>
+            </w:pPr>
+            <w:r>
+              <w:rPr>
+                <w:b w:val="0"/>
+                <w:bCs w:val="0"/>
+              </w:rPr>
+              <w:t>US06</w:t>
+            </w:r>
+          </w:p>
+        </w:tc>
+        <w:tc>
+          <w:tcPr>
+            <w:tcW w:w="1560" w:type="dxa"/>
+          </w:tcPr>
+          <w:p>
+            <w:pPr>
+              <w:cnfStyle w:val="000000000000" w:firstRow="0" w:lastRow="0" w:firstColumn="0" w:lastColumn="0" w:oddVBand="0" w:evenVBand="0" w:oddHBand="0" w:evenHBand="0" w:firstRowFirstColumn="0" w:firstRowLastColumn="0" w:lastRowFirstColumn="0" w:lastRowLastColumn="0"/>
+            </w:pPr>
+            <w:r>
+              <w:t>FR10</w:t>
+            </w:r>
+          </w:p>
+        </w:tc>
+        <w:tc>
+          <w:tcPr>
+            <w:tcW w:w="4076" w:type="dxa"/>
+          </w:tcPr>
+          <w:p>
+            <w:pPr>
+              <w:cnfStyle w:val="000000000000" w:firstRow="0" w:lastRow="0" w:firstColumn="0" w:lastColumn="0" w:oddVBand="0" w:evenVBand="0" w:oddHBand="0" w:evenHBand="0" w:firstRowFirstColumn="0" w:firstRowLastColumn="0" w:lastRowFirstColumn="0" w:lastRowLastColumn="0"/>
+            </w:pPr>
+            <w:r>
+              <w:t>As a borrower, I want my choice about an alternative item recorded, so that my original request is not cancelled without my agreement</w:t>
+            </w:r>
+          </w:p>
+        </w:tc>
+        <w:tc>
+          <w:tcPr>
+            <w:tcW w:w="2251" w:type="dxa"/>
+          </w:tcPr>
+          <w:p>
+            <w:pPr>
+              <w:cnfStyle w:val="000000000000" w:firstRow="0" w:lastRow="0" w:firstColumn="0" w:lastColumn="0" w:oddVBand="0" w:evenVBand="0" w:oddHBand="0" w:evenHBand="0" w:firstRowFirstColumn="0" w:firstRowLastColumn="0" w:lastRowFirstColumn="0" w:lastRowLastColumn="0"/>
+            </w:pPr>
+            <w:r>
+              <w:t>Should</w:t>
+            </w:r>
+          </w:p>
+        </w:tc>
+      </w:tr>
+      <w:tr>
+        <w:trPr>
+          <w:cnfStyle w:val="000000100000" w:firstRow="0" w:lastRow="0" w:firstColumn="0" w:lastColumn="0" w:oddVBand="0" w:evenVBand="0" w:oddHBand="1" w:evenHBand="0" w:firstRowFirstColumn="0" w:firstRowLastColumn="0" w:lastRowFirstColumn="0" w:lastRowLastColumn="0"/>
+        </w:trPr>
+        <w:tc>
+          <w:tcPr>
+            <w:cnfStyle w:val="001000000000" w:firstRow="0" w:lastRow="0" w:firstColumn="1" w:lastColumn="0" w:oddVBand="0" w:evenVBand="0" w:oddHBand="0" w:evenHBand="0" w:firstRowFirstColumn="0" w:firstRowLastColumn="0" w:lastRowFirstColumn="0" w:lastRowLastColumn="0"/>
+            <w:tcW w:w="1129" w:type="dxa"/>
+          </w:tcPr>
+          <w:p>
+            <w:pPr>
+              <w:rPr>
+                <w:b w:val="0"/>
+                <w:bCs w:val="0"/>
+              </w:rPr>
+            </w:pPr>
+            <w:r>
+              <w:rPr>
+                <w:b w:val="0"/>
+                <w:bCs w:val="0"/>
+              </w:rPr>
+              <w:t>US07</w:t>
+            </w:r>
+          </w:p>
+        </w:tc>
+        <w:tc>
+          <w:tcPr>
+            <w:tcW w:w="1560" w:type="dxa"/>
+          </w:tcPr>
+          <w:p>
+            <w:pPr>
+              <w:cnfStyle w:val="000000100000" w:firstRow="0" w:lastRow="0" w:firstColumn="0" w:lastColumn="0" w:oddVBand="0" w:evenVBand="0" w:oddHBand="1" w:evenHBand="0" w:firstRowFirstColumn="0" w:firstRowLastColumn="0" w:lastRowFirstColumn="0" w:lastRowLastColumn="0"/>
+            </w:pPr>
+            <w:r>
+              <w:t>FR11</w:t>
+            </w:r>
+          </w:p>
+        </w:tc>
+        <w:tc>
+          <w:tcPr>
+            <w:tcW w:w="4076" w:type="dxa"/>
+          </w:tcPr>
+          <w:p>
+            <w:pPr>
+              <w:cnfStyle w:val="000000100000" w:firstRow="0" w:lastRow="0" w:firstColumn="0" w:lastColumn="0" w:oddVBand="0" w:evenVBand="0" w:oddHBand="1" w:evenHBand="0" w:firstRowFirstColumn="0" w:firstRowLastColumn="0" w:lastRowFirstColumn="0" w:lastRowLastColumn="0"/>
+            </w:pPr>
+            <w:r>
+              <w:t>As a mobile-library staff member I want to record loans and returns with no connection, so that the service continues at stops with poor signal.</w:t>
+            </w:r>
+          </w:p>
+        </w:tc>
+        <w:tc>
+          <w:tcPr>
+            <w:tcW w:w="2251" w:type="dxa"/>
+          </w:tcPr>
+          <w:p>
+            <w:pPr>
+              <w:cnfStyle w:val="000000100000" w:firstRow="0" w:lastRow="0" w:firstColumn="0" w:lastColumn="0" w:oddVBand="0" w:evenVBand="0" w:oddHBand="1" w:evenHBand="0" w:firstRowFirstColumn="0" w:firstRowLastColumn="0" w:lastRowFirstColumn="0" w:lastRowLastColumn="0"/>
+            </w:pPr>
+            <w:r>
+              <w:t>Must</w:t>
+            </w:r>
+          </w:p>
+        </w:tc>
+      </w:tr>
+      <w:tr>
+        <w:tc>
+          <w:tcPr>
+            <w:cnfStyle w:val="001000000000" w:firstRow="0" w:lastRow="0" w:firstColumn="1" w:lastColumn="0" w:oddVBand="0" w:evenVBand="0" w:oddHBand="0" w:evenHBand="0" w:firstRowFirstColumn="0" w:firstRowLastColumn="0" w:lastRowFirstColumn="0" w:lastRowLastColumn="0"/>
+            <w:tcW w:w="1129" w:type="dxa"/>
+          </w:tcPr>
+          <w:p>
+            <w:pPr>
+              <w:rPr>
+                <w:b w:val="0"/>
+                <w:bCs w:val="0"/>
+              </w:rPr>
+            </w:pPr>
+            <w:r>
+              <w:rPr>
+                <w:b w:val="0"/>
+                <w:bCs w:val="0"/>
+              </w:rPr>
+              <w:t>US08</w:t>
+            </w:r>
+          </w:p>
+        </w:tc>
+        <w:tc>
+          <w:tcPr>
+            <w:tcW w:w="1560" w:type="dxa"/>
+          </w:tcPr>
+          <w:p>
+            <w:pPr>
+              <w:cnfStyle w:val="000000000000" w:firstRow="0" w:lastRow="0" w:firstColumn="0" w:lastColumn="0" w:oddVBand="0" w:evenVBand="0" w:oddHBand="0" w:evenHBand="0" w:firstRowFirstColumn="0" w:firstRowLastColumn="0" w:lastRowFirstColumn="0" w:lastRowLastColumn="0"/>
+            </w:pPr>
+            <w:r>
+              <w:t>FR13</w:t>
+            </w:r>
+          </w:p>
+        </w:tc>
+        <w:tc>
+          <w:tcPr>
+            <w:tcW w:w="4076" w:type="dxa"/>
+          </w:tcPr>
+          <w:p>
+            <w:pPr>
+              <w:cnfStyle w:val="000000000000" w:firstRow="0" w:lastRow="0" w:firstColumn="0" w:lastColumn="0" w:oddVBand="0" w:evenVBand="0" w:oddHBand="0" w:evenHBand="0" w:firstRowFirstColumn="0" w:firstRowLastColumn="0" w:lastRowFirstColumn="0" w:lastRowLastColumn="0"/>
+            </w:pPr>
+            <w:r>
+              <w:t>As a mobile-library staff member, I want to record who collected material for a borrower, so that items are not given out wrongly</w:t>
+            </w:r>
+          </w:p>
+        </w:tc>
+        <w:tc>
+          <w:tcPr>
+            <w:tcW w:w="2251" w:type="dxa"/>
+          </w:tcPr>
+          <w:p>
+            <w:pPr>
+              <w:cnfStyle w:val="000000000000" w:firstRow="0" w:lastRow="0" w:firstColumn="0" w:lastColumn="0" w:oddVBand="0" w:evenVBand="0" w:oddHBand="0" w:evenHBand="0" w:firstRowFirstColumn="0" w:firstRowLastColumn="0" w:lastRowFirstColumn="0" w:lastRowLastColumn="0"/>
+            </w:pPr>
+            <w:r>
+              <w:t xml:space="preserve">Should </w:t>
+            </w:r>
+            <w:r>
+              <w:t xml:space="preserve"> </w:t>
+            </w:r>
+          </w:p>
+        </w:tc>
+      </w:tr>
+    </w:tbl>
+    <w:p/>
+    <w:p/>
+    <w:p/>
+    <w:p/>
+    <w:p/>
+    <w:p>
+      <w:pPr>
+        <w:pStyle w:val="Heading2"/>
+        <w:numPr>
+          <w:ilvl w:val="1"/>
+          <w:numId w:val="1"/>
+        </w:numPr>
+      </w:pPr>
+      <w:bookmarkStart w:id="31" w:name="_Toc243295424"/>
+      <w:r>
+        <w:t>Acceptance criteria</w:t>
+      </w:r>
+      <w:bookmarkEnd w:id="31"/>
+    </w:p>
+    <w:p/>
+    <w:p>
+      <w:pPr>
+        <w:pStyle w:val="Subtitle"/>
+      </w:pPr>
+      <w:r>
+        <w:t>Selected story 1: US04 (Gherkin GH01 GH02)</w:t>
+      </w:r>
+    </w:p>
+    <w:tbl>
+      <w:tblPr>
+        <w:tblStyle w:val="PlainTable1"/>
+        <w:tblW w:w="0" w:type="auto"/>
+        <w:tblLook w:val="04A0" w:firstRow="1" w:lastRow="0" w:firstColumn="1" w:lastColumn="0" w:noHBand="0" w:noVBand="1"/>
+      </w:tblPr>
+      <w:tblGrid>
+        <w:gridCol w:w="4508"/>
+        <w:gridCol w:w="4508"/>
+      </w:tblGrid>
+      <w:tr>
+        <w:trPr>
+          <w:cnfStyle w:val="100000000000" w:firstRow="1" w:lastRow="0" w:firstColumn="0" w:lastColumn="0" w:oddVBand="0" w:evenVBand="0" w:oddHBand="0" w:evenHBand="0" w:firstRowFirstColumn="0" w:firstRowLastColumn="0" w:lastRowFirstColumn="0" w:lastRowLastColumn="0"/>
+        </w:trPr>
+        <w:tc>
+          <w:tcPr>
+            <w:cnfStyle w:val="001000000000" w:firstRow="0" w:lastRow="0" w:firstColumn="1" w:lastColumn="0" w:oddVBand="0" w:evenVBand="0" w:oddHBand="0" w:evenHBand="0" w:firstRowFirstColumn="0" w:firstRowLastColumn="0" w:lastRowFirstColumn="0" w:lastRowLastColumn="0"/>
+            <w:tcW w:w="4508" w:type="dxa"/>
+          </w:tcPr>
+          <w:p>
+            <w:r>
+              <w:t>Criterion</w:t>
+            </w:r>
+          </w:p>
+        </w:tc>
+        <w:tc>
+          <w:tcPr>
+            <w:tcW w:w="4508" w:type="dxa"/>
+          </w:tcPr>
+          <w:p>
+            <w:pPr>
+              <w:cnfStyle w:val="100000000000" w:firstRow="1" w:lastRow="0" w:firstColumn="0" w:lastColumn="0" w:oddVBand="0" w:evenVBand="0" w:oddHBand="0" w:evenHBand="0" w:firstRowFirstColumn="0" w:firstRowLastColumn="0" w:lastRowFirstColumn="0" w:lastRowLastColumn="0"/>
+            </w:pPr>
+            <w:r>
+              <w:t>Observable acceptance condition</w:t>
+            </w:r>
+          </w:p>
+        </w:tc>
+      </w:tr>
+      <w:tr>
+        <w:trPr>
+          <w:cnfStyle w:val="000000100000" w:firstRow="0" w:lastRow="0" w:firstColumn="0" w:lastColumn="0" w:oddVBand="0" w:evenVBand="0" w:oddHBand="1" w:evenHBand="0" w:firstRowFirstColumn="0" w:firstRowLastColumn="0" w:lastRowFirstColumn="0" w:lastRowLastColumn="0"/>
+        </w:trPr>
+        <w:tc>
+          <w:tcPr>
+            <w:cnfStyle w:val="001000000000" w:firstRow="0" w:lastRow="0" w:firstColumn="1" w:lastColumn="0" w:oddVBand="0" w:evenVBand="0" w:oddHBand="0" w:evenHBand="0" w:firstRowFirstColumn="0" w:firstRowLastColumn="0" w:lastRowFirstColumn="0" w:lastRowLastColumn="0"/>
+            <w:tcW w:w="4508" w:type="dxa"/>
+          </w:tcPr>
+          <w:p>
+            <w:pPr>
+              <w:rPr>
+                <w:b w:val="0"/>
+                <w:bCs w:val="0"/>
+              </w:rPr>
+            </w:pPr>
+            <w:r>
+              <w:rPr>
+                <w:b w:val="0"/>
+                <w:bCs w:val="0"/>
+              </w:rPr>
+              <w:t>1</w:t>
+            </w:r>
+          </w:p>
+        </w:tc>
+        <w:tc>
+          <w:tcPr>
+            <w:tcW w:w="4508" w:type="dxa"/>
+          </w:tcPr>
+          <w:p>
+            <w:pPr>
+              <w:cnfStyle w:val="000000100000" w:firstRow="0" w:lastRow="0" w:firstColumn="0" w:lastColumn="0" w:oddVBand="0" w:evenVBand="0" w:oddHBand="1" w:evenHBand="0" w:firstRowFirstColumn="0" w:firstRowLastColumn="0" w:lastRowFirstColumn="0" w:lastRowLastColumn="0"/>
+            </w:pPr>
+            <w:r>
+              <w:t>The route visit and its assigned vehicle are identified.</w:t>
+            </w:r>
+          </w:p>
+        </w:tc>
+      </w:tr>
+      <w:tr>
+        <w:tc>
+          <w:tcPr>
+            <w:cnfStyle w:val="001000000000" w:firstRow="0" w:lastRow="0" w:firstColumn="1" w:lastColumn="0" w:oddVBand="0" w:evenVBand="0" w:oddHBand="0" w:evenHBand="0" w:firstRowFirstColumn="0" w:firstRowLastColumn="0" w:lastRowFirstColumn="0" w:lastRowLastColumn="0"/>
+            <w:tcW w:w="4508" w:type="dxa"/>
+          </w:tcPr>
+          <w:p>
+            <w:pPr>
+              <w:rPr>
+                <w:b w:val="0"/>
+                <w:bCs w:val="0"/>
+              </w:rPr>
+            </w:pPr>
+            <w:r>
+              <w:rPr>
+                <w:b w:val="0"/>
+                <w:bCs w:val="0"/>
+              </w:rPr>
+              <w:t>2</w:t>
+            </w:r>
+          </w:p>
+        </w:tc>
+        <w:tc>
+          <w:tcPr>
+            <w:tcW w:w="4508" w:type="dxa"/>
+          </w:tcPr>
+          <w:p>
+            <w:pPr>
+              <w:cnfStyle w:val="000000000000" w:firstRow="0" w:lastRow="0" w:firstColumn="0" w:lastColumn="0" w:oddVBand="0" w:evenVBand="0" w:oddHBand="0" w:evenHBand="0" w:firstRowFirstColumn="0" w:firstRowLastColumn="0" w:lastRowFirstColumn="0" w:lastRowLastColumn="0"/>
+            </w:pPr>
+            <w:r>
+              <w:t>An item linked to a different route visit is not recorded as loaded.</w:t>
+            </w:r>
+          </w:p>
+        </w:tc>
+      </w:tr>
+      <w:tr>
+        <w:trPr>
+          <w:cnfStyle w:val="000000100000" w:firstRow="0" w:lastRow="0" w:firstColumn="0" w:lastColumn="0" w:oddVBand="0" w:evenVBand="0" w:oddHBand="1" w:evenHBand="0" w:firstRowFirstColumn="0" w:firstRowLastColumn="0" w:lastRowFirstColumn="0" w:lastRowLastColumn="0"/>
+        </w:trPr>
+        <w:tc>
+          <w:tcPr>
+            <w:cnfStyle w:val="001000000000" w:firstRow="0" w:lastRow="0" w:firstColumn="1" w:lastColumn="0" w:oddVBand="0" w:evenVBand="0" w:oddHBand="0" w:evenHBand="0" w:firstRowFirstColumn="0" w:firstRowLastColumn="0" w:lastRowFirstColumn="0" w:lastRowLastColumn="0"/>
+            <w:tcW w:w="4508" w:type="dxa"/>
+          </w:tcPr>
+          <w:p>
+            <w:pPr>
+              <w:rPr>
+                <w:b w:val="0"/>
+                <w:bCs w:val="0"/>
+              </w:rPr>
+            </w:pPr>
+            <w:r>
+              <w:rPr>
+                <w:b w:val="0"/>
+                <w:bCs w:val="0"/>
+              </w:rPr>
+              <w:t>3</w:t>
+            </w:r>
+          </w:p>
+        </w:tc>
+        <w:tc>
+          <w:tcPr>
+            <w:tcW w:w="4508" w:type="dxa"/>
+          </w:tcPr>
+          <w:p>
+            <w:pPr>
+              <w:cnfStyle w:val="000000100000" w:firstRow="0" w:lastRow="0" w:firstColumn="0" w:lastColumn="0" w:oddVBand="0" w:evenVBand="0" w:oddHBand="1" w:evenHBand="0" w:firstRowFirstColumn="0" w:firstRowLastColumn="0" w:lastRowFirstColumn="0" w:lastRowLastColumn="0"/>
+            </w:pPr>
+            <w:r>
+              <w:t>Each loaded item is recorded against the route visit.</w:t>
+            </w:r>
+          </w:p>
+        </w:tc>
+      </w:tr>
+      <w:tr>
+        <w:tc>
+          <w:tcPr>
+            <w:cnfStyle w:val="001000000000" w:firstRow="0" w:lastRow="0" w:firstColumn="1" w:lastColumn="0" w:oddVBand="0" w:evenVBand="0" w:oddHBand="0" w:evenHBand="0" w:firstRowFirstColumn="0" w:firstRowLastColumn="0" w:lastRowFirstColumn="0" w:lastRowLastColumn="0"/>
+            <w:tcW w:w="4508" w:type="dxa"/>
+          </w:tcPr>
+          <w:p>
+            <w:pPr>
+              <w:rPr>
+                <w:b w:val="0"/>
+                <w:bCs w:val="0"/>
+              </w:rPr>
+            </w:pPr>
+            <w:r>
+              <w:rPr>
+                <w:b w:val="0"/>
+                <w:bCs w:val="0"/>
+              </w:rPr>
+              <w:t>4</w:t>
+            </w:r>
+          </w:p>
+        </w:tc>
+        <w:tc>
+          <w:tcPr>
+            <w:tcW w:w="4508" w:type="dxa"/>
+          </w:tcPr>
+          <w:p>
+            <w:pPr>
+              <w:cnfStyle w:val="000000000000" w:firstRow="0" w:lastRow="0" w:firstColumn="0" w:lastColumn="0" w:oddVBand="0" w:evenVBand="0" w:oddHBand="0" w:evenHBand="0" w:firstRowFirstColumn="0" w:firstRowLastColumn="0" w:lastRowFirstColumn="0" w:lastRowLastColumn="0"/>
+            </w:pPr>
+            <w:r>
+              <w:t>Any item on the load list that is not loaded is reported before departure.</w:t>
+            </w:r>
+          </w:p>
+        </w:tc>
+      </w:tr>
+    </w:tbl>
+    <w:p/>
+    <w:p>
+      <w:pPr>
+        <w:pStyle w:val="Subtitle"/>
+      </w:pPr>
+      <w:r>
+        <w:t>Selected story 2: US05 (Gherkin GH04)</w:t>
+      </w:r>
+    </w:p>
+    <w:tbl>
+      <w:tblPr>
+        <w:tblStyle w:val="PlainTable1"/>
+        <w:tblW w:w="0" w:type="auto"/>
+        <w:tblLook w:val="04A0" w:firstRow="1" w:lastRow="0" w:firstColumn="1" w:lastColumn="0" w:noHBand="0" w:noVBand="1"/>
+      </w:tblPr>
+      <w:tblGrid>
+        <w:gridCol w:w="2689"/>
+        <w:gridCol w:w="6327"/>
+      </w:tblGrid>
+      <w:tr>
+        <w:trPr>
+          <w:cnfStyle w:val="100000000000" w:firstRow="1" w:lastRow="0" w:firstColumn="0" w:lastColumn="0" w:oddVBand="0" w:evenVBand="0" w:oddHBand="0" w:evenHBand="0" w:firstRowFirstColumn="0" w:firstRowLastColumn="0" w:lastRowFirstColumn="0" w:lastRowLastColumn="0"/>
+        </w:trPr>
+        <w:tc>
+          <w:tcPr>
+            <w:cnfStyle w:val="001000000000" w:firstRow="0" w:lastRow="0" w:firstColumn="1" w:lastColumn="0" w:oddVBand="0" w:evenVBand="0" w:oddHBand="0" w:evenHBand="0" w:firstRowFirstColumn="0" w:firstRowLastColumn="0" w:lastRowFirstColumn="0" w:lastRowLastColumn="0"/>
+            <w:tcW w:w="2689" w:type="dxa"/>
+          </w:tcPr>
+          <w:p>
+            <w:r>
+              <w:t>Criterion</w:t>
+            </w:r>
+          </w:p>
+        </w:tc>
+        <w:tc>
+          <w:tcPr>
+            <w:tcW w:w="6327" w:type="dxa"/>
+          </w:tcPr>
+          <w:p>
+            <w:pPr>
+              <w:cnfStyle w:val="100000000000" w:firstRow="1" w:lastRow="0" w:firstColumn="0" w:lastColumn="0" w:oddVBand="0" w:evenVBand="0" w:oddHBand="0" w:evenHBand="0" w:firstRowFirstColumn="0" w:firstRowLastColumn="0" w:lastRowFirstColumn="0" w:lastRowLastColumn="0"/>
+            </w:pPr>
+            <w:r>
+              <w:t>Observable acceptance condition</w:t>
+            </w:r>
+          </w:p>
+        </w:tc>
+      </w:tr>
+      <w:tr>
+        <w:trPr>
+          <w:cnfStyle w:val="000000100000" w:firstRow="0" w:lastRow="0" w:firstColumn="0" w:lastColumn="0" w:oddVBand="0" w:evenVBand="0" w:oddHBand="1" w:evenHBand="0" w:firstRowFirstColumn="0" w:firstRowLastColumn="0" w:lastRowFirstColumn="0" w:lastRowLastColumn="0"/>
+        </w:trPr>
+        <w:tc>
+          <w:tcPr>
+            <w:cnfStyle w:val="001000000000" w:firstRow="0" w:lastRow="0" w:firstColumn="1" w:lastColumn="0" w:oddVBand="0" w:evenVBand="0" w:oddHBand="0" w:evenHBand="0" w:firstRowFirstColumn="0" w:firstRowLastColumn="0" w:lastRowFirstColumn="0" w:lastRowLastColumn="0"/>
+            <w:tcW w:w="2689" w:type="dxa"/>
+          </w:tcPr>
+          <w:p>
+            <w:pPr>
+              <w:rPr>
+                <w:b w:val="0"/>
+                <w:bCs w:val="0"/>
+              </w:rPr>
+            </w:pPr>
+            <w:r>
+              <w:rPr>
+                <w:b w:val="0"/>
+                <w:bCs w:val="0"/>
+              </w:rPr>
+              <w:t>1</w:t>
+            </w:r>
+          </w:p>
+        </w:tc>
+        <w:tc>
+          <w:tcPr>
+            <w:tcW w:w="6327" w:type="dxa"/>
+          </w:tcPr>
+          <w:p>
+            <w:pPr>
+              <w:cnfStyle w:val="000000100000" w:firstRow="0" w:lastRow="0" w:firstColumn="0" w:lastColumn="0" w:oddVBand="0" w:evenVBand="0" w:oddHBand="1" w:evenHBand="0" w:firstRowFirstColumn="0" w:firstRowLastColumn="0" w:lastRowFirstColumn="0" w:lastRowLastColumn="0"/>
+            </w:pPr>
+            <w:r>
+              <w:t>One of the three choices is recorded: accept the alternative, keep the original request open, or cancel the request.</w:t>
+            </w:r>
+          </w:p>
+        </w:tc>
+      </w:tr>
+      <w:tr>
+        <w:tc>
+          <w:tcPr>
+            <w:cnfStyle w:val="001000000000" w:firstRow="0" w:lastRow="0" w:firstColumn="1" w:lastColumn="0" w:oddVBand="0" w:evenVBand="0" w:oddHBand="0" w:evenHBand="0" w:firstRowFirstColumn="0" w:firstRowLastColumn="0" w:lastRowFirstColumn="0" w:lastRowLastColumn="0"/>
+            <w:tcW w:w="2689" w:type="dxa"/>
+          </w:tcPr>
+          <w:p>
+            <w:pPr>
+              <w:rPr>
+                <w:b w:val="0"/>
+                <w:bCs w:val="0"/>
+              </w:rPr>
+            </w:pPr>
+            <w:r>
+              <w:rPr>
+                <w:b w:val="0"/>
+                <w:bCs w:val="0"/>
+              </w:rPr>
+              <w:t>2</w:t>
+            </w:r>
+          </w:p>
+        </w:tc>
+        <w:tc>
+          <w:tcPr>
+            <w:tcW w:w="6327" w:type="dxa"/>
+          </w:tcPr>
+          <w:p>
+            <w:pPr>
+              <w:cnfStyle w:val="000000000000" w:firstRow="0" w:lastRow="0" w:firstColumn="0" w:lastColumn="0" w:oddVBand="0" w:evenVBand="0" w:oddHBand="0" w:evenHBand="0" w:firstRowFirstColumn="0" w:firstRowLastColumn="0" w:lastRowFirstColumn="0" w:lastRowLastColumn="0"/>
+            </w:pPr>
+            <w:r>
+              <w:t>The original request stays open unless the borrower cancels it.</w:t>
+            </w:r>
+          </w:p>
+        </w:tc>
+      </w:tr>
+      <w:tr>
+        <w:trPr>
+          <w:cnfStyle w:val="000000100000" w:firstRow="0" w:lastRow="0" w:firstColumn="0" w:lastColumn="0" w:oddVBand="0" w:evenVBand="0" w:oddHBand="1" w:evenHBand="0" w:firstRowFirstColumn="0" w:firstRowLastColumn="0" w:lastRowFirstColumn="0" w:lastRowLastColumn="0"/>
+        </w:trPr>
+        <w:tc>
+          <w:tcPr>
+            <w:cnfStyle w:val="001000000000" w:firstRow="0" w:lastRow="0" w:firstColumn="1" w:lastColumn="0" w:oddVBand="0" w:evenVBand="0" w:oddHBand="0" w:evenHBand="0" w:firstRowFirstColumn="0" w:firstRowLastColumn="0" w:lastRowFirstColumn="0" w:lastRowLastColumn="0"/>
+            <w:tcW w:w="2689" w:type="dxa"/>
+          </w:tcPr>
+          <w:p>
+            <w:pPr>
+              <w:rPr>
+                <w:b w:val="0"/>
+                <w:bCs w:val="0"/>
+              </w:rPr>
+            </w:pPr>
+            <w:r>
+              <w:rPr>
+                <w:b w:val="0"/>
+                <w:bCs w:val="0"/>
+              </w:rPr>
+              <w:t>3</w:t>
+            </w:r>
+          </w:p>
+        </w:tc>
+        <w:tc>
+          <w:tcPr>
+            <w:tcW w:w="6327" w:type="dxa"/>
+          </w:tcPr>
+          <w:p>
+            <w:pPr>
+              <w:cnfStyle w:val="000000100000" w:firstRow="0" w:lastRow="0" w:firstColumn="0" w:lastColumn="0" w:oddVBand="0" w:evenVBand="0" w:oddHBand="1" w:evenHBand="0" w:firstRowFirstColumn="0" w:firstRowLastColumn="0" w:lastRowFirstColumn="0" w:lastRowLastColumn="0"/>
+            </w:pPr>
+            <w:r>
+              <w:t>Only borrowers with items for that stop, and its community coordinator are told.</w:t>
+            </w:r>
+          </w:p>
+        </w:tc>
+      </w:tr>
+      <w:tr>
+        <w:tc>
+          <w:tcPr>
+            <w:cnfStyle w:val="001000000000" w:firstRow="0" w:lastRow="0" w:firstColumn="1" w:lastColumn="0" w:oddVBand="0" w:evenVBand="0" w:oddHBand="0" w:evenHBand="0" w:firstRowFirstColumn="0" w:firstRowLastColumn="0" w:lastRowFirstColumn="0" w:lastRowLastColumn="0"/>
+            <w:tcW w:w="2689" w:type="dxa"/>
+          </w:tcPr>
+          <w:p>
+            <w:pPr>
+              <w:rPr>
+                <w:b w:val="0"/>
+                <w:bCs w:val="0"/>
+              </w:rPr>
+            </w:pPr>
+            <w:r>
+              <w:rPr>
+                <w:b w:val="0"/>
+                <w:bCs w:val="0"/>
+              </w:rPr>
+              <w:t>4</w:t>
+            </w:r>
+          </w:p>
+        </w:tc>
+        <w:tc>
+          <w:tcPr>
+            <w:tcW w:w="6327" w:type="dxa"/>
+          </w:tcPr>
+          <w:p>
+            <w:pPr>
+              <w:cnfStyle w:val="000000000000" w:firstRow="0" w:lastRow="0" w:firstColumn="0" w:lastColumn="0" w:oddVBand="0" w:evenVBand="0" w:oddHBand="0" w:evenHBand="0" w:firstRowFirstColumn="0" w:firstRowLastColumn="0" w:lastRowFirstColumn="0" w:lastRowLastColumn="0"/>
+            </w:pPr>
+            <w:r>
+              <w:t>The notice contains no borrower personal details (NFR03).</w:t>
+            </w:r>
+          </w:p>
+        </w:tc>
+      </w:tr>
+    </w:tbl>
+    <w:p/>
+    <w:p>
+      <w:pPr>
+        <w:pStyle w:val="Subtitle"/>
+        <w:rPr>
+          <w:rStyle w:val="SubtleEmphasis"/>
+          <w:i w:val="0"/>
+          <w:iCs w:val="0"/>
+        </w:rPr>
+      </w:pPr>
+      <w:r>
+        <w:rPr>
+          <w:rStyle w:val="SubtleEmphasis"/>
+          <w:i w:val="0"/>
+          <w:iCs w:val="0"/>
+        </w:rPr>
+        <w:t>Selected story 3: US06 (Gherkin GH05)</w:t>
+      </w:r>
+    </w:p>
+    <w:tbl>
+      <w:tblPr>
+        <w:tblStyle w:val="PlainTable1"/>
+        <w:tblW w:w="0" w:type="auto"/>
+        <w:tblLook w:val="04A0" w:firstRow="1" w:lastRow="0" w:firstColumn="1" w:lastColumn="0" w:noHBand="0" w:noVBand="1"/>
+      </w:tblPr>
+      <w:tblGrid>
+        <w:gridCol w:w="4508"/>
+        <w:gridCol w:w="4508"/>
+      </w:tblGrid>
+      <w:tr>
+        <w:trPr>
+          <w:cnfStyle w:val="100000000000" w:firstRow="1" w:lastRow="0" w:firstColumn="0" w:lastColumn="0" w:oddVBand="0" w:evenVBand="0" w:oddHBand="0" w:evenHBand="0" w:firstRowFirstColumn="0" w:firstRowLastColumn="0" w:lastRowFirstColumn="0" w:lastRowLastColumn="0"/>
+        </w:trPr>
+        <w:tc>
+          <w:tcPr>
+            <w:cnfStyle w:val="001000000000" w:firstRow="0" w:lastRow="0" w:firstColumn="1" w:lastColumn="0" w:oddVBand="0" w:evenVBand="0" w:oddHBand="0" w:evenHBand="0" w:firstRowFirstColumn="0" w:firstRowLastColumn="0" w:lastRowFirstColumn="0" w:lastRowLastColumn="0"/>
+            <w:tcW w:w="4508" w:type="dxa"/>
+          </w:tcPr>
+          <w:p>
+            <w:r>
+              <w:t>Criterion</w:t>
+            </w:r>
+          </w:p>
+        </w:tc>
+        <w:tc>
+          <w:tcPr>
+            <w:tcW w:w="4508" w:type="dxa"/>
+          </w:tcPr>
+          <w:p>
+            <w:pPr>
+              <w:cnfStyle w:val="100000000000" w:firstRow="1" w:lastRow="0" w:firstColumn="0" w:lastColumn="0" w:oddVBand="0" w:evenVBand="0" w:oddHBand="0" w:evenHBand="0" w:firstRowFirstColumn="0" w:firstRowLastColumn="0" w:lastRowFirstColumn="0" w:lastRowLastColumn="0"/>
+            </w:pPr>
+            <w:r>
+              <w:t>Observable acceptance condition</w:t>
+            </w:r>
+          </w:p>
+        </w:tc>
+      </w:tr>
+      <w:tr>
+        <w:trPr>
+          <w:cnfStyle w:val="000000100000" w:firstRow="0" w:lastRow="0" w:firstColumn="0" w:lastColumn="0" w:oddVBand="0" w:evenVBand="0" w:oddHBand="1" w:evenHBand="0" w:firstRowFirstColumn="0" w:firstRowLastColumn="0" w:lastRowFirstColumn="0" w:lastRowLastColumn="0"/>
+        </w:trPr>
+        <w:tc>
+          <w:tcPr>
+            <w:cnfStyle w:val="001000000000" w:firstRow="0" w:lastRow="0" w:firstColumn="1" w:lastColumn="0" w:oddVBand="0" w:evenVBand="0" w:oddHBand="0" w:evenHBand="0" w:firstRowFirstColumn="0" w:firstRowLastColumn="0" w:lastRowFirstColumn="0" w:lastRowLastColumn="0"/>
+            <w:tcW w:w="4508" w:type="dxa"/>
+          </w:tcPr>
+          <w:p>
+            <w:pPr>
+              <w:rPr>
+                <w:b w:val="0"/>
+                <w:bCs w:val="0"/>
+              </w:rPr>
+            </w:pPr>
+            <w:r>
+              <w:rPr>
+                <w:b w:val="0"/>
+                <w:bCs w:val="0"/>
+              </w:rPr>
+              <w:t>1</w:t>
+            </w:r>
+          </w:p>
+        </w:tc>
+        <w:tc>
+          <w:tcPr>
+            <w:tcW w:w="4508" w:type="dxa"/>
+          </w:tcPr>
+          <w:p>
+            <w:pPr>
+              <w:cnfStyle w:val="000000100000" w:firstRow="0" w:lastRow="0" w:firstColumn="0" w:lastColumn="0" w:oddVBand="0" w:evenVBand="0" w:oddHBand="1" w:evenHBand="0" w:firstRowFirstColumn="0" w:firstRowLastColumn="0" w:lastRowFirstColumn="0" w:lastRowLastColumn="0"/>
+            </w:pPr>
+            <w:r>
+              <w:t>One of three choices is recorded: accept the alternative, keep the original request open, or cancel the request</w:t>
+            </w:r>
+            <w:r>
+              <w:t>.</w:t>
+            </w:r>
+            <w:r>
+              <w:t xml:space="preserve"> </w:t>
+            </w:r>
+          </w:p>
+        </w:tc>
+      </w:tr>
+      <w:tr>
+        <w:tc>
+          <w:tcPr>
+            <w:cnfStyle w:val="001000000000" w:firstRow="0" w:lastRow="0" w:firstColumn="1" w:lastColumn="0" w:oddVBand="0" w:evenVBand="0" w:oddHBand="0" w:evenHBand="0" w:firstRowFirstColumn="0" w:firstRowLastColumn="0" w:lastRowFirstColumn="0" w:lastRowLastColumn="0"/>
+            <w:tcW w:w="4508" w:type="dxa"/>
+          </w:tcPr>
+          <w:p>
+            <w:pPr>
+              <w:rPr>
+                <w:b w:val="0"/>
+                <w:bCs w:val="0"/>
+              </w:rPr>
+            </w:pPr>
+            <w:r>
+              <w:rPr>
+                <w:b w:val="0"/>
+                <w:bCs w:val="0"/>
+              </w:rPr>
+              <w:t>2</w:t>
+            </w:r>
+          </w:p>
+        </w:tc>
+        <w:tc>
+          <w:tcPr>
+            <w:tcW w:w="4508" w:type="dxa"/>
+          </w:tcPr>
+          <w:p>
+            <w:pPr>
+              <w:cnfStyle w:val="000000000000" w:firstRow="0" w:lastRow="0" w:firstColumn="0" w:lastColumn="0" w:oddVBand="0" w:evenVBand="0" w:oddHBand="0" w:evenHBand="0" w:firstRowFirstColumn="0" w:firstRowLastColumn="0" w:lastRowFirstColumn="0" w:lastRowLastColumn="0"/>
+            </w:pPr>
+            <w:r>
+              <w:t xml:space="preserve">The original request stays open unless the borrower cancels </w:t>
+            </w:r>
+            <w:r>
+              <w:t>it.</w:t>
+            </w:r>
+          </w:p>
+        </w:tc>
+      </w:tr>
+      <w:tr>
+        <w:trPr>
+          <w:cnfStyle w:val="000000100000" w:firstRow="0" w:lastRow="0" w:firstColumn="0" w:lastColumn="0" w:oddVBand="0" w:evenVBand="0" w:oddHBand="1" w:evenHBand="0" w:firstRowFirstColumn="0" w:firstRowLastColumn="0" w:lastRowFirstColumn="0" w:lastRowLastColumn="0"/>
+        </w:trPr>
+        <w:tc>
+          <w:tcPr>
+            <w:cnfStyle w:val="001000000000" w:firstRow="0" w:lastRow="0" w:firstColumn="1" w:lastColumn="0" w:oddVBand="0" w:evenVBand="0" w:oddHBand="0" w:evenHBand="0" w:firstRowFirstColumn="0" w:firstRowLastColumn="0" w:lastRowFirstColumn="0" w:lastRowLastColumn="0"/>
+            <w:tcW w:w="4508" w:type="dxa"/>
+          </w:tcPr>
+          <w:p/>
+        </w:tc>
+        <w:tc>
+          <w:tcPr>
+            <w:tcW w:w="4508" w:type="dxa"/>
+          </w:tcPr>
+          <w:p>
+            <w:pPr>
+              <w:cnfStyle w:val="000000100000" w:firstRow="0" w:lastRow="0" w:firstColumn="0" w:lastColumn="0" w:oddVBand="0" w:evenVBand="0" w:oddHBand="1" w:evenHBand="0" w:firstRowFirstColumn="0" w:firstRowLastColumn="0" w:lastRowFirstColumn="0" w:lastRowLastColumn="0"/>
+            </w:pPr>
+          </w:p>
+        </w:tc>
+      </w:tr>
+      <w:tr>
+        <w:tc>
+          <w:tcPr>
+            <w:cnfStyle w:val="001000000000" w:firstRow="0" w:lastRow="0" w:firstColumn="1" w:lastColumn="0" w:oddVBand="0" w:evenVBand="0" w:oddHBand="0" w:evenHBand="0" w:firstRowFirstColumn="0" w:firstRowLastColumn="0" w:lastRowFirstColumn="0" w:lastRowLastColumn="0"/>
+            <w:tcW w:w="4508" w:type="dxa"/>
+          </w:tcPr>
+          <w:p/>
+        </w:tc>
+        <w:tc>
+          <w:tcPr>
+            <w:tcW w:w="4508" w:type="dxa"/>
+          </w:tcPr>
+          <w:p>
+            <w:pPr>
+              <w:cnfStyle w:val="000000000000" w:firstRow="0" w:lastRow="0" w:firstColumn="0" w:lastColumn="0" w:oddVBand="0" w:evenVBand="0" w:oddHBand="0" w:evenHBand="0" w:firstRowFirstColumn="0" w:firstRowLastColumn="0" w:lastRowFirstColumn="0" w:lastRowLastColumn="0"/>
+            </w:pPr>
+          </w:p>
+        </w:tc>
+      </w:tr>
+    </w:tbl>
+    <w:p/>
     <w:sectPr>
-      <w:footerReference w:type="default" r:id="rId9"/>
-      <w:footerReference w:type="first" r:id="rId10"/>
+      <w:footerReference w:type="default" r:id="rId13"/>
+      <w:footerReference w:type="first" r:id="rId14"/>
       <w:pgSz w:w="11906" w:h="16838"/>
       <w:pgMar w:top="1440" w:right="1440" w:bottom="1440" w:left="1440" w:header="708" w:footer="708" w:gutter="0"/>
       <w:pgNumType w:start="0"/>
@@ -14981,6 +18054,42 @@
       </w:tblBorders>
     </w:tblPr>
   </w:style>
+  <w:style w:type="character" w:styleId="UnresolvedMention">
+    <w:name w:val="Unresolved Mention"/>
+    <w:basedOn w:val="DefaultParagraphFont"/>
+    <w:uiPriority w:val="99"/>
+    <w:semiHidden/>
+    <w:unhideWhenUsed/>
+    <w:rsid w:val="00E9648E"/>
+    <w:rPr>
+      <w:color w:val="605E5C"/>
+      <w:shd w:val="clear" w:color="auto" w:fill="E1DFDD"/>
+    </w:rPr>
+  </w:style>
+  <w:style w:type="character" w:styleId="FollowedHyperlink">
+    <w:name w:val="FollowedHyperlink"/>
+    <w:basedOn w:val="DefaultParagraphFont"/>
+    <w:uiPriority w:val="99"/>
+    <w:semiHidden/>
+    <w:unhideWhenUsed/>
+    <w:rsid w:val="00E9648E"/>
+    <w:rPr>
+      <w:color w:val="96607D" w:themeColor="followedHyperlink"/>
+      <w:u w:val="single"/>
+    </w:rPr>
+  </w:style>
+  <w:style w:type="character" w:styleId="SubtleEmphasis">
+    <w:name w:val="Subtle Emphasis"/>
+    <w:basedOn w:val="DefaultParagraphFont"/>
+    <w:uiPriority w:val="19"/>
+    <w:qFormat/>
+    <w:rsid w:val="00B323D7"/>
+    <w:rPr>
+      <w:i/>
+      <w:iCs/>
+      <w:color w:val="404040" w:themeColor="text1" w:themeTint="BF"/>
+    </w:rPr>
+  </w:style>
 </w:styles>
 </file>
 

</xml_diff>

<commit_message>
Final Commit (Project completeion) Did some finishing touches to the report before submission
</commit_message>
<xml_diff>
--- a/report/ca1-report.docx
+++ b/report/ca1-report.docx
@@ -948,7 +948,7 @@
           <w:r>
             <w:fldChar w:fldCharType="separate"/>
           </w:r>
-          <w:hyperlink w:anchor="_Toc243601291" w:history="1">
+          <w:hyperlink w:anchor="_Toc243605228" w:history="1">
             <w:r>
               <w:rPr>
                 <w:rStyle w:val="Hyperlink"/>
@@ -994,7 +994,7 @@
                 <w:noProof/>
                 <w:webHidden/>
               </w:rPr>
-              <w:instrText xml:space="preserve"> PAGEREF _Toc243601291 \h </w:instrText>
+              <w:instrText xml:space="preserve"> PAGEREF _Toc243605228 \h </w:instrText>
             </w:r>
             <w:r>
               <w:rPr>
@@ -1042,7 +1042,7 @@
               <w14:ligatures w14:val="standardContextual"/>
             </w:rPr>
           </w:pPr>
-          <w:hyperlink w:anchor="_Toc243601292" w:history="1">
+          <w:hyperlink w:anchor="_Toc243605229" w:history="1">
             <w:r>
               <w:rPr>
                 <w:rStyle w:val="Hyperlink"/>
@@ -1088,7 +1088,7 @@
                 <w:noProof/>
                 <w:webHidden/>
               </w:rPr>
-              <w:instrText xml:space="preserve"> PAGEREF _Toc243601292 \h </w:instrText>
+              <w:instrText xml:space="preserve"> PAGEREF _Toc243605229 \h </w:instrText>
             </w:r>
             <w:r>
               <w:rPr>
@@ -1136,7 +1136,7 @@
               <w14:ligatures w14:val="standardContextual"/>
             </w:rPr>
           </w:pPr>
-          <w:hyperlink w:anchor="_Toc243601293" w:history="1">
+          <w:hyperlink w:anchor="_Toc243605230" w:history="1">
             <w:r>
               <w:rPr>
                 <w:rStyle w:val="Hyperlink"/>
@@ -1182,7 +1182,7 @@
                 <w:noProof/>
                 <w:webHidden/>
               </w:rPr>
-              <w:instrText xml:space="preserve"> PAGEREF _Toc243601293 \h </w:instrText>
+              <w:instrText xml:space="preserve"> PAGEREF _Toc243605230 \h </w:instrText>
             </w:r>
             <w:r>
               <w:rPr>
@@ -1230,7 +1230,7 @@
               <w14:ligatures w14:val="standardContextual"/>
             </w:rPr>
           </w:pPr>
-          <w:hyperlink w:anchor="_Toc243601294" w:history="1">
+          <w:hyperlink w:anchor="_Toc243605231" w:history="1">
             <w:r>
               <w:rPr>
                 <w:rStyle w:val="Hyperlink"/>
@@ -1276,7 +1276,7 @@
                 <w:noProof/>
                 <w:webHidden/>
               </w:rPr>
-              <w:instrText xml:space="preserve"> PAGEREF _Toc243601294 \h </w:instrText>
+              <w:instrText xml:space="preserve"> PAGEREF _Toc243605231 \h </w:instrText>
             </w:r>
             <w:r>
               <w:rPr>
@@ -1324,7 +1324,7 @@
               <w14:ligatures w14:val="standardContextual"/>
             </w:rPr>
           </w:pPr>
-          <w:hyperlink w:anchor="_Toc243601295" w:history="1">
+          <w:hyperlink w:anchor="_Toc243605232" w:history="1">
             <w:r>
               <w:rPr>
                 <w:rStyle w:val="Hyperlink"/>
@@ -1370,7 +1370,7 @@
                 <w:noProof/>
                 <w:webHidden/>
               </w:rPr>
-              <w:instrText xml:space="preserve"> PAGEREF _Toc243601295 \h </w:instrText>
+              <w:instrText xml:space="preserve"> PAGEREF _Toc243605232 \h </w:instrText>
             </w:r>
             <w:r>
               <w:rPr>
@@ -1418,7 +1418,7 @@
               <w14:ligatures w14:val="standardContextual"/>
             </w:rPr>
           </w:pPr>
-          <w:hyperlink w:anchor="_Toc243601296" w:history="1">
+          <w:hyperlink w:anchor="_Toc243605233" w:history="1">
             <w:r>
               <w:rPr>
                 <w:rStyle w:val="Hyperlink"/>
@@ -1464,7 +1464,7 @@
                 <w:noProof/>
                 <w:webHidden/>
               </w:rPr>
-              <w:instrText xml:space="preserve"> PAGEREF _Toc243601296 \h </w:instrText>
+              <w:instrText xml:space="preserve"> PAGEREF _Toc243605233 \h </w:instrText>
             </w:r>
             <w:r>
               <w:rPr>
@@ -1511,7 +1511,7 @@
               <w14:ligatures w14:val="standardContextual"/>
             </w:rPr>
           </w:pPr>
-          <w:hyperlink w:anchor="_Toc243601297" w:history="1">
+          <w:hyperlink w:anchor="_Toc243605234" w:history="1">
             <w:r>
               <w:rPr>
                 <w:rStyle w:val="Hyperlink"/>
@@ -1538,7 +1538,7 @@
                 <w:noProof/>
                 <w:webHidden/>
               </w:rPr>
-              <w:instrText xml:space="preserve"> PAGEREF _Toc243601297 \h </w:instrText>
+              <w:instrText xml:space="preserve"> PAGEREF _Toc243605234 \h </w:instrText>
             </w:r>
             <w:r>
               <w:rPr>
@@ -1585,7 +1585,7 @@
               <w14:ligatures w14:val="standardContextual"/>
             </w:rPr>
           </w:pPr>
-          <w:hyperlink w:anchor="_Toc243601298" w:history="1">
+          <w:hyperlink w:anchor="_Toc243605235" w:history="1">
             <w:r>
               <w:rPr>
                 <w:rStyle w:val="Hyperlink"/>
@@ -1612,7 +1612,7 @@
                 <w:noProof/>
                 <w:webHidden/>
               </w:rPr>
-              <w:instrText xml:space="preserve"> PAGEREF _Toc243601298 \h </w:instrText>
+              <w:instrText xml:space="preserve"> PAGEREF _Toc243605235 \h </w:instrText>
             </w:r>
             <w:r>
               <w:rPr>
@@ -1660,7 +1660,7 @@
               <w14:ligatures w14:val="standardContextual"/>
             </w:rPr>
           </w:pPr>
-          <w:hyperlink w:anchor="_Toc243601299" w:history="1">
+          <w:hyperlink w:anchor="_Toc243605236" w:history="1">
             <w:r>
               <w:rPr>
                 <w:rStyle w:val="Hyperlink"/>
@@ -1706,7 +1706,7 @@
                 <w:noProof/>
                 <w:webHidden/>
               </w:rPr>
-              <w:instrText xml:space="preserve"> PAGEREF _Toc243601299 \h </w:instrText>
+              <w:instrText xml:space="preserve"> PAGEREF _Toc243605236 \h </w:instrText>
             </w:r>
             <w:r>
               <w:rPr>
@@ -1754,7 +1754,7 @@
               <w14:ligatures w14:val="standardContextual"/>
             </w:rPr>
           </w:pPr>
-          <w:hyperlink w:anchor="_Toc243601300" w:history="1">
+          <w:hyperlink w:anchor="_Toc243605237" w:history="1">
             <w:r>
               <w:rPr>
                 <w:rStyle w:val="Hyperlink"/>
@@ -1800,7 +1800,7 @@
                 <w:noProof/>
                 <w:webHidden/>
               </w:rPr>
-              <w:instrText xml:space="preserve"> PAGEREF _Toc243601300 \h </w:instrText>
+              <w:instrText xml:space="preserve"> PAGEREF _Toc243605237 \h </w:instrText>
             </w:r>
             <w:r>
               <w:rPr>
@@ -1848,7 +1848,7 @@
               <w14:ligatures w14:val="standardContextual"/>
             </w:rPr>
           </w:pPr>
-          <w:hyperlink w:anchor="_Toc243601301" w:history="1">
+          <w:hyperlink w:anchor="_Toc243605238" w:history="1">
             <w:r>
               <w:rPr>
                 <w:rStyle w:val="Hyperlink"/>
@@ -1894,7 +1894,7 @@
                 <w:noProof/>
                 <w:webHidden/>
               </w:rPr>
-              <w:instrText xml:space="preserve"> PAGEREF _Toc243601301 \h </w:instrText>
+              <w:instrText xml:space="preserve"> PAGEREF _Toc243605238 \h </w:instrText>
             </w:r>
             <w:r>
               <w:rPr>
@@ -1941,7 +1941,7 @@
               <w14:ligatures w14:val="standardContextual"/>
             </w:rPr>
           </w:pPr>
-          <w:hyperlink w:anchor="_Toc243601302" w:history="1">
+          <w:hyperlink w:anchor="_Toc243605239" w:history="1">
             <w:r>
               <w:rPr>
                 <w:rStyle w:val="Hyperlink"/>
@@ -1968,7 +1968,7 @@
                 <w:noProof/>
                 <w:webHidden/>
               </w:rPr>
-              <w:instrText xml:space="preserve"> PAGEREF _Toc243601302 \h </w:instrText>
+              <w:instrText xml:space="preserve"> PAGEREF _Toc243605239 \h </w:instrText>
             </w:r>
             <w:r>
               <w:rPr>
@@ -2015,7 +2015,7 @@
               <w14:ligatures w14:val="standardContextual"/>
             </w:rPr>
           </w:pPr>
-          <w:hyperlink w:anchor="_Toc243601303" w:history="1">
+          <w:hyperlink w:anchor="_Toc243605240" w:history="1">
             <w:r>
               <w:rPr>
                 <w:rStyle w:val="Hyperlink"/>
@@ -2042,7 +2042,7 @@
                 <w:noProof/>
                 <w:webHidden/>
               </w:rPr>
-              <w:instrText xml:space="preserve"> PAGEREF _Toc243601303 \h </w:instrText>
+              <w:instrText xml:space="preserve"> PAGEREF _Toc243605240 \h </w:instrText>
             </w:r>
             <w:r>
               <w:rPr>
@@ -2090,7 +2090,7 @@
               <w14:ligatures w14:val="standardContextual"/>
             </w:rPr>
           </w:pPr>
-          <w:hyperlink w:anchor="_Toc243601304" w:history="1">
+          <w:hyperlink w:anchor="_Toc243605241" w:history="1">
             <w:r>
               <w:rPr>
                 <w:rStyle w:val="Hyperlink"/>
@@ -2136,7 +2136,7 @@
                 <w:noProof/>
                 <w:webHidden/>
               </w:rPr>
-              <w:instrText xml:space="preserve"> PAGEREF _Toc243601304 \h </w:instrText>
+              <w:instrText xml:space="preserve"> PAGEREF _Toc243605241 \h </w:instrText>
             </w:r>
             <w:r>
               <w:rPr>
@@ -2184,7 +2184,7 @@
               <w14:ligatures w14:val="standardContextual"/>
             </w:rPr>
           </w:pPr>
-          <w:hyperlink w:anchor="_Toc243601305" w:history="1">
+          <w:hyperlink w:anchor="_Toc243605242" w:history="1">
             <w:r>
               <w:rPr>
                 <w:rStyle w:val="Hyperlink"/>
@@ -2230,7 +2230,7 @@
                 <w:noProof/>
                 <w:webHidden/>
               </w:rPr>
-              <w:instrText xml:space="preserve"> PAGEREF _Toc243601305 \h </w:instrText>
+              <w:instrText xml:space="preserve"> PAGEREF _Toc243605242 \h </w:instrText>
             </w:r>
             <w:r>
               <w:rPr>
@@ -2278,7 +2278,7 @@
               <w14:ligatures w14:val="standardContextual"/>
             </w:rPr>
           </w:pPr>
-          <w:hyperlink w:anchor="_Toc243601306" w:history="1">
+          <w:hyperlink w:anchor="_Toc243605243" w:history="1">
             <w:r>
               <w:rPr>
                 <w:rStyle w:val="Hyperlink"/>
@@ -2324,7 +2324,7 @@
                 <w:noProof/>
                 <w:webHidden/>
               </w:rPr>
-              <w:instrText xml:space="preserve"> PAGEREF _Toc243601306 \h </w:instrText>
+              <w:instrText xml:space="preserve"> PAGEREF _Toc243605243 \h </w:instrText>
             </w:r>
             <w:r>
               <w:rPr>
@@ -2372,7 +2372,7 @@
               <w14:ligatures w14:val="standardContextual"/>
             </w:rPr>
           </w:pPr>
-          <w:hyperlink w:anchor="_Toc243601307" w:history="1">
+          <w:hyperlink w:anchor="_Toc243605244" w:history="1">
             <w:r>
               <w:rPr>
                 <w:rStyle w:val="Hyperlink"/>
@@ -2418,7 +2418,7 @@
                 <w:noProof/>
                 <w:webHidden/>
               </w:rPr>
-              <w:instrText xml:space="preserve"> PAGEREF _Toc243601307 \h </w:instrText>
+              <w:instrText xml:space="preserve"> PAGEREF _Toc243605244 \h </w:instrText>
             </w:r>
             <w:r>
               <w:rPr>
@@ -2438,7 +2438,7 @@
                 <w:noProof/>
                 <w:webHidden/>
               </w:rPr>
-              <w:t>12</w:t>
+              <w:t>13</w:t>
             </w:r>
             <w:r>
               <w:rPr>
@@ -2466,7 +2466,7 @@
               <w14:ligatures w14:val="standardContextual"/>
             </w:rPr>
           </w:pPr>
-          <w:hyperlink w:anchor="_Toc243601308" w:history="1">
+          <w:hyperlink w:anchor="_Toc243605245" w:history="1">
             <w:r>
               <w:rPr>
                 <w:rStyle w:val="Hyperlink"/>
@@ -2512,7 +2512,7 @@
                 <w:noProof/>
                 <w:webHidden/>
               </w:rPr>
-              <w:instrText xml:space="preserve"> PAGEREF _Toc243601308 \h </w:instrText>
+              <w:instrText xml:space="preserve"> PAGEREF _Toc243605245 \h </w:instrText>
             </w:r>
             <w:r>
               <w:rPr>
@@ -2560,7 +2560,7 @@
               <w14:ligatures w14:val="standardContextual"/>
             </w:rPr>
           </w:pPr>
-          <w:hyperlink w:anchor="_Toc243601309" w:history="1">
+          <w:hyperlink w:anchor="_Toc243605246" w:history="1">
             <w:r>
               <w:rPr>
                 <w:rStyle w:val="Hyperlink"/>
@@ -2606,7 +2606,7 @@
                 <w:noProof/>
                 <w:webHidden/>
               </w:rPr>
-              <w:instrText xml:space="preserve"> PAGEREF _Toc243601309 \h </w:instrText>
+              <w:instrText xml:space="preserve"> PAGEREF _Toc243605246 \h </w:instrText>
             </w:r>
             <w:r>
               <w:rPr>
@@ -2653,7 +2653,7 @@
               <w14:ligatures w14:val="standardContextual"/>
             </w:rPr>
           </w:pPr>
-          <w:hyperlink w:anchor="_Toc243601310" w:history="1">
+          <w:hyperlink w:anchor="_Toc243605247" w:history="1">
             <w:r>
               <w:rPr>
                 <w:rStyle w:val="Hyperlink"/>
@@ -2680,7 +2680,7 @@
                 <w:noProof/>
                 <w:webHidden/>
               </w:rPr>
-              <w:instrText xml:space="preserve"> PAGEREF _Toc243601310 \h </w:instrText>
+              <w:instrText xml:space="preserve"> PAGEREF _Toc243605247 \h </w:instrText>
             </w:r>
             <w:r>
               <w:rPr>
@@ -2727,7 +2727,7 @@
               <w14:ligatures w14:val="standardContextual"/>
             </w:rPr>
           </w:pPr>
-          <w:hyperlink w:anchor="_Toc243601311" w:history="1">
+          <w:hyperlink w:anchor="_Toc243605248" w:history="1">
             <w:r>
               <w:rPr>
                 <w:rStyle w:val="Hyperlink"/>
@@ -2754,7 +2754,7 @@
                 <w:noProof/>
                 <w:webHidden/>
               </w:rPr>
-              <w:instrText xml:space="preserve"> PAGEREF _Toc243601311 \h </w:instrText>
+              <w:instrText xml:space="preserve"> PAGEREF _Toc243605248 \h </w:instrText>
             </w:r>
             <w:r>
               <w:rPr>
@@ -2802,7 +2802,7 @@
               <w14:ligatures w14:val="standardContextual"/>
             </w:rPr>
           </w:pPr>
-          <w:hyperlink w:anchor="_Toc243601312" w:history="1">
+          <w:hyperlink w:anchor="_Toc243605249" w:history="1">
             <w:r>
               <w:rPr>
                 <w:rStyle w:val="Hyperlink"/>
@@ -2848,7 +2848,7 @@
                 <w:noProof/>
                 <w:webHidden/>
               </w:rPr>
-              <w:instrText xml:space="preserve"> PAGEREF _Toc243601312 \h </w:instrText>
+              <w:instrText xml:space="preserve"> PAGEREF _Toc243605249 \h </w:instrText>
             </w:r>
             <w:r>
               <w:rPr>
@@ -2896,7 +2896,7 @@
               <w14:ligatures w14:val="standardContextual"/>
             </w:rPr>
           </w:pPr>
-          <w:hyperlink w:anchor="_Toc243601313" w:history="1">
+          <w:hyperlink w:anchor="_Toc243605250" w:history="1">
             <w:r>
               <w:rPr>
                 <w:rStyle w:val="Hyperlink"/>
@@ -2942,7 +2942,7 @@
                 <w:noProof/>
                 <w:webHidden/>
               </w:rPr>
-              <w:instrText xml:space="preserve"> PAGEREF _Toc243601313 \h </w:instrText>
+              <w:instrText xml:space="preserve"> PAGEREF _Toc243605250 \h </w:instrText>
             </w:r>
             <w:r>
               <w:rPr>
@@ -2990,7 +2990,7 @@
               <w14:ligatures w14:val="standardContextual"/>
             </w:rPr>
           </w:pPr>
-          <w:hyperlink w:anchor="_Toc243601314" w:history="1">
+          <w:hyperlink w:anchor="_Toc243605251" w:history="1">
             <w:r>
               <w:rPr>
                 <w:rStyle w:val="Hyperlink"/>
@@ -3036,7 +3036,7 @@
                 <w:noProof/>
                 <w:webHidden/>
               </w:rPr>
-              <w:instrText xml:space="preserve"> PAGEREF _Toc243601314 \h </w:instrText>
+              <w:instrText xml:space="preserve"> PAGEREF _Toc243605251 \h </w:instrText>
             </w:r>
             <w:r>
               <w:rPr>
@@ -3084,7 +3084,7 @@
               <w14:ligatures w14:val="standardContextual"/>
             </w:rPr>
           </w:pPr>
-          <w:hyperlink w:anchor="_Toc243601315" w:history="1">
+          <w:hyperlink w:anchor="_Toc243605252" w:history="1">
             <w:r>
               <w:rPr>
                 <w:rStyle w:val="Hyperlink"/>
@@ -3130,7 +3130,7 @@
                 <w:noProof/>
                 <w:webHidden/>
               </w:rPr>
-              <w:instrText xml:space="preserve"> PAGEREF _Toc243601315 \h </w:instrText>
+              <w:instrText xml:space="preserve"> PAGEREF _Toc243605252 \h </w:instrText>
             </w:r>
             <w:r>
               <w:rPr>
@@ -3178,7 +3178,7 @@
               <w14:ligatures w14:val="standardContextual"/>
             </w:rPr>
           </w:pPr>
-          <w:hyperlink w:anchor="_Toc243601316" w:history="1">
+          <w:hyperlink w:anchor="_Toc243605253" w:history="1">
             <w:r>
               <w:rPr>
                 <w:rStyle w:val="Hyperlink"/>
@@ -3224,7 +3224,7 @@
                 <w:noProof/>
                 <w:webHidden/>
               </w:rPr>
-              <w:instrText xml:space="preserve"> PAGEREF _Toc243601316 \h </w:instrText>
+              <w:instrText xml:space="preserve"> PAGEREF _Toc243605253 \h </w:instrText>
             </w:r>
             <w:r>
               <w:rPr>
@@ -3272,7 +3272,7 @@
               <w14:ligatures w14:val="standardContextual"/>
             </w:rPr>
           </w:pPr>
-          <w:hyperlink w:anchor="_Toc243601317" w:history="1">
+          <w:hyperlink w:anchor="_Toc243605254" w:history="1">
             <w:r>
               <w:rPr>
                 <w:rStyle w:val="Hyperlink"/>
@@ -3318,7 +3318,7 @@
                 <w:noProof/>
                 <w:webHidden/>
               </w:rPr>
-              <w:instrText xml:space="preserve"> PAGEREF _Toc243601317 \h </w:instrText>
+              <w:instrText xml:space="preserve"> PAGEREF _Toc243605254 \h </w:instrText>
             </w:r>
             <w:r>
               <w:rPr>
@@ -3366,7 +3366,7 @@
               <w14:ligatures w14:val="standardContextual"/>
             </w:rPr>
           </w:pPr>
-          <w:hyperlink w:anchor="_Toc243601318" w:history="1">
+          <w:hyperlink w:anchor="_Toc243605255" w:history="1">
             <w:r>
               <w:rPr>
                 <w:rStyle w:val="Hyperlink"/>
@@ -3391,7 +3391,21 @@
                 <w:rStyle w:val="Hyperlink"/>
                 <w:noProof/>
               </w:rPr>
-              <w:t>Gherkin Examples</w:t>
+              <w:t>G</w:t>
+            </w:r>
+            <w:r>
+              <w:rPr>
+                <w:rStyle w:val="Hyperlink"/>
+                <w:noProof/>
+              </w:rPr>
+              <w:t>h</w:t>
+            </w:r>
+            <w:r>
+              <w:rPr>
+                <w:rStyle w:val="Hyperlink"/>
+                <w:noProof/>
+              </w:rPr>
+              <w:t>erkin Examples</w:t>
             </w:r>
             <w:r>
               <w:rPr>
@@ -3412,7 +3426,7 @@
                 <w:noProof/>
                 <w:webHidden/>
               </w:rPr>
-              <w:instrText xml:space="preserve"> PAGEREF _Toc243601318 \h </w:instrText>
+              <w:instrText xml:space="preserve"> PAGEREF _Toc243605255 \h </w:instrText>
             </w:r>
             <w:r>
               <w:rPr>
@@ -3432,7 +3446,7 @@
                 <w:noProof/>
                 <w:webHidden/>
               </w:rPr>
-              <w:t>19</w:t>
+              <w:t>20</w:t>
             </w:r>
             <w:r>
               <w:rPr>
@@ -3460,7 +3474,7 @@
               <w14:ligatures w14:val="standardContextual"/>
             </w:rPr>
           </w:pPr>
-          <w:hyperlink w:anchor="_Toc243601319" w:history="1">
+          <w:hyperlink w:anchor="_Toc243605256" w:history="1">
             <w:r>
               <w:rPr>
                 <w:rStyle w:val="Hyperlink"/>
@@ -3506,7 +3520,7 @@
                 <w:noProof/>
                 <w:webHidden/>
               </w:rPr>
-              <w:instrText xml:space="preserve"> PAGEREF _Toc243601319 \h </w:instrText>
+              <w:instrText xml:space="preserve"> PAGEREF _Toc243605256 \h </w:instrText>
             </w:r>
             <w:r>
               <w:rPr>
@@ -3526,7 +3540,7 @@
                 <w:noProof/>
                 <w:webHidden/>
               </w:rPr>
-              <w:t>21</w:t>
+              <w:t>22</w:t>
             </w:r>
             <w:r>
               <w:rPr>
@@ -3554,7 +3568,7 @@
               <w14:ligatures w14:val="standardContextual"/>
             </w:rPr>
           </w:pPr>
-          <w:hyperlink w:anchor="_Toc243601320" w:history="1">
+          <w:hyperlink w:anchor="_Toc243605257" w:history="1">
             <w:r>
               <w:rPr>
                 <w:rStyle w:val="Hyperlink"/>
@@ -3600,7 +3614,7 @@
                 <w:noProof/>
                 <w:webHidden/>
               </w:rPr>
-              <w:instrText xml:space="preserve"> PAGEREF _Toc243601320 \h </w:instrText>
+              <w:instrText xml:space="preserve"> PAGEREF _Toc243605257 \h </w:instrText>
             </w:r>
             <w:r>
               <w:rPr>
@@ -3620,7 +3634,7 @@
                 <w:noProof/>
                 <w:webHidden/>
               </w:rPr>
-              <w:t>21</w:t>
+              <w:t>22</w:t>
             </w:r>
             <w:r>
               <w:rPr>
@@ -3648,7 +3662,7 @@
               <w14:ligatures w14:val="standardContextual"/>
             </w:rPr>
           </w:pPr>
-          <w:hyperlink w:anchor="_Toc243601321" w:history="1">
+          <w:hyperlink w:anchor="_Toc243605258" w:history="1">
             <w:r>
               <w:rPr>
                 <w:rStyle w:val="Hyperlink"/>
@@ -3694,7 +3708,7 @@
                 <w:noProof/>
                 <w:webHidden/>
               </w:rPr>
-              <w:instrText xml:space="preserve"> PAGEREF _Toc243601321 \h </w:instrText>
+              <w:instrText xml:space="preserve"> PAGEREF _Toc243605258 \h </w:instrText>
             </w:r>
             <w:r>
               <w:rPr>
@@ -3742,7 +3756,7 @@
               <w14:ligatures w14:val="standardContextual"/>
             </w:rPr>
           </w:pPr>
-          <w:hyperlink w:anchor="_Toc243601322" w:history="1">
+          <w:hyperlink w:anchor="_Toc243605259" w:history="1">
             <w:r>
               <w:rPr>
                 <w:rStyle w:val="Hyperlink"/>
@@ -3788,7 +3802,7 @@
                 <w:noProof/>
                 <w:webHidden/>
               </w:rPr>
-              <w:instrText xml:space="preserve"> PAGEREF _Toc243601322 \h </w:instrText>
+              <w:instrText xml:space="preserve"> PAGEREF _Toc243605259 \h </w:instrText>
             </w:r>
             <w:r>
               <w:rPr>
@@ -3835,7 +3849,7 @@
               <w14:ligatures w14:val="standardContextual"/>
             </w:rPr>
           </w:pPr>
-          <w:hyperlink w:anchor="_Toc243601323" w:history="1">
+          <w:hyperlink w:anchor="_Toc243605260" w:history="1">
             <w:r>
               <w:rPr>
                 <w:rStyle w:val="Hyperlink"/>
@@ -3862,7 +3876,7 @@
                 <w:noProof/>
                 <w:webHidden/>
               </w:rPr>
-              <w:instrText xml:space="preserve"> PAGEREF _Toc243601323 \h </w:instrText>
+              <w:instrText xml:space="preserve"> PAGEREF _Toc243605260 \h </w:instrText>
             </w:r>
             <w:r>
               <w:rPr>
@@ -3910,7 +3924,7 @@
               <w14:ligatures w14:val="standardContextual"/>
             </w:rPr>
           </w:pPr>
-          <w:hyperlink w:anchor="_Toc243601324" w:history="1">
+          <w:hyperlink w:anchor="_Toc243605261" w:history="1">
             <w:r>
               <w:rPr>
                 <w:rStyle w:val="Hyperlink"/>
@@ -3956,7 +3970,7 @@
                 <w:noProof/>
                 <w:webHidden/>
               </w:rPr>
-              <w:instrText xml:space="preserve"> PAGEREF _Toc243601324 \h </w:instrText>
+              <w:instrText xml:space="preserve"> PAGEREF _Toc243605261 \h </w:instrText>
             </w:r>
             <w:r>
               <w:rPr>
@@ -4004,7 +4018,7 @@
               <w14:ligatures w14:val="standardContextual"/>
             </w:rPr>
           </w:pPr>
-          <w:hyperlink w:anchor="_Toc243601325" w:history="1">
+          <w:hyperlink w:anchor="_Toc243605262" w:history="1">
             <w:r>
               <w:rPr>
                 <w:rStyle w:val="Hyperlink"/>
@@ -4050,7 +4064,7 @@
                 <w:noProof/>
                 <w:webHidden/>
               </w:rPr>
-              <w:instrText xml:space="preserve"> PAGEREF _Toc243601325 \h </w:instrText>
+              <w:instrText xml:space="preserve"> PAGEREF _Toc243605262 \h </w:instrText>
             </w:r>
             <w:r>
               <w:rPr>
@@ -4070,7 +4084,7 @@
                 <w:noProof/>
                 <w:webHidden/>
               </w:rPr>
-              <w:t>24</w:t>
+              <w:t>25</w:t>
             </w:r>
             <w:r>
               <w:rPr>
@@ -4097,7 +4111,7 @@
               <w14:ligatures w14:val="standardContextual"/>
             </w:rPr>
           </w:pPr>
-          <w:hyperlink w:anchor="_Toc243601326" w:history="1">
+          <w:hyperlink w:anchor="_Toc243605263" w:history="1">
             <w:r>
               <w:rPr>
                 <w:rStyle w:val="Hyperlink"/>
@@ -4124,7 +4138,7 @@
                 <w:noProof/>
                 <w:webHidden/>
               </w:rPr>
-              <w:instrText xml:space="preserve"> PAGEREF _Toc243601326 \h </w:instrText>
+              <w:instrText xml:space="preserve"> PAGEREF _Toc243605263 \h </w:instrText>
             </w:r>
             <w:r>
               <w:rPr>
@@ -4144,7 +4158,7 @@
                 <w:noProof/>
                 <w:webHidden/>
               </w:rPr>
-              <w:t>24</w:t>
+              <w:t>25</w:t>
             </w:r>
             <w:r>
               <w:rPr>
@@ -4171,7 +4185,7 @@
               <w14:ligatures w14:val="standardContextual"/>
             </w:rPr>
           </w:pPr>
-          <w:hyperlink w:anchor="_Toc243601327" w:history="1">
+          <w:hyperlink w:anchor="_Toc243605264" w:history="1">
             <w:r>
               <w:rPr>
                 <w:rStyle w:val="Hyperlink"/>
@@ -4198,7 +4212,7 @@
                 <w:noProof/>
                 <w:webHidden/>
               </w:rPr>
-              <w:instrText xml:space="preserve"> PAGEREF _Toc243601327 \h </w:instrText>
+              <w:instrText xml:space="preserve"> PAGEREF _Toc243605264 \h </w:instrText>
             </w:r>
             <w:r>
               <w:rPr>
@@ -4245,7 +4259,7 @@
               <w14:ligatures w14:val="standardContextual"/>
             </w:rPr>
           </w:pPr>
-          <w:hyperlink w:anchor="_Toc243601328" w:history="1">
+          <w:hyperlink w:anchor="_Toc243605265" w:history="1">
             <w:r>
               <w:rPr>
                 <w:rStyle w:val="Hyperlink"/>
@@ -4272,7 +4286,7 @@
                 <w:noProof/>
                 <w:webHidden/>
               </w:rPr>
-              <w:instrText xml:space="preserve"> PAGEREF _Toc243601328 \h </w:instrText>
+              <w:instrText xml:space="preserve"> PAGEREF _Toc243605265 \h </w:instrText>
             </w:r>
             <w:r>
               <w:rPr>
@@ -4319,7 +4333,7 @@
               <w14:ligatures w14:val="standardContextual"/>
             </w:rPr>
           </w:pPr>
-          <w:hyperlink w:anchor="_Toc243601329" w:history="1">
+          <w:hyperlink w:anchor="_Toc243605266" w:history="1">
             <w:r>
               <w:rPr>
                 <w:rStyle w:val="Hyperlink"/>
@@ -4346,7 +4360,7 @@
                 <w:noProof/>
                 <w:webHidden/>
               </w:rPr>
-              <w:instrText xml:space="preserve"> PAGEREF _Toc243601329 \h </w:instrText>
+              <w:instrText xml:space="preserve"> PAGEREF _Toc243605266 \h </w:instrText>
             </w:r>
             <w:r>
               <w:rPr>
@@ -4394,7 +4408,7 @@
               <w14:ligatures w14:val="standardContextual"/>
             </w:rPr>
           </w:pPr>
-          <w:hyperlink w:anchor="_Toc243601330" w:history="1">
+          <w:hyperlink w:anchor="_Toc243605267" w:history="1">
             <w:r>
               <w:rPr>
                 <w:rStyle w:val="Hyperlink"/>
@@ -4440,7 +4454,7 @@
                 <w:noProof/>
                 <w:webHidden/>
               </w:rPr>
-              <w:instrText xml:space="preserve"> PAGEREF _Toc243601330 \h </w:instrText>
+              <w:instrText xml:space="preserve"> PAGEREF _Toc243605267 \h </w:instrText>
             </w:r>
             <w:r>
               <w:rPr>
@@ -4460,7 +4474,7 @@
                 <w:noProof/>
                 <w:webHidden/>
               </w:rPr>
-              <w:t>32</w:t>
+              <w:t>33</w:t>
             </w:r>
             <w:r>
               <w:rPr>
@@ -4488,7 +4502,7 @@
               <w14:ligatures w14:val="standardContextual"/>
             </w:rPr>
           </w:pPr>
-          <w:hyperlink w:anchor="_Toc243601331" w:history="1">
+          <w:hyperlink w:anchor="_Toc243605268" w:history="1">
             <w:r>
               <w:rPr>
                 <w:rStyle w:val="Hyperlink"/>
@@ -4534,7 +4548,7 @@
                 <w:noProof/>
                 <w:webHidden/>
               </w:rPr>
-              <w:instrText xml:space="preserve"> PAGEREF _Toc243601331 \h </w:instrText>
+              <w:instrText xml:space="preserve"> PAGEREF _Toc243605268 \h </w:instrText>
             </w:r>
             <w:r>
               <w:rPr>
@@ -4554,7 +4568,7 @@
                 <w:noProof/>
                 <w:webHidden/>
               </w:rPr>
-              <w:t>32</w:t>
+              <w:t>33</w:t>
             </w:r>
             <w:r>
               <w:rPr>
@@ -4582,7 +4596,7 @@
               <w14:ligatures w14:val="standardContextual"/>
             </w:rPr>
           </w:pPr>
-          <w:hyperlink w:anchor="_Toc243601332" w:history="1">
+          <w:hyperlink w:anchor="_Toc243605269" w:history="1">
             <w:r>
               <w:rPr>
                 <w:rStyle w:val="Hyperlink"/>
@@ -4628,7 +4642,7 @@
                 <w:noProof/>
                 <w:webHidden/>
               </w:rPr>
-              <w:instrText xml:space="preserve"> PAGEREF _Toc243601332 \h </w:instrText>
+              <w:instrText xml:space="preserve"> PAGEREF _Toc243605269 \h </w:instrText>
             </w:r>
             <w:r>
               <w:rPr>
@@ -4676,7 +4690,7 @@
               <w14:ligatures w14:val="standardContextual"/>
             </w:rPr>
           </w:pPr>
-          <w:hyperlink w:anchor="_Toc243601333" w:history="1">
+          <w:hyperlink w:anchor="_Toc243605270" w:history="1">
             <w:r>
               <w:rPr>
                 <w:rStyle w:val="Hyperlink"/>
@@ -4722,7 +4736,7 @@
                 <w:noProof/>
                 <w:webHidden/>
               </w:rPr>
-              <w:instrText xml:space="preserve"> PAGEREF _Toc243601333 \h </w:instrText>
+              <w:instrText xml:space="preserve"> PAGEREF _Toc243605270 \h </w:instrText>
             </w:r>
             <w:r>
               <w:rPr>
@@ -4770,7 +4784,7 @@
               <w14:ligatures w14:val="standardContextual"/>
             </w:rPr>
           </w:pPr>
-          <w:hyperlink w:anchor="_Toc243601334" w:history="1">
+          <w:hyperlink w:anchor="_Toc243605271" w:history="1">
             <w:r>
               <w:rPr>
                 <w:rStyle w:val="Hyperlink"/>
@@ -4816,7 +4830,7 @@
                 <w:noProof/>
                 <w:webHidden/>
               </w:rPr>
-              <w:instrText xml:space="preserve"> PAGEREF _Toc243601334 \h </w:instrText>
+              <w:instrText xml:space="preserve"> PAGEREF _Toc243605271 \h </w:instrText>
             </w:r>
             <w:r>
               <w:rPr>
@@ -4864,7 +4878,7 @@
               <w14:ligatures w14:val="standardContextual"/>
             </w:rPr>
           </w:pPr>
-          <w:hyperlink w:anchor="_Toc243601335" w:history="1">
+          <w:hyperlink w:anchor="_Toc243605272" w:history="1">
             <w:r>
               <w:rPr>
                 <w:rStyle w:val="Hyperlink"/>
@@ -4910,7 +4924,7 @@
                 <w:noProof/>
                 <w:webHidden/>
               </w:rPr>
-              <w:instrText xml:space="preserve"> PAGEREF _Toc243601335 \h </w:instrText>
+              <w:instrText xml:space="preserve"> PAGEREF _Toc243605272 \h </w:instrText>
             </w:r>
             <w:r>
               <w:rPr>
@@ -4958,7 +4972,7 @@
               <w14:ligatures w14:val="standardContextual"/>
             </w:rPr>
           </w:pPr>
-          <w:hyperlink w:anchor="_Toc243601336" w:history="1">
+          <w:hyperlink w:anchor="_Toc243605273" w:history="1">
             <w:r>
               <w:rPr>
                 <w:rStyle w:val="Hyperlink"/>
@@ -5004,7 +5018,7 @@
                 <w:noProof/>
                 <w:webHidden/>
               </w:rPr>
-              <w:instrText xml:space="preserve"> PAGEREF _Toc243601336 \h </w:instrText>
+              <w:instrText xml:space="preserve"> PAGEREF _Toc243605273 \h </w:instrText>
             </w:r>
             <w:r>
               <w:rPr>
@@ -5061,7 +5075,7 @@
           <w:numId w:val="1"/>
         </w:numPr>
       </w:pPr>
-      <w:bookmarkStart w:id="0" w:name="_Toc243601291"/>
+      <w:bookmarkStart w:id="0" w:name="_Toc243605228"/>
       <w:r>
         <w:lastRenderedPageBreak/>
         <w:t>Scenario Interpretation</w:t>
@@ -5076,7 +5090,7 @@
           <w:numId w:val="1"/>
         </w:numPr>
       </w:pPr>
-      <w:bookmarkStart w:id="1" w:name="_Toc243601292"/>
+      <w:bookmarkStart w:id="1" w:name="_Toc243605229"/>
       <w:r>
         <w:t>Organi</w:t>
       </w:r>
@@ -5594,7 +5608,7 @@
           <w:numId w:val="1"/>
         </w:numPr>
       </w:pPr>
-      <w:bookmarkStart w:id="2" w:name="_Toc243601293"/>
+      <w:bookmarkStart w:id="2" w:name="_Toc243605230"/>
       <w:r>
         <w:lastRenderedPageBreak/>
         <w:t>Symptoms, Problems and Consequences</w:t>
@@ -5608,10 +5622,10 @@
         <w:tblLook w:val="04A0" w:firstRow="1" w:lastRow="0" w:firstColumn="1" w:lastColumn="0" w:noHBand="0" w:noVBand="1"/>
       </w:tblPr>
       <w:tblGrid>
-        <w:gridCol w:w="2254"/>
-        <w:gridCol w:w="2254"/>
-        <w:gridCol w:w="2254"/>
-        <w:gridCol w:w="2254"/>
+        <w:gridCol w:w="2145"/>
+        <w:gridCol w:w="2211"/>
+        <w:gridCol w:w="2440"/>
+        <w:gridCol w:w="2220"/>
       </w:tblGrid>
       <w:tr>
         <w:trPr>
@@ -5705,7 +5719,15 @@
               <w:cnfStyle w:val="000000100000" w:firstRow="0" w:lastRow="0" w:firstColumn="0" w:lastColumn="0" w:oddVBand="0" w:evenVBand="0" w:oddHBand="1" w:evenHBand="0" w:firstRowFirstColumn="0" w:firstRowLastColumn="0" w:lastRowFirstColumn="0" w:lastRowLastColumn="0"/>
             </w:pPr>
             <w:r>
-              <w:t>Requested items are not reliably assigned to a route visit.</w:t>
+              <w:t xml:space="preserve">Requested items are not reliably assigned to a </w:t>
+            </w:r>
+            <w:proofErr w:type="spellStart"/>
+            <w:r>
+              <w:t>RouteVisit</w:t>
+            </w:r>
+            <w:proofErr w:type="spellEnd"/>
+            <w:r>
+              <w:t>.</w:t>
             </w:r>
           </w:p>
         </w:tc>
@@ -6061,8 +6083,13 @@
             <w:pPr>
               <w:cnfStyle w:val="000000100000" w:firstRow="0" w:lastRow="0" w:firstColumn="0" w:lastColumn="0" w:oddVBand="0" w:evenVBand="0" w:oddHBand="1" w:evenHBand="0" w:firstRowFirstColumn="0" w:firstRowLastColumn="0" w:lastRowFirstColumn="0" w:lastRowLastColumn="0"/>
             </w:pPr>
-            <w:r>
-              <w:t>Collection permission is undefined.</w:t>
+            <w:proofErr w:type="spellStart"/>
+            <w:r>
+              <w:t>CollectionPermission</w:t>
+            </w:r>
+            <w:proofErr w:type="spellEnd"/>
+            <w:r>
+              <w:t xml:space="preserve"> is undefined.</w:t>
             </w:r>
           </w:p>
         </w:tc>
@@ -6150,7 +6177,7 @@
           <w:numId w:val="1"/>
         </w:numPr>
       </w:pPr>
-      <w:bookmarkStart w:id="3" w:name="_Toc243601294"/>
+      <w:bookmarkStart w:id="3" w:name="_Toc243605231"/>
       <w:r>
         <w:t>Business Problem statement</w:t>
       </w:r>
@@ -6227,7 +6254,7 @@
           <w:numId w:val="1"/>
         </w:numPr>
       </w:pPr>
-      <w:bookmarkStart w:id="4" w:name="_Toc243601295"/>
+      <w:bookmarkStart w:id="4" w:name="_Toc243605232"/>
       <w:r>
         <w:t>Desired outcomes</w:t>
       </w:r>
@@ -6242,7 +6269,15 @@
         </w:numPr>
       </w:pPr>
       <w:r>
-        <w:t>Staff and drivers work from a central view of each route visit and its stops.</w:t>
+        <w:t xml:space="preserve">Staff and drivers work from a central view of each </w:t>
+      </w:r>
+      <w:proofErr w:type="spellStart"/>
+      <w:r>
+        <w:t>RouteVisit</w:t>
+      </w:r>
+      <w:proofErr w:type="spellEnd"/>
+      <w:r>
+        <w:t xml:space="preserve"> and its stops.</w:t>
       </w:r>
     </w:p>
     <w:p>
@@ -6317,7 +6352,7 @@
           <w:numId w:val="1"/>
         </w:numPr>
       </w:pPr>
-      <w:bookmarkStart w:id="5" w:name="_Toc243601296"/>
+      <w:bookmarkStart w:id="5" w:name="_Toc243605233"/>
       <w:r>
         <w:lastRenderedPageBreak/>
         <w:t>Purpose, scope and boundary</w:t>
@@ -6350,7 +6385,18 @@
         <w:t>ervice will support route and stop scheduling, request</w:t>
       </w:r>
       <w:r>
-        <w:t xml:space="preserve"> assignment to route visits, visit preparation and loading checks, recording of service status and disruption, borrower and partner notification and reconciliation of offline transactions, all applied for the two mobile library vehicles. </w:t>
+        <w:t xml:space="preserve"> assignment to </w:t>
+      </w:r>
+      <w:proofErr w:type="spellStart"/>
+      <w:r>
+        <w:t>RouteVisit</w:t>
+      </w:r>
+      <w:r>
+        <w:t>s</w:t>
+      </w:r>
+      <w:proofErr w:type="spellEnd"/>
+      <w:r>
+        <w:t xml:space="preserve">, visit preparation and loading checks, recording of service status and disruption, borrower and partner notification and reconciliation of offline transactions, all applied for the two mobile library vehicles. </w:t>
       </w:r>
     </w:p>
     <w:p>
@@ -6765,7 +6811,7 @@
       <w:pPr>
         <w:pStyle w:val="Heading2"/>
       </w:pPr>
-      <w:bookmarkStart w:id="6" w:name="_Toc243601297"/>
+      <w:bookmarkStart w:id="6" w:name="_Toc243605234"/>
       <w:r>
         <w:t>What the in</w:t>
       </w:r>
@@ -7006,7 +7052,7 @@
       <w:r>
         <w:t xml:space="preserve"> </w:t>
       </w:r>
-      <w:bookmarkStart w:id="7" w:name="_Toc243601298"/>
+      <w:bookmarkStart w:id="7" w:name="_Toc243605235"/>
       <w:r>
         <w:t>Wh</w:t>
       </w:r>
@@ -7184,7 +7230,7 @@
           <w:numId w:val="1"/>
         </w:numPr>
       </w:pPr>
-      <w:bookmarkStart w:id="8" w:name="_Toc243601299"/>
+      <w:bookmarkStart w:id="8" w:name="_Toc243605236"/>
       <w:r>
         <w:t>Dependencies</w:t>
       </w:r>
@@ -7557,7 +7603,7 @@
           <w:numId w:val="1"/>
         </w:numPr>
       </w:pPr>
-      <w:bookmarkStart w:id="9" w:name="_Toc243601300"/>
+      <w:bookmarkStart w:id="9" w:name="_Toc243605237"/>
       <w:r>
         <w:t>System Boundary</w:t>
       </w:r>
@@ -7785,7 +7831,7 @@
       <w:r>
         <w:t xml:space="preserve"> </w:t>
       </w:r>
-      <w:bookmarkStart w:id="10" w:name="_Toc243601301"/>
+      <w:bookmarkStart w:id="10" w:name="_Toc243605238"/>
       <w:r>
         <w:t>Stakeholder and actor catalogue</w:t>
       </w:r>
@@ -8883,7 +8929,7 @@
       <w:pPr>
         <w:pStyle w:val="Heading2"/>
       </w:pPr>
-      <w:bookmarkStart w:id="11" w:name="_Toc243601302"/>
+      <w:bookmarkStart w:id="11" w:name="_Toc243605239"/>
       <w:r>
         <w:t>3.1 Stakeholder analysis</w:t>
       </w:r>
@@ -8953,7 +8999,7 @@
       <w:pPr>
         <w:pStyle w:val="Heading2"/>
       </w:pPr>
-      <w:bookmarkStart w:id="12" w:name="_Toc243601303"/>
+      <w:bookmarkStart w:id="12" w:name="_Toc243605240"/>
       <w:r>
         <w:t>3.2 Actor catalogue</w:t>
       </w:r>
@@ -9399,15 +9445,7 @@
               <w:cnfStyle w:val="000000000000" w:firstRow="0" w:lastRow="0" w:firstColumn="0" w:lastColumn="0" w:oddVBand="0" w:evenVBand="0" w:oddHBand="0" w:evenHBand="0" w:firstRowFirstColumn="0" w:firstRowLastColumn="0" w:lastRowFirstColumn="0" w:lastRowLastColumn="0"/>
             </w:pPr>
             <w:r>
-              <w:t xml:space="preserve">Provide account and item status, receive loans and </w:t>
-            </w:r>
-            <w:proofErr w:type="gramStart"/>
-            <w:r>
-              <w:t>returns</w:t>
-            </w:r>
-            <w:proofErr w:type="gramEnd"/>
-            <w:r>
-              <w:t xml:space="preserve"> </w:t>
+              <w:t xml:space="preserve">Provide account and item status, receive loans and returns </w:t>
             </w:r>
           </w:p>
         </w:tc>
@@ -9631,7 +9669,7 @@
         <w:lastRenderedPageBreak/>
         <w:t xml:space="preserve"> </w:t>
       </w:r>
-      <w:bookmarkStart w:id="13" w:name="_Toc243601304"/>
+      <w:bookmarkStart w:id="13" w:name="_Toc243605241"/>
       <w:r>
         <w:t>Requirements catalogue</w:t>
       </w:r>
@@ -9656,7 +9694,7 @@
           <w:numId w:val="1"/>
         </w:numPr>
       </w:pPr>
-      <w:bookmarkStart w:id="14" w:name="_Toc243601305"/>
+      <w:bookmarkStart w:id="14" w:name="_Toc243605242"/>
       <w:r>
         <w:t>Functional requirements</w:t>
       </w:r>
@@ -9857,7 +9895,15 @@
               <w:t>shall</w:t>
             </w:r>
             <w:r>
-              <w:t xml:space="preserve"> allow the route coordinator to change the stop order for a single route visit without changing the planned route.</w:t>
+              <w:t xml:space="preserve"> allow the route coordinator to change the stop order for a single </w:t>
+            </w:r>
+            <w:proofErr w:type="spellStart"/>
+            <w:r>
+              <w:t>RouteVisit</w:t>
+            </w:r>
+            <w:proofErr w:type="spellEnd"/>
+            <w:r>
+              <w:t xml:space="preserve"> without changing the planned route.</w:t>
             </w:r>
           </w:p>
         </w:tc>
@@ -10073,7 +10119,15 @@
               <w:cnfStyle w:val="000000100000" w:firstRow="0" w:lastRow="0" w:firstColumn="0" w:lastColumn="0" w:oddVBand="0" w:evenVBand="0" w:oddHBand="1" w:evenHBand="0" w:firstRowFirstColumn="0" w:firstRowLastColumn="0" w:lastRowFirstColumn="0" w:lastRowLastColumn="0"/>
             </w:pPr>
             <w:r>
-              <w:t>The system shall link each requested item to one route visit.</w:t>
+              <w:t xml:space="preserve">The system shall link each requested item to one </w:t>
+            </w:r>
+            <w:proofErr w:type="spellStart"/>
+            <w:r>
+              <w:t>RouteVisit</w:t>
+            </w:r>
+            <w:proofErr w:type="spellEnd"/>
+            <w:r>
+              <w:t>.</w:t>
             </w:r>
           </w:p>
         </w:tc>
@@ -10139,7 +10193,15 @@
               <w:cnfStyle w:val="000000000000" w:firstRow="0" w:lastRow="0" w:firstColumn="0" w:lastColumn="0" w:oddVBand="0" w:evenVBand="0" w:oddHBand="0" w:evenHBand="0" w:firstRowFirstColumn="0" w:firstRowLastColumn="0" w:lastRowFirstColumn="0" w:lastRowLastColumn="0"/>
             </w:pPr>
             <w:r>
-              <w:t>The system shall produce a load list for each route visit showing requested items, expected collections and returns going back to branches</w:t>
+              <w:t xml:space="preserve">The system shall produce a load list for each </w:t>
+            </w:r>
+            <w:proofErr w:type="spellStart"/>
+            <w:r>
+              <w:t>RouteVisit</w:t>
+            </w:r>
+            <w:proofErr w:type="spellEnd"/>
+            <w:r>
+              <w:t xml:space="preserve"> showing requested items, expected collections and returns going back to branches</w:t>
             </w:r>
           </w:p>
         </w:tc>
@@ -10274,7 +10336,16 @@
               <w:cnfStyle w:val="000000000000" w:firstRow="0" w:lastRow="0" w:firstColumn="0" w:lastColumn="0" w:oddVBand="0" w:evenVBand="0" w:oddHBand="0" w:evenHBand="0" w:firstRowFirstColumn="0" w:firstRowLastColumn="0" w:lastRowFirstColumn="0" w:lastRowLastColumn="0"/>
             </w:pPr>
             <w:r>
-              <w:t>The system shall record the status of each stop visit as on time, delayed, moved or cancelled.</w:t>
+              <w:t xml:space="preserve">The system shall record the status of each </w:t>
+            </w:r>
+            <w:r>
+              <w:t>stop v</w:t>
+            </w:r>
+            <w:r>
+              <w:t>isit</w:t>
+            </w:r>
+            <w:r>
+              <w:t xml:space="preserve"> as on time, delayed, moved or cancelled.</w:t>
             </w:r>
           </w:p>
         </w:tc>
@@ -10343,7 +10414,11 @@
               <w:cnfStyle w:val="000000100000" w:firstRow="0" w:lastRow="0" w:firstColumn="0" w:lastColumn="0" w:oddVBand="0" w:evenVBand="0" w:oddHBand="1" w:evenHBand="0" w:firstRowFirstColumn="0" w:firstRowLastColumn="0" w:lastRowFirstColumn="0" w:lastRowLastColumn="0"/>
             </w:pPr>
             <w:r>
-              <w:t xml:space="preserve">The system shall notify borrowers with items for a stop, and that stop’s community coordinator when the visit is moved or cancelled. </w:t>
+              <w:t xml:space="preserve">The system shall notify borrowers with items for a stop, and that stop’s community coordinator </w:t>
+            </w:r>
+            <w:r>
+              <w:lastRenderedPageBreak/>
+              <w:t xml:space="preserve">when the visit is moved or cancelled. </w:t>
             </w:r>
           </w:p>
         </w:tc>
@@ -10358,6 +10433,7 @@
               <w:cnfStyle w:val="000000100000" w:firstRow="0" w:lastRow="0" w:firstColumn="0" w:lastColumn="0" w:oddVBand="0" w:evenVBand="0" w:oddHBand="1" w:evenHBand="0" w:firstRowFirstColumn="0" w:firstRowLastColumn="0" w:lastRowFirstColumn="0" w:lastRowLastColumn="0"/>
             </w:pPr>
             <w:r>
+              <w:lastRenderedPageBreak/>
               <w:t xml:space="preserve">Must </w:t>
             </w:r>
           </w:p>
@@ -10394,7 +10470,6 @@
                 <w:b w:val="0"/>
                 <w:bCs w:val="0"/>
               </w:rPr>
-              <w:lastRenderedPageBreak/>
               <w:t>FR10</w:t>
             </w:r>
           </w:p>
@@ -10668,6 +10743,12 @@
         </w:tc>
       </w:tr>
     </w:tbl>
+    <w:p>
+      <w:pPr>
+        <w:pStyle w:val="ListParagraph"/>
+        <w:ind w:left="840"/>
+      </w:pPr>
+    </w:p>
     <w:p>
       <w:pPr>
         <w:pStyle w:val="ListParagraph"/>
@@ -10682,7 +10763,7 @@
           <w:numId w:val="1"/>
         </w:numPr>
       </w:pPr>
-      <w:bookmarkStart w:id="15" w:name="_Toc243601306"/>
+      <w:bookmarkStart w:id="15" w:name="_Toc243605243"/>
       <w:r>
         <w:t>Non-functional requirements</w:t>
       </w:r>
@@ -11089,6 +11170,9 @@
       </w:tr>
     </w:tbl>
     <w:p/>
+    <w:p/>
+    <w:p/>
+    <w:p/>
     <w:p>
       <w:pPr>
         <w:pStyle w:val="Heading2"/>
@@ -11097,8 +11181,9 @@
           <w:numId w:val="1"/>
         </w:numPr>
       </w:pPr>
-      <w:bookmarkStart w:id="16" w:name="_Toc243601307"/>
+      <w:bookmarkStart w:id="16" w:name="_Toc243605244"/>
       <w:r>
+        <w:lastRenderedPageBreak/>
         <w:t>MoSCoW</w:t>
       </w:r>
       <w:bookmarkEnd w:id="16"/>
@@ -11258,11 +11343,7 @@
               <w:t xml:space="preserve">Record the </w:t>
             </w:r>
             <w:r>
-              <w:t xml:space="preserve">borrower’s choice on an alternative </w:t>
-            </w:r>
-            <w:r>
-              <w:lastRenderedPageBreak/>
-              <w:t>(FR10): staff can note it by hand for now</w:t>
+              <w:t>borrower’s choice on an alternative (FR10): staff can note it by hand for now</w:t>
             </w:r>
           </w:p>
         </w:tc>
@@ -11288,7 +11369,6 @@
                 <w:b w:val="0"/>
                 <w:bCs w:val="0"/>
               </w:rPr>
-              <w:lastRenderedPageBreak/>
               <w:t>Could</w:t>
             </w:r>
           </w:p>
@@ -11385,7 +11465,7 @@
           <w:numId w:val="1"/>
         </w:numPr>
       </w:pPr>
-      <w:bookmarkStart w:id="17" w:name="_Toc243601308"/>
+      <w:bookmarkStart w:id="17" w:name="_Toc243605245"/>
       <w:r>
         <w:t>Requirement quality review</w:t>
       </w:r>
@@ -11974,18 +12054,19 @@
               <w:cnfStyle w:val="000000000000" w:firstRow="0" w:lastRow="0" w:firstColumn="0" w:lastColumn="0" w:oddVBand="0" w:evenVBand="0" w:oddHBand="0" w:evenHBand="0" w:firstRowFirstColumn="0" w:firstRowLastColumn="0" w:lastRowFirstColumn="0" w:lastRowLastColumn="0"/>
             </w:pPr>
             <w:r>
-              <w:t xml:space="preserve">The delay triggers a </w:t>
-            </w:r>
-            <w:proofErr w:type="gramStart"/>
-            <w:r>
-              <w:t>notice</w:t>
-            </w:r>
-            <w:proofErr w:type="gramEnd"/>
-            <w:r>
-              <w:t xml:space="preserve"> and the collection permission</w:t>
-            </w:r>
-            <w:r>
-              <w:t xml:space="preserve">s are recorded as questions </w:t>
+              <w:t xml:space="preserve">The delay triggers a notice and the </w:t>
+            </w:r>
+            <w:proofErr w:type="spellStart"/>
+            <w:r>
+              <w:lastRenderedPageBreak/>
+              <w:t>CollectionPermission</w:t>
+            </w:r>
+            <w:r>
+              <w:t>s</w:t>
+            </w:r>
+            <w:proofErr w:type="spellEnd"/>
+            <w:r>
+              <w:t xml:space="preserve"> are recorded as questions </w:t>
             </w:r>
             <w:r>
               <w:t xml:space="preserve">in </w:t>
@@ -11997,11 +12078,6 @@
         </w:tc>
       </w:tr>
     </w:tbl>
-    <w:p>
-      <w:pPr>
-        <w:ind w:left="360"/>
-      </w:pPr>
-    </w:p>
     <w:p/>
     <w:p>
       <w:pPr>
@@ -12011,9 +12087,8 @@
           <w:numId w:val="1"/>
         </w:numPr>
       </w:pPr>
-      <w:bookmarkStart w:id="18" w:name="_Toc243601309"/>
+      <w:bookmarkStart w:id="18" w:name="_Toc243605246"/>
       <w:r>
-        <w:lastRenderedPageBreak/>
         <w:t>Business rules and uncertainty register</w:t>
       </w:r>
       <w:bookmarkEnd w:id="18"/>
@@ -12029,7 +12104,7 @@
       <w:pPr>
         <w:pStyle w:val="Heading2"/>
       </w:pPr>
-      <w:bookmarkStart w:id="19" w:name="_Toc243601310"/>
+      <w:bookmarkStart w:id="19" w:name="_Toc243605247"/>
       <w:r>
         <w:t>5.1 Rules, assumptions, constraints and risks</w:t>
       </w:r>
@@ -12605,6 +12680,7 @@
                 <w:b w:val="0"/>
                 <w:bCs w:val="0"/>
               </w:rPr>
+              <w:lastRenderedPageBreak/>
               <w:t>Risk</w:t>
             </w:r>
           </w:p>
@@ -12706,7 +12782,6 @@
                 <w:b w:val="0"/>
                 <w:bCs w:val="0"/>
               </w:rPr>
-              <w:lastRenderedPageBreak/>
               <w:t>Risk</w:t>
             </w:r>
           </w:p>
@@ -12749,7 +12824,7 @@
       <w:pPr>
         <w:pStyle w:val="Heading2"/>
       </w:pPr>
-      <w:bookmarkStart w:id="20" w:name="_Toc243601311"/>
+      <w:bookmarkStart w:id="20" w:name="_Toc243605248"/>
       <w:r>
         <w:t>5.2 Questions for stakeholders</w:t>
       </w:r>
@@ -13305,6 +13380,7 @@
                 <w:b w:val="0"/>
                 <w:bCs w:val="0"/>
               </w:rPr>
+              <w:lastRenderedPageBreak/>
               <w:t>Q9: Can the van leave while items on the load list are still unloaded?</w:t>
             </w:r>
           </w:p>
@@ -13346,9 +13422,8 @@
           <w:numId w:val="1"/>
         </w:numPr>
       </w:pPr>
-      <w:bookmarkStart w:id="21" w:name="_Toc243601312"/>
+      <w:bookmarkStart w:id="21" w:name="_Toc243605249"/>
       <w:r>
-        <w:lastRenderedPageBreak/>
         <w:t>Use-case model</w:t>
       </w:r>
       <w:bookmarkEnd w:id="21"/>
@@ -13393,7 +13468,7 @@
           <w:numId w:val="1"/>
         </w:numPr>
       </w:pPr>
-      <w:bookmarkStart w:id="22" w:name="_Toc243601313"/>
+      <w:bookmarkStart w:id="22" w:name="_Toc243605250"/>
       <w:r>
         <w:t>Use-case catalogue</w:t>
       </w:r>
@@ -13549,7 +13624,28 @@
                 <w:b w:val="0"/>
                 <w:bCs w:val="0"/>
               </w:rPr>
-              <w:t>UC02 Adjust Route Visit</w:t>
+              <w:t xml:space="preserve">UC02 Adjust </w:t>
+            </w:r>
+            <w:r>
+              <w:rPr>
+                <w:b w:val="0"/>
+                <w:bCs w:val="0"/>
+              </w:rPr>
+              <w:t>Route</w:t>
+            </w:r>
+            <w:r>
+              <w:rPr>
+                <w:b w:val="0"/>
+                <w:bCs w:val="0"/>
+              </w:rPr>
+              <w:t xml:space="preserve"> </w:t>
+            </w:r>
+            <w:r>
+              <w:rPr>
+                <w:b w:val="0"/>
+                <w:bCs w:val="0"/>
+              </w:rPr>
+              <w:t>Visit</w:t>
             </w:r>
           </w:p>
         </w:tc>
@@ -13640,8 +13736,13 @@
               <w:cnfStyle w:val="000000100000" w:firstRow="0" w:lastRow="0" w:firstColumn="0" w:lastColumn="0" w:oddVBand="0" w:evenVBand="0" w:oddHBand="1" w:evenHBand="0" w:firstRowFirstColumn="0" w:firstRowLastColumn="0" w:lastRowFirstColumn="0" w:lastRowLastColumn="0"/>
             </w:pPr>
             <w:r>
-              <w:t>A request is recorded and linked to one route visit</w:t>
-            </w:r>
+              <w:t xml:space="preserve">A request is recorded and linked to one </w:t>
+            </w:r>
+            <w:proofErr w:type="spellStart"/>
+            <w:r>
+              <w:t>RouteVisit</w:t>
+            </w:r>
+            <w:proofErr w:type="spellEnd"/>
           </w:p>
         </w:tc>
         <w:tc>
@@ -14028,6 +14129,7 @@
                 <w:b w:val="0"/>
                 <w:bCs w:val="0"/>
               </w:rPr>
+              <w:lastRenderedPageBreak/>
               <w:t>UC08 Reconcile Offline Transactions</w:t>
             </w:r>
           </w:p>
@@ -14082,23 +14184,19 @@
           <w:numId w:val="1"/>
         </w:numPr>
       </w:pPr>
-      <w:bookmarkStart w:id="23" w:name="_Toc243601314"/>
+      <w:bookmarkStart w:id="23" w:name="_Toc243605251"/>
       <w:r>
-        <w:lastRenderedPageBreak/>
         <w:t>Use-case diagram</w:t>
       </w:r>
       <w:bookmarkEnd w:id="23"/>
     </w:p>
     <w:p>
       <w:r>
-        <w:rPr>
-          <w:noProof/>
-        </w:rPr>
         <w:drawing>
-          <wp:inline distT="0" distB="0" distL="0" distR="0" wp14:anchorId="55B7C95C" wp14:editId="6A75F8D2">
-            <wp:extent cx="6086035" cy="6509657"/>
-            <wp:effectExtent l="0" t="0" r="0" b="5715"/>
-            <wp:docPr id="1772095715" name="Picture 1"/>
+          <wp:inline distT="0" distB="0" distL="0" distR="0" wp14:anchorId="46B18E4B" wp14:editId="2FC54A5A">
+            <wp:extent cx="6472052" cy="6925974"/>
+            <wp:effectExtent l="0" t="0" r="5080" b="8255"/>
+            <wp:docPr id="1441247807" name="Picture 1"/>
             <wp:cNvGraphicFramePr>
               <a:graphicFrameLocks xmlns:a="http://schemas.openxmlformats.org/drawingml/2006/main" noChangeAspect="1"/>
             </wp:cNvGraphicFramePr>
@@ -14106,7 +14204,7 @@
               <a:graphicData uri="http://schemas.openxmlformats.org/drawingml/2006/picture">
                 <pic:pic xmlns:pic="http://schemas.openxmlformats.org/drawingml/2006/picture">
                   <pic:nvPicPr>
-                    <pic:cNvPr id="1772095715" name=""/>
+                    <pic:cNvPr id="1441247807" name=""/>
                     <pic:cNvPicPr/>
                   </pic:nvPicPr>
                   <pic:blipFill>
@@ -14118,7 +14216,7 @@
                   <pic:spPr>
                     <a:xfrm>
                       <a:off x="0" y="0"/>
-                      <a:ext cx="6099029" cy="6523556"/>
+                      <a:ext cx="6489553" cy="6944703"/>
                     </a:xfrm>
                     <a:prstGeom prst="rect">
                       <a:avLst/>
@@ -14136,7 +14234,14 @@
         <w:ind w:left="360"/>
       </w:pPr>
       <w:r>
-        <w:t>I used PlantUML to do the use-case diagram. You can view the actual code in the diagram/use-case-</w:t>
+        <w:lastRenderedPageBreak/>
+        <w:t>I used PlantUML to do the use-case diagram. You can view the actual code in the diagram</w:t>
+      </w:r>
+      <w:r>
+        <w:t>s</w:t>
+      </w:r>
+      <w:r>
+        <w:t>/use-case-</w:t>
       </w:r>
       <w:proofErr w:type="spellStart"/>
       <w:r>
@@ -14177,7 +14282,7 @@
           <w:numId w:val="1"/>
         </w:numPr>
       </w:pPr>
-      <w:bookmarkStart w:id="24" w:name="_Toc243601315"/>
+      <w:bookmarkStart w:id="24" w:name="_Toc243605252"/>
       <w:r>
         <w:t xml:space="preserve">Detailed use case: UC04 </w:t>
       </w:r>
@@ -14418,7 +14523,15 @@
               <w:cnfStyle w:val="000000100000" w:firstRow="0" w:lastRow="0" w:firstColumn="0" w:lastColumn="0" w:oddVBand="0" w:evenVBand="0" w:oddHBand="1" w:evenHBand="0" w:firstRowFirstColumn="0" w:firstRowLastColumn="0" w:lastRowFirstColumn="0" w:lastRowLastColumn="0"/>
             </w:pPr>
             <w:r>
-              <w:t>A route visit exists with an assigned vehicle and requested items have been linked to it.</w:t>
+              <w:t xml:space="preserve">A </w:t>
+            </w:r>
+            <w:proofErr w:type="spellStart"/>
+            <w:r>
+              <w:t>RouteVisit</w:t>
+            </w:r>
+            <w:proofErr w:type="spellEnd"/>
+            <w:r>
+              <w:t xml:space="preserve"> exists with an assigned vehicle and requested items have been linked to it.</w:t>
             </w:r>
           </w:p>
         </w:tc>
@@ -14454,7 +14567,15 @@
               <w:cnfStyle w:val="000000000000" w:firstRow="0" w:lastRow="0" w:firstColumn="0" w:lastColumn="0" w:oddVBand="0" w:evenVBand="0" w:oddHBand="0" w:evenHBand="0" w:firstRowFirstColumn="0" w:firstRowLastColumn="0" w:lastRowFirstColumn="0" w:lastRowLastColumn="0"/>
             </w:pPr>
             <w:r>
-              <w:t>The staff member starts preparing a vehicle for a scheduled route visit.</w:t>
+              <w:t xml:space="preserve">The staff member starts preparing a vehicle for a scheduled </w:t>
+            </w:r>
+            <w:proofErr w:type="spellStart"/>
+            <w:r>
+              <w:t>RouteVisit</w:t>
+            </w:r>
+            <w:proofErr w:type="spellEnd"/>
+            <w:r>
+              <w:t>.</w:t>
             </w:r>
           </w:p>
         </w:tc>
@@ -14666,7 +14787,15 @@
               <w:cnfStyle w:val="000000100000" w:firstRow="0" w:lastRow="0" w:firstColumn="0" w:lastColumn="0" w:oddVBand="0" w:evenVBand="0" w:oddHBand="1" w:evenHBand="0" w:firstRowFirstColumn="0" w:firstRowLastColumn="0" w:lastRowFirstColumn="0" w:lastRowLastColumn="0"/>
             </w:pPr>
             <w:r>
-              <w:t>The staff member starts preparing a route visit.</w:t>
+              <w:t xml:space="preserve">The staff member starts preparing a </w:t>
+            </w:r>
+            <w:proofErr w:type="spellStart"/>
+            <w:r>
+              <w:t>RouteVisit</w:t>
+            </w:r>
+            <w:proofErr w:type="spellEnd"/>
+            <w:r>
+              <w:t>.</w:t>
             </w:r>
           </w:p>
         </w:tc>
@@ -14702,7 +14831,15 @@
               <w:cnfStyle w:val="000000000000" w:firstRow="0" w:lastRow="0" w:firstColumn="0" w:lastColumn="0" w:oddVBand="0" w:evenVBand="0" w:oddHBand="0" w:evenHBand="0" w:firstRowFirstColumn="0" w:firstRowLastColumn="0" w:lastRowFirstColumn="0" w:lastRowLastColumn="0"/>
             </w:pPr>
             <w:r>
-              <w:t>The system identifies the route visit and its assigned vehicle</w:t>
+              <w:t xml:space="preserve">The system identifies the </w:t>
+            </w:r>
+            <w:proofErr w:type="spellStart"/>
+            <w:r>
+              <w:t>RouteVisit</w:t>
+            </w:r>
+            <w:proofErr w:type="spellEnd"/>
+            <w:r>
+              <w:t xml:space="preserve"> and its assigned vehicle</w:t>
             </w:r>
           </w:p>
         </w:tc>
@@ -15102,7 +15239,15 @@
               <w:cnfStyle w:val="000000000000" w:firstRow="0" w:lastRow="0" w:firstColumn="0" w:lastColumn="0" w:oddVBand="0" w:evenVBand="0" w:oddHBand="0" w:evenHBand="0" w:firstRowFirstColumn="0" w:firstRowLastColumn="0" w:lastRowFirstColumn="0" w:lastRowLastColumn="0"/>
             </w:pPr>
             <w:r>
-              <w:t>The item is linked to a different route visit.</w:t>
+              <w:t xml:space="preserve">The item is linked to a different </w:t>
+            </w:r>
+            <w:proofErr w:type="spellStart"/>
+            <w:r>
+              <w:t>RouteVisit</w:t>
+            </w:r>
+            <w:proofErr w:type="spellEnd"/>
+            <w:r>
+              <w:t>.</w:t>
             </w:r>
           </w:p>
         </w:tc>
@@ -15141,7 +15286,6 @@
                 <w:b w:val="0"/>
                 <w:bCs w:val="0"/>
               </w:rPr>
-              <w:lastRenderedPageBreak/>
               <w:t>5b</w:t>
             </w:r>
           </w:p>
@@ -15285,7 +15429,7 @@
           <w:numId w:val="1"/>
         </w:numPr>
       </w:pPr>
-      <w:bookmarkStart w:id="25" w:name="_Toc243601316"/>
+      <w:bookmarkStart w:id="25" w:name="_Toc243605253"/>
       <w:r>
         <w:t>Behavioural examples (Gherkin)</w:t>
       </w:r>
@@ -15332,7 +15476,7 @@
           <w:numId w:val="1"/>
         </w:numPr>
       </w:pPr>
-      <w:bookmarkStart w:id="26" w:name="_Toc243601317"/>
+      <w:bookmarkStart w:id="26" w:name="_Toc243605254"/>
       <w:r>
         <w:t>From paths and rules to focused examples</w:t>
       </w:r>
@@ -15481,8 +15625,13 @@
               <w:cnfStyle w:val="000000000000" w:firstRow="0" w:lastRow="0" w:firstColumn="0" w:lastColumn="0" w:oddVBand="0" w:evenVBand="0" w:oddHBand="0" w:evenHBand="0" w:firstRowFirstColumn="0" w:firstRowLastColumn="0" w:lastRowFirstColumn="0" w:lastRowLastColumn="0"/>
             </w:pPr>
             <w:r>
-              <w:t>Item linked to a different route visit</w:t>
-            </w:r>
+              <w:t xml:space="preserve">Item linked to a different </w:t>
+            </w:r>
+            <w:proofErr w:type="spellStart"/>
+            <w:r>
+              <w:t>RouteVisit</w:t>
+            </w:r>
+            <w:proofErr w:type="spellEnd"/>
           </w:p>
         </w:tc>
         <w:tc>
@@ -15668,15 +15817,24 @@
           <w:numId w:val="1"/>
         </w:numPr>
       </w:pPr>
-      <w:bookmarkStart w:id="27" w:name="_Toc243601318"/>
+      <w:bookmarkStart w:id="27" w:name="_Toc243605255"/>
       <w:r>
+        <w:lastRenderedPageBreak/>
         <w:t>Gherkin Examples</w:t>
       </w:r>
       <w:bookmarkEnd w:id="27"/>
     </w:p>
     <w:p>
       <w:r>
-        <w:t>For the Gherkin examples, I used Session 7 (Detailed Use Cases and Executable Gherkin) and the Cucumber Gherkin reference listed at the end of that lab to help with the structure. I made up a few naming conventions such as B-1001 for a book, RV-0412 for a route visit and ST-07 for a stop</w:t>
+        <w:t xml:space="preserve">For the Gherkin examples, I used Session 7 (Detailed Use Cases and Executable Gherkin) and the Cucumber Gherkin reference listed at the end of that lab to help with the structure. I made up a few naming conventions such as B-1001 for a book, RV-0412 for a </w:t>
+      </w:r>
+      <w:proofErr w:type="spellStart"/>
+      <w:r>
+        <w:t>RouteVisit</w:t>
+      </w:r>
+      <w:proofErr w:type="spellEnd"/>
+      <w:r>
+        <w:t xml:space="preserve"> and ST-07 for a stop</w:t>
       </w:r>
       <w:r>
         <w:t>, CC-03 for a community coordinator, T-221 for a title, MLV-1 for a vehicle and BW-12 for a borrower</w:t>
@@ -15707,14 +15865,11 @@
     </w:p>
     <w:p>
       <w:r>
-        <w:rPr>
-          <w:noProof/>
-        </w:rPr>
         <w:drawing>
-          <wp:inline distT="0" distB="0" distL="0" distR="0" wp14:anchorId="13CCB579" wp14:editId="7B3AB022">
-            <wp:extent cx="5731510" cy="3139440"/>
-            <wp:effectExtent l="0" t="0" r="2540" b="3810"/>
-            <wp:docPr id="529160086" name="Picture 1"/>
+          <wp:inline distT="0" distB="0" distL="0" distR="0" wp14:anchorId="43F9D9C4" wp14:editId="0C7764D5">
+            <wp:extent cx="5731510" cy="2880360"/>
+            <wp:effectExtent l="0" t="0" r="2540" b="0"/>
+            <wp:docPr id="772453613" name="Picture 1"/>
             <wp:cNvGraphicFramePr>
               <a:graphicFrameLocks xmlns:a="http://schemas.openxmlformats.org/drawingml/2006/main" noChangeAspect="1"/>
             </wp:cNvGraphicFramePr>
@@ -15722,7 +15877,7 @@
               <a:graphicData uri="http://schemas.openxmlformats.org/drawingml/2006/picture">
                 <pic:pic xmlns:pic="http://schemas.openxmlformats.org/drawingml/2006/picture">
                   <pic:nvPicPr>
-                    <pic:cNvPr id="529160086" name=""/>
+                    <pic:cNvPr id="772453613" name=""/>
                     <pic:cNvPicPr/>
                   </pic:nvPicPr>
                   <pic:blipFill>
@@ -15734,7 +15889,7 @@
                   <pic:spPr>
                     <a:xfrm>
                       <a:off x="0" y="0"/>
-                      <a:ext cx="5731510" cy="3139440"/>
+                      <a:ext cx="5731510" cy="2880360"/>
                     </a:xfrm>
                     <a:prstGeom prst="rect">
                       <a:avLst/>
@@ -15761,14 +15916,12 @@
     </w:p>
     <w:p>
       <w:r>
-        <w:rPr>
-          <w:noProof/>
-        </w:rPr>
+        <w:lastRenderedPageBreak/>
         <w:drawing>
-          <wp:inline distT="0" distB="0" distL="0" distR="0" wp14:anchorId="09E98A0C" wp14:editId="2CEBA495">
-            <wp:extent cx="5731510" cy="3583940"/>
-            <wp:effectExtent l="0" t="0" r="2540" b="0"/>
-            <wp:docPr id="1797956295" name="Picture 1"/>
+          <wp:inline distT="0" distB="0" distL="0" distR="0" wp14:anchorId="58859148" wp14:editId="1CBD61DD">
+            <wp:extent cx="5731510" cy="4092575"/>
+            <wp:effectExtent l="0" t="0" r="2540" b="3175"/>
+            <wp:docPr id="343539737" name="Picture 1"/>
             <wp:cNvGraphicFramePr>
               <a:graphicFrameLocks xmlns:a="http://schemas.openxmlformats.org/drawingml/2006/main" noChangeAspect="1"/>
             </wp:cNvGraphicFramePr>
@@ -15776,7 +15929,7 @@
               <a:graphicData uri="http://schemas.openxmlformats.org/drawingml/2006/picture">
                 <pic:pic xmlns:pic="http://schemas.openxmlformats.org/drawingml/2006/picture">
                   <pic:nvPicPr>
-                    <pic:cNvPr id="1797956295" name=""/>
+                    <pic:cNvPr id="343539737" name=""/>
                     <pic:cNvPicPr/>
                   </pic:nvPicPr>
                   <pic:blipFill>
@@ -15788,7 +15941,7 @@
                   <pic:spPr>
                     <a:xfrm>
                       <a:off x="0" y="0"/>
-                      <a:ext cx="5731510" cy="3583940"/>
+                      <a:ext cx="5731510" cy="4092575"/>
                     </a:xfrm>
                     <a:prstGeom prst="rect">
                       <a:avLst/>
@@ -15823,14 +15976,11 @@
     </w:p>
     <w:p>
       <w:r>
-        <w:rPr>
-          <w:noProof/>
-        </w:rPr>
         <w:drawing>
-          <wp:inline distT="0" distB="0" distL="0" distR="0" wp14:anchorId="432864AF" wp14:editId="4190ACB1">
-            <wp:extent cx="5731510" cy="2653665"/>
+          <wp:inline distT="0" distB="0" distL="0" distR="0" wp14:anchorId="0A04E16E" wp14:editId="13F3AB96">
+            <wp:extent cx="5731510" cy="2688590"/>
             <wp:effectExtent l="0" t="0" r="2540" b="0"/>
-            <wp:docPr id="565482411" name="Picture 1"/>
+            <wp:docPr id="1532719684" name="Picture 1"/>
             <wp:cNvGraphicFramePr>
               <a:graphicFrameLocks xmlns:a="http://schemas.openxmlformats.org/drawingml/2006/main" noChangeAspect="1"/>
             </wp:cNvGraphicFramePr>
@@ -15838,7 +15988,7 @@
               <a:graphicData uri="http://schemas.openxmlformats.org/drawingml/2006/picture">
                 <pic:pic xmlns:pic="http://schemas.openxmlformats.org/drawingml/2006/picture">
                   <pic:nvPicPr>
-                    <pic:cNvPr id="565482411" name=""/>
+                    <pic:cNvPr id="1532719684" name=""/>
                     <pic:cNvPicPr/>
                   </pic:nvPicPr>
                   <pic:blipFill>
@@ -15850,7 +16000,7 @@
                   <pic:spPr>
                     <a:xfrm>
                       <a:off x="0" y="0"/>
-                      <a:ext cx="5731510" cy="2653665"/>
+                      <a:ext cx="5731510" cy="2688590"/>
                     </a:xfrm>
                     <a:prstGeom prst="rect">
                       <a:avLst/>
@@ -15873,7 +16023,7 @@
           <w:numId w:val="1"/>
         </w:numPr>
       </w:pPr>
-      <w:bookmarkStart w:id="28" w:name="_Toc243601319"/>
+      <w:bookmarkStart w:id="28" w:name="_Toc243605256"/>
       <w:r>
         <w:t>User stories and acceptance criteria</w:t>
       </w:r>
@@ -15901,7 +16051,7 @@
           <w:numId w:val="1"/>
         </w:numPr>
       </w:pPr>
-      <w:bookmarkStart w:id="29" w:name="_Toc243601320"/>
+      <w:bookmarkStart w:id="29" w:name="_Toc243605257"/>
       <w:r>
         <w:t>Story parts</w:t>
       </w:r>
@@ -16141,9 +16291,8 @@
           <w:numId w:val="1"/>
         </w:numPr>
       </w:pPr>
-      <w:bookmarkStart w:id="30" w:name="_Toc243601321"/>
+      <w:bookmarkStart w:id="30" w:name="_Toc243605258"/>
       <w:r>
-        <w:lastRenderedPageBreak/>
         <w:t>Develop user stories</w:t>
       </w:r>
       <w:bookmarkEnd w:id="30"/>
@@ -16392,7 +16541,15 @@
               <w:cnfStyle w:val="000000100000" w:firstRow="0" w:lastRow="0" w:firstColumn="0" w:lastColumn="0" w:oddVBand="0" w:evenVBand="0" w:oddHBand="1" w:evenHBand="0" w:firstRowFirstColumn="0" w:firstRowLastColumn="0" w:lastRowFirstColumn="0" w:lastRowLastColumn="0"/>
             </w:pPr>
             <w:r>
-              <w:t xml:space="preserve">As a branch staff member, I want each requested item linked to one route visit, so that I know which record is </w:t>
+              <w:t xml:space="preserve">As a branch staff member, I want each requested item linked to one </w:t>
+            </w:r>
+            <w:proofErr w:type="spellStart"/>
+            <w:r>
+              <w:t>RouteVisit</w:t>
+            </w:r>
+            <w:proofErr w:type="spellEnd"/>
+            <w:r>
+              <w:t xml:space="preserve">, so that I know which record is </w:t>
             </w:r>
             <w:r>
               <w:t>current.</w:t>
@@ -16525,7 +16682,11 @@
               <w:t xml:space="preserve">As a community coordinator, I want to be told when a visit to my stop </w:t>
             </w:r>
             <w:r>
-              <w:t>is moved or cancelled, so that I can tell local borrowers in advance whether the van is coming or not</w:t>
+              <w:t xml:space="preserve">is moved or cancelled, so that I can tell </w:t>
+            </w:r>
+            <w:r>
+              <w:lastRenderedPageBreak/>
+              <w:t>local borrowers in advance whether the van is coming or not</w:t>
             </w:r>
           </w:p>
         </w:tc>
@@ -16538,6 +16699,7 @@
               <w:cnfStyle w:val="000000100000" w:firstRow="0" w:lastRow="0" w:firstColumn="0" w:lastColumn="0" w:oddVBand="0" w:evenVBand="0" w:oddHBand="1" w:evenHBand="0" w:firstRowFirstColumn="0" w:firstRowLastColumn="0" w:lastRowFirstColumn="0" w:lastRowLastColumn="0"/>
             </w:pPr>
             <w:r>
+              <w:lastRenderedPageBreak/>
               <w:t>Must</w:t>
             </w:r>
           </w:p>
@@ -16748,9 +16910,8 @@
           <w:numId w:val="1"/>
         </w:numPr>
       </w:pPr>
-      <w:bookmarkStart w:id="31" w:name="_Toc243601322"/>
+      <w:bookmarkStart w:id="31" w:name="_Toc243605259"/>
       <w:r>
-        <w:lastRenderedPageBreak/>
         <w:t>Acceptance criteria</w:t>
       </w:r>
       <w:bookmarkEnd w:id="31"/>
@@ -16837,7 +16998,15 @@
               <w:cnfStyle w:val="000000100000" w:firstRow="0" w:lastRow="0" w:firstColumn="0" w:lastColumn="0" w:oddVBand="0" w:evenVBand="0" w:oddHBand="1" w:evenHBand="0" w:firstRowFirstColumn="0" w:firstRowLastColumn="0" w:lastRowFirstColumn="0" w:lastRowLastColumn="0"/>
             </w:pPr>
             <w:r>
-              <w:t>The route visit and its assigned vehicle are identified.</w:t>
+              <w:t xml:space="preserve">The </w:t>
+            </w:r>
+            <w:proofErr w:type="spellStart"/>
+            <w:r>
+              <w:t>RouteVisit</w:t>
+            </w:r>
+            <w:proofErr w:type="spellEnd"/>
+            <w:r>
+              <w:t xml:space="preserve"> and its assigned vehicle are identified.</w:t>
             </w:r>
           </w:p>
         </w:tc>
@@ -16873,7 +17042,15 @@
               <w:cnfStyle w:val="000000000000" w:firstRow="0" w:lastRow="0" w:firstColumn="0" w:lastColumn="0" w:oddVBand="0" w:evenVBand="0" w:oddHBand="0" w:evenHBand="0" w:firstRowFirstColumn="0" w:firstRowLastColumn="0" w:lastRowFirstColumn="0" w:lastRowLastColumn="0"/>
             </w:pPr>
             <w:r>
-              <w:t>An item linked to a different route visit is not recorded as loaded.</w:t>
+              <w:t xml:space="preserve">An item linked to a different </w:t>
+            </w:r>
+            <w:proofErr w:type="spellStart"/>
+            <w:r>
+              <w:t>RouteVisit</w:t>
+            </w:r>
+            <w:proofErr w:type="spellEnd"/>
+            <w:r>
+              <w:t xml:space="preserve"> is not recorded as loaded.</w:t>
             </w:r>
           </w:p>
         </w:tc>
@@ -16912,7 +17089,15 @@
               <w:cnfStyle w:val="000000100000" w:firstRow="0" w:lastRow="0" w:firstColumn="0" w:lastColumn="0" w:oddVBand="0" w:evenVBand="0" w:oddHBand="1" w:evenHBand="0" w:firstRowFirstColumn="0" w:firstRowLastColumn="0" w:lastRowFirstColumn="0" w:lastRowLastColumn="0"/>
             </w:pPr>
             <w:r>
-              <w:t>Each loaded item is recorded against the route visit.</w:t>
+              <w:t xml:space="preserve">Each loaded item is recorded against the </w:t>
+            </w:r>
+            <w:proofErr w:type="spellStart"/>
+            <w:r>
+              <w:t>RouteVisit</w:t>
+            </w:r>
+            <w:proofErr w:type="spellEnd"/>
+            <w:r>
+              <w:t>.</w:t>
             </w:r>
           </w:p>
         </w:tc>
@@ -17134,6 +17319,7 @@
                 <w:b w:val="0"/>
                 <w:bCs w:val="0"/>
               </w:rPr>
+              <w:lastRenderedPageBreak/>
               <w:t>4</w:t>
             </w:r>
           </w:p>
@@ -17378,9 +17564,8 @@
       <w:pPr>
         <w:pStyle w:val="Heading2"/>
       </w:pPr>
-      <w:bookmarkStart w:id="32" w:name="_Toc243601323"/>
+      <w:bookmarkStart w:id="32" w:name="_Toc243605260"/>
       <w:r>
-        <w:lastRenderedPageBreak/>
         <w:t>Given-when-then example (US07)</w:t>
       </w:r>
       <w:bookmarkEnd w:id="32"/>
@@ -17411,7 +17596,7 @@
           <w:numId w:val="1"/>
         </w:numPr>
       </w:pPr>
-      <w:bookmarkStart w:id="33" w:name="_Toc243601324"/>
+      <w:bookmarkStart w:id="33" w:name="_Toc243605261"/>
       <w:r>
         <w:t>Unanswered questions revealed</w:t>
       </w:r>
@@ -17635,8 +17820,9 @@
           <w:numId w:val="1"/>
         </w:numPr>
       </w:pPr>
-      <w:bookmarkStart w:id="34" w:name="_Toc243601325"/>
+      <w:bookmarkStart w:id="34" w:name="_Toc243605262"/>
       <w:r>
+        <w:lastRenderedPageBreak/>
         <w:t>Candidate-concept analysis and glossary</w:t>
       </w:r>
       <w:bookmarkEnd w:id="34"/>
@@ -17645,7 +17831,7 @@
       <w:pPr>
         <w:pStyle w:val="Heading2"/>
       </w:pPr>
-      <w:bookmarkStart w:id="35" w:name="_Toc243601326"/>
+      <w:bookmarkStart w:id="35" w:name="_Toc243605263"/>
       <w:r>
         <w:t>9.1 Initial candidate extraction</w:t>
       </w:r>
@@ -18048,7 +18234,6 @@
                 <w:b w:val="0"/>
                 <w:bCs w:val="0"/>
               </w:rPr>
-              <w:lastRenderedPageBreak/>
               <w:t>Topic</w:t>
             </w:r>
           </w:p>
@@ -18524,6 +18709,7 @@
                 <w:b w:val="0"/>
                 <w:bCs w:val="0"/>
               </w:rPr>
+              <w:lastRenderedPageBreak/>
               <w:t>Usual day, arriv</w:t>
             </w:r>
             <w:r>
@@ -18585,13 +18771,15 @@
                 <w:bCs w:val="0"/>
               </w:rPr>
             </w:pPr>
-            <w:r>
-              <w:rPr>
-                <w:b w:val="0"/>
-                <w:bCs w:val="0"/>
-              </w:rPr>
-              <w:t>Route visit</w:t>
-            </w:r>
+            <w:proofErr w:type="spellStart"/>
+            <w:r>
+              <w:rPr>
+                <w:b w:val="0"/>
+                <w:bCs w:val="0"/>
+              </w:rPr>
+              <w:t>RouteVisit</w:t>
+            </w:r>
+            <w:proofErr w:type="spellEnd"/>
           </w:p>
         </w:tc>
         <w:tc>
@@ -19080,7 +19268,6 @@
                 <w:b w:val="0"/>
                 <w:bCs w:val="0"/>
               </w:rPr>
-              <w:lastRenderedPageBreak/>
               <w:t xml:space="preserve">Permission to collect </w:t>
             </w:r>
           </w:p>
@@ -19421,7 +19608,7 @@
       <w:pPr>
         <w:pStyle w:val="Heading2"/>
       </w:pPr>
-      <w:bookmarkStart w:id="36" w:name="_Toc243601327"/>
+      <w:bookmarkStart w:id="36" w:name="_Toc243605264"/>
       <w:r>
         <w:t>9.2 Classify the candidates</w:t>
       </w:r>
@@ -19593,6 +19780,7 @@
                 <w:b w:val="0"/>
                 <w:bCs w:val="0"/>
               </w:rPr>
+              <w:lastRenderedPageBreak/>
               <w:t>Borrower</w:t>
             </w:r>
           </w:p>
@@ -20019,7 +20207,6 @@
                 <w:b w:val="0"/>
                 <w:bCs w:val="0"/>
               </w:rPr>
-              <w:lastRenderedPageBreak/>
               <w:t>Temporary sheet</w:t>
             </w:r>
           </w:p>
@@ -20286,13 +20473,15 @@
                 <w:bCs w:val="0"/>
               </w:rPr>
             </w:pPr>
-            <w:r>
-              <w:rPr>
-                <w:b w:val="0"/>
-                <w:bCs w:val="0"/>
-              </w:rPr>
-              <w:t>Route visit</w:t>
-            </w:r>
+            <w:proofErr w:type="spellStart"/>
+            <w:r>
+              <w:rPr>
+                <w:b w:val="0"/>
+                <w:bCs w:val="0"/>
+              </w:rPr>
+              <w:t>RouteVisit</w:t>
+            </w:r>
+            <w:proofErr w:type="spellEnd"/>
           </w:p>
         </w:tc>
         <w:tc>
@@ -20553,6 +20742,7 @@
                 <w:b w:val="0"/>
                 <w:bCs w:val="0"/>
               </w:rPr>
+              <w:lastRenderedPageBreak/>
               <w:t>Route manifest / load list</w:t>
             </w:r>
           </w:p>
@@ -20683,17 +20873,11 @@
               <w:t>Receives visit notices</w:t>
             </w:r>
             <w:r>
-              <w:t xml:space="preserve"> and may collect for borrowers</w:t>
-            </w:r>
-            <w:r>
-              <w:t>(Q2</w:t>
+              <w:t xml:space="preserve"> and may collect for borrowers(Q2</w:t>
             </w:r>
             <w:proofErr w:type="gramStart"/>
             <w:r>
-              <w:t>)</w:t>
-            </w:r>
-            <w:r>
-              <w:t xml:space="preserve"> </w:t>
+              <w:t xml:space="preserve">) </w:t>
             </w:r>
             <w:r>
               <w:t>:</w:t>
@@ -20752,7 +20936,15 @@
               <w:cnfStyle w:val="000000100000" w:firstRow="0" w:lastRow="0" w:firstColumn="0" w:lastColumn="0" w:oddVBand="0" w:evenVBand="0" w:oddHBand="1" w:evenHBand="0" w:firstRowFirstColumn="0" w:firstRowLastColumn="0" w:lastRowFirstColumn="0" w:lastRowLastColumn="0"/>
             </w:pPr>
             <w:r>
-              <w:t>Only matters if collection permission is stored</w:t>
+              <w:t xml:space="preserve">Only matters if </w:t>
+            </w:r>
+            <w:proofErr w:type="spellStart"/>
+            <w:r>
+              <w:t>CollectionPermission</w:t>
+            </w:r>
+            <w:proofErr w:type="spellEnd"/>
+            <w:r>
+              <w:t xml:space="preserve"> is stored</w:t>
             </w:r>
             <w:r>
               <w:t xml:space="preserve"> (Q2)</w:t>
@@ -20945,7 +21137,6 @@
                 <w:b w:val="0"/>
                 <w:bCs w:val="0"/>
               </w:rPr>
-              <w:lastRenderedPageBreak/>
               <w:t>Driver /relief driver</w:t>
             </w:r>
           </w:p>
@@ -21137,7 +21328,7 @@
       <w:pPr>
         <w:pStyle w:val="Heading2"/>
       </w:pPr>
-      <w:bookmarkStart w:id="37" w:name="_Toc243601328"/>
+      <w:bookmarkStart w:id="37" w:name="_Toc243605265"/>
       <w:r>
         <w:t>9.3 Keep, merge, convert or remove</w:t>
       </w:r>
@@ -21361,6 +21552,7 @@
                 <w:b w:val="0"/>
                 <w:bCs w:val="0"/>
               </w:rPr>
+              <w:lastRenderedPageBreak/>
               <w:t>Borrower</w:t>
             </w:r>
           </w:p>
@@ -21796,11 +21988,7 @@
               <w:cnfStyle w:val="000000100000" w:firstRow="0" w:lastRow="0" w:firstColumn="0" w:lastColumn="0" w:oddVBand="0" w:evenVBand="0" w:oddHBand="1" w:evenHBand="0" w:firstRowFirstColumn="0" w:firstRowLastColumn="0" w:lastRowFirstColumn="0" w:lastRowLastColumn="0"/>
             </w:pPr>
             <w:r>
-              <w:t xml:space="preserve">Records the borrower’s </w:t>
-            </w:r>
-            <w:r>
-              <w:lastRenderedPageBreak/>
-              <w:t>choice on the request (FR10)</w:t>
+              <w:t>Records the borrower’s choice on the request (FR10)</w:t>
             </w:r>
           </w:p>
         </w:tc>
@@ -21823,7 +22011,6 @@
                 <w:b w:val="0"/>
                 <w:bCs w:val="0"/>
               </w:rPr>
-              <w:lastRenderedPageBreak/>
               <w:t>Loan</w:t>
             </w:r>
           </w:p>
@@ -22231,6 +22418,7 @@
                 <w:b w:val="0"/>
                 <w:bCs w:val="0"/>
               </w:rPr>
+              <w:lastRenderedPageBreak/>
               <w:t>Arrival time and visit duration</w:t>
             </w:r>
           </w:p>
@@ -22256,6 +22444,14 @@
             <w:pPr>
               <w:cnfStyle w:val="000000000000" w:firstRow="0" w:lastRow="0" w:firstColumn="0" w:lastColumn="0" w:oddVBand="0" w:evenVBand="0" w:oddHBand="0" w:evenHBand="0" w:firstRowFirstColumn="0" w:firstRowLastColumn="0" w:lastRowFirstColumn="0" w:lastRowLastColumn="0"/>
             </w:pPr>
+            <w:proofErr w:type="spellStart"/>
+            <w:r>
+              <w:t>RouteStop</w:t>
+            </w:r>
+            <w:proofErr w:type="spellEnd"/>
+            <w:r>
+              <w:t xml:space="preserve"> and </w:t>
+            </w:r>
             <w:r>
               <w:t xml:space="preserve">Attributes of </w:t>
             </w:r>
@@ -22305,13 +22501,15 @@
                 <w:bCs w:val="0"/>
               </w:rPr>
             </w:pPr>
-            <w:r>
-              <w:rPr>
-                <w:b w:val="0"/>
-                <w:bCs w:val="0"/>
-              </w:rPr>
-              <w:t>Route visit</w:t>
-            </w:r>
+            <w:proofErr w:type="spellStart"/>
+            <w:r>
+              <w:rPr>
+                <w:b w:val="0"/>
+                <w:bCs w:val="0"/>
+              </w:rPr>
+              <w:t>RouteVisit</w:t>
+            </w:r>
+            <w:proofErr w:type="spellEnd"/>
           </w:p>
         </w:tc>
         <w:tc>
@@ -22377,7 +22575,23 @@
               <w:cnfStyle w:val="000000100000" w:firstRow="0" w:lastRow="0" w:firstColumn="0" w:lastColumn="0" w:oddVBand="0" w:evenVBand="0" w:oddHBand="1" w:evenHBand="0" w:firstRowFirstColumn="0" w:firstRowLastColumn="0" w:lastRowFirstColumn="0" w:lastRowLastColumn="0"/>
             </w:pPr>
             <w:r>
-              <w:t>A route visit is one dated running of a route: a stop visit holds the status of each stop on that day, because one stop can be moved while the other</w:t>
+              <w:t xml:space="preserve">A </w:t>
+            </w:r>
+            <w:proofErr w:type="spellStart"/>
+            <w:r>
+              <w:t>RouteVisit</w:t>
+            </w:r>
+            <w:proofErr w:type="spellEnd"/>
+            <w:r>
+              <w:t xml:space="preserve"> is one dated running of a route: a </w:t>
+            </w:r>
+            <w:proofErr w:type="spellStart"/>
+            <w:r>
+              <w:t>StopVisit</w:t>
+            </w:r>
+            <w:proofErr w:type="spellEnd"/>
+            <w:r>
+              <w:t xml:space="preserve"> holds the status of each stop on that day, because one stop can be moved while the other</w:t>
             </w:r>
             <w:r>
               <w:t>s still</w:t>
@@ -22468,7 +22682,13 @@
               <w:cnfStyle w:val="000000000000" w:firstRow="0" w:lastRow="0" w:firstColumn="0" w:lastColumn="0" w:oddVBand="0" w:evenVBand="0" w:oddHBand="0" w:evenHBand="0" w:firstRowFirstColumn="0" w:firstRowLastColumn="0" w:lastRowFirstColumn="0" w:lastRowLastColumn="0"/>
             </w:pPr>
             <w:r>
-              <w:t>Values: on time delayed, moved or cancelled.</w:t>
+              <w:t>Values: on time</w:t>
+            </w:r>
+            <w:r>
+              <w:t xml:space="preserve">, </w:t>
+            </w:r>
+            <w:r>
+              <w:t>delayed, moved or cancelled.</w:t>
             </w:r>
           </w:p>
         </w:tc>
@@ -22570,7 +22790,6 @@
                 <w:b w:val="0"/>
                 <w:bCs w:val="0"/>
               </w:rPr>
-              <w:lastRenderedPageBreak/>
               <w:t>Vehicle / replacement vehicle</w:t>
             </w:r>
           </w:p>
@@ -23082,6 +23301,7 @@
                 <w:b w:val="0"/>
                 <w:bCs w:val="0"/>
               </w:rPr>
+              <w:lastRenderedPageBreak/>
               <w:t>Notification / notice</w:t>
             </w:r>
           </w:p>
@@ -23478,9 +23698,8 @@
       <w:pPr>
         <w:pStyle w:val="Heading2"/>
       </w:pPr>
-      <w:bookmarkStart w:id="38" w:name="_Toc243601329"/>
+      <w:bookmarkStart w:id="38" w:name="_Toc243605266"/>
       <w:r>
-        <w:lastRenderedPageBreak/>
         <w:t>9.4 Glossary</w:t>
       </w:r>
       <w:bookmarkEnd w:id="38"/>
@@ -23492,10 +23711,10 @@
         <w:tblLook w:val="04A0" w:firstRow="1" w:lastRow="0" w:firstColumn="1" w:lastColumn="0" w:noHBand="0" w:noVBand="1"/>
       </w:tblPr>
       <w:tblGrid>
-        <w:gridCol w:w="2254"/>
-        <w:gridCol w:w="2254"/>
-        <w:gridCol w:w="2254"/>
-        <w:gridCol w:w="2254"/>
+        <w:gridCol w:w="2440"/>
+        <w:gridCol w:w="2194"/>
+        <w:gridCol w:w="2202"/>
+        <w:gridCol w:w="2180"/>
       </w:tblGrid>
       <w:tr>
         <w:trPr>
@@ -23786,7 +24005,10 @@
               <w:cnfStyle w:val="000000000000" w:firstRow="0" w:lastRow="0" w:firstColumn="0" w:lastColumn="0" w:oddVBand="0" w:evenVBand="0" w:oddHBand="0" w:evenHBand="0" w:firstRowFirstColumn="0" w:firstRowLastColumn="0" w:lastRowFirstColumn="0" w:lastRowLastColumn="0"/>
             </w:pPr>
             <w:r>
-              <w:t>A borrower’s ask for a specific title, edition or any item on a topic with a status of (Open, fulfilled, unfulfilled)</w:t>
+              <w:t xml:space="preserve">A borrower’s ask for a specific title, edition or any item on a topic with a status of (Open, fulfilled, </w:t>
+            </w:r>
+            <w:r>
+              <w:t>cancelled</w:t>
             </w:r>
           </w:p>
         </w:tc>
@@ -23851,7 +24073,11 @@
               <w:cnfStyle w:val="000000100000" w:firstRow="0" w:lastRow="0" w:firstColumn="0" w:lastColumn="0" w:oddVBand="0" w:evenVBand="0" w:oddHBand="1" w:evenHBand="0" w:firstRowFirstColumn="0" w:firstRowLastColumn="0" w:lastRowFirstColumn="0" w:lastRowLastColumn="0"/>
             </w:pPr>
             <w:r>
-              <w:t>A record that a borrower has an item, from the date lent to the date returned</w:t>
+              <w:t xml:space="preserve">A record that a borrower has an item, from the date </w:t>
+            </w:r>
+            <w:r>
+              <w:lastRenderedPageBreak/>
+              <w:t>lent to the date returned</w:t>
             </w:r>
           </w:p>
         </w:tc>
@@ -23864,6 +24090,7 @@
               <w:cnfStyle w:val="000000100000" w:firstRow="0" w:lastRow="0" w:firstColumn="0" w:lastColumn="0" w:oddVBand="0" w:evenVBand="0" w:oddHBand="1" w:evenHBand="0" w:firstRowFirstColumn="0" w:firstRowLastColumn="0" w:lastRowFirstColumn="0" w:lastRowLastColumn="0"/>
             </w:pPr>
             <w:r>
+              <w:lastRenderedPageBreak/>
               <w:t xml:space="preserve">Borrower, Item, </w:t>
             </w:r>
             <w:proofErr w:type="spellStart"/>
@@ -24071,13 +24298,15 @@
                 <w:bCs w:val="0"/>
               </w:rPr>
             </w:pPr>
-            <w:r>
-              <w:rPr>
-                <w:b w:val="0"/>
-                <w:bCs w:val="0"/>
-              </w:rPr>
-              <w:t>Route Stop</w:t>
-            </w:r>
+            <w:proofErr w:type="spellStart"/>
+            <w:r>
+              <w:rPr>
+                <w:b w:val="0"/>
+                <w:bCs w:val="0"/>
+              </w:rPr>
+              <w:t>RouteStop</w:t>
+            </w:r>
+            <w:proofErr w:type="spellEnd"/>
           </w:p>
         </w:tc>
         <w:tc>
@@ -24142,13 +24371,15 @@
                 <w:bCs w:val="0"/>
               </w:rPr>
             </w:pPr>
-            <w:r>
-              <w:rPr>
-                <w:b w:val="0"/>
-                <w:bCs w:val="0"/>
-              </w:rPr>
-              <w:t>Route Visit</w:t>
-            </w:r>
+            <w:proofErr w:type="spellStart"/>
+            <w:r>
+              <w:rPr>
+                <w:b w:val="0"/>
+                <w:bCs w:val="0"/>
+              </w:rPr>
+              <w:t>RouteVisit</w:t>
+            </w:r>
+            <w:proofErr w:type="spellEnd"/>
           </w:p>
         </w:tc>
         <w:tc>
@@ -24187,7 +24418,13 @@
             </w:r>
             <w:proofErr w:type="spellEnd"/>
             <w:r>
-              <w:t xml:space="preserve">, vehicle, </w:t>
+              <w:t xml:space="preserve">, </w:t>
+            </w:r>
+            <w:r>
+              <w:t>V</w:t>
+            </w:r>
+            <w:r>
+              <w:t xml:space="preserve">ehicle, </w:t>
             </w:r>
             <w:proofErr w:type="spellStart"/>
             <w:r>
@@ -24235,14 +24472,15 @@
                 <w:bCs w:val="0"/>
               </w:rPr>
             </w:pPr>
-            <w:r>
-              <w:rPr>
-                <w:b w:val="0"/>
-                <w:bCs w:val="0"/>
-              </w:rPr>
-              <w:lastRenderedPageBreak/>
-              <w:t>Stop Visit</w:t>
-            </w:r>
+            <w:proofErr w:type="spellStart"/>
+            <w:r>
+              <w:rPr>
+                <w:b w:val="0"/>
+                <w:bCs w:val="0"/>
+              </w:rPr>
+              <w:t>StopVisit</w:t>
+            </w:r>
+            <w:proofErr w:type="spellEnd"/>
           </w:p>
         </w:tc>
         <w:tc>
@@ -24254,7 +24492,15 @@
               <w:cnfStyle w:val="000000000000" w:firstRow="0" w:lastRow="0" w:firstColumn="0" w:lastColumn="0" w:oddVBand="0" w:evenVBand="0" w:oddHBand="0" w:evenHBand="0" w:firstRowFirstColumn="0" w:firstRowLastColumn="0" w:lastRowFirstColumn="0" w:lastRowLastColumn="0"/>
             </w:pPr>
             <w:r>
-              <w:t>One stop on a dated route visit, with its status (</w:t>
+              <w:t xml:space="preserve">One stop on a dated </w:t>
+            </w:r>
+            <w:proofErr w:type="spellStart"/>
+            <w:r>
+              <w:t>RouteVisit</w:t>
+            </w:r>
+            <w:proofErr w:type="spellEnd"/>
+            <w:r>
+              <w:t>, with its status (</w:t>
             </w:r>
             <w:r>
               <w:t>on time, delayed, moved or cancelled</w:t>
@@ -24385,13 +24631,15 @@
                 <w:bCs w:val="0"/>
               </w:rPr>
             </w:pPr>
-            <w:r>
-              <w:rPr>
-                <w:b w:val="0"/>
-                <w:bCs w:val="0"/>
-              </w:rPr>
-              <w:t>Load list entry</w:t>
-            </w:r>
+            <w:proofErr w:type="spellStart"/>
+            <w:r>
+              <w:rPr>
+                <w:b w:val="0"/>
+                <w:bCs w:val="0"/>
+              </w:rPr>
+              <w:t>LoadListEntry</w:t>
+            </w:r>
+            <w:proofErr w:type="spellEnd"/>
           </w:p>
         </w:tc>
         <w:tc>
@@ -24403,7 +24651,15 @@
               <w:cnfStyle w:val="000000000000" w:firstRow="0" w:lastRow="0" w:firstColumn="0" w:lastColumn="0" w:oddVBand="0" w:evenVBand="0" w:oddHBand="0" w:evenHBand="0" w:firstRowFirstColumn="0" w:firstRowLastColumn="0" w:lastRowFirstColumn="0" w:lastRowLastColumn="0"/>
             </w:pPr>
             <w:r>
-              <w:t>One item assigned to a route visit, showing whether it has been loaded</w:t>
+              <w:t xml:space="preserve">One item assigned to a </w:t>
+            </w:r>
+            <w:proofErr w:type="spellStart"/>
+            <w:r>
+              <w:t>RouteVisit</w:t>
+            </w:r>
+            <w:proofErr w:type="spellEnd"/>
+            <w:r>
+              <w:t>, showing whether it has been loaded</w:t>
             </w:r>
           </w:p>
         </w:tc>
@@ -24455,13 +24711,15 @@
                 <w:bCs w:val="0"/>
               </w:rPr>
             </w:pPr>
-            <w:r>
-              <w:rPr>
-                <w:b w:val="0"/>
-                <w:bCs w:val="0"/>
-              </w:rPr>
-              <w:t>Collection Permission</w:t>
-            </w:r>
+            <w:proofErr w:type="spellStart"/>
+            <w:r>
+              <w:rPr>
+                <w:b w:val="0"/>
+                <w:bCs w:val="0"/>
+              </w:rPr>
+              <w:t>CollectionPermission</w:t>
+            </w:r>
+            <w:proofErr w:type="spellEnd"/>
           </w:p>
         </w:tc>
         <w:tc>
@@ -24499,7 +24757,13 @@
               <w:cnfStyle w:val="000000100000" w:firstRow="0" w:lastRow="0" w:firstColumn="0" w:lastColumn="0" w:oddVBand="0" w:evenVBand="0" w:oddHBand="1" w:evenHBand="0" w:firstRowFirstColumn="0" w:firstRowLastColumn="0" w:lastRowFirstColumn="0" w:lastRowLastColumn="0"/>
             </w:pPr>
             <w:r>
-              <w:t>FR13: Q2</w:t>
+              <w:t>FR13</w:t>
+            </w:r>
+            <w:r>
+              <w:t>,</w:t>
+            </w:r>
+            <w:r>
+              <w:t xml:space="preserve"> Q2</w:t>
             </w:r>
           </w:p>
         </w:tc>
@@ -24585,8 +24849,9 @@
           <w:numId w:val="1"/>
         </w:numPr>
       </w:pPr>
-      <w:bookmarkStart w:id="39" w:name="_Toc243601330"/>
+      <w:bookmarkStart w:id="39" w:name="_Toc243605267"/>
       <w:r>
+        <w:lastRenderedPageBreak/>
         <w:t>Domain Modelling</w:t>
       </w:r>
       <w:bookmarkEnd w:id="39"/>
@@ -24599,7 +24864,7 @@
           <w:numId w:val="1"/>
         </w:numPr>
       </w:pPr>
-      <w:bookmarkStart w:id="40" w:name="_Toc243601331"/>
+      <w:bookmarkStart w:id="40" w:name="_Toc243605268"/>
       <w:r>
         <w:t>Attributes</w:t>
       </w:r>
@@ -24997,7 +25262,21 @@
               <w:t xml:space="preserve"> replaces the temporary sheet (</w:t>
             </w:r>
             <w:r>
-              <w:t>FR11 FR12</w:t>
+              <w:t>FR</w:t>
+            </w:r>
+            <w:proofErr w:type="gramStart"/>
+            <w:r>
+              <w:t>11</w:t>
+            </w:r>
+            <w:r>
+              <w:t xml:space="preserve">, </w:t>
+            </w:r>
+            <w:r>
+              <w:t xml:space="preserve"> FR</w:t>
+            </w:r>
+            <w:proofErr w:type="gramEnd"/>
+            <w:r>
+              <w:t>12</w:t>
             </w:r>
             <w:r>
               <w:t>)</w:t>
@@ -25120,14 +25399,15 @@
                 <w:bCs w:val="0"/>
               </w:rPr>
             </w:pPr>
-            <w:r>
-              <w:rPr>
-                <w:b w:val="0"/>
-                <w:bCs w:val="0"/>
-              </w:rPr>
-              <w:lastRenderedPageBreak/>
-              <w:t>Route Stop</w:t>
-            </w:r>
+            <w:proofErr w:type="spellStart"/>
+            <w:r>
+              <w:rPr>
+                <w:b w:val="0"/>
+                <w:bCs w:val="0"/>
+              </w:rPr>
+              <w:t>RouteStop</w:t>
+            </w:r>
+            <w:proofErr w:type="spellEnd"/>
           </w:p>
         </w:tc>
         <w:tc>
@@ -25202,13 +25482,15 @@
                 <w:bCs w:val="0"/>
               </w:rPr>
             </w:pPr>
-            <w:r>
-              <w:rPr>
-                <w:b w:val="0"/>
-                <w:bCs w:val="0"/>
-              </w:rPr>
-              <w:t>Route Visit</w:t>
-            </w:r>
+            <w:proofErr w:type="spellStart"/>
+            <w:r>
+              <w:rPr>
+                <w:b w:val="0"/>
+                <w:bCs w:val="0"/>
+              </w:rPr>
+              <w:t>RouteVisit</w:t>
+            </w:r>
+            <w:proofErr w:type="spellEnd"/>
           </w:p>
         </w:tc>
         <w:tc>
@@ -25258,13 +25540,15 @@
                 <w:bCs w:val="0"/>
               </w:rPr>
             </w:pPr>
-            <w:r>
-              <w:rPr>
-                <w:b w:val="0"/>
-                <w:bCs w:val="0"/>
-              </w:rPr>
-              <w:t>Stop Visit</w:t>
-            </w:r>
+            <w:proofErr w:type="spellStart"/>
+            <w:r>
+              <w:rPr>
+                <w:b w:val="0"/>
+                <w:bCs w:val="0"/>
+              </w:rPr>
+              <w:t>StopVisit</w:t>
+            </w:r>
+            <w:proofErr w:type="spellEnd"/>
           </w:p>
         </w:tc>
         <w:tc>
@@ -25605,7 +25889,7 @@
           <w:numId w:val="1"/>
         </w:numPr>
       </w:pPr>
-      <w:bookmarkStart w:id="41" w:name="_Toc243601332"/>
+      <w:bookmarkStart w:id="41" w:name="_Toc243605269"/>
       <w:r>
         <w:t>Associations and multiplicities</w:t>
       </w:r>
@@ -25805,8 +26089,17 @@
                 <w:b w:val="0"/>
                 <w:bCs w:val="0"/>
               </w:rPr>
-              <w:t>Borrower gives Collection Permission</w:t>
-            </w:r>
+              <w:t xml:space="preserve">Borrower gives </w:t>
+            </w:r>
+            <w:proofErr w:type="spellStart"/>
+            <w:r>
+              <w:rPr>
+                <w:b w:val="0"/>
+                <w:bCs w:val="0"/>
+              </w:rPr>
+              <w:t>CollectionPermission</w:t>
+            </w:r>
+            <w:proofErr w:type="spellEnd"/>
           </w:p>
         </w:tc>
         <w:tc>
@@ -25862,6 +26155,7 @@
                 <w:b w:val="0"/>
                 <w:bCs w:val="0"/>
               </w:rPr>
+              <w:lastRenderedPageBreak/>
               <w:t>Title has copies Item</w:t>
             </w:r>
           </w:p>
@@ -26466,7 +26760,35 @@
                 <w:b w:val="0"/>
                 <w:bCs w:val="0"/>
               </w:rPr>
-              <w:t xml:space="preserve">Stop visited in </w:t>
+              <w:t>S</w:t>
+            </w:r>
+            <w:r>
+              <w:rPr>
+                <w:b w:val="0"/>
+                <w:bCs w:val="0"/>
+              </w:rPr>
+              <w:t>top</w:t>
+            </w:r>
+            <w:r>
+              <w:rPr>
+                <w:b w:val="0"/>
+                <w:bCs w:val="0"/>
+              </w:rPr>
+              <w:t xml:space="preserve"> v</w:t>
+            </w:r>
+            <w:r>
+              <w:rPr>
+                <w:b w:val="0"/>
+                <w:bCs w:val="0"/>
+              </w:rPr>
+              <w:t>isit</w:t>
+            </w:r>
+            <w:r>
+              <w:rPr>
+                <w:b w:val="0"/>
+                <w:bCs w:val="0"/>
+              </w:rPr>
+              <w:t xml:space="preserve">ed in </w:t>
             </w:r>
             <w:proofErr w:type="spellStart"/>
             <w:r>
@@ -26533,7 +26855,6 @@
                 <w:b w:val="0"/>
                 <w:bCs w:val="0"/>
               </w:rPr>
-              <w:lastRenderedPageBreak/>
               <w:t>RouteVisit</w:t>
             </w:r>
             <w:proofErr w:type="spellEnd"/>
@@ -26858,7 +27179,7 @@
           <w:numId w:val="1"/>
         </w:numPr>
       </w:pPr>
-      <w:bookmarkStart w:id="42" w:name="_Toc243601333"/>
+      <w:bookmarkStart w:id="42" w:name="_Toc243605270"/>
       <w:r>
         <w:t>Transactions</w:t>
       </w:r>
@@ -27171,7 +27492,7 @@
           <w:numId w:val="1"/>
         </w:numPr>
       </w:pPr>
-      <w:bookmarkStart w:id="43" w:name="_Toc243601334"/>
+      <w:bookmarkStart w:id="43" w:name="_Toc243605271"/>
       <w:r>
         <w:lastRenderedPageBreak/>
         <w:t>Domain model</w:t>
@@ -27183,14 +27504,11 @@
         <w:jc w:val="center"/>
       </w:pPr>
       <w:r>
-        <w:rPr>
-          <w:noProof/>
-        </w:rPr>
         <w:drawing>
-          <wp:inline distT="0" distB="0" distL="0" distR="0" wp14:anchorId="0888CC64" wp14:editId="5F2D1509">
-            <wp:extent cx="6584400" cy="5594400"/>
-            <wp:effectExtent l="0" t="0" r="6985" b="6350"/>
-            <wp:docPr id="903491499" name="Picture 1"/>
+          <wp:inline distT="0" distB="0" distL="0" distR="0" wp14:anchorId="3F08F195" wp14:editId="5A1A7E9D">
+            <wp:extent cx="6552367" cy="5692555"/>
+            <wp:effectExtent l="0" t="0" r="1270" b="3810"/>
+            <wp:docPr id="1829260404" name="Picture 1"/>
             <wp:cNvGraphicFramePr>
               <a:graphicFrameLocks xmlns:a="http://schemas.openxmlformats.org/drawingml/2006/main" noChangeAspect="1"/>
             </wp:cNvGraphicFramePr>
@@ -27198,7 +27516,7 @@
               <a:graphicData uri="http://schemas.openxmlformats.org/drawingml/2006/picture">
                 <pic:pic xmlns:pic="http://schemas.openxmlformats.org/drawingml/2006/picture">
                   <pic:nvPicPr>
-                    <pic:cNvPr id="903491499" name=""/>
+                    <pic:cNvPr id="1829260404" name=""/>
                     <pic:cNvPicPr/>
                   </pic:nvPicPr>
                   <pic:blipFill>
@@ -27210,7 +27528,7 @@
                   <pic:spPr>
                     <a:xfrm>
                       <a:off x="0" y="0"/>
-                      <a:ext cx="6584400" cy="5594400"/>
+                      <a:ext cx="6603712" cy="5737162"/>
                     </a:xfrm>
                     <a:prstGeom prst="rect">
                       <a:avLst/>
@@ -27261,7 +27579,7 @@
           <w:numId w:val="1"/>
         </w:numPr>
       </w:pPr>
-      <w:bookmarkStart w:id="44" w:name="_Toc243601335"/>
+      <w:bookmarkStart w:id="44" w:name="_Toc243605272"/>
       <w:r>
         <w:lastRenderedPageBreak/>
         <w:t>Traceability matrix</w:t>
@@ -28392,7 +28710,7 @@
         <w:lastRenderedPageBreak/>
         <w:t xml:space="preserve"> </w:t>
       </w:r>
-      <w:bookmarkStart w:id="45" w:name="_Toc243601336"/>
+      <w:bookmarkStart w:id="45" w:name="_Toc243605273"/>
       <w:r>
         <w:t>AI Declaration and Reflection</w:t>
       </w:r>
@@ -28952,6 +29270,9 @@
         <w:pStyle w:val="Subtitle"/>
       </w:pPr>
       <w:r>
+        <w:t xml:space="preserve">Decision and </w:t>
+      </w:r>
+      <w:r>
         <w:t>Rejected use case for AI:</w:t>
       </w:r>
     </w:p>
@@ -28974,7 +29295,7 @@
         <w:t>small few fixes</w:t>
       </w:r>
       <w:r>
-        <w:t>.</w:t>
+        <w:t xml:space="preserve"> from the output of the prompt.</w:t>
       </w:r>
     </w:p>
     <w:p/>

</xml_diff>